<commit_message>
chore (TR4): filling in the report
</commit_message>
<xml_diff>
--- a/42TR Tehnologiji Rozpodilenyh System/4/TR_KNT-122_Onyshchenko_19_PR4.docx
+++ b/42TR Tehnologiji Rozpodilenyh System/4/TR_KNT-122_Onyshchenko_19_PR4.docx
@@ -468,17 +468,322 @@
     <w:p>
       <w:pPr>
         <w:pStyle w:val="P1"/>
-        <w:rPr/>
-      </w:pPr>
-      <w:r>
-        <w:rPr/>
-        <w:t>Завдання на роботу</w:t>
-      </w:r>
-      <w:r>
-        <w:rPr>
+        <w:rPr>
+          <w:lang w:val="uk-UA"/>
+        </w:rPr>
+      </w:pPr>
+      <w:r>
+        <w:rPr>
+          <w:lang w:val="uk-UA"/>
+        </w:rPr>
+        <w:t>Завдання 1</w:t>
+      </w:r>
+    </w:p>
+    <w:p>
+      <w:pPr>
+        <w:pStyle w:val="P1"/>
+        <w:rPr>
+          <w:lang w:val="uk-UA"/>
+        </w:rPr>
+      </w:pPr>
+      <w:r>
+        <w:rPr>
+          <w:lang w:val="uk-UA"/>
+        </w:rPr>
+        <w:drawing>
+          <wp:anchor behindDoc="0" distT="0" distB="0" distL="0" distR="0" simplePos="0" locked="0" layoutInCell="0" allowOverlap="1" relativeHeight="2">
+            <wp:simplePos x="0" y="0"/>
+            <wp:positionH relativeFrom="column">
+              <wp:posOffset>4702810</wp:posOffset>
+            </wp:positionH>
+            <wp:positionV relativeFrom="paragraph">
+              <wp:posOffset>33655</wp:posOffset>
+            </wp:positionV>
+            <wp:extent cx="497205" cy="488315"/>
+            <wp:effectExtent l="0" t="0" r="0" b="0"/>
+            <wp:wrapSquare wrapText="largest"/>
+            <wp:docPr id="1" name="Зображення1"/>
+            <wp:cNvGraphicFramePr>
+              <a:graphicFrameLocks xmlns:a="http://schemas.openxmlformats.org/drawingml/2006/main" noChangeAspect="1"/>
+            </wp:cNvGraphicFramePr>
+            <a:graphic xmlns:a="http://schemas.openxmlformats.org/drawingml/2006/main">
+              <a:graphicData uri="http://schemas.openxmlformats.org/drawingml/2006/picture">
+                <pic:pic xmlns:pic="http://schemas.openxmlformats.org/drawingml/2006/picture">
+                  <pic:nvPicPr>
+                    <pic:cNvPr id="1" name="Зображення1"/>
+                    <pic:cNvPicPr>
+                      <a:picLocks noChangeAspect="1" noChangeArrowheads="1"/>
+                    </pic:cNvPicPr>
+                  </pic:nvPicPr>
+                  <pic:blipFill>
+                    <a:blip r:embed="rId2"/>
+                    <a:stretch>
+                      <a:fillRect/>
+                    </a:stretch>
+                  </pic:blipFill>
+                  <pic:spPr bwMode="auto">
+                    <a:xfrm>
+                      <a:off x="0" y="0"/>
+                      <a:ext cx="497205" cy="488315"/>
+                    </a:xfrm>
+                    <a:prstGeom prst="rect">
+                      <a:avLst/>
+                    </a:prstGeom>
+                    <a:noFill/>
+                  </pic:spPr>
+                </pic:pic>
+              </a:graphicData>
+            </a:graphic>
+          </wp:anchor>
+        </w:drawing>
+      </w:r>
+    </w:p>
+    <w:p>
+      <w:pPr>
+        <w:pStyle w:val="P1"/>
+        <w:rPr>
+          <w:lang w:val="uk-UA"/>
+        </w:rPr>
+      </w:pPr>
+      <w:r>
+        <w:rPr>
+          <w:lang w:val="uk-UA"/>
+        </w:rPr>
+        <w:t xml:space="preserve">Програма виконує паралельне обчислення суми рядку . Для цього до кожного з </w:t>
+      </w:r>
+      <w:r>
+        <w:rPr>
+          <w:i/>
+          <w:iCs/>
+          <w:lang w:val="uk-UA"/>
+        </w:rPr>
+        <w:t>Р</w:t>
+      </w:r>
+      <w:r>
+        <w:rPr>
+          <w:i w:val="false"/>
+          <w:iCs w:val="false"/>
+          <w:lang w:val="uk-UA"/>
+        </w:rPr>
+        <w:t xml:space="preserve"> процесів за допомогою функції </w:t>
+      </w:r>
+      <w:r>
+        <w:rPr>
+          <w:i/>
+          <w:iCs/>
           <w:lang w:val="en-US"/>
         </w:rPr>
-        <w:t>:</w:t>
+        <w:t xml:space="preserve">MPI_Scatter() </w:t>
+      </w:r>
+      <w:r>
+        <w:rPr>
+          <w:i w:val="false"/>
+          <w:iCs w:val="false"/>
+          <w:lang w:val="uk-UA"/>
+        </w:rPr>
+        <w:t xml:space="preserve">передається відповідна частина масива чисел </w:t>
+      </w:r>
+      <w:r>
+        <w:rPr>
+          <w:i w:val="false"/>
+          <w:iCs w:val="false"/>
+          <w:lang w:val="en-US"/>
+        </w:rPr>
+        <w:t>a</w:t>
+      </w:r>
+      <w:r>
+        <w:rPr>
+          <w:i w:val="false"/>
+          <w:iCs w:val="false"/>
+          <w:vertAlign w:val="subscript"/>
+          <w:lang w:val="en-US"/>
+        </w:rPr>
+        <w:t>i</w:t>
+      </w:r>
+      <w:r>
+        <w:rPr>
+          <w:i w:val="false"/>
+          <w:iCs w:val="false"/>
+          <w:position w:val="0"/>
+          <w:sz w:val="28"/>
+          <w:vertAlign w:val="baseline"/>
+          <w:lang w:val="en-US"/>
+        </w:rPr>
+        <w:t xml:space="preserve"> </w:t>
+      </w:r>
+      <w:r>
+        <w:rPr>
+          <w:i w:val="false"/>
+          <w:iCs w:val="false"/>
+          <w:position w:val="0"/>
+          <w:sz w:val="28"/>
+          <w:vertAlign w:val="baseline"/>
+          <w:lang w:val="uk-UA"/>
+        </w:rPr>
+        <w:t xml:space="preserve">та </w:t>
+      </w:r>
+      <w:r>
+        <w:rPr>
+          <w:i w:val="false"/>
+          <w:iCs w:val="false"/>
+          <w:position w:val="0"/>
+          <w:sz w:val="28"/>
+          <w:vertAlign w:val="baseline"/>
+          <w:lang w:val="en-US"/>
+        </w:rPr>
+        <w:t>x</w:t>
+      </w:r>
+      <w:r>
+        <w:rPr>
+          <w:i w:val="false"/>
+          <w:iCs w:val="false"/>
+          <w:vertAlign w:val="subscript"/>
+          <w:lang w:val="en-US"/>
+        </w:rPr>
+        <w:t>i</w:t>
+      </w:r>
+      <w:r>
+        <w:rPr>
+          <w:i w:val="false"/>
+          <w:iCs w:val="false"/>
+          <w:position w:val="0"/>
+          <w:sz w:val="28"/>
+          <w:vertAlign w:val="baseline"/>
+          <w:lang w:val="en-US"/>
+        </w:rPr>
+        <w:t xml:space="preserve">, </w:t>
+      </w:r>
+      <w:r>
+        <w:rPr>
+          <w:i w:val="false"/>
+          <w:iCs w:val="false"/>
+          <w:position w:val="0"/>
+          <w:sz w:val="28"/>
+          <w:vertAlign w:val="baseline"/>
+          <w:lang w:val="uk-UA"/>
+        </w:rPr>
+        <w:t xml:space="preserve">кожна з яких складається з </w:t>
+      </w:r>
+      <w:r>
+        <w:rPr>
+          <w:i/>
+          <w:iCs/>
+          <w:position w:val="0"/>
+          <w:sz w:val="28"/>
+          <w:vertAlign w:val="baseline"/>
+          <w:lang w:val="en-US"/>
+        </w:rPr>
+        <w:t>M=N/P</w:t>
+      </w:r>
+      <w:r>
+        <w:rPr>
+          <w:i w:val="false"/>
+          <w:iCs w:val="false"/>
+          <w:position w:val="0"/>
+          <w:sz w:val="28"/>
+          <w:vertAlign w:val="baseline"/>
+          <w:lang w:val="en-US"/>
+        </w:rPr>
+        <w:t xml:space="preserve"> </w:t>
+      </w:r>
+      <w:r>
+        <w:rPr>
+          <w:i w:val="false"/>
+          <w:iCs w:val="false"/>
+          <w:position w:val="0"/>
+          <w:sz w:val="28"/>
+          <w:vertAlign w:val="baseline"/>
+          <w:lang w:val="uk-UA"/>
+        </w:rPr>
+        <w:t xml:space="preserve">елементів. Процеси обчислюють часткові суми ряду (змінна </w:t>
+      </w:r>
+      <w:r>
+        <w:rPr>
+          <w:i/>
+          <w:iCs/>
+          <w:position w:val="0"/>
+          <w:sz w:val="28"/>
+          <w:vertAlign w:val="baseline"/>
+          <w:lang w:val="en-US"/>
+        </w:rPr>
+        <w:t>sum</w:t>
+      </w:r>
+      <w:r>
+        <w:rPr>
+          <w:i w:val="false"/>
+          <w:iCs w:val="false"/>
+          <w:position w:val="0"/>
+          <w:sz w:val="28"/>
+          <w:vertAlign w:val="baseline"/>
+          <w:lang w:val="en-US"/>
+        </w:rPr>
+        <w:t xml:space="preserve">), </w:t>
+      </w:r>
+      <w:r>
+        <w:rPr>
+          <w:i w:val="false"/>
+          <w:iCs w:val="false"/>
+          <w:position w:val="0"/>
+          <w:sz w:val="28"/>
+          <w:vertAlign w:val="baseline"/>
+          <w:lang w:val="uk-UA"/>
+        </w:rPr>
+        <w:t xml:space="preserve">які далі за допомогою функції </w:t>
+      </w:r>
+      <w:r>
+        <w:rPr>
+          <w:i/>
+          <w:iCs/>
+          <w:position w:val="0"/>
+          <w:sz w:val="28"/>
+          <w:vertAlign w:val="baseline"/>
+          <w:lang w:val="en-US"/>
+        </w:rPr>
+        <w:t>MPI_Reduce()</w:t>
+      </w:r>
+      <w:r>
+        <w:rPr>
+          <w:i w:val="false"/>
+          <w:iCs w:val="false"/>
+          <w:position w:val="0"/>
+          <w:sz w:val="28"/>
+          <w:vertAlign w:val="baseline"/>
+          <w:lang w:val="en-US"/>
+        </w:rPr>
+        <w:t xml:space="preserve"> </w:t>
+      </w:r>
+      <w:r>
+        <w:rPr>
+          <w:i w:val="false"/>
+          <w:iCs w:val="false"/>
+          <w:position w:val="0"/>
+          <w:sz w:val="28"/>
+          <w:vertAlign w:val="baseline"/>
+          <w:lang w:val="uk-UA"/>
+        </w:rPr>
+        <w:t xml:space="preserve">приводяться до загальної суми (змінна </w:t>
+      </w:r>
+      <w:r>
+        <w:rPr>
+          <w:i/>
+          <w:iCs/>
+          <w:position w:val="0"/>
+          <w:sz w:val="28"/>
+          <w:vertAlign w:val="baseline"/>
+          <w:lang w:val="en-US"/>
+        </w:rPr>
+        <w:t>total</w:t>
+      </w:r>
+      <w:r>
+        <w:rPr>
+          <w:i w:val="false"/>
+          <w:iCs w:val="false"/>
+          <w:position w:val="0"/>
+          <w:sz w:val="28"/>
+          <w:vertAlign w:val="baseline"/>
+          <w:lang w:val="en-US"/>
+        </w:rPr>
+        <w:t>).</w:t>
       </w:r>
     </w:p>
     <w:p>
@@ -493,15 +798,6 @@
     </w:p>
     <w:p>
       <w:pPr>
-        <w:pStyle w:val="p11"/>
-        <w:rPr/>
-      </w:pPr>
-      <w:r>
-        <w:rPr/>
-      </w:r>
-    </w:p>
-    <w:p>
-      <w:pPr>
         <w:pStyle w:val="h11"/>
         <w:rPr/>
       </w:pPr>
@@ -512,15 +808,82 @@
     </w:p>
     <w:p>
       <w:pPr>
-        <w:pStyle w:val="p11"/>
-        <w:rPr>
-          <w:lang w:val="en-US"/>
-        </w:rPr>
-      </w:pPr>
-      <w:r>
-        <w:rPr>
-          <w:lang w:val="en-US"/>
-        </w:rPr>
+        <w:pStyle w:val="H2"/>
+        <w:rPr/>
+      </w:pPr>
+      <w:r>
+        <w:rPr/>
+        <w:t>Чи можна оператор M=N/P в програмі першого завдання виконати у всіх процесах? Якщо так, покажіть, що треба змінити в програмі.</w:t>
+      </w:r>
+    </w:p>
+    <w:p>
+      <w:pPr>
+        <w:pStyle w:val="H2"/>
+        <w:rPr/>
+      </w:pPr>
+      <w:r>
+        <w:rPr/>
+        <w:t>Використовуючи довідкові матеріали на комп’ютері, самостійно вивчіть функцію MPI_Gatherv().</w:t>
+      </w:r>
+    </w:p>
+    <w:p>
+      <w:pPr>
+        <w:pStyle w:val="H2"/>
+        <w:rPr/>
+      </w:pPr>
+      <w:r>
+        <w:rPr/>
+        <w:t>Що таке функція обміну з блокуванням, які функції її виконують в MPI?</w:t>
+      </w:r>
+    </w:p>
+    <w:p>
+      <w:pPr>
+        <w:pStyle w:val="H2"/>
+        <w:rPr/>
+      </w:pPr>
+      <w:r>
+        <w:rPr/>
+        <w:t>Для чого використовується функція MPI_Barrier()?</w:t>
+      </w:r>
+    </w:p>
+    <w:p>
+      <w:pPr>
+        <w:pStyle w:val="H2"/>
+        <w:rPr/>
+      </w:pPr>
+      <w:r>
+        <w:rPr/>
+        <w:t>Як в програмі, що використовує функції MPI, створити приймальний буфер, який у точності відповідає повідомленню, що передається?</w:t>
+      </w:r>
+    </w:p>
+    <w:p>
+      <w:pPr>
+        <w:pStyle w:val="H2"/>
+        <w:rPr/>
+      </w:pPr>
+      <w:r>
+        <w:rPr/>
+        <w:t>Чим відрізняються алгоритми логарифмічного здвоєння та рекурсивного подвоєння?</w:t>
+      </w:r>
+    </w:p>
+    <w:p>
+      <w:pPr>
+        <w:pStyle w:val="H2"/>
+        <w:rPr/>
+      </w:pPr>
+      <w:r>
+        <w:rPr/>
+        <w:t>Опишіть роботу функції MPI_Scan().</w:t>
+      </w:r>
+    </w:p>
+    <w:p>
+      <w:pPr>
+        <w:pStyle w:val="H2"/>
+        <w:rPr/>
+      </w:pPr>
+      <w:r>
+        <w:rPr/>
+        <w:t>Як можна розподілити між процесорами обчислення множення матриць?</w:t>
       </w:r>
     </w:p>
     <w:sectPr>

</xml_diff>

<commit_message>
feat (TR4): copying the code, filling in the task in the report
</commit_message>
<xml_diff>
--- a/42TR Tehnologiji Rozpodilenyh System/4/TR_KNT-122_Onyshchenko_19_PR4.docx
+++ b/42TR Tehnologiji Rozpodilenyh System/4/TR_KNT-122_Onyshchenko_19_PR4.docx
@@ -458,20 +458,15 @@
     </w:p>
     <w:p>
       <w:pPr>
-        <w:pStyle w:val="P1"/>
-        <w:rPr/>
-      </w:pPr>
-      <w:r>
-        <w:rPr/>
-      </w:r>
-    </w:p>
-    <w:p>
-      <w:pPr>
-        <w:pStyle w:val="P1"/>
-        <w:rPr>
-          <w:lang w:val="uk-UA"/>
-        </w:rPr>
-      </w:pPr>
+        <w:pStyle w:val="H2"/>
+        <w:rPr/>
+      </w:pPr>
+      <w:r>
+        <w:rPr>
+          <w:lang w:val="en-US"/>
+        </w:rPr>
+        <w:t xml:space="preserve">4.2.1 </w:t>
+      </w:r>
       <w:r>
         <w:rPr>
           <w:lang w:val="uk-UA"/>
@@ -606,6 +601,7 @@
           <w:iCs w:val="false"/>
           <w:position w:val="0"/>
           <w:sz w:val="28"/>
+          <w:sz w:val="28"/>
           <w:vertAlign w:val="baseline"/>
           <w:lang w:val="en-US"/>
         </w:rPr>
@@ -616,6 +612,7 @@
           <w:i w:val="false"/>
           <w:iCs w:val="false"/>
           <w:position w:val="0"/>
+          <w:sz w:val="28"/>
           <w:sz w:val="28"/>
           <w:vertAlign w:val="baseline"/>
           <w:lang w:val="uk-UA"/>
@@ -628,6 +625,7 @@
           <w:iCs w:val="false"/>
           <w:position w:val="0"/>
           <w:sz w:val="28"/>
+          <w:sz w:val="28"/>
           <w:vertAlign w:val="baseline"/>
           <w:lang w:val="en-US"/>
         </w:rPr>
@@ -648,6 +646,7 @@
           <w:iCs w:val="false"/>
           <w:position w:val="0"/>
           <w:sz w:val="28"/>
+          <w:sz w:val="28"/>
           <w:vertAlign w:val="baseline"/>
           <w:lang w:val="en-US"/>
         </w:rPr>
@@ -658,6 +657,7 @@
           <w:i w:val="false"/>
           <w:iCs w:val="false"/>
           <w:position w:val="0"/>
+          <w:sz w:val="28"/>
           <w:sz w:val="28"/>
           <w:vertAlign w:val="baseline"/>
           <w:lang w:val="uk-UA"/>
@@ -670,6 +670,7 @@
           <w:iCs/>
           <w:position w:val="0"/>
           <w:sz w:val="28"/>
+          <w:sz w:val="28"/>
           <w:vertAlign w:val="baseline"/>
           <w:lang w:val="en-US"/>
         </w:rPr>
@@ -681,6 +682,7 @@
           <w:iCs w:val="false"/>
           <w:position w:val="0"/>
           <w:sz w:val="28"/>
+          <w:sz w:val="28"/>
           <w:vertAlign w:val="baseline"/>
           <w:lang w:val="en-US"/>
         </w:rPr>
@@ -691,6 +693,7 @@
           <w:i w:val="false"/>
           <w:iCs w:val="false"/>
           <w:position w:val="0"/>
+          <w:sz w:val="28"/>
           <w:sz w:val="28"/>
           <w:vertAlign w:val="baseline"/>
           <w:lang w:val="uk-UA"/>
@@ -703,6 +706,7 @@
           <w:iCs/>
           <w:position w:val="0"/>
           <w:sz w:val="28"/>
+          <w:sz w:val="28"/>
           <w:vertAlign w:val="baseline"/>
           <w:lang w:val="en-US"/>
         </w:rPr>
@@ -714,6 +718,7 @@
           <w:iCs w:val="false"/>
           <w:position w:val="0"/>
           <w:sz w:val="28"/>
+          <w:sz w:val="28"/>
           <w:vertAlign w:val="baseline"/>
           <w:lang w:val="en-US"/>
         </w:rPr>
@@ -724,6 +729,7 @@
           <w:i w:val="false"/>
           <w:iCs w:val="false"/>
           <w:position w:val="0"/>
+          <w:sz w:val="28"/>
           <w:sz w:val="28"/>
           <w:vertAlign w:val="baseline"/>
           <w:lang w:val="uk-UA"/>
@@ -736,6 +742,7 @@
           <w:iCs/>
           <w:position w:val="0"/>
           <w:sz w:val="28"/>
+          <w:sz w:val="28"/>
           <w:vertAlign w:val="baseline"/>
           <w:lang w:val="en-US"/>
         </w:rPr>
@@ -747,6 +754,7 @@
           <w:iCs w:val="false"/>
           <w:position w:val="0"/>
           <w:sz w:val="28"/>
+          <w:sz w:val="28"/>
           <w:vertAlign w:val="baseline"/>
           <w:lang w:val="en-US"/>
         </w:rPr>
@@ -757,6 +765,7 @@
           <w:i w:val="false"/>
           <w:iCs w:val="false"/>
           <w:position w:val="0"/>
+          <w:sz w:val="28"/>
           <w:sz w:val="28"/>
           <w:vertAlign w:val="baseline"/>
           <w:lang w:val="uk-UA"/>
@@ -769,6 +778,7 @@
           <w:iCs/>
           <w:position w:val="0"/>
           <w:sz w:val="28"/>
+          <w:sz w:val="28"/>
           <w:vertAlign w:val="baseline"/>
           <w:lang w:val="en-US"/>
         </w:rPr>
@@ -780,10 +790,1668 @@
           <w:iCs w:val="false"/>
           <w:position w:val="0"/>
           <w:sz w:val="28"/>
+          <w:sz w:val="28"/>
           <w:vertAlign w:val="baseline"/>
           <w:lang w:val="en-US"/>
         </w:rPr>
         <w:t>).</w:t>
+      </w:r>
+    </w:p>
+    <w:p>
+      <w:pPr>
+        <w:pStyle w:val="P1"/>
+        <w:rPr>
+          <w:lang w:val="uk-UA"/>
+        </w:rPr>
+      </w:pPr>
+      <w:r>
+        <w:rPr>
+          <w:i w:val="false"/>
+          <w:iCs w:val="false"/>
+          <w:sz w:val="28"/>
+          <w:lang w:val="en-US"/>
+        </w:rPr>
+      </w:r>
+    </w:p>
+    <w:p>
+      <w:pPr>
+        <w:pStyle w:val="P1"/>
+        <w:rPr/>
+      </w:pPr>
+      <w:r>
+        <w:rPr>
+          <w:lang w:val="en-US"/>
+        </w:rPr>
+        <w:t xml:space="preserve">4.2.1.1 </w:t>
+      </w:r>
+      <w:r>
+        <w:rPr/>
+        <w:t>Створити програму обчислення суми ряду.</w:t>
+      </w:r>
+    </w:p>
+    <w:p>
+      <w:pPr>
+        <w:pStyle w:val="P1"/>
+        <w:ind w:hanging="0" w:left="0"/>
+        <w:rPr>
+          <w:i w:val="false"/>
+          <w:i w:val="false"/>
+          <w:iCs w:val="false"/>
+          <w:sz w:val="28"/>
+          <w:lang w:val="uk-UA"/>
+        </w:rPr>
+      </w:pPr>
+      <w:r>
+        <w:drawing>
+          <wp:anchor behindDoc="0" distT="0" distB="0" distL="0" distR="0" simplePos="0" locked="0" layoutInCell="0" allowOverlap="1" relativeHeight="3">
+            <wp:simplePos x="0" y="0"/>
+            <wp:positionH relativeFrom="column">
+              <wp:posOffset>-376555</wp:posOffset>
+            </wp:positionH>
+            <wp:positionV relativeFrom="paragraph">
+              <wp:posOffset>-57150</wp:posOffset>
+            </wp:positionV>
+            <wp:extent cx="871220" cy="391160"/>
+            <wp:effectExtent l="0" t="0" r="0" b="0"/>
+            <wp:wrapSquare wrapText="largest"/>
+            <wp:docPr id="2" name="Зображення2"/>
+            <wp:cNvGraphicFramePr>
+              <a:graphicFrameLocks xmlns:a="http://schemas.openxmlformats.org/drawingml/2006/main" noChangeAspect="1"/>
+            </wp:cNvGraphicFramePr>
+            <a:graphic xmlns:a="http://schemas.openxmlformats.org/drawingml/2006/main">
+              <a:graphicData uri="http://schemas.openxmlformats.org/drawingml/2006/picture">
+                <pic:pic xmlns:pic="http://schemas.openxmlformats.org/drawingml/2006/picture">
+                  <pic:nvPicPr>
+                    <pic:cNvPr id="2" name="Зображення2"/>
+                    <pic:cNvPicPr>
+                      <a:picLocks noChangeAspect="1" noChangeArrowheads="1"/>
+                    </pic:cNvPicPr>
+                  </pic:nvPicPr>
+                  <pic:blipFill>
+                    <a:blip r:embed="rId3"/>
+                    <a:stretch>
+                      <a:fillRect/>
+                    </a:stretch>
+                  </pic:blipFill>
+                  <pic:spPr bwMode="auto">
+                    <a:xfrm>
+                      <a:off x="0" y="0"/>
+                      <a:ext cx="871220" cy="391160"/>
+                    </a:xfrm>
+                    <a:prstGeom prst="rect">
+                      <a:avLst/>
+                    </a:prstGeom>
+                    <a:noFill/>
+                  </pic:spPr>
+                </pic:pic>
+              </a:graphicData>
+            </a:graphic>
+          </wp:anchor>
+        </w:drawing>
+        <w:drawing>
+          <wp:anchor behindDoc="0" distT="0" distB="0" distL="0" distR="0" simplePos="0" locked="0" layoutInCell="0" allowOverlap="1" relativeHeight="4">
+            <wp:simplePos x="0" y="0"/>
+            <wp:positionH relativeFrom="column">
+              <wp:posOffset>2297430</wp:posOffset>
+            </wp:positionH>
+            <wp:positionV relativeFrom="paragraph">
+              <wp:posOffset>514350</wp:posOffset>
+            </wp:positionV>
+            <wp:extent cx="4025265" cy="668020"/>
+            <wp:effectExtent l="0" t="0" r="0" b="0"/>
+            <wp:wrapSquare wrapText="largest"/>
+            <wp:docPr id="3" name="Зображення3"/>
+            <wp:cNvGraphicFramePr>
+              <a:graphicFrameLocks xmlns:a="http://schemas.openxmlformats.org/drawingml/2006/main" noChangeAspect="1"/>
+            </wp:cNvGraphicFramePr>
+            <a:graphic xmlns:a="http://schemas.openxmlformats.org/drawingml/2006/main">
+              <a:graphicData uri="http://schemas.openxmlformats.org/drawingml/2006/picture">
+                <pic:pic xmlns:pic="http://schemas.openxmlformats.org/drawingml/2006/picture">
+                  <pic:nvPicPr>
+                    <pic:cNvPr id="3" name="Зображення3"/>
+                    <pic:cNvPicPr>
+                      <a:picLocks noChangeAspect="1" noChangeArrowheads="1"/>
+                    </pic:cNvPicPr>
+                  </pic:nvPicPr>
+                  <pic:blipFill>
+                    <a:blip r:embed="rId4"/>
+                    <a:stretch>
+                      <a:fillRect/>
+                    </a:stretch>
+                  </pic:blipFill>
+                  <pic:spPr bwMode="auto">
+                    <a:xfrm>
+                      <a:off x="0" y="0"/>
+                      <a:ext cx="4025265" cy="668020"/>
+                    </a:xfrm>
+                    <a:prstGeom prst="rect">
+                      <a:avLst/>
+                    </a:prstGeom>
+                    <a:noFill/>
+                  </pic:spPr>
+                </pic:pic>
+              </a:graphicData>
+            </a:graphic>
+          </wp:anchor>
+        </w:drawing>
+      </w:r>
+      <w:r>
+        <w:rPr>
+          <w:i w:val="false"/>
+          <w:iCs w:val="false"/>
+          <w:sz w:val="28"/>
+          <w:lang w:val="uk-UA"/>
+        </w:rPr>
+        <w:t xml:space="preserve">, де </w:t>
+      </w:r>
+      <w:r>
+        <w:rPr>
+          <w:i w:val="false"/>
+          <w:iCs w:val="false"/>
+          <w:sz w:val="28"/>
+          <w:lang w:val="en-US"/>
+        </w:rPr>
+        <w:t>i=0,1,…,N; N=240 000, x</w:t>
+      </w:r>
+      <w:r>
+        <w:rPr>
+          <w:i w:val="false"/>
+          <w:iCs w:val="false"/>
+          <w:sz w:val="28"/>
+          <w:vertAlign w:val="subscript"/>
+          <w:lang w:val="en-US"/>
+        </w:rPr>
+        <w:t>i</w:t>
+      </w:r>
+      <w:r>
+        <w:rPr>
+          <w:i w:val="false"/>
+          <w:iCs w:val="false"/>
+          <w:position w:val="0"/>
+          <w:sz w:val="28"/>
+          <w:sz w:val="28"/>
+          <w:vertAlign w:val="baseline"/>
+          <w:lang w:val="en-US"/>
+        </w:rPr>
+        <w:t xml:space="preserve"> = 0.0001 * I, a</w:t>
+      </w:r>
+      <w:r>
+        <w:rPr>
+          <w:i w:val="false"/>
+          <w:iCs w:val="false"/>
+          <w:sz w:val="28"/>
+          <w:vertAlign w:val="subscript"/>
+          <w:lang w:val="en-US"/>
+        </w:rPr>
+        <w:t>i</w:t>
+      </w:r>
+      <w:r>
+        <w:rPr>
+          <w:i w:val="false"/>
+          <w:iCs w:val="false"/>
+          <w:position w:val="0"/>
+          <w:sz w:val="28"/>
+          <w:sz w:val="28"/>
+          <w:vertAlign w:val="baseline"/>
+          <w:lang w:val="en-US"/>
+        </w:rPr>
+        <w:t xml:space="preserve"> – </w:t>
+      </w:r>
+      <w:r>
+        <w:rPr>
+          <w:i w:val="false"/>
+          <w:iCs w:val="false"/>
+          <w:position w:val="0"/>
+          <w:sz w:val="28"/>
+          <w:sz w:val="28"/>
+          <w:vertAlign w:val="baseline"/>
+          <w:lang w:val="uk-UA"/>
+        </w:rPr>
+        <w:t xml:space="preserve">випадкові дійсні числа в діапазоні (-1, 1). Функцію </w:t>
+      </w:r>
+      <w:r>
+        <w:rPr>
+          <w:i w:val="false"/>
+          <w:iCs w:val="false"/>
+          <w:position w:val="0"/>
+          <w:sz w:val="28"/>
+          <w:sz w:val="28"/>
+          <w:vertAlign w:val="baseline"/>
+          <w:lang w:val="en-US"/>
+        </w:rPr>
+        <w:t>sin(x</w:t>
+      </w:r>
+      <w:r>
+        <w:rPr>
+          <w:i w:val="false"/>
+          <w:iCs w:val="false"/>
+          <w:sz w:val="28"/>
+          <w:vertAlign w:val="subscript"/>
+          <w:lang w:val="en-US"/>
+        </w:rPr>
+        <w:t>i</w:t>
+      </w:r>
+      <w:r>
+        <w:rPr>
+          <w:i w:val="false"/>
+          <w:iCs w:val="false"/>
+          <w:position w:val="0"/>
+          <w:sz w:val="28"/>
+          <w:sz w:val="28"/>
+          <w:vertAlign w:val="baseline"/>
+          <w:lang w:val="en-US"/>
+        </w:rPr>
+        <w:t xml:space="preserve">) </w:t>
+      </w:r>
+      <w:r>
+        <w:rPr>
+          <w:i w:val="false"/>
+          <w:iCs w:val="false"/>
+          <w:position w:val="0"/>
+          <w:sz w:val="28"/>
+          <w:sz w:val="28"/>
+          <w:vertAlign w:val="baseline"/>
+          <w:lang w:val="uk-UA"/>
+        </w:rPr>
+        <w:t xml:space="preserve">обчислювати за допомогою розкладання її в ряд Тейлора: </w:t>
+      </w:r>
+    </w:p>
+    <w:p>
+      <w:pPr>
+        <w:pStyle w:val="P1"/>
+        <w:ind w:hanging="0" w:left="0"/>
+        <w:rPr>
+          <w:i w:val="false"/>
+          <w:i w:val="false"/>
+          <w:iCs w:val="false"/>
+          <w:sz w:val="28"/>
+          <w:lang w:val="uk-UA"/>
+        </w:rPr>
+      </w:pPr>
+      <w:r>
+        <w:rPr>
+          <w:i w:val="false"/>
+          <w:iCs w:val="false"/>
+          <w:sz w:val="28"/>
+          <w:lang w:val="uk-UA"/>
+        </w:rPr>
+        <w:t xml:space="preserve">Обчислення кожного значення функції </w:t>
+      </w:r>
+      <w:r>
+        <w:rPr>
+          <w:i w:val="false"/>
+          <w:iCs w:val="false"/>
+          <w:sz w:val="28"/>
+          <w:lang w:val="en-US"/>
+        </w:rPr>
+        <w:t>sin(x</w:t>
+      </w:r>
+      <w:r>
+        <w:rPr>
+          <w:i w:val="false"/>
+          <w:iCs w:val="false"/>
+          <w:sz w:val="28"/>
+          <w:vertAlign w:val="subscript"/>
+          <w:lang w:val="en-US"/>
+        </w:rPr>
+        <w:t>i</w:t>
+      </w:r>
+      <w:r>
+        <w:rPr>
+          <w:i w:val="false"/>
+          <w:iCs w:val="false"/>
+          <w:position w:val="0"/>
+          <w:sz w:val="28"/>
+          <w:sz w:val="28"/>
+          <w:vertAlign w:val="baseline"/>
+          <w:lang w:val="en-US"/>
+        </w:rPr>
+        <w:t xml:space="preserve">) </w:t>
+      </w:r>
+      <w:r>
+        <w:rPr>
+          <w:i w:val="false"/>
+          <w:iCs w:val="false"/>
+          <w:position w:val="0"/>
+          <w:sz w:val="28"/>
+          <w:sz w:val="28"/>
+          <w:vertAlign w:val="baseline"/>
+          <w:lang w:val="uk-UA"/>
+        </w:rPr>
+        <w:t>можна організувати за наступним алгоритмом:</w:t>
+      </w:r>
+    </w:p>
+    <w:p>
+      <w:pPr>
+        <w:pStyle w:val="P1"/>
+        <w:ind w:hanging="0" w:left="0"/>
+        <w:rPr>
+          <w:i w:val="false"/>
+          <w:i w:val="false"/>
+          <w:iCs w:val="false"/>
+          <w:sz w:val="28"/>
+          <w:lang w:val="en-US"/>
+        </w:rPr>
+      </w:pPr>
+      <w:r>
+        <w:rPr>
+          <w:i w:val="false"/>
+          <w:iCs w:val="false"/>
+          <w:sz w:val="28"/>
+          <w:lang w:val="en-US"/>
+        </w:rPr>
+        <w:t>a) y = x; s = y; k = 1;</w:t>
+      </w:r>
+    </w:p>
+    <w:p>
+      <w:pPr>
+        <w:pStyle w:val="P1"/>
+        <w:ind w:hanging="0" w:left="0"/>
+        <w:rPr>
+          <w:i w:val="false"/>
+          <w:i w:val="false"/>
+          <w:iCs w:val="false"/>
+          <w:sz w:val="28"/>
+          <w:lang w:val="uk-UA"/>
+        </w:rPr>
+      </w:pPr>
+      <w:r>
+        <w:rPr>
+          <w:i w:val="false"/>
+          <w:iCs w:val="false"/>
+          <w:sz w:val="28"/>
+          <w:lang w:val="uk-UA"/>
+        </w:rPr>
+        <w:t xml:space="preserve">б) </w:t>
+      </w:r>
+      <w:r>
+        <w:rPr>
+          <w:i w:val="false"/>
+          <w:iCs w:val="false"/>
+          <w:sz w:val="28"/>
+          <w:lang w:val="en-US"/>
+        </w:rPr>
+        <w:t>y = - (x</w:t>
+      </w:r>
+      <w:r>
+        <w:rPr>
+          <w:i w:val="false"/>
+          <w:iCs w:val="false"/>
+          <w:sz w:val="28"/>
+          <w:vertAlign w:val="superscript"/>
+          <w:lang w:val="en-US"/>
+        </w:rPr>
+        <w:t>2</w:t>
+      </w:r>
+      <w:r>
+        <w:rPr>
+          <w:i w:val="false"/>
+          <w:iCs w:val="false"/>
+          <w:position w:val="0"/>
+          <w:sz w:val="28"/>
+          <w:sz w:val="28"/>
+          <w:vertAlign w:val="baseline"/>
+          <w:lang w:val="en-US"/>
+        </w:rPr>
+        <w:t xml:space="preserve"> / (k+1)*(k+2)) * y;</w:t>
+      </w:r>
+    </w:p>
+    <w:p>
+      <w:pPr>
+        <w:pStyle w:val="P1"/>
+        <w:ind w:hanging="0" w:left="0"/>
+        <w:rPr>
+          <w:i w:val="false"/>
+          <w:i w:val="false"/>
+          <w:iCs w:val="false"/>
+          <w:sz w:val="28"/>
+          <w:lang w:val="uk-UA"/>
+        </w:rPr>
+      </w:pPr>
+      <w:r>
+        <w:rPr>
+          <w:i w:val="false"/>
+          <w:iCs w:val="false"/>
+          <w:sz w:val="28"/>
+          <w:lang w:val="uk-UA"/>
+        </w:rPr>
+        <w:t xml:space="preserve">в) </w:t>
+      </w:r>
+      <w:r>
+        <w:rPr>
+          <w:i w:val="false"/>
+          <w:iCs w:val="false"/>
+          <w:sz w:val="28"/>
+          <w:lang w:val="en-US"/>
+        </w:rPr>
+        <w:t>s = s + y; k = k + 2;</w:t>
+      </w:r>
+    </w:p>
+    <w:p>
+      <w:pPr>
+        <w:pStyle w:val="P1"/>
+        <w:ind w:hanging="0" w:left="0"/>
+        <w:rPr>
+          <w:i w:val="false"/>
+          <w:i w:val="false"/>
+          <w:iCs w:val="false"/>
+          <w:sz w:val="28"/>
+          <w:lang w:val="uk-UA"/>
+        </w:rPr>
+      </w:pPr>
+      <w:r>
+        <w:rPr>
+          <w:i w:val="false"/>
+          <w:iCs w:val="false"/>
+          <w:sz w:val="28"/>
+          <w:lang w:val="uk-UA"/>
+        </w:rPr>
+        <w:t xml:space="preserve">г) якщо </w:t>
+      </w:r>
+      <w:r>
+        <w:rPr>
+          <w:i w:val="false"/>
+          <w:iCs w:val="false"/>
+          <w:sz w:val="28"/>
+          <w:lang w:val="en-US"/>
+        </w:rPr>
+        <w:t>k &lt;= K,</w:t>
+      </w:r>
+      <w:r>
+        <w:rPr>
+          <w:i w:val="false"/>
+          <w:iCs w:val="false"/>
+          <w:sz w:val="28"/>
+          <w:lang w:val="uk-UA"/>
+        </w:rPr>
+        <w:t xml:space="preserve"> то перехід на п. б), інакше — кінець.</w:t>
+      </w:r>
+    </w:p>
+    <w:p>
+      <w:pPr>
+        <w:pStyle w:val="P1"/>
+        <w:rPr/>
+      </w:pPr>
+      <w:r>
+        <w:rPr/>
+        <w:t>Для обчислення синуса в програмі створити окрему функцію,</w:t>
+      </w:r>
+      <w:r>
+        <w:rPr>
+          <w:lang w:val="en-US"/>
+        </w:rPr>
+        <w:t xml:space="preserve"> K </w:t>
+      </w:r>
+      <w:r>
+        <w:rPr/>
+        <w:t>нехай дорівнює 500.</w:t>
+      </w:r>
+    </w:p>
+    <w:p>
+      <w:pPr>
+        <w:pStyle w:val="P1"/>
+        <w:rPr>
+          <w:lang w:val="en-US"/>
+        </w:rPr>
+      </w:pPr>
+      <w:r>
+        <w:rPr>
+          <w:lang w:val="uk-UA"/>
+        </w:rPr>
+        <w:t xml:space="preserve">4.2.1.2 </w:t>
+      </w:r>
+      <w:r>
+        <w:rPr>
+          <w:lang w:val="en-US"/>
+        </w:rPr>
+        <w:t>Виміряйте час виконання розробленої програми на одному, двох, трьох та чотирьох процесорах для N=240000 та визначте прискорення обчислень для цих випадків. Дані занесіть до таблиці 4.1 (форми таблиць наведені нижче). Намалюйте графік залежності прискорення від кількості процесорів.</w:t>
+      </w:r>
+    </w:p>
+    <w:p>
+      <w:pPr>
+        <w:pStyle w:val="P1"/>
+        <w:rPr>
+          <w:lang w:val="en-US"/>
+        </w:rPr>
+      </w:pPr>
+      <w:r>
+        <w:rPr>
+          <w:lang w:val="en-US"/>
+        </w:rPr>
+        <w:t>4.2.1.3 Дослідити та намалювати графіки залежності прискорення від кількості членів ряду при обчисленнях на чотирьох процесорах, змінюючи кількість членів ряду від 20000 до 240000 з дискретністю 20000. Вимірювання виконуйте 3 рази з інтервалом між вимірюваннями 15 хвилин, результати вимірювань занесіть до таблиці4.2.</w:t>
+      </w:r>
+    </w:p>
+    <w:p>
+      <w:pPr>
+        <w:pStyle w:val="P1"/>
+        <w:rPr>
+          <w:lang w:val="en-US"/>
+        </w:rPr>
+      </w:pPr>
+      <w:r>
+        <w:rPr>
+          <w:lang w:val="en-US"/>
+        </w:rPr>
+        <w:t>4.2.1.4 Додайте до програми код для вимірювання часу, який витрачається на виконання двох функцій MPI_Scatter(), дослідіть та намалюйте графіки залежності цього часу від довжини масиву, що розсилається при виконанні задачі на чотирьох процесорах. Результати занесіть до таблиці 4.3.</w:t>
+      </w:r>
+    </w:p>
+    <w:p>
+      <w:pPr>
+        <w:pStyle w:val="P1"/>
+        <w:rPr>
+          <w:lang w:val="en-US"/>
+        </w:rPr>
+      </w:pPr>
+      <w:r>
+        <w:rPr>
+          <w:lang w:val="en-US"/>
+        </w:rPr>
+        <w:t>Таблиця 4.1 – Залежність прискорення від кількості процесорів (N=240000, номер робочого місця №)</w:t>
+      </w:r>
+    </w:p>
+    <w:tbl>
+      <w:tblPr>
+        <w:tblW w:w="5000" w:type="dxa"/>
+        <w:jc w:val="left"/>
+        <w:tblInd w:w="55" w:type="dxa"/>
+        <w:tblLayout w:type="fixed"/>
+        <w:tblCellMar>
+          <w:top w:w="55" w:type="dxa"/>
+          <w:left w:w="55" w:type="dxa"/>
+          <w:bottom w:w="55" w:type="dxa"/>
+          <w:right w:w="55" w:type="dxa"/>
+        </w:tblCellMar>
+      </w:tblPr>
+      <w:tblGrid>
+        <w:gridCol w:w="1468"/>
+        <w:gridCol w:w="2480"/>
+        <w:gridCol w:w="383"/>
+        <w:gridCol w:w="383"/>
+        <w:gridCol w:w="286"/>
+      </w:tblGrid>
+      <w:tr>
+        <w:trPr/>
+        <w:tc>
+          <w:tcPr>
+            <w:tcW w:w="1468" w:type="dxa"/>
+            <w:tcBorders>
+              <w:top w:val="single" w:sz="4" w:space="0" w:color="000000"/>
+              <w:left w:val="single" w:sz="4" w:space="0" w:color="000000"/>
+              <w:bottom w:val="single" w:sz="4" w:space="0" w:color="000000"/>
+            </w:tcBorders>
+          </w:tcPr>
+          <w:p>
+            <w:pPr>
+              <w:pStyle w:val="Style14"/>
+              <w:spacing w:lineRule="auto" w:line="240"/>
+              <w:ind w:hanging="0" w:left="0"/>
+              <w:rPr/>
+            </w:pPr>
+            <w:r>
+              <w:rPr/>
+              <w:t>Дата та час</w:t>
+            </w:r>
+          </w:p>
+        </w:tc>
+        <w:tc>
+          <w:tcPr>
+            <w:tcW w:w="2480" w:type="dxa"/>
+            <w:tcBorders>
+              <w:top w:val="single" w:sz="4" w:space="0" w:color="000000"/>
+              <w:left w:val="single" w:sz="4" w:space="0" w:color="000000"/>
+              <w:bottom w:val="single" w:sz="4" w:space="0" w:color="000000"/>
+            </w:tcBorders>
+          </w:tcPr>
+          <w:p>
+            <w:pPr>
+              <w:pStyle w:val="Style14"/>
+              <w:spacing w:lineRule="auto" w:line="240"/>
+              <w:ind w:hanging="0" w:left="0"/>
+              <w:rPr/>
+            </w:pPr>
+            <w:r>
+              <w:rPr/>
+              <w:t xml:space="preserve">Число процесорів </w:t>
+            </w:r>
+            <w:r>
+              <w:rPr>
+                <w:lang w:val="en-US"/>
+              </w:rPr>
+              <w:t>P</w:t>
+            </w:r>
+          </w:p>
+        </w:tc>
+        <w:tc>
+          <w:tcPr>
+            <w:tcW w:w="383" w:type="dxa"/>
+            <w:tcBorders>
+              <w:top w:val="single" w:sz="4" w:space="0" w:color="000000"/>
+              <w:left w:val="single" w:sz="4" w:space="0" w:color="000000"/>
+              <w:bottom w:val="single" w:sz="4" w:space="0" w:color="000000"/>
+            </w:tcBorders>
+          </w:tcPr>
+          <w:p>
+            <w:pPr>
+              <w:pStyle w:val="Style14"/>
+              <w:spacing w:lineRule="auto" w:line="240"/>
+              <w:ind w:hanging="0" w:left="0"/>
+              <w:rPr>
+                <w:lang w:val="en-US"/>
+              </w:rPr>
+            </w:pPr>
+            <w:r>
+              <w:rPr>
+                <w:lang w:val="en-US"/>
+              </w:rPr>
+              <w:t>T</w:t>
+            </w:r>
+            <w:r>
+              <w:rPr>
+                <w:vertAlign w:val="subscript"/>
+                <w:lang w:val="en-US"/>
+              </w:rPr>
+              <w:t>1</w:t>
+            </w:r>
+          </w:p>
+        </w:tc>
+        <w:tc>
+          <w:tcPr>
+            <w:tcW w:w="383" w:type="dxa"/>
+            <w:tcBorders>
+              <w:top w:val="single" w:sz="4" w:space="0" w:color="000000"/>
+              <w:left w:val="single" w:sz="4" w:space="0" w:color="000000"/>
+              <w:bottom w:val="single" w:sz="4" w:space="0" w:color="000000"/>
+            </w:tcBorders>
+          </w:tcPr>
+          <w:p>
+            <w:pPr>
+              <w:pStyle w:val="Style14"/>
+              <w:spacing w:lineRule="auto" w:line="240"/>
+              <w:ind w:hanging="0" w:left="0"/>
+              <w:rPr>
+                <w:lang w:val="en-US"/>
+              </w:rPr>
+            </w:pPr>
+            <w:r>
+              <w:rPr>
+                <w:lang w:val="en-US"/>
+              </w:rPr>
+              <w:t>T</w:t>
+            </w:r>
+            <w:r>
+              <w:rPr>
+                <w:vertAlign w:val="subscript"/>
+                <w:lang w:val="en-US"/>
+              </w:rPr>
+              <w:t>p</w:t>
+            </w:r>
+          </w:p>
+        </w:tc>
+        <w:tc>
+          <w:tcPr>
+            <w:tcW w:w="286" w:type="dxa"/>
+            <w:tcBorders>
+              <w:top w:val="single" w:sz="4" w:space="0" w:color="000000"/>
+              <w:left w:val="single" w:sz="4" w:space="0" w:color="000000"/>
+              <w:bottom w:val="single" w:sz="4" w:space="0" w:color="000000"/>
+              <w:right w:val="single" w:sz="4" w:space="0" w:color="000000"/>
+            </w:tcBorders>
+          </w:tcPr>
+          <w:p>
+            <w:pPr>
+              <w:pStyle w:val="Style14"/>
+              <w:spacing w:lineRule="auto" w:line="240"/>
+              <w:ind w:hanging="0" w:left="0"/>
+              <w:rPr>
+                <w:lang w:val="en-US"/>
+              </w:rPr>
+            </w:pPr>
+            <w:r>
+              <w:rPr>
+                <w:lang w:val="en-US"/>
+              </w:rPr>
+              <w:t>S</w:t>
+            </w:r>
+          </w:p>
+        </w:tc>
+      </w:tr>
+    </w:tbl>
+    <w:p>
+      <w:pPr>
+        <w:pStyle w:val="P1"/>
+        <w:rPr>
+          <w:lang w:val="en-US"/>
+        </w:rPr>
+      </w:pPr>
+      <w:r>
+        <w:rPr>
+          <w:lang w:val="en-US"/>
+        </w:rPr>
+      </w:r>
+    </w:p>
+    <w:p>
+      <w:pPr>
+        <w:pStyle w:val="P1"/>
+        <w:rPr>
+          <w:lang w:val="en-US"/>
+        </w:rPr>
+      </w:pPr>
+      <w:r>
+        <w:rPr>
+          <w:lang w:val="en-US"/>
+        </w:rPr>
+      </w:r>
+    </w:p>
+    <w:p>
+      <w:pPr>
+        <w:pStyle w:val="P1"/>
+        <w:rPr>
+          <w:lang w:val="en-US"/>
+        </w:rPr>
+      </w:pPr>
+      <w:r>
+        <w:rPr>
+          <w:lang w:val="en-US"/>
+        </w:rPr>
+        <w:t>Таблиця 4.2 – Залежність прискорення від кількості членів ряду при P=4</w:t>
+      </w:r>
+    </w:p>
+    <w:tbl>
+      <w:tblPr>
+        <w:tblW w:w="2853" w:type="dxa"/>
+        <w:jc w:val="left"/>
+        <w:tblInd w:w="55" w:type="dxa"/>
+        <w:tblLayout w:type="fixed"/>
+        <w:tblCellMar>
+          <w:top w:w="55" w:type="dxa"/>
+          <w:left w:w="55" w:type="dxa"/>
+          <w:bottom w:w="55" w:type="dxa"/>
+          <w:right w:w="55" w:type="dxa"/>
+        </w:tblCellMar>
+      </w:tblPr>
+      <w:tblGrid>
+        <w:gridCol w:w="1468"/>
+        <w:gridCol w:w="333"/>
+        <w:gridCol w:w="383"/>
+        <w:gridCol w:w="383"/>
+        <w:gridCol w:w="286"/>
+      </w:tblGrid>
+      <w:tr>
+        <w:trPr/>
+        <w:tc>
+          <w:tcPr>
+            <w:tcW w:w="1468" w:type="dxa"/>
+            <w:tcBorders>
+              <w:top w:val="single" w:sz="4" w:space="0" w:color="000000"/>
+              <w:left w:val="single" w:sz="4" w:space="0" w:color="000000"/>
+              <w:bottom w:val="single" w:sz="4" w:space="0" w:color="000000"/>
+            </w:tcBorders>
+          </w:tcPr>
+          <w:p>
+            <w:pPr>
+              <w:pStyle w:val="Style14"/>
+              <w:spacing w:lineRule="auto" w:line="240"/>
+              <w:ind w:hanging="0" w:left="0"/>
+              <w:rPr/>
+            </w:pPr>
+            <w:r>
+              <w:rPr/>
+              <w:t>Дата та час</w:t>
+            </w:r>
+          </w:p>
+        </w:tc>
+        <w:tc>
+          <w:tcPr>
+            <w:tcW w:w="333" w:type="dxa"/>
+            <w:tcBorders>
+              <w:top w:val="single" w:sz="4" w:space="0" w:color="000000"/>
+              <w:left w:val="single" w:sz="4" w:space="0" w:color="000000"/>
+              <w:bottom w:val="single" w:sz="4" w:space="0" w:color="000000"/>
+            </w:tcBorders>
+          </w:tcPr>
+          <w:p>
+            <w:pPr>
+              <w:pStyle w:val="Style14"/>
+              <w:spacing w:lineRule="auto" w:line="240"/>
+              <w:ind w:hanging="0" w:left="0"/>
+              <w:rPr>
+                <w:lang w:val="en-US"/>
+              </w:rPr>
+            </w:pPr>
+            <w:r>
+              <w:rPr>
+                <w:lang w:val="en-US"/>
+              </w:rPr>
+              <w:t>N</w:t>
+            </w:r>
+          </w:p>
+        </w:tc>
+        <w:tc>
+          <w:tcPr>
+            <w:tcW w:w="383" w:type="dxa"/>
+            <w:tcBorders>
+              <w:top w:val="single" w:sz="4" w:space="0" w:color="000000"/>
+              <w:left w:val="single" w:sz="4" w:space="0" w:color="000000"/>
+              <w:bottom w:val="single" w:sz="4" w:space="0" w:color="000000"/>
+            </w:tcBorders>
+          </w:tcPr>
+          <w:p>
+            <w:pPr>
+              <w:pStyle w:val="Style14"/>
+              <w:spacing w:lineRule="auto" w:line="240"/>
+              <w:ind w:hanging="0" w:left="0"/>
+              <w:rPr>
+                <w:lang w:val="en-US"/>
+              </w:rPr>
+            </w:pPr>
+            <w:r>
+              <w:rPr>
+                <w:lang w:val="en-US"/>
+              </w:rPr>
+              <w:t>T</w:t>
+            </w:r>
+            <w:r>
+              <w:rPr>
+                <w:vertAlign w:val="subscript"/>
+                <w:lang w:val="en-US"/>
+              </w:rPr>
+              <w:t>1</w:t>
+            </w:r>
+          </w:p>
+        </w:tc>
+        <w:tc>
+          <w:tcPr>
+            <w:tcW w:w="383" w:type="dxa"/>
+            <w:tcBorders>
+              <w:top w:val="single" w:sz="4" w:space="0" w:color="000000"/>
+              <w:left w:val="single" w:sz="4" w:space="0" w:color="000000"/>
+              <w:bottom w:val="single" w:sz="4" w:space="0" w:color="000000"/>
+            </w:tcBorders>
+          </w:tcPr>
+          <w:p>
+            <w:pPr>
+              <w:pStyle w:val="Style14"/>
+              <w:spacing w:lineRule="auto" w:line="240"/>
+              <w:ind w:hanging="0" w:left="0"/>
+              <w:rPr>
+                <w:lang w:val="en-US"/>
+              </w:rPr>
+            </w:pPr>
+            <w:r>
+              <w:rPr>
+                <w:lang w:val="en-US"/>
+              </w:rPr>
+              <w:t>T</w:t>
+            </w:r>
+            <w:r>
+              <w:rPr>
+                <w:vertAlign w:val="subscript"/>
+                <w:lang w:val="en-US"/>
+              </w:rPr>
+              <w:t>4</w:t>
+            </w:r>
+          </w:p>
+        </w:tc>
+        <w:tc>
+          <w:tcPr>
+            <w:tcW w:w="286" w:type="dxa"/>
+            <w:tcBorders>
+              <w:top w:val="single" w:sz="4" w:space="0" w:color="000000"/>
+              <w:left w:val="single" w:sz="4" w:space="0" w:color="000000"/>
+              <w:bottom w:val="single" w:sz="4" w:space="0" w:color="000000"/>
+              <w:right w:val="single" w:sz="4" w:space="0" w:color="000000"/>
+            </w:tcBorders>
+          </w:tcPr>
+          <w:p>
+            <w:pPr>
+              <w:pStyle w:val="Style14"/>
+              <w:spacing w:lineRule="auto" w:line="240"/>
+              <w:ind w:hanging="0" w:left="0"/>
+              <w:rPr>
+                <w:lang w:val="en-US"/>
+              </w:rPr>
+            </w:pPr>
+            <w:r>
+              <w:rPr>
+                <w:lang w:val="en-US"/>
+              </w:rPr>
+              <w:t>S</w:t>
+            </w:r>
+          </w:p>
+        </w:tc>
+      </w:tr>
+    </w:tbl>
+    <w:p>
+      <w:pPr>
+        <w:pStyle w:val="Normal"/>
+        <w:rPr>
+          <w:lang w:val="en-US"/>
+        </w:rPr>
+      </w:pPr>
+      <w:r>
+        <w:rPr>
+          <w:lang w:val="en-US"/>
+        </w:rPr>
+      </w:r>
+    </w:p>
+    <w:p>
+      <w:pPr>
+        <w:pStyle w:val="P1"/>
+        <w:rPr>
+          <w:lang w:val="en-US"/>
+        </w:rPr>
+      </w:pPr>
+      <w:r>
+        <w:rPr>
+          <w:lang w:val="en-US"/>
+        </w:rPr>
+        <w:t>Таблиця 4.3 – Залежність швидкості розсилання від довжини масиву при P=4</w:t>
+      </w:r>
+    </w:p>
+    <w:tbl>
+      <w:tblPr>
+        <w:tblW w:w="3975" w:type="dxa"/>
+        <w:jc w:val="left"/>
+        <w:tblInd w:w="55" w:type="dxa"/>
+        <w:tblLayout w:type="fixed"/>
+        <w:tblCellMar>
+          <w:top w:w="55" w:type="dxa"/>
+          <w:left w:w="55" w:type="dxa"/>
+          <w:bottom w:w="55" w:type="dxa"/>
+          <w:right w:w="55" w:type="dxa"/>
+        </w:tblCellMar>
+      </w:tblPr>
+      <w:tblGrid>
+        <w:gridCol w:w="1468"/>
+        <w:gridCol w:w="333"/>
+        <w:gridCol w:w="751"/>
+        <w:gridCol w:w="1423"/>
+      </w:tblGrid>
+      <w:tr>
+        <w:trPr/>
+        <w:tc>
+          <w:tcPr>
+            <w:tcW w:w="1468" w:type="dxa"/>
+            <w:tcBorders>
+              <w:top w:val="single" w:sz="4" w:space="0" w:color="000000"/>
+              <w:left w:val="single" w:sz="4" w:space="0" w:color="000000"/>
+              <w:bottom w:val="single" w:sz="4" w:space="0" w:color="000000"/>
+            </w:tcBorders>
+          </w:tcPr>
+          <w:p>
+            <w:pPr>
+              <w:pStyle w:val="Style14"/>
+              <w:spacing w:lineRule="auto" w:line="240"/>
+              <w:ind w:hanging="0" w:left="0"/>
+              <w:rPr/>
+            </w:pPr>
+            <w:r>
+              <w:rPr/>
+              <w:t>Дата та час</w:t>
+            </w:r>
+          </w:p>
+        </w:tc>
+        <w:tc>
+          <w:tcPr>
+            <w:tcW w:w="333" w:type="dxa"/>
+            <w:tcBorders>
+              <w:top w:val="single" w:sz="4" w:space="0" w:color="000000"/>
+              <w:left w:val="single" w:sz="4" w:space="0" w:color="000000"/>
+              <w:bottom w:val="single" w:sz="4" w:space="0" w:color="000000"/>
+            </w:tcBorders>
+          </w:tcPr>
+          <w:p>
+            <w:pPr>
+              <w:pStyle w:val="Style14"/>
+              <w:spacing w:lineRule="auto" w:line="240"/>
+              <w:ind w:hanging="0" w:left="0"/>
+              <w:rPr/>
+            </w:pPr>
+            <w:r>
+              <w:rPr>
+                <w:lang w:val="en-US"/>
+              </w:rPr>
+              <w:t>N</w:t>
+            </w:r>
+          </w:p>
+        </w:tc>
+        <w:tc>
+          <w:tcPr>
+            <w:tcW w:w="751" w:type="dxa"/>
+            <w:tcBorders>
+              <w:top w:val="single" w:sz="4" w:space="0" w:color="000000"/>
+              <w:left w:val="single" w:sz="4" w:space="0" w:color="000000"/>
+              <w:bottom w:val="single" w:sz="4" w:space="0" w:color="000000"/>
+            </w:tcBorders>
+          </w:tcPr>
+          <w:p>
+            <w:pPr>
+              <w:pStyle w:val="Style14"/>
+              <w:spacing w:lineRule="auto" w:line="240"/>
+              <w:ind w:hanging="0" w:left="0"/>
+              <w:rPr>
+                <w:lang w:val="en-US"/>
+              </w:rPr>
+            </w:pPr>
+            <w:r>
+              <w:rPr>
+                <w:lang w:val="en-US"/>
+              </w:rPr>
+              <w:t>T</w:t>
+            </w:r>
+            <w:r>
+              <w:rPr>
+                <w:vertAlign w:val="subscript"/>
+                <w:lang w:val="en-US"/>
+              </w:rPr>
+              <w:t>Scatter</w:t>
+            </w:r>
+          </w:p>
+        </w:tc>
+        <w:tc>
+          <w:tcPr>
+            <w:tcW w:w="1423" w:type="dxa"/>
+            <w:tcBorders>
+              <w:top w:val="single" w:sz="4" w:space="0" w:color="000000"/>
+              <w:left w:val="single" w:sz="4" w:space="0" w:color="000000"/>
+              <w:bottom w:val="single" w:sz="4" w:space="0" w:color="000000"/>
+              <w:right w:val="single" w:sz="4" w:space="0" w:color="000000"/>
+            </w:tcBorders>
+          </w:tcPr>
+          <w:p>
+            <w:pPr>
+              <w:pStyle w:val="Style14"/>
+              <w:spacing w:lineRule="auto" w:line="240"/>
+              <w:ind w:hanging="0" w:left="0"/>
+              <w:rPr>
+                <w:lang w:val="en-US"/>
+              </w:rPr>
+            </w:pPr>
+            <w:r>
+              <w:rPr>
+                <w:lang w:val="en-US"/>
+              </w:rPr>
+              <w:t xml:space="preserve">S </w:t>
+            </w:r>
+            <w:r>
+              <w:rPr>
+                <w:lang w:val="uk-UA"/>
+              </w:rPr>
+              <w:t>(байт / с)</w:t>
+            </w:r>
+          </w:p>
+        </w:tc>
+      </w:tr>
+    </w:tbl>
+    <w:p>
+      <w:pPr>
+        <w:pStyle w:val="P1"/>
+        <w:rPr/>
+      </w:pPr>
+      <w:r>
+        <w:rPr/>
+      </w:r>
+    </w:p>
+    <w:p>
+      <w:pPr>
+        <w:pStyle w:val="H2"/>
+        <w:rPr/>
+      </w:pPr>
+      <w:r>
+        <w:rPr/>
+        <w:t>4.2.2 Завдання 2</w:t>
+      </w:r>
+    </w:p>
+    <w:p>
+      <w:pPr>
+        <w:pStyle w:val="P1"/>
+        <w:rPr/>
+      </w:pPr>
+      <w:r>
+        <w:rPr/>
+        <w:drawing>
+          <wp:anchor behindDoc="0" distT="0" distB="0" distL="0" distR="0" simplePos="0" locked="0" layoutInCell="0" allowOverlap="1" relativeHeight="5">
+            <wp:simplePos x="0" y="0"/>
+            <wp:positionH relativeFrom="column">
+              <wp:posOffset>4963160</wp:posOffset>
+            </wp:positionH>
+            <wp:positionV relativeFrom="paragraph">
+              <wp:posOffset>141605</wp:posOffset>
+            </wp:positionV>
+            <wp:extent cx="1038225" cy="428625"/>
+            <wp:effectExtent l="0" t="0" r="0" b="0"/>
+            <wp:wrapSquare wrapText="largest"/>
+            <wp:docPr id="4" name="Зображення4"/>
+            <wp:cNvGraphicFramePr>
+              <a:graphicFrameLocks xmlns:a="http://schemas.openxmlformats.org/drawingml/2006/main" noChangeAspect="1"/>
+            </wp:cNvGraphicFramePr>
+            <a:graphic xmlns:a="http://schemas.openxmlformats.org/drawingml/2006/main">
+              <a:graphicData uri="http://schemas.openxmlformats.org/drawingml/2006/picture">
+                <pic:pic xmlns:pic="http://schemas.openxmlformats.org/drawingml/2006/picture">
+                  <pic:nvPicPr>
+                    <pic:cNvPr id="4" name="Зображення4"/>
+                    <pic:cNvPicPr>
+                      <a:picLocks noChangeAspect="1" noChangeArrowheads="1"/>
+                    </pic:cNvPicPr>
+                  </pic:nvPicPr>
+                  <pic:blipFill>
+                    <a:blip r:embed="rId5"/>
+                    <a:stretch>
+                      <a:fillRect/>
+                    </a:stretch>
+                  </pic:blipFill>
+                  <pic:spPr bwMode="auto">
+                    <a:xfrm>
+                      <a:off x="0" y="0"/>
+                      <a:ext cx="1038225" cy="428625"/>
+                    </a:xfrm>
+                    <a:prstGeom prst="rect">
+                      <a:avLst/>
+                    </a:prstGeom>
+                    <a:noFill/>
+                  </pic:spPr>
+                </pic:pic>
+              </a:graphicData>
+            </a:graphic>
+          </wp:anchor>
+        </w:drawing>
+      </w:r>
+    </w:p>
+    <w:p>
+      <w:pPr>
+        <w:pStyle w:val="P1"/>
+        <w:rPr/>
+      </w:pPr>
+      <w:r>
+        <w:drawing>
+          <wp:anchor behindDoc="0" distT="0" distB="0" distL="0" distR="0" simplePos="0" locked="0" layoutInCell="0" allowOverlap="1" relativeHeight="6">
+            <wp:simplePos x="0" y="0"/>
+            <wp:positionH relativeFrom="column">
+              <wp:posOffset>2133600</wp:posOffset>
+            </wp:positionH>
+            <wp:positionV relativeFrom="paragraph">
+              <wp:posOffset>1923415</wp:posOffset>
+            </wp:positionV>
+            <wp:extent cx="4391025" cy="381000"/>
+            <wp:effectExtent l="0" t="0" r="0" b="0"/>
+            <wp:wrapSquare wrapText="largest"/>
+            <wp:docPr id="5" name="Зображення5"/>
+            <wp:cNvGraphicFramePr>
+              <a:graphicFrameLocks xmlns:a="http://schemas.openxmlformats.org/drawingml/2006/main" noChangeAspect="1"/>
+            </wp:cNvGraphicFramePr>
+            <a:graphic xmlns:a="http://schemas.openxmlformats.org/drawingml/2006/main">
+              <a:graphicData uri="http://schemas.openxmlformats.org/drawingml/2006/picture">
+                <pic:pic xmlns:pic="http://schemas.openxmlformats.org/drawingml/2006/picture">
+                  <pic:nvPicPr>
+                    <pic:cNvPr id="5" name="Зображення5"/>
+                    <pic:cNvPicPr>
+                      <a:picLocks noChangeAspect="1" noChangeArrowheads="1"/>
+                    </pic:cNvPicPr>
+                  </pic:nvPicPr>
+                  <pic:blipFill>
+                    <a:blip r:embed="rId6"/>
+                    <a:stretch>
+                      <a:fillRect/>
+                    </a:stretch>
+                  </pic:blipFill>
+                  <pic:spPr bwMode="auto">
+                    <a:xfrm>
+                      <a:off x="0" y="0"/>
+                      <a:ext cx="4391025" cy="381000"/>
+                    </a:xfrm>
+                    <a:prstGeom prst="rect">
+                      <a:avLst/>
+                    </a:prstGeom>
+                    <a:noFill/>
+                  </pic:spPr>
+                </pic:pic>
+              </a:graphicData>
+            </a:graphic>
+          </wp:anchor>
+        </w:drawing>
+      </w:r>
+      <w:r>
+        <w:rPr/>
+        <w:t>Постановка задачі. Нехай необхідно обчислити суму ряду , де N - досить велике число та обчислення слід розподілити між P процесорами, причому, степінь чисел x</w:t>
+      </w:r>
+      <w:r>
+        <w:rPr>
+          <w:vertAlign w:val="subscript"/>
+        </w:rPr>
+        <w:t>i</w:t>
+      </w:r>
+      <w:r>
+        <w:rPr/>
+        <w:t xml:space="preserve"> повинна обчислюватись шляхом їх перемноження. Якщо в кожному процесорі обчислювати частину суми, яка складається з</w:t>
+      </w:r>
+      <w:r>
+        <w:rPr>
+          <w:lang w:val="en-US"/>
+        </w:rPr>
+        <w:t xml:space="preserve"> </w:t>
+      </w:r>
+      <w:r>
+        <w:rPr>
+          <w:lang w:val="en-US"/>
+        </w:rPr>
+        <w:t>N/P</w:t>
+      </w:r>
+      <w:r>
+        <w:rPr>
+          <w:lang w:val="en-US"/>
+        </w:rPr>
+        <w:t xml:space="preserve"> </w:t>
+      </w:r>
+      <w:r>
+        <w:rPr/>
+        <w:t xml:space="preserve">елементів вихідного ряду, то це приведе до нерівномірного навантаження процесорів. Наприклад, якщо N=30, P=3, то розбивання ряду на три частини по </w:t>
+      </w:r>
+      <w:r>
+        <w:rPr>
+          <w:lang w:val="en-US"/>
+        </w:rPr>
+        <w:t>N/P</w:t>
+      </w:r>
+      <w:r>
+        <w:rPr/>
+        <w:t xml:space="preserve"> елементів буде: . В результаті перший процесор виконає 55, другий – 155, а третій – 255 множень. В програмі реалізовано рівномірний розподіл навантаження обчислень цієї модельної задачі наступним чином.</w:t>
+      </w:r>
+    </w:p>
+    <w:p>
+      <w:pPr>
+        <w:pStyle w:val="P1"/>
+        <w:rPr/>
+      </w:pPr>
+      <w:r>
+        <w:rPr/>
+        <w:t xml:space="preserve">В другому елементі ряду, що розглядається, необхідно виконати одне множення, в третьому – два і т.д. Загальна кількість множень будь-якого "відрізка" ряду з </w:t>
+      </w:r>
+      <w:r>
+        <w:rPr>
+          <w:lang w:val="en-US"/>
+        </w:rPr>
+        <w:t>M</w:t>
+      </w:r>
+      <w:r>
+        <w:rPr/>
+        <w:t xml:space="preserve"> елементів утворюють арифметичну прогресію, отже:</w:t>
+      </w:r>
+    </w:p>
+    <w:p>
+      <w:pPr>
+        <w:pStyle w:val="P1"/>
+        <w:rPr/>
+      </w:pPr>
+      <w:r>
+        <w:rPr/>
+        <w:drawing>
+          <wp:inline distT="0" distB="0" distL="0" distR="0">
+            <wp:extent cx="3239135" cy="742950"/>
+            <wp:effectExtent l="0" t="0" r="0" b="0"/>
+            <wp:docPr id="6" name="Зображення6"/>
+            <wp:cNvGraphicFramePr>
+              <a:graphicFrameLocks xmlns:a="http://schemas.openxmlformats.org/drawingml/2006/main" noChangeAspect="1"/>
+            </wp:cNvGraphicFramePr>
+            <a:graphic xmlns:a="http://schemas.openxmlformats.org/drawingml/2006/main">
+              <a:graphicData uri="http://schemas.openxmlformats.org/drawingml/2006/picture">
+                <pic:pic xmlns:pic="http://schemas.openxmlformats.org/drawingml/2006/picture">
+                  <pic:nvPicPr>
+                    <pic:cNvPr id="6" name="Зображення6"/>
+                    <pic:cNvPicPr>
+                      <a:picLocks noChangeAspect="1" noChangeArrowheads="1"/>
+                    </pic:cNvPicPr>
+                  </pic:nvPicPr>
+                  <pic:blipFill>
+                    <a:blip r:embed="rId7"/>
+                    <a:stretch>
+                      <a:fillRect/>
+                    </a:stretch>
+                  </pic:blipFill>
+                  <pic:spPr bwMode="auto">
+                    <a:xfrm>
+                      <a:off x="0" y="0"/>
+                      <a:ext cx="3239135" cy="742950"/>
+                    </a:xfrm>
+                    <a:prstGeom prst="rect">
+                      <a:avLst/>
+                    </a:prstGeom>
+                    <a:noFill/>
+                  </pic:spPr>
+                </pic:pic>
+              </a:graphicData>
+            </a:graphic>
+          </wp:inline>
+        </w:drawing>
+      </w:r>
+    </w:p>
+    <w:p>
+      <w:pPr>
+        <w:pStyle w:val="P1"/>
+        <w:rPr/>
+      </w:pPr>
+      <w:r>
+        <w:rPr/>
+        <w:t>де n</w:t>
+      </w:r>
+      <w:r>
+        <w:rPr>
+          <w:vertAlign w:val="subscript"/>
+          <w:lang w:val="en-US"/>
+        </w:rPr>
+        <w:t>1</w:t>
+      </w:r>
+      <w:r>
+        <w:rPr/>
+        <w:t xml:space="preserve"> - номер першого елемента ділянки.</w:t>
+      </w:r>
+    </w:p>
+    <w:p>
+      <w:pPr>
+        <w:pStyle w:val="P1"/>
+        <w:rPr/>
+      </w:pPr>
+      <w:r>
+        <w:rPr/>
+        <w:t>Тоді кількість операцій множення, яку повинний виконати кожний процесор, можна визначити за формулою:</w:t>
+      </w:r>
+    </w:p>
+    <w:p>
+      <w:pPr>
+        <w:pStyle w:val="P1"/>
+        <w:rPr/>
+      </w:pPr>
+      <w:r>
+        <w:rPr/>
+        <w:drawing>
+          <wp:inline distT="0" distB="0" distL="0" distR="0">
+            <wp:extent cx="4772660" cy="695325"/>
+            <wp:effectExtent l="0" t="0" r="0" b="0"/>
+            <wp:docPr id="7" name="Зображення7"/>
+            <wp:cNvGraphicFramePr>
+              <a:graphicFrameLocks xmlns:a="http://schemas.openxmlformats.org/drawingml/2006/main" noChangeAspect="1"/>
+            </wp:cNvGraphicFramePr>
+            <a:graphic xmlns:a="http://schemas.openxmlformats.org/drawingml/2006/main">
+              <a:graphicData uri="http://schemas.openxmlformats.org/drawingml/2006/picture">
+                <pic:pic xmlns:pic="http://schemas.openxmlformats.org/drawingml/2006/picture">
+                  <pic:nvPicPr>
+                    <pic:cNvPr id="7" name="Зображення7"/>
+                    <pic:cNvPicPr>
+                      <a:picLocks noChangeAspect="1" noChangeArrowheads="1"/>
+                    </pic:cNvPicPr>
+                  </pic:nvPicPr>
+                  <pic:blipFill>
+                    <a:blip r:embed="rId8"/>
+                    <a:stretch>
+                      <a:fillRect/>
+                    </a:stretch>
+                  </pic:blipFill>
+                  <pic:spPr bwMode="auto">
+                    <a:xfrm>
+                      <a:off x="0" y="0"/>
+                      <a:ext cx="4772660" cy="695325"/>
+                    </a:xfrm>
+                    <a:prstGeom prst="rect">
+                      <a:avLst/>
+                    </a:prstGeom>
+                    <a:noFill/>
+                  </pic:spPr>
+                </pic:pic>
+              </a:graphicData>
+            </a:graphic>
+          </wp:inline>
+        </w:drawing>
+      </w:r>
+    </w:p>
+    <w:p>
+      <w:pPr>
+        <w:pStyle w:val="P1"/>
+        <w:rPr/>
+      </w:pPr>
+      <w:r>
+        <w:rPr/>
+        <w:t>Для знаходження кількості операцій множення, яку повинний виконати перший процесор, складемо рівняння:</w:t>
+      </w:r>
+    </w:p>
+    <w:p>
+      <w:pPr>
+        <w:pStyle w:val="P1"/>
+        <w:rPr/>
+      </w:pPr>
+      <w:r>
+        <w:rPr/>
+        <w:drawing>
+          <wp:inline distT="0" distB="0" distL="0" distR="0">
+            <wp:extent cx="4143375" cy="723900"/>
+            <wp:effectExtent l="0" t="0" r="0" b="0"/>
+            <wp:docPr id="8" name="Зображення8"/>
+            <wp:cNvGraphicFramePr>
+              <a:graphicFrameLocks xmlns:a="http://schemas.openxmlformats.org/drawingml/2006/main" noChangeAspect="1"/>
+            </wp:cNvGraphicFramePr>
+            <a:graphic xmlns:a="http://schemas.openxmlformats.org/drawingml/2006/main">
+              <a:graphicData uri="http://schemas.openxmlformats.org/drawingml/2006/picture">
+                <pic:pic xmlns:pic="http://schemas.openxmlformats.org/drawingml/2006/picture">
+                  <pic:nvPicPr>
+                    <pic:cNvPr id="8" name="Зображення8"/>
+                    <pic:cNvPicPr>
+                      <a:picLocks noChangeAspect="1" noChangeArrowheads="1"/>
+                    </pic:cNvPicPr>
+                  </pic:nvPicPr>
+                  <pic:blipFill>
+                    <a:blip r:embed="rId9"/>
+                    <a:stretch>
+                      <a:fillRect/>
+                    </a:stretch>
+                  </pic:blipFill>
+                  <pic:spPr bwMode="auto">
+                    <a:xfrm>
+                      <a:off x="0" y="0"/>
+                      <a:ext cx="4143375" cy="723900"/>
+                    </a:xfrm>
+                    <a:prstGeom prst="rect">
+                      <a:avLst/>
+                    </a:prstGeom>
+                    <a:noFill/>
+                  </pic:spPr>
+                </pic:pic>
+              </a:graphicData>
+            </a:graphic>
+          </wp:inline>
+        </w:drawing>
+      </w:r>
+    </w:p>
+    <w:p>
+      <w:pPr>
+        <w:pStyle w:val="P1"/>
+        <w:rPr/>
+      </w:pPr>
+      <w:r>
+        <w:rPr/>
+        <w:t>де n</w:t>
+      </w:r>
+      <w:r>
+        <w:rPr>
+          <w:vertAlign w:val="subscript"/>
+          <w:lang w:val="en-US"/>
+        </w:rPr>
+        <w:t>1</w:t>
+      </w:r>
+      <w:r>
+        <w:rPr/>
+        <w:t>=1.</w:t>
+      </w:r>
+    </w:p>
+    <w:p>
+      <w:pPr>
+        <w:pStyle w:val="P1"/>
+        <w:rPr/>
+      </w:pPr>
+      <w:r>
+        <w:rPr/>
+        <w:t>Розв’язуючи це квадратне рівняння, знайдемо значення M</w:t>
+      </w:r>
+      <w:r>
+        <w:rPr>
+          <w:vertAlign w:val="subscript"/>
+        </w:rPr>
+        <w:t>1</w:t>
+      </w:r>
+      <w:r>
+        <w:rPr/>
+        <w:t xml:space="preserve"> – кількість елементів першого відрізка. Початком другого відрізка, очевидно, буде елемент з номером n</w:t>
+      </w:r>
+      <w:r>
+        <w:rPr>
+          <w:vertAlign w:val="subscript"/>
+        </w:rPr>
+        <w:t>2</w:t>
+      </w:r>
+      <w:r>
+        <w:rPr/>
+        <w:t xml:space="preserve"> = n</w:t>
+      </w:r>
+      <w:r>
+        <w:rPr>
+          <w:vertAlign w:val="subscript"/>
+        </w:rPr>
+        <w:t>1</w:t>
+      </w:r>
+      <w:r>
+        <w:rPr/>
+        <w:t xml:space="preserve"> + M</w:t>
+      </w:r>
+      <w:r>
+        <w:rPr>
+          <w:vertAlign w:val="subscript"/>
+        </w:rPr>
+        <w:t>1</w:t>
+      </w:r>
+      <w:r>
+        <w:rPr/>
+        <w:t>, тоді кількість елементів другого відрізка, призначеного для обчислення на другому процесорі, можна знайти аналогічно, розв’язуючи рівняння:</w:t>
+      </w:r>
+    </w:p>
+    <w:p>
+      <w:pPr>
+        <w:pStyle w:val="P1"/>
+        <w:rPr/>
+      </w:pPr>
+      <w:r>
+        <w:rPr/>
+        <w:drawing>
+          <wp:inline distT="0" distB="0" distL="0" distR="0">
+            <wp:extent cx="4115435" cy="704850"/>
+            <wp:effectExtent l="0" t="0" r="0" b="0"/>
+            <wp:docPr id="9" name="Зображення9"/>
+            <wp:cNvGraphicFramePr>
+              <a:graphicFrameLocks xmlns:a="http://schemas.openxmlformats.org/drawingml/2006/main" noChangeAspect="1"/>
+            </wp:cNvGraphicFramePr>
+            <a:graphic xmlns:a="http://schemas.openxmlformats.org/drawingml/2006/main">
+              <a:graphicData uri="http://schemas.openxmlformats.org/drawingml/2006/picture">
+                <pic:pic xmlns:pic="http://schemas.openxmlformats.org/drawingml/2006/picture">
+                  <pic:nvPicPr>
+                    <pic:cNvPr id="9" name="Зображення9"/>
+                    <pic:cNvPicPr>
+                      <a:picLocks noChangeAspect="1" noChangeArrowheads="1"/>
+                    </pic:cNvPicPr>
+                  </pic:nvPicPr>
+                  <pic:blipFill>
+                    <a:blip r:embed="rId10"/>
+                    <a:stretch>
+                      <a:fillRect/>
+                    </a:stretch>
+                  </pic:blipFill>
+                  <pic:spPr bwMode="auto">
+                    <a:xfrm>
+                      <a:off x="0" y="0"/>
+                      <a:ext cx="4115435" cy="704850"/>
+                    </a:xfrm>
+                    <a:prstGeom prst="rect">
+                      <a:avLst/>
+                    </a:prstGeom>
+                    <a:noFill/>
+                  </pic:spPr>
+                </pic:pic>
+              </a:graphicData>
+            </a:graphic>
+          </wp:inline>
+        </w:drawing>
+      </w:r>
+    </w:p>
+    <w:p>
+      <w:pPr>
+        <w:pStyle w:val="P1"/>
+        <w:rPr/>
+      </w:pPr>
+      <w:r>
+        <w:rPr/>
+        <w:t>і т.д.</w:t>
+      </w:r>
+    </w:p>
+    <w:p>
+      <w:pPr>
+        <w:pStyle w:val="P1"/>
+        <w:rPr/>
+      </w:pPr>
+      <w:r>
+        <w:rPr/>
+        <w:t>З тим, щоб врахувати незначну неточність у визначенні довжин відрізків, пов’язану з цілочисленним розподіленням, кількість елементів відрізка для останнього процесора знайдемо із співвідношення:</w:t>
+      </w:r>
+    </w:p>
+    <w:p>
+      <w:pPr>
+        <w:pStyle w:val="P1"/>
+        <w:rPr/>
+      </w:pPr>
+      <w:r>
+        <w:rPr/>
+        <w:drawing>
+          <wp:inline distT="0" distB="0" distL="0" distR="0">
+            <wp:extent cx="3696335" cy="371475"/>
+            <wp:effectExtent l="0" t="0" r="0" b="0"/>
+            <wp:docPr id="10" name="Зображення10"/>
+            <wp:cNvGraphicFramePr>
+              <a:graphicFrameLocks xmlns:a="http://schemas.openxmlformats.org/drawingml/2006/main" noChangeAspect="1"/>
+            </wp:cNvGraphicFramePr>
+            <a:graphic xmlns:a="http://schemas.openxmlformats.org/drawingml/2006/main">
+              <a:graphicData uri="http://schemas.openxmlformats.org/drawingml/2006/picture">
+                <pic:pic xmlns:pic="http://schemas.openxmlformats.org/drawingml/2006/picture">
+                  <pic:nvPicPr>
+                    <pic:cNvPr id="10" name="Зображення10"/>
+                    <pic:cNvPicPr>
+                      <a:picLocks noChangeAspect="1" noChangeArrowheads="1"/>
+                    </pic:cNvPicPr>
+                  </pic:nvPicPr>
+                  <pic:blipFill>
+                    <a:blip r:embed="rId11"/>
+                    <a:stretch>
+                      <a:fillRect/>
+                    </a:stretch>
+                  </pic:blipFill>
+                  <pic:spPr bwMode="auto">
+                    <a:xfrm>
+                      <a:off x="0" y="0"/>
+                      <a:ext cx="3696335" cy="371475"/>
+                    </a:xfrm>
+                    <a:prstGeom prst="rect">
+                      <a:avLst/>
+                    </a:prstGeom>
+                    <a:noFill/>
+                  </pic:spPr>
+                </pic:pic>
+              </a:graphicData>
+            </a:graphic>
+          </wp:inline>
+        </w:drawing>
+      </w:r>
+    </w:p>
+    <w:p>
+      <w:pPr>
+        <w:pStyle w:val="P1"/>
+        <w:rPr/>
+      </w:pPr>
+      <w:r>
+        <w:rPr/>
+        <w:t>Реалізація програми. Для розподілення різної кількості елементів між процесами використовується функція MPI_Scatterv(), яку описано вище.</w:t>
       </w:r>
     </w:p>
     <w:p>
@@ -1684,12 +3352,12 @@
       <w:lang w:val="en-US" w:eastAsia="uk-UA"/>
     </w:rPr>
   </w:style>
-  <w:style w:type="character" w:styleId="Style12">
-    <w:name w:val="Символ нумерації"/>
+  <w:style w:type="character" w:styleId="user">
+    <w:name w:val="Символ нумерації (user)"/>
     <w:qFormat/>
     <w:rPr/>
   </w:style>
-  <w:style w:type="paragraph" w:styleId="Style13">
+  <w:style w:type="paragraph" w:styleId="Style12">
     <w:name w:val="Заголовок"/>
     <w:basedOn w:val="Normal"/>
     <w:next w:val="BodyText"/>
@@ -1699,7 +3367,7 @@
       <w:spacing w:before="240" w:after="120"/>
     </w:pPr>
     <w:rPr>
-      <w:rFonts w:ascii="Liberation Sans" w:hAnsi="Liberation Sans" w:eastAsia="Microsoft YaHei" w:cs="Lucida Sans"/>
+      <w:rFonts w:ascii="Liberation Sans" w:hAnsi="Liberation Sans" w:eastAsia="Microsoft YaHei" w:cs="Arial Unicode MS"/>
       <w:sz w:val="28"/>
       <w:szCs w:val="28"/>
     </w:rPr>
@@ -1736,7 +3404,7 @@
       <w:szCs w:val="24"/>
     </w:rPr>
   </w:style>
-  <w:style w:type="paragraph" w:styleId="Style14">
+  <w:style w:type="paragraph" w:styleId="Style13">
     <w:name w:val="Покажчик"/>
     <w:basedOn w:val="Normal"/>
     <w:qFormat/>
@@ -1744,10 +3412,10 @@
       <w:suppressLineNumbers/>
     </w:pPr>
     <w:rPr>
-      <w:rFonts w:cs="Lucida Sans"/>
-    </w:rPr>
-  </w:style>
-  <w:style w:type="paragraph" w:styleId="user">
+      <w:rFonts w:cs="Arial Unicode MS"/>
+    </w:rPr>
+  </w:style>
+  <w:style w:type="paragraph" w:styleId="user1">
     <w:name w:val="Заголовок (user)"/>
     <w:basedOn w:val="Normal"/>
     <w:next w:val="BodyText"/>
@@ -1757,12 +3425,12 @@
       <w:spacing w:before="240" w:after="120"/>
     </w:pPr>
     <w:rPr>
-      <w:rFonts w:ascii="Liberation Sans" w:hAnsi="Liberation Sans" w:eastAsia="Microsoft YaHei" w:cs="Arial Unicode MS"/>
+      <w:rFonts w:ascii="Liberation Sans" w:hAnsi="Liberation Sans" w:eastAsia="Microsoft YaHei" w:cs="Lucida Sans"/>
       <w:sz w:val="28"/>
       <w:szCs w:val="28"/>
     </w:rPr>
   </w:style>
-  <w:style w:type="paragraph" w:styleId="user1">
+  <w:style w:type="paragraph" w:styleId="user2">
     <w:name w:val="Покажчик (user)"/>
     <w:basedOn w:val="Normal"/>
     <w:qFormat/>
@@ -1770,12 +3438,12 @@
       <w:suppressLineNumbers/>
     </w:pPr>
     <w:rPr>
-      <w:rFonts w:cs="Arial Unicode MS"/>
+      <w:rFonts w:cs="Lucida Sans"/>
     </w:rPr>
   </w:style>
   <w:style w:type="paragraph" w:styleId="IndexHeading">
     <w:name w:val="index heading"/>
-    <w:basedOn w:val="user"/>
+    <w:basedOn w:val="Style12"/>
     <w:pPr/>
     <w:rPr/>
   </w:style>
@@ -2053,8 +3721,8 @@
     </w:pPr>
     <w:rPr/>
   </w:style>
-  <w:style w:type="paragraph" w:styleId="user2">
-    <w:name w:val="Вміст таблиці (user)"/>
+  <w:style w:type="paragraph" w:styleId="Style14">
+    <w:name w:val="Вміст таблиці"/>
     <w:basedOn w:val="Normal"/>
     <w:qFormat/>
     <w:pPr>
@@ -2063,8 +3731,8 @@
     </w:pPr>
     <w:rPr/>
   </w:style>
-  <w:style w:type="paragraph" w:styleId="Style15">
-    <w:name w:val="Вміст таблиці"/>
+  <w:style w:type="paragraph" w:styleId="user3">
+    <w:name w:val="Вміст таблиці (user)"/>
     <w:basedOn w:val="Normal"/>
     <w:qFormat/>
     <w:pPr>
@@ -2073,8 +3741,43 @@
     </w:pPr>
     <w:rPr/>
   </w:style>
-  <w:style w:type="numbering" w:styleId="user3" w:default="1">
-    <w:name w:val="Без маркерів (user)"/>
+  <w:style w:type="paragraph" w:styleId="Style15">
+    <w:name w:val="Заголовок таблиці"/>
+    <w:basedOn w:val="Style14"/>
+    <w:qFormat/>
+    <w:pPr>
+      <w:suppressLineNumbers/>
+      <w:jc w:val="center"/>
+    </w:pPr>
+    <w:rPr>
+      <w:b/>
+      <w:bCs/>
+    </w:rPr>
+  </w:style>
+  <w:style w:type="paragraph" w:styleId="Style16">
+    <w:name w:val="Верхній і нижній колонтитули"/>
+    <w:basedOn w:val="Normal"/>
+    <w:qFormat/>
+    <w:pPr>
+      <w:suppressLineNumbers/>
+      <w:tabs>
+        <w:tab w:val="clear" w:pos="643"/>
+        <w:tab w:val="center" w:pos="4513" w:leader="none"/>
+        <w:tab w:val="right" w:pos="9026" w:leader="none"/>
+      </w:tabs>
+    </w:pPr>
+    <w:rPr/>
+  </w:style>
+  <w:style w:type="paragraph" w:styleId="Footer">
+    <w:name w:val="footer"/>
+    <w:basedOn w:val="Style16"/>
+    <w:pPr>
+      <w:suppressLineNumbers/>
+    </w:pPr>
+    <w:rPr/>
+  </w:style>
+  <w:style w:type="numbering" w:styleId="Style17" w:default="1">
+    <w:name w:val="Без маркерів"/>
     <w:uiPriority w:val="99"/>
     <w:semiHidden/>
     <w:unhideWhenUsed/>

</xml_diff>

<commit_message>
chore -- TR4: not going well
</commit_message>
<xml_diff>
--- a/42TR Tehnologiji Rozpodilenyh System/4/TR_KNT-122_Onyshchenko_19_PR4.docx
+++ b/42TR Tehnologiji Rozpodilenyh System/4/TR_KNT-122_Onyshchenko_19_PR4.docx
@@ -486,7 +486,7 @@
           <w:lang w:val="uk-UA"/>
         </w:rPr>
         <w:drawing>
-          <wp:anchor behindDoc="0" distT="0" distB="0" distL="0" distR="0" simplePos="0" locked="0" layoutInCell="0" allowOverlap="1" relativeHeight="2">
+          <wp:anchor behindDoc="0" distT="0" distB="0" distL="0" distR="0" simplePos="0" locked="0" layoutInCell="0" allowOverlap="1" relativeHeight="7">
             <wp:simplePos x="0" y="0"/>
             <wp:positionH relativeFrom="column">
               <wp:posOffset>4702810</wp:posOffset>
@@ -806,10 +806,7 @@
       </w:pPr>
       <w:r>
         <w:rPr>
-          <w:i w:val="false"/>
-          <w:iCs w:val="false"/>
-          <w:sz w:val="28"/>
-          <w:lang w:val="en-US"/>
+          <w:lang w:val="uk-UA"/>
         </w:rPr>
       </w:r>
     </w:p>
@@ -843,7 +840,7 @@
       </w:pPr>
       <w:r>
         <w:drawing>
-          <wp:anchor behindDoc="0" distT="0" distB="0" distL="0" distR="0" simplePos="0" locked="0" layoutInCell="0" allowOverlap="1" relativeHeight="3">
+          <wp:anchor behindDoc="0" distT="0" distB="0" distL="0" distR="0" simplePos="0" locked="0" layoutInCell="0" allowOverlap="1" relativeHeight="8">
             <wp:simplePos x="0" y="0"/>
             <wp:positionH relativeFrom="column">
               <wp:posOffset>-376555</wp:posOffset>
@@ -889,7 +886,7 @@
           </wp:anchor>
         </w:drawing>
         <w:drawing>
-          <wp:anchor behindDoc="0" distT="0" distB="0" distL="0" distR="0" simplePos="0" locked="0" layoutInCell="0" allowOverlap="1" relativeHeight="4">
+          <wp:anchor behindDoc="0" distT="0" distB="0" distL="0" distR="0" simplePos="0" locked="0" layoutInCell="0" allowOverlap="1" relativeHeight="9">
             <wp:simplePos x="0" y="0"/>
             <wp:positionH relativeFrom="column">
               <wp:posOffset>2297430</wp:posOffset>
@@ -1318,7 +1315,7 @@
         <w:rPr>
           <w:lang w:val="en-US"/>
         </w:rPr>
-        <w:t>4.2.1.3 Дослідити та намалювати графіки залежності прискорення від кількості членів ряду при обчисленнях на чотирьох процесорах, змінюючи кількість членів ряду від 20000 до 240000 з дискретністю 20000. Вимірювання виконуйте 3 рази з інтервалом між вимірюваннями 15 хвилин, результати вимірювань занесіть до таблиці4.2.</w:t>
+        <w:t>4.2.1.3 Дослідити та намалювати графіки залежності прискорення від кількості членів ряду при обчисленнях на чотирьох процесорах, змінюючи кількість членів ряду від 20000 до 240000 з дискретністю 20000. Вимірювання виконуйте 3 рази з інтервалом між вимірюваннями 15 хвилин, результати вимірювань занесіть до таблиці 4.2.</w:t>
       </w:r>
     </w:p>
     <w:p>
@@ -1351,7 +1348,7 @@
     </w:p>
     <w:tbl>
       <w:tblPr>
-        <w:tblW w:w="5000" w:type="dxa"/>
+        <w:tblW w:w="9026" w:type="dxa"/>
         <w:jc w:val="left"/>
         <w:tblInd w:w="55" w:type="dxa"/>
         <w:tblLayout w:type="fixed"/>
@@ -1363,17 +1360,17 @@
         </w:tblCellMar>
       </w:tblPr>
       <w:tblGrid>
-        <w:gridCol w:w="1468"/>
-        <w:gridCol w:w="2480"/>
-        <w:gridCol w:w="383"/>
-        <w:gridCol w:w="383"/>
-        <w:gridCol w:w="286"/>
+        <w:gridCol w:w="2010"/>
+        <w:gridCol w:w="1805"/>
+        <w:gridCol w:w="1805"/>
+        <w:gridCol w:w="1805"/>
+        <w:gridCol w:w="1601"/>
       </w:tblGrid>
       <w:tr>
         <w:trPr/>
         <w:tc>
           <w:tcPr>
-            <w:tcW w:w="1468" w:type="dxa"/>
+            <w:tcW w:w="2010" w:type="dxa"/>
             <w:tcBorders>
               <w:top w:val="single" w:sz="4" w:space="0" w:color="000000"/>
               <w:left w:val="single" w:sz="4" w:space="0" w:color="000000"/>
@@ -1382,7 +1379,7 @@
           </w:tcPr>
           <w:p>
             <w:pPr>
-              <w:pStyle w:val="Style14"/>
+              <w:pStyle w:val="user2"/>
               <w:spacing w:lineRule="auto" w:line="240"/>
               <w:ind w:hanging="0" w:left="0"/>
               <w:rPr/>
@@ -1395,7 +1392,7 @@
         </w:tc>
         <w:tc>
           <w:tcPr>
-            <w:tcW w:w="2480" w:type="dxa"/>
+            <w:tcW w:w="1805" w:type="dxa"/>
             <w:tcBorders>
               <w:top w:val="single" w:sz="4" w:space="0" w:color="000000"/>
               <w:left w:val="single" w:sz="4" w:space="0" w:color="000000"/>
@@ -1404,7 +1401,7 @@
           </w:tcPr>
           <w:p>
             <w:pPr>
-              <w:pStyle w:val="Style14"/>
+              <w:pStyle w:val="user2"/>
               <w:spacing w:lineRule="auto" w:line="240"/>
               <w:ind w:hanging="0" w:left="0"/>
               <w:rPr/>
@@ -1423,7 +1420,7 @@
         </w:tc>
         <w:tc>
           <w:tcPr>
-            <w:tcW w:w="383" w:type="dxa"/>
+            <w:tcW w:w="1805" w:type="dxa"/>
             <w:tcBorders>
               <w:top w:val="single" w:sz="4" w:space="0" w:color="000000"/>
               <w:left w:val="single" w:sz="4" w:space="0" w:color="000000"/>
@@ -1432,7 +1429,7 @@
           </w:tcPr>
           <w:p>
             <w:pPr>
-              <w:pStyle w:val="Style14"/>
+              <w:pStyle w:val="user2"/>
               <w:spacing w:lineRule="auto" w:line="240"/>
               <w:ind w:hanging="0" w:left="0"/>
               <w:rPr>
@@ -1456,7 +1453,7 @@
         </w:tc>
         <w:tc>
           <w:tcPr>
-            <w:tcW w:w="383" w:type="dxa"/>
+            <w:tcW w:w="1805" w:type="dxa"/>
             <w:tcBorders>
               <w:top w:val="single" w:sz="4" w:space="0" w:color="000000"/>
               <w:left w:val="single" w:sz="4" w:space="0" w:color="000000"/>
@@ -1465,7 +1462,7 @@
           </w:tcPr>
           <w:p>
             <w:pPr>
-              <w:pStyle w:val="Style14"/>
+              <w:pStyle w:val="user2"/>
               <w:spacing w:lineRule="auto" w:line="240"/>
               <w:ind w:hanging="0" w:left="0"/>
               <w:rPr>
@@ -1489,7 +1486,7 @@
         </w:tc>
         <w:tc>
           <w:tcPr>
-            <w:tcW w:w="286" w:type="dxa"/>
+            <w:tcW w:w="1601" w:type="dxa"/>
             <w:tcBorders>
               <w:top w:val="single" w:sz="4" w:space="0" w:color="000000"/>
               <w:left w:val="single" w:sz="4" w:space="0" w:color="000000"/>
@@ -1499,7 +1496,7 @@
           </w:tcPr>
           <w:p>
             <w:pPr>
-              <w:pStyle w:val="Style14"/>
+              <w:pStyle w:val="user2"/>
               <w:spacing w:lineRule="auto" w:line="240"/>
               <w:ind w:hanging="0" w:left="0"/>
               <w:rPr>
@@ -1511,6 +1508,388 @@
                 <w:lang w:val="en-US"/>
               </w:rPr>
               <w:t>S</w:t>
+            </w:r>
+          </w:p>
+        </w:tc>
+      </w:tr>
+      <w:tr>
+        <w:trPr/>
+        <w:tc>
+          <w:tcPr>
+            <w:tcW w:w="2010" w:type="dxa"/>
+            <w:tcBorders>
+              <w:left w:val="single" w:sz="4" w:space="0" w:color="000000"/>
+              <w:bottom w:val="single" w:sz="4" w:space="0" w:color="000000"/>
+            </w:tcBorders>
+          </w:tcPr>
+          <w:p>
+            <w:pPr>
+              <w:pStyle w:val="user2"/>
+              <w:spacing w:lineRule="auto" w:line="240"/>
+              <w:ind w:hanging="0" w:left="0"/>
+              <w:rPr/>
+            </w:pPr>
+            <w:r>
+              <w:rPr/>
+              <w:t>13.02.2026 12:02</w:t>
+            </w:r>
+          </w:p>
+        </w:tc>
+        <w:tc>
+          <w:tcPr>
+            <w:tcW w:w="1805" w:type="dxa"/>
+            <w:tcBorders>
+              <w:left w:val="single" w:sz="4" w:space="0" w:color="000000"/>
+              <w:bottom w:val="single" w:sz="4" w:space="0" w:color="000000"/>
+            </w:tcBorders>
+          </w:tcPr>
+          <w:p>
+            <w:pPr>
+              <w:pStyle w:val="user2"/>
+              <w:spacing w:lineRule="auto" w:line="240"/>
+              <w:ind w:hanging="0" w:left="0"/>
+              <w:jc w:val="right"/>
+              <w:rPr/>
+            </w:pPr>
+            <w:r>
+              <w:rPr/>
+              <w:t>1</w:t>
+            </w:r>
+          </w:p>
+        </w:tc>
+        <w:tc>
+          <w:tcPr>
+            <w:tcW w:w="1805" w:type="dxa"/>
+            <w:vMerge w:val="restart"/>
+            <w:tcBorders>
+              <w:left w:val="single" w:sz="4" w:space="0" w:color="000000"/>
+              <w:bottom w:val="single" w:sz="4" w:space="0" w:color="000000"/>
+            </w:tcBorders>
+          </w:tcPr>
+          <w:p>
+            <w:pPr>
+              <w:pStyle w:val="user2"/>
+              <w:spacing w:lineRule="auto" w:line="240"/>
+              <w:ind w:hanging="0" w:left="0"/>
+              <w:rPr>
+                <w:lang w:val="en-US"/>
+              </w:rPr>
+            </w:pPr>
+            <w:r>
+              <w:rPr>
+                <w:lang w:val="en-US"/>
+              </w:rPr>
+              <w:t>15.539054099994246</w:t>
+            </w:r>
+          </w:p>
+        </w:tc>
+        <w:tc>
+          <w:tcPr>
+            <w:tcW w:w="1805" w:type="dxa"/>
+            <w:tcBorders>
+              <w:left w:val="single" w:sz="4" w:space="0" w:color="000000"/>
+              <w:bottom w:val="single" w:sz="4" w:space="0" w:color="000000"/>
+            </w:tcBorders>
+          </w:tcPr>
+          <w:p>
+            <w:pPr>
+              <w:pStyle w:val="user2"/>
+              <w:spacing w:lineRule="auto" w:line="240"/>
+              <w:ind w:hanging="0" w:left="0"/>
+              <w:rPr>
+                <w:lang w:val="en-US"/>
+              </w:rPr>
+            </w:pPr>
+            <w:r>
+              <w:rPr>
+                <w:lang w:val="en-US"/>
+              </w:rPr>
+              <w:t>15.645392999984324</w:t>
+            </w:r>
+          </w:p>
+        </w:tc>
+        <w:tc>
+          <w:tcPr>
+            <w:tcW w:w="1601" w:type="dxa"/>
+            <w:tcBorders>
+              <w:left w:val="single" w:sz="4" w:space="0" w:color="000000"/>
+              <w:bottom w:val="single" w:sz="4" w:space="0" w:color="000000"/>
+              <w:right w:val="single" w:sz="4" w:space="0" w:color="000000"/>
+            </w:tcBorders>
+          </w:tcPr>
+          <w:p>
+            <w:pPr>
+              <w:pStyle w:val="user2"/>
+              <w:spacing w:lineRule="auto" w:line="240"/>
+              <w:ind w:hanging="0" w:left="0"/>
+              <w:rPr>
+                <w:lang w:val="en-US"/>
+              </w:rPr>
+            </w:pPr>
+            <w:r>
+              <w:rPr>
+                <w:lang w:val="en-US"/>
+              </w:rPr>
+              <w:t>0,993203181</w:t>
+            </w:r>
+          </w:p>
+        </w:tc>
+      </w:tr>
+      <w:tr>
+        <w:trPr/>
+        <w:tc>
+          <w:tcPr>
+            <w:tcW w:w="2010" w:type="dxa"/>
+            <w:tcBorders>
+              <w:left w:val="single" w:sz="4" w:space="0" w:color="000000"/>
+              <w:bottom w:val="single" w:sz="4" w:space="0" w:color="000000"/>
+            </w:tcBorders>
+          </w:tcPr>
+          <w:p>
+            <w:pPr>
+              <w:pStyle w:val="user2"/>
+              <w:spacing w:lineRule="auto" w:line="240"/>
+              <w:ind w:hanging="0" w:left="0"/>
+              <w:rPr>
+                <w:lang w:val="en-US"/>
+              </w:rPr>
+            </w:pPr>
+            <w:r>
+              <w:rPr>
+                <w:lang w:val="en-US"/>
+              </w:rPr>
+              <w:t>13.02.2026 12:13</w:t>
+            </w:r>
+          </w:p>
+        </w:tc>
+        <w:tc>
+          <w:tcPr>
+            <w:tcW w:w="1805" w:type="dxa"/>
+            <w:tcBorders>
+              <w:left w:val="single" w:sz="4" w:space="0" w:color="000000"/>
+              <w:bottom w:val="single" w:sz="4" w:space="0" w:color="000000"/>
+            </w:tcBorders>
+          </w:tcPr>
+          <w:p>
+            <w:pPr>
+              <w:pStyle w:val="user2"/>
+              <w:spacing w:lineRule="auto" w:line="240"/>
+              <w:ind w:hanging="0" w:left="0"/>
+              <w:jc w:val="right"/>
+              <w:rPr>
+                <w:lang w:val="en-US"/>
+              </w:rPr>
+            </w:pPr>
+            <w:r>
+              <w:rPr>
+                <w:lang w:val="en-US"/>
+              </w:rPr>
+              <w:t>2</w:t>
+            </w:r>
+          </w:p>
+        </w:tc>
+        <w:tc>
+          <w:tcPr>
+            <w:tcW w:w="1805" w:type="dxa"/>
+            <w:vMerge w:val="continue"/>
+            <w:tcBorders>
+              <w:left w:val="single" w:sz="4" w:space="0" w:color="000000"/>
+              <w:bottom w:val="single" w:sz="4" w:space="0" w:color="000000"/>
+            </w:tcBorders>
+          </w:tcPr>
+          <w:p>
+            <w:pPr>
+              <w:pStyle w:val="user2"/>
+              <w:spacing w:lineRule="auto" w:line="240"/>
+              <w:ind w:hanging="0" w:left="0"/>
+              <w:rPr>
+                <w:lang w:val="en-US"/>
+              </w:rPr>
+            </w:pPr>
+            <w:r>
+              <w:rPr>
+                <w:lang w:val="en-US"/>
+              </w:rPr>
+            </w:r>
+          </w:p>
+        </w:tc>
+        <w:tc>
+          <w:tcPr>
+            <w:tcW w:w="1805" w:type="dxa"/>
+            <w:tcBorders>
+              <w:left w:val="single" w:sz="4" w:space="0" w:color="000000"/>
+              <w:bottom w:val="single" w:sz="4" w:space="0" w:color="000000"/>
+            </w:tcBorders>
+          </w:tcPr>
+          <w:p>
+            <w:pPr>
+              <w:pStyle w:val="user2"/>
+              <w:spacing w:lineRule="auto" w:line="240"/>
+              <w:ind w:hanging="0" w:left="0"/>
+              <w:rPr>
+                <w:lang w:val="en-US"/>
+              </w:rPr>
+            </w:pPr>
+            <w:r>
+              <w:rPr>
+                <w:lang w:val="en-US"/>
+              </w:rPr>
+              <w:t>16.29839929996524</w:t>
+            </w:r>
+          </w:p>
+        </w:tc>
+        <w:tc>
+          <w:tcPr>
+            <w:tcW w:w="1601" w:type="dxa"/>
+            <w:tcBorders>
+              <w:left w:val="single" w:sz="4" w:space="0" w:color="000000"/>
+              <w:bottom w:val="single" w:sz="4" w:space="0" w:color="000000"/>
+              <w:right w:val="single" w:sz="4" w:space="0" w:color="000000"/>
+            </w:tcBorders>
+          </w:tcPr>
+          <w:p>
+            <w:pPr>
+              <w:pStyle w:val="user2"/>
+              <w:spacing w:lineRule="auto" w:line="240"/>
+              <w:ind w:hanging="0" w:left="0"/>
+              <w:rPr>
+                <w:lang w:val="en-US"/>
+              </w:rPr>
+            </w:pPr>
+            <w:r>
+              <w:rPr>
+                <w:lang w:val="en-US"/>
+              </w:rPr>
+              <w:t>0,959934329</w:t>
+            </w:r>
+          </w:p>
+        </w:tc>
+      </w:tr>
+      <w:tr>
+        <w:trPr/>
+        <w:tc>
+          <w:tcPr>
+            <w:tcW w:w="2010" w:type="dxa"/>
+            <w:tcBorders>
+              <w:left w:val="single" w:sz="4" w:space="0" w:color="000000"/>
+              <w:bottom w:val="single" w:sz="4" w:space="0" w:color="000000"/>
+            </w:tcBorders>
+          </w:tcPr>
+          <w:p>
+            <w:pPr>
+              <w:pStyle w:val="user2"/>
+              <w:spacing w:lineRule="auto" w:line="240"/>
+              <w:ind w:hanging="0" w:left="0"/>
+              <w:rPr>
+                <w:lang w:val="en-US"/>
+              </w:rPr>
+            </w:pPr>
+            <w:r>
+              <w:rPr>
+                <w:lang w:val="en-US"/>
+              </w:rPr>
+              <w:t>13.02.2026 12:14</w:t>
+            </w:r>
+          </w:p>
+        </w:tc>
+        <w:tc>
+          <w:tcPr>
+            <w:tcW w:w="1805" w:type="dxa"/>
+            <w:tcBorders>
+              <w:left w:val="single" w:sz="4" w:space="0" w:color="000000"/>
+              <w:bottom w:val="single" w:sz="4" w:space="0" w:color="000000"/>
+            </w:tcBorders>
+          </w:tcPr>
+          <w:p>
+            <w:pPr>
+              <w:pStyle w:val="user2"/>
+              <w:spacing w:lineRule="auto" w:line="240"/>
+              <w:ind w:hanging="0" w:left="0"/>
+              <w:jc w:val="right"/>
+              <w:rPr>
+                <w:lang w:val="en-US"/>
+              </w:rPr>
+            </w:pPr>
+            <w:r>
+              <w:rPr>
+                <w:lang w:val="en-US"/>
+              </w:rPr>
+              <w:t>4</w:t>
+            </w:r>
+          </w:p>
+        </w:tc>
+        <w:tc>
+          <w:tcPr>
+            <w:tcW w:w="1805" w:type="dxa"/>
+            <w:vMerge w:val="continue"/>
+            <w:tcBorders>
+              <w:left w:val="single" w:sz="4" w:space="0" w:color="000000"/>
+              <w:bottom w:val="single" w:sz="4" w:space="0" w:color="000000"/>
+            </w:tcBorders>
+          </w:tcPr>
+          <w:p>
+            <w:pPr>
+              <w:pStyle w:val="user2"/>
+              <w:spacing w:lineRule="auto" w:line="240"/>
+              <w:ind w:hanging="0" w:left="0"/>
+              <w:rPr>
+                <w:lang w:val="en-US"/>
+              </w:rPr>
+            </w:pPr>
+            <w:r>
+              <w:rPr>
+                <w:lang w:val="en-US"/>
+              </w:rPr>
+            </w:r>
+          </w:p>
+        </w:tc>
+        <w:tc>
+          <w:tcPr>
+            <w:tcW w:w="1805" w:type="dxa"/>
+            <w:tcBorders>
+              <w:left w:val="single" w:sz="4" w:space="0" w:color="000000"/>
+              <w:bottom w:val="single" w:sz="4" w:space="0" w:color="000000"/>
+            </w:tcBorders>
+          </w:tcPr>
+          <w:p>
+            <w:pPr>
+              <w:pStyle w:val="user2"/>
+              <w:spacing w:lineRule="auto" w:line="240"/>
+              <w:ind w:hanging="0" w:left="0"/>
+              <w:rPr>
+                <w:lang w:val="en-US"/>
+              </w:rPr>
+            </w:pPr>
+            <w:r>
+              <w:rPr>
+                <w:lang w:val="en-US"/>
+              </w:rPr>
+              <w:t>16.573226300009992</w:t>
+            </w:r>
+          </w:p>
+        </w:tc>
+        <w:tc>
+          <w:tcPr>
+            <w:tcW w:w="1601" w:type="dxa"/>
+            <w:tcBorders>
+              <w:left w:val="single" w:sz="4" w:space="0" w:color="000000"/>
+              <w:bottom w:val="single" w:sz="4" w:space="0" w:color="000000"/>
+              <w:right w:val="single" w:sz="4" w:space="0" w:color="000000"/>
+            </w:tcBorders>
+          </w:tcPr>
+          <w:p>
+            <w:pPr>
+              <w:pStyle w:val="user2"/>
+              <w:spacing w:lineRule="auto" w:line="240"/>
+              <w:ind w:hanging="0" w:left="0"/>
+              <w:rPr>
+                <w:lang w:val="en-US"/>
+              </w:rPr>
+            </w:pPr>
+            <w:r>
+              <w:rPr>
+                <w:lang w:val="en-US"/>
+              </w:rPr>
             </w:r>
           </w:p>
         </w:tc>
@@ -1570,17 +1949,17 @@
         </w:tblCellMar>
       </w:tblPr>
       <w:tblGrid>
-        <w:gridCol w:w="1468"/>
-        <w:gridCol w:w="333"/>
-        <w:gridCol w:w="383"/>
-        <w:gridCol w:w="383"/>
+        <w:gridCol w:w="1467"/>
+        <w:gridCol w:w="334"/>
+        <w:gridCol w:w="382"/>
+        <w:gridCol w:w="384"/>
         <w:gridCol w:w="286"/>
       </w:tblGrid>
       <w:tr>
         <w:trPr/>
         <w:tc>
           <w:tcPr>
-            <w:tcW w:w="1468" w:type="dxa"/>
+            <w:tcW w:w="1467" w:type="dxa"/>
             <w:tcBorders>
               <w:top w:val="single" w:sz="4" w:space="0" w:color="000000"/>
               <w:left w:val="single" w:sz="4" w:space="0" w:color="000000"/>
@@ -1589,7 +1968,7 @@
           </w:tcPr>
           <w:p>
             <w:pPr>
-              <w:pStyle w:val="Style14"/>
+              <w:pStyle w:val="user2"/>
               <w:spacing w:lineRule="auto" w:line="240"/>
               <w:ind w:hanging="0" w:left="0"/>
               <w:rPr/>
@@ -1602,7 +1981,7 @@
         </w:tc>
         <w:tc>
           <w:tcPr>
-            <w:tcW w:w="333" w:type="dxa"/>
+            <w:tcW w:w="334" w:type="dxa"/>
             <w:tcBorders>
               <w:top w:val="single" w:sz="4" w:space="0" w:color="000000"/>
               <w:left w:val="single" w:sz="4" w:space="0" w:color="000000"/>
@@ -1611,7 +1990,7 @@
           </w:tcPr>
           <w:p>
             <w:pPr>
-              <w:pStyle w:val="Style14"/>
+              <w:pStyle w:val="user2"/>
               <w:spacing w:lineRule="auto" w:line="240"/>
               <w:ind w:hanging="0" w:left="0"/>
               <w:rPr>
@@ -1628,7 +2007,7 @@
         </w:tc>
         <w:tc>
           <w:tcPr>
-            <w:tcW w:w="383" w:type="dxa"/>
+            <w:tcW w:w="382" w:type="dxa"/>
             <w:tcBorders>
               <w:top w:val="single" w:sz="4" w:space="0" w:color="000000"/>
               <w:left w:val="single" w:sz="4" w:space="0" w:color="000000"/>
@@ -1637,7 +2016,7 @@
           </w:tcPr>
           <w:p>
             <w:pPr>
-              <w:pStyle w:val="Style14"/>
+              <w:pStyle w:val="user2"/>
               <w:spacing w:lineRule="auto" w:line="240"/>
               <w:ind w:hanging="0" w:left="0"/>
               <w:rPr>
@@ -1661,7 +2040,7 @@
         </w:tc>
         <w:tc>
           <w:tcPr>
-            <w:tcW w:w="383" w:type="dxa"/>
+            <w:tcW w:w="384" w:type="dxa"/>
             <w:tcBorders>
               <w:top w:val="single" w:sz="4" w:space="0" w:color="000000"/>
               <w:left w:val="single" w:sz="4" w:space="0" w:color="000000"/>
@@ -1670,7 +2049,7 @@
           </w:tcPr>
           <w:p>
             <w:pPr>
-              <w:pStyle w:val="Style14"/>
+              <w:pStyle w:val="user2"/>
               <w:spacing w:lineRule="auto" w:line="240"/>
               <w:ind w:hanging="0" w:left="0"/>
               <w:rPr>
@@ -1704,7 +2083,7 @@
           </w:tcPr>
           <w:p>
             <w:pPr>
-              <w:pStyle w:val="Style14"/>
+              <w:pStyle w:val="user2"/>
               <w:spacing w:lineRule="auto" w:line="240"/>
               <w:ind w:hanging="0" w:left="0"/>
               <w:rPr>
@@ -1762,16 +2141,16 @@
         </w:tblCellMar>
       </w:tblPr>
       <w:tblGrid>
-        <w:gridCol w:w="1468"/>
-        <w:gridCol w:w="333"/>
-        <w:gridCol w:w="751"/>
-        <w:gridCol w:w="1423"/>
+        <w:gridCol w:w="1467"/>
+        <w:gridCol w:w="334"/>
+        <w:gridCol w:w="750"/>
+        <w:gridCol w:w="1424"/>
       </w:tblGrid>
       <w:tr>
         <w:trPr/>
         <w:tc>
           <w:tcPr>
-            <w:tcW w:w="1468" w:type="dxa"/>
+            <w:tcW w:w="1467" w:type="dxa"/>
             <w:tcBorders>
               <w:top w:val="single" w:sz="4" w:space="0" w:color="000000"/>
               <w:left w:val="single" w:sz="4" w:space="0" w:color="000000"/>
@@ -1780,7 +2159,7 @@
           </w:tcPr>
           <w:p>
             <w:pPr>
-              <w:pStyle w:val="Style14"/>
+              <w:pStyle w:val="user2"/>
               <w:spacing w:lineRule="auto" w:line="240"/>
               <w:ind w:hanging="0" w:left="0"/>
               <w:rPr/>
@@ -1793,7 +2172,7 @@
         </w:tc>
         <w:tc>
           <w:tcPr>
-            <w:tcW w:w="333" w:type="dxa"/>
+            <w:tcW w:w="334" w:type="dxa"/>
             <w:tcBorders>
               <w:top w:val="single" w:sz="4" w:space="0" w:color="000000"/>
               <w:left w:val="single" w:sz="4" w:space="0" w:color="000000"/>
@@ -1802,7 +2181,7 @@
           </w:tcPr>
           <w:p>
             <w:pPr>
-              <w:pStyle w:val="Style14"/>
+              <w:pStyle w:val="user2"/>
               <w:spacing w:lineRule="auto" w:line="240"/>
               <w:ind w:hanging="0" w:left="0"/>
               <w:rPr/>
@@ -1817,7 +2196,7 @@
         </w:tc>
         <w:tc>
           <w:tcPr>
-            <w:tcW w:w="751" w:type="dxa"/>
+            <w:tcW w:w="750" w:type="dxa"/>
             <w:tcBorders>
               <w:top w:val="single" w:sz="4" w:space="0" w:color="000000"/>
               <w:left w:val="single" w:sz="4" w:space="0" w:color="000000"/>
@@ -1826,7 +2205,7 @@
           </w:tcPr>
           <w:p>
             <w:pPr>
-              <w:pStyle w:val="Style14"/>
+              <w:pStyle w:val="user2"/>
               <w:spacing w:lineRule="auto" w:line="240"/>
               <w:ind w:hanging="0" w:left="0"/>
               <w:rPr>
@@ -1850,7 +2229,7 @@
         </w:tc>
         <w:tc>
           <w:tcPr>
-            <w:tcW w:w="1423" w:type="dxa"/>
+            <w:tcW w:w="1424" w:type="dxa"/>
             <w:tcBorders>
               <w:top w:val="single" w:sz="4" w:space="0" w:color="000000"/>
               <w:left w:val="single" w:sz="4" w:space="0" w:color="000000"/>
@@ -1860,7 +2239,7 @@
           </w:tcPr>
           <w:p>
             <w:pPr>
-              <w:pStyle w:val="Style14"/>
+              <w:pStyle w:val="user2"/>
               <w:spacing w:lineRule="auto" w:line="240"/>
               <w:ind w:hanging="0" w:left="0"/>
               <w:rPr>
@@ -1910,7 +2289,7 @@
       <w:r>
         <w:rPr/>
         <w:drawing>
-          <wp:anchor behindDoc="0" distT="0" distB="0" distL="0" distR="0" simplePos="0" locked="0" layoutInCell="0" allowOverlap="1" relativeHeight="5">
+          <wp:anchor behindDoc="0" distT="0" distB="0" distL="0" distR="0" simplePos="0" locked="0" layoutInCell="0" allowOverlap="1" relativeHeight="10">
             <wp:simplePos x="0" y="0"/>
             <wp:positionH relativeFrom="column">
               <wp:posOffset>4963160</wp:posOffset>
@@ -1964,7 +2343,7 @@
       </w:pPr>
       <w:r>
         <w:drawing>
-          <wp:anchor behindDoc="0" distT="0" distB="0" distL="0" distR="0" simplePos="0" locked="0" layoutInCell="0" allowOverlap="1" relativeHeight="6">
+          <wp:anchor behindDoc="0" distT="0" distB="0" distL="0" distR="0" simplePos="0" locked="0" layoutInCell="0" allowOverlap="1" relativeHeight="11">
             <wp:simplePos x="0" y="0"/>
             <wp:positionH relativeFrom="column">
               <wp:posOffset>2133600</wp:posOffset>
@@ -2028,19 +2407,7 @@
         <w:rPr>
           <w:lang w:val="en-US"/>
         </w:rPr>
-        <w:t xml:space="preserve"> </w:t>
-      </w:r>
-      <w:r>
-        <w:rPr>
-          <w:lang w:val="en-US"/>
-        </w:rPr>
-        <w:t>N/P</w:t>
-      </w:r>
-      <w:r>
-        <w:rPr>
-          <w:lang w:val="en-US"/>
-        </w:rPr>
-        <w:t xml:space="preserve"> </w:t>
+        <w:t xml:space="preserve"> N/P </w:t>
       </w:r>
       <w:r>
         <w:rPr/>
@@ -3352,12 +3719,12 @@
       <w:lang w:val="en-US" w:eastAsia="uk-UA"/>
     </w:rPr>
   </w:style>
-  <w:style w:type="character" w:styleId="user">
-    <w:name w:val="Символ нумерації (user)"/>
+  <w:style w:type="character" w:styleId="Style12">
+    <w:name w:val="Символ нумерації"/>
     <w:qFormat/>
     <w:rPr/>
   </w:style>
-  <w:style w:type="paragraph" w:styleId="Style12">
+  <w:style w:type="paragraph" w:styleId="Style13">
     <w:name w:val="Заголовок"/>
     <w:basedOn w:val="Normal"/>
     <w:next w:val="BodyText"/>
@@ -3367,7 +3734,7 @@
       <w:spacing w:before="240" w:after="120"/>
     </w:pPr>
     <w:rPr>
-      <w:rFonts w:ascii="Liberation Sans" w:hAnsi="Liberation Sans" w:eastAsia="Microsoft YaHei" w:cs="Arial Unicode MS"/>
+      <w:rFonts w:ascii="Liberation Sans" w:hAnsi="Liberation Sans" w:eastAsia="Microsoft YaHei" w:cs="Lucida Sans"/>
       <w:sz w:val="28"/>
       <w:szCs w:val="28"/>
     </w:rPr>
@@ -3404,8 +3771,34 @@
       <w:szCs w:val="24"/>
     </w:rPr>
   </w:style>
-  <w:style w:type="paragraph" w:styleId="Style13">
+  <w:style w:type="paragraph" w:styleId="Style14">
     <w:name w:val="Покажчик"/>
+    <w:basedOn w:val="Normal"/>
+    <w:qFormat/>
+    <w:pPr>
+      <w:suppressLineNumbers/>
+    </w:pPr>
+    <w:rPr>
+      <w:rFonts w:cs="Lucida Sans"/>
+    </w:rPr>
+  </w:style>
+  <w:style w:type="paragraph" w:styleId="user">
+    <w:name w:val="Заголовок (user)"/>
+    <w:basedOn w:val="Normal"/>
+    <w:next w:val="BodyText"/>
+    <w:qFormat/>
+    <w:pPr>
+      <w:keepNext w:val="true"/>
+      <w:spacing w:before="240" w:after="120"/>
+    </w:pPr>
+    <w:rPr>
+      <w:rFonts w:ascii="Liberation Sans" w:hAnsi="Liberation Sans" w:eastAsia="Microsoft YaHei" w:cs="Arial Unicode MS"/>
+      <w:sz w:val="28"/>
+      <w:szCs w:val="28"/>
+    </w:rPr>
+  </w:style>
+  <w:style w:type="paragraph" w:styleId="user1">
+    <w:name w:val="Покажчик (user)"/>
     <w:basedOn w:val="Normal"/>
     <w:qFormat/>
     <w:pPr>
@@ -3415,35 +3808,9 @@
       <w:rFonts w:cs="Arial Unicode MS"/>
     </w:rPr>
   </w:style>
-  <w:style w:type="paragraph" w:styleId="user1">
-    <w:name w:val="Заголовок (user)"/>
-    <w:basedOn w:val="Normal"/>
-    <w:next w:val="BodyText"/>
-    <w:qFormat/>
-    <w:pPr>
-      <w:keepNext w:val="true"/>
-      <w:spacing w:before="240" w:after="120"/>
-    </w:pPr>
-    <w:rPr>
-      <w:rFonts w:ascii="Liberation Sans" w:hAnsi="Liberation Sans" w:eastAsia="Microsoft YaHei" w:cs="Lucida Sans"/>
-      <w:sz w:val="28"/>
-      <w:szCs w:val="28"/>
-    </w:rPr>
-  </w:style>
-  <w:style w:type="paragraph" w:styleId="user2">
-    <w:name w:val="Покажчик (user)"/>
-    <w:basedOn w:val="Normal"/>
-    <w:qFormat/>
-    <w:pPr>
-      <w:suppressLineNumbers/>
-    </w:pPr>
-    <w:rPr>
-      <w:rFonts w:cs="Lucida Sans"/>
-    </w:rPr>
-  </w:style>
   <w:style w:type="paragraph" w:styleId="IndexHeading">
     <w:name w:val="index heading"/>
-    <w:basedOn w:val="Style12"/>
+    <w:basedOn w:val="user"/>
     <w:pPr/>
     <w:rPr/>
   </w:style>
@@ -3721,8 +4088,8 @@
     </w:pPr>
     <w:rPr/>
   </w:style>
-  <w:style w:type="paragraph" w:styleId="Style14">
-    <w:name w:val="Вміст таблиці"/>
+  <w:style w:type="paragraph" w:styleId="user2">
+    <w:name w:val="Вміст таблиці (user)"/>
     <w:basedOn w:val="Normal"/>
     <w:qFormat/>
     <w:pPr>
@@ -3731,8 +4098,8 @@
     </w:pPr>
     <w:rPr/>
   </w:style>
-  <w:style w:type="paragraph" w:styleId="user3">
-    <w:name w:val="Вміст таблиці (user)"/>
+  <w:style w:type="paragraph" w:styleId="Style15">
+    <w:name w:val="Вміст таблиці"/>
     <w:basedOn w:val="Normal"/>
     <w:qFormat/>
     <w:pPr>
@@ -3741,9 +4108,9 @@
     </w:pPr>
     <w:rPr/>
   </w:style>
-  <w:style w:type="paragraph" w:styleId="Style15">
-    <w:name w:val="Заголовок таблиці"/>
-    <w:basedOn w:val="Style14"/>
+  <w:style w:type="paragraph" w:styleId="user3">
+    <w:name w:val="Заголовок таблиці (user)"/>
+    <w:basedOn w:val="user2"/>
     <w:qFormat/>
     <w:pPr>
       <w:suppressLineNumbers/>
@@ -3754,8 +4121,8 @@
       <w:bCs/>
     </w:rPr>
   </w:style>
-  <w:style w:type="paragraph" w:styleId="Style16">
-    <w:name w:val="Верхній і нижній колонтитули"/>
+  <w:style w:type="paragraph" w:styleId="user4">
+    <w:name w:val="Верхній і нижній колонтитули (user)"/>
     <w:basedOn w:val="Normal"/>
     <w:qFormat/>
     <w:pPr>
@@ -3768,16 +4135,49 @@
     </w:pPr>
     <w:rPr/>
   </w:style>
+  <w:style w:type="paragraph" w:styleId="Style16">
+    <w:name w:val="Верхній і нижній колонтитули"/>
+    <w:basedOn w:val="Normal"/>
+    <w:qFormat/>
+    <w:pPr/>
+    <w:rPr/>
+  </w:style>
   <w:style w:type="paragraph" w:styleId="Footer">
     <w:name w:val="footer"/>
-    <w:basedOn w:val="Style16"/>
+    <w:basedOn w:val="user4"/>
     <w:pPr>
       <w:suppressLineNumbers/>
     </w:pPr>
     <w:rPr/>
   </w:style>
-  <w:style w:type="numbering" w:styleId="Style17" w:default="1">
-    <w:name w:val="Без маркерів"/>
+  <w:style w:type="paragraph" w:styleId="Header">
+    <w:name w:val="header"/>
+    <w:basedOn w:val="Style16"/>
+    <w:pPr>
+      <w:suppressLineNumbers/>
+      <w:tabs>
+        <w:tab w:val="clear" w:pos="643"/>
+        <w:tab w:val="center" w:pos="4513" w:leader="none"/>
+        <w:tab w:val="right" w:pos="9026" w:leader="none"/>
+      </w:tabs>
+    </w:pPr>
+    <w:rPr/>
+  </w:style>
+  <w:style w:type="paragraph" w:styleId="Style17">
+    <w:name w:val="Заголовок таблиці"/>
+    <w:basedOn w:val="Style15"/>
+    <w:qFormat/>
+    <w:pPr>
+      <w:suppressLineNumbers/>
+      <w:jc w:val="center"/>
+    </w:pPr>
+    <w:rPr>
+      <w:b/>
+      <w:bCs/>
+    </w:rPr>
+  </w:style>
+  <w:style w:type="numbering" w:styleId="user5" w:default="1">
+    <w:name w:val="Без маркерів (user)"/>
     <w:uiPriority w:val="99"/>
     <w:semiHidden/>
     <w:unhideWhenUsed/>

</xml_diff>

<commit_message>
feat -- TR4: copied the code from ai, Jesus please help
</commit_message>
<xml_diff>
--- a/42TR Tehnologiji Rozpodilenyh System/4/TR_KNT-122_Onyshchenko_19_PR4.docx
+++ b/42TR Tehnologiji Rozpodilenyh System/4/TR_KNT-122_Onyshchenko_19_PR4.docx
@@ -1343,12 +1343,24 @@
         <w:rPr>
           <w:lang w:val="en-US"/>
         </w:rPr>
-        <w:t>Таблиця 4.1 – Залежність прискорення від кількості процесорів (N=240000, номер робочого місця №)</w:t>
+        <w:t>Таблиця 4.1 – Залежність прискорення від кількості процесорів (N=240000, номер робочого місця №</w:t>
+      </w:r>
+      <w:r>
+        <w:rPr>
+          <w:lang w:val="en-US"/>
+        </w:rPr>
+        <w:t>19</w:t>
+      </w:r>
+      <w:r>
+        <w:rPr>
+          <w:lang w:val="en-US"/>
+        </w:rPr>
+        <w:t>)</w:t>
       </w:r>
     </w:p>
     <w:tbl>
       <w:tblPr>
-        <w:tblW w:w="9026" w:type="dxa"/>
+        <w:tblW w:w="8262" w:type="dxa"/>
         <w:jc w:val="left"/>
         <w:tblInd w:w="55" w:type="dxa"/>
         <w:tblLayout w:type="fixed"/>
@@ -1360,17 +1372,17 @@
         </w:tblCellMar>
       </w:tblPr>
       <w:tblGrid>
-        <w:gridCol w:w="2010"/>
-        <w:gridCol w:w="1805"/>
-        <w:gridCol w:w="1805"/>
-        <w:gridCol w:w="1805"/>
-        <w:gridCol w:w="1601"/>
+        <w:gridCol w:w="2098"/>
+        <w:gridCol w:w="2621"/>
+        <w:gridCol w:w="1041"/>
+        <w:gridCol w:w="1041"/>
+        <w:gridCol w:w="1461"/>
       </w:tblGrid>
       <w:tr>
         <w:trPr/>
         <w:tc>
           <w:tcPr>
-            <w:tcW w:w="2010" w:type="dxa"/>
+            <w:tcW w:w="2098" w:type="dxa"/>
             <w:tcBorders>
               <w:top w:val="single" w:sz="4" w:space="0" w:color="000000"/>
               <w:left w:val="single" w:sz="4" w:space="0" w:color="000000"/>
@@ -1380,7 +1392,7 @@
           </w:tcPr>
           <w:p>
             <w:pPr>
-              <w:pStyle w:val="user2"/>
+              <w:pStyle w:val="Style14"/>
               <w:spacing w:lineRule="auto" w:line="240"/>
               <w:ind w:hanging="0" w:left="0"/>
               <w:rPr>
@@ -1399,7 +1411,7 @@
         </w:tc>
         <w:tc>
           <w:tcPr>
-            <w:tcW w:w="1805" w:type="dxa"/>
+            <w:tcW w:w="2621" w:type="dxa"/>
             <w:tcBorders>
               <w:top w:val="single" w:sz="4" w:space="0" w:color="000000"/>
               <w:left w:val="single" w:sz="4" w:space="0" w:color="000000"/>
@@ -1409,7 +1421,7 @@
           </w:tcPr>
           <w:p>
             <w:pPr>
-              <w:pStyle w:val="user2"/>
+              <w:pStyle w:val="Style14"/>
               <w:spacing w:lineRule="auto" w:line="240"/>
               <w:ind w:hanging="0" w:left="0"/>
               <w:rPr>
@@ -1436,7 +1448,7 @@
         </w:tc>
         <w:tc>
           <w:tcPr>
-            <w:tcW w:w="1805" w:type="dxa"/>
+            <w:tcW w:w="1041" w:type="dxa"/>
             <w:tcBorders>
               <w:top w:val="single" w:sz="4" w:space="0" w:color="000000"/>
               <w:left w:val="single" w:sz="4" w:space="0" w:color="000000"/>
@@ -1446,7 +1458,7 @@
           </w:tcPr>
           <w:p>
             <w:pPr>
-              <w:pStyle w:val="user2"/>
+              <w:pStyle w:val="Style14"/>
               <w:spacing w:lineRule="auto" w:line="240"/>
               <w:ind w:hanging="0" w:left="0"/>
               <w:rPr>
@@ -1475,7 +1487,7 @@
         </w:tc>
         <w:tc>
           <w:tcPr>
-            <w:tcW w:w="1805" w:type="dxa"/>
+            <w:tcW w:w="1041" w:type="dxa"/>
             <w:tcBorders>
               <w:top w:val="single" w:sz="4" w:space="0" w:color="000000"/>
               <w:left w:val="single" w:sz="4" w:space="0" w:color="000000"/>
@@ -1485,7 +1497,7 @@
           </w:tcPr>
           <w:p>
             <w:pPr>
-              <w:pStyle w:val="user2"/>
+              <w:pStyle w:val="Style14"/>
               <w:spacing w:lineRule="auto" w:line="240"/>
               <w:ind w:hanging="0" w:left="0"/>
               <w:rPr>
@@ -1514,7 +1526,7 @@
         </w:tc>
         <w:tc>
           <w:tcPr>
-            <w:tcW w:w="1601" w:type="dxa"/>
+            <w:tcW w:w="1461" w:type="dxa"/>
             <w:tcBorders>
               <w:top w:val="single" w:sz="4" w:space="0" w:color="000000"/>
               <w:left w:val="single" w:sz="4" w:space="0" w:color="000000"/>
@@ -1525,7 +1537,7 @@
           </w:tcPr>
           <w:p>
             <w:pPr>
-              <w:pStyle w:val="user2"/>
+              <w:pStyle w:val="Style14"/>
               <w:spacing w:lineRule="auto" w:line="240"/>
               <w:ind w:hanging="0" w:left="0"/>
               <w:rPr>
@@ -1548,7 +1560,7 @@
         <w:trPr/>
         <w:tc>
           <w:tcPr>
-            <w:tcW w:w="2010" w:type="dxa"/>
+            <w:tcW w:w="2098" w:type="dxa"/>
             <w:tcBorders>
               <w:left w:val="single" w:sz="4" w:space="0" w:color="000000"/>
               <w:bottom w:val="single" w:sz="4" w:space="0" w:color="000000"/>
@@ -1557,20 +1569,26 @@
           </w:tcPr>
           <w:p>
             <w:pPr>
-              <w:pStyle w:val="user2"/>
+              <w:pStyle w:val="Style14"/>
               <w:spacing w:lineRule="auto" w:line="240"/>
               <w:ind w:hanging="0" w:left="0"/>
-              <w:rPr/>
+              <w:rPr>
+                <w:b w:val="false"/>
+                <w:bCs w:val="false"/>
+              </w:rPr>
             </w:pPr>
             <w:r>
-              <w:rPr/>
-              <w:t>13.02.2026 12:02</w:t>
+              <w:rPr>
+                <w:b w:val="false"/>
+                <w:bCs w:val="false"/>
+              </w:rPr>
+              <w:t>13.02.2026 17:38</w:t>
             </w:r>
           </w:p>
         </w:tc>
         <w:tc>
           <w:tcPr>
-            <w:tcW w:w="1805" w:type="dxa"/>
+            <w:tcW w:w="2621" w:type="dxa"/>
             <w:tcBorders>
               <w:left w:val="single" w:sz="4" w:space="0" w:color="000000"/>
               <w:bottom w:val="single" w:sz="4" w:space="0" w:color="000000"/>
@@ -1579,21 +1597,26 @@
           </w:tcPr>
           <w:p>
             <w:pPr>
-              <w:pStyle w:val="user2"/>
+              <w:pStyle w:val="Style14"/>
               <w:spacing w:lineRule="auto" w:line="240"/>
               <w:ind w:hanging="0" w:left="0"/>
-              <w:jc w:val="right"/>
-              <w:rPr/>
+              <w:rPr>
+                <w:b w:val="false"/>
+                <w:bCs w:val="false"/>
+              </w:rPr>
             </w:pPr>
             <w:r>
-              <w:rPr/>
+              <w:rPr>
+                <w:b w:val="false"/>
+                <w:bCs w:val="false"/>
+              </w:rPr>
               <w:t>1</w:t>
             </w:r>
           </w:p>
         </w:tc>
         <w:tc>
           <w:tcPr>
-            <w:tcW w:w="1805" w:type="dxa"/>
+            <w:tcW w:w="1041" w:type="dxa"/>
             <w:vMerge w:val="restart"/>
             <w:tcBorders>
               <w:left w:val="single" w:sz="4" w:space="0" w:color="000000"/>
@@ -1603,24 +1626,26 @@
           </w:tcPr>
           <w:p>
             <w:pPr>
-              <w:pStyle w:val="user2"/>
+              <w:pStyle w:val="Style14"/>
               <w:spacing w:lineRule="auto" w:line="240"/>
               <w:ind w:hanging="0" w:left="0"/>
               <w:rPr>
-                <w:lang w:val="en-US"/>
+                <w:b w:val="false"/>
+                <w:bCs w:val="false"/>
               </w:rPr>
             </w:pPr>
             <w:r>
               <w:rPr>
-                <w:lang w:val="en-US"/>
-              </w:rPr>
-              <w:t>15.539054099994246</w:t>
+                <w:b w:val="false"/>
+                <w:bCs w:val="false"/>
+              </w:rPr>
+              <w:t>24.6048</w:t>
             </w:r>
           </w:p>
         </w:tc>
         <w:tc>
           <w:tcPr>
-            <w:tcW w:w="1805" w:type="dxa"/>
+            <w:tcW w:w="1041" w:type="dxa"/>
             <w:tcBorders>
               <w:left w:val="single" w:sz="4" w:space="0" w:color="000000"/>
               <w:bottom w:val="single" w:sz="4" w:space="0" w:color="000000"/>
@@ -1629,24 +1654,26 @@
           </w:tcPr>
           <w:p>
             <w:pPr>
-              <w:pStyle w:val="user2"/>
+              <w:pStyle w:val="Style14"/>
               <w:spacing w:lineRule="auto" w:line="240"/>
               <w:ind w:hanging="0" w:left="0"/>
               <w:rPr>
-                <w:lang w:val="en-US"/>
+                <w:b w:val="false"/>
+                <w:bCs w:val="false"/>
               </w:rPr>
             </w:pPr>
             <w:r>
               <w:rPr>
-                <w:lang w:val="en-US"/>
-              </w:rPr>
-              <w:t>15.645392999984324</w:t>
+                <w:b w:val="false"/>
+                <w:bCs w:val="false"/>
+              </w:rPr>
+              <w:t>24.6048</w:t>
             </w:r>
           </w:p>
         </w:tc>
         <w:tc>
           <w:tcPr>
-            <w:tcW w:w="1601" w:type="dxa"/>
+            <w:tcW w:w="1461" w:type="dxa"/>
             <w:tcBorders>
               <w:left w:val="single" w:sz="4" w:space="0" w:color="000000"/>
               <w:bottom w:val="single" w:sz="4" w:space="0" w:color="000000"/>
@@ -1656,18 +1683,20 @@
           </w:tcPr>
           <w:p>
             <w:pPr>
-              <w:pStyle w:val="user2"/>
+              <w:pStyle w:val="Style14"/>
               <w:spacing w:lineRule="auto" w:line="240"/>
               <w:ind w:hanging="0" w:left="0"/>
               <w:rPr>
-                <w:lang w:val="en-US"/>
+                <w:b w:val="false"/>
+                <w:bCs w:val="false"/>
               </w:rPr>
             </w:pPr>
             <w:r>
               <w:rPr>
-                <w:lang w:val="en-US"/>
-              </w:rPr>
-              <w:t>0,993203181</w:t>
+                <w:b w:val="false"/>
+                <w:bCs w:val="false"/>
+              </w:rPr>
+              <w:t>1</w:t>
             </w:r>
           </w:p>
         </w:tc>
@@ -1676,7 +1705,7 @@
         <w:trPr/>
         <w:tc>
           <w:tcPr>
-            <w:tcW w:w="2010" w:type="dxa"/>
+            <w:tcW w:w="2098" w:type="dxa"/>
             <w:tcBorders>
               <w:left w:val="single" w:sz="4" w:space="0" w:color="000000"/>
               <w:bottom w:val="single" w:sz="4" w:space="0" w:color="000000"/>
@@ -1685,24 +1714,34 @@
           </w:tcPr>
           <w:p>
             <w:pPr>
-              <w:pStyle w:val="user2"/>
+              <w:pStyle w:val="Style14"/>
               <w:spacing w:lineRule="auto" w:line="240"/>
               <w:ind w:hanging="0" w:left="0"/>
               <w:rPr>
-                <w:lang w:val="en-US"/>
+                <w:b w:val="false"/>
+                <w:bCs w:val="false"/>
               </w:rPr>
             </w:pPr>
             <w:r>
               <w:rPr>
+                <w:b w:val="false"/>
+                <w:bCs w:val="false"/>
+              </w:rPr>
+              <w:t>13.02.2026 17:</w:t>
+            </w:r>
+            <w:r>
+              <w:rPr>
+                <w:b w:val="false"/>
+                <w:bCs w:val="false"/>
                 <w:lang w:val="en-US"/>
               </w:rPr>
-              <w:t>13.02.2026 12:13</w:t>
+              <w:t>40</w:t>
             </w:r>
           </w:p>
         </w:tc>
         <w:tc>
           <w:tcPr>
-            <w:tcW w:w="1805" w:type="dxa"/>
+            <w:tcW w:w="2621" w:type="dxa"/>
             <w:tcBorders>
               <w:left w:val="single" w:sz="4" w:space="0" w:color="000000"/>
               <w:bottom w:val="single" w:sz="4" w:space="0" w:color="000000"/>
@@ -1711,17 +1750,18 @@
           </w:tcPr>
           <w:p>
             <w:pPr>
-              <w:pStyle w:val="user2"/>
+              <w:pStyle w:val="Style14"/>
               <w:spacing w:lineRule="auto" w:line="240"/>
               <w:ind w:hanging="0" w:left="0"/>
-              <w:jc w:val="right"/>
-              <w:rPr>
-                <w:lang w:val="en-US"/>
+              <w:rPr>
+                <w:b w:val="false"/>
+                <w:bCs w:val="false"/>
               </w:rPr>
             </w:pPr>
             <w:r>
               <w:rPr>
-                <w:lang w:val="en-US"/>
+                <w:b w:val="false"/>
+                <w:bCs w:val="false"/>
               </w:rPr>
               <w:t>2</w:t>
             </w:r>
@@ -1729,7 +1769,7 @@
         </w:tc>
         <w:tc>
           <w:tcPr>
-            <w:tcW w:w="1805" w:type="dxa"/>
+            <w:tcW w:w="1041" w:type="dxa"/>
             <w:vMerge w:val="continue"/>
             <w:tcBorders>
               <w:left w:val="single" w:sz="4" w:space="0" w:color="000000"/>
@@ -1739,23 +1779,25 @@
           </w:tcPr>
           <w:p>
             <w:pPr>
-              <w:pStyle w:val="user2"/>
+              <w:pStyle w:val="Style14"/>
               <w:spacing w:lineRule="auto" w:line="240"/>
               <w:ind w:hanging="0" w:left="0"/>
               <w:rPr>
-                <w:lang w:val="en-US"/>
+                <w:b w:val="false"/>
+                <w:bCs w:val="false"/>
               </w:rPr>
             </w:pPr>
             <w:r>
               <w:rPr>
-                <w:lang w:val="en-US"/>
+                <w:b w:val="false"/>
+                <w:bCs w:val="false"/>
               </w:rPr>
             </w:r>
           </w:p>
         </w:tc>
         <w:tc>
           <w:tcPr>
-            <w:tcW w:w="1805" w:type="dxa"/>
+            <w:tcW w:w="1041" w:type="dxa"/>
             <w:tcBorders>
               <w:left w:val="single" w:sz="4" w:space="0" w:color="000000"/>
               <w:bottom w:val="single" w:sz="4" w:space="0" w:color="000000"/>
@@ -1764,24 +1806,26 @@
           </w:tcPr>
           <w:p>
             <w:pPr>
-              <w:pStyle w:val="user2"/>
+              <w:pStyle w:val="Style14"/>
               <w:spacing w:lineRule="auto" w:line="240"/>
               <w:ind w:hanging="0" w:left="0"/>
               <w:rPr>
-                <w:lang w:val="en-US"/>
+                <w:b w:val="false"/>
+                <w:bCs w:val="false"/>
               </w:rPr>
             </w:pPr>
             <w:r>
               <w:rPr>
-                <w:lang w:val="en-US"/>
-              </w:rPr>
-              <w:t>16.29839929996524</w:t>
+                <w:b w:val="false"/>
+                <w:bCs w:val="false"/>
+              </w:rPr>
+              <w:t>12.5789</w:t>
             </w:r>
           </w:p>
         </w:tc>
         <w:tc>
           <w:tcPr>
-            <w:tcW w:w="1601" w:type="dxa"/>
+            <w:tcW w:w="1461" w:type="dxa"/>
             <w:tcBorders>
               <w:left w:val="single" w:sz="4" w:space="0" w:color="000000"/>
               <w:bottom w:val="single" w:sz="4" w:space="0" w:color="000000"/>
@@ -1791,18 +1835,20 @@
           </w:tcPr>
           <w:p>
             <w:pPr>
-              <w:pStyle w:val="user2"/>
+              <w:pStyle w:val="Style14"/>
               <w:spacing w:lineRule="auto" w:line="240"/>
               <w:ind w:hanging="0" w:left="0"/>
               <w:rPr>
-                <w:lang w:val="en-US"/>
+                <w:b w:val="false"/>
+                <w:bCs w:val="false"/>
               </w:rPr>
             </w:pPr>
             <w:r>
               <w:rPr>
-                <w:lang w:val="en-US"/>
-              </w:rPr>
-              <w:t>0,959934329</w:t>
+                <w:b w:val="false"/>
+                <w:bCs w:val="false"/>
+              </w:rPr>
+              <w:t>1.95603749</w:t>
             </w:r>
           </w:p>
         </w:tc>
@@ -1811,7 +1857,7 @@
         <w:trPr/>
         <w:tc>
           <w:tcPr>
-            <w:tcW w:w="2010" w:type="dxa"/>
+            <w:tcW w:w="2098" w:type="dxa"/>
             <w:tcBorders>
               <w:left w:val="single" w:sz="4" w:space="0" w:color="000000"/>
               <w:bottom w:val="single" w:sz="4" w:space="0" w:color="000000"/>
@@ -1820,24 +1866,28 @@
           </w:tcPr>
           <w:p>
             <w:pPr>
-              <w:pStyle w:val="user2"/>
+              <w:pStyle w:val="Style14"/>
               <w:spacing w:lineRule="auto" w:line="240"/>
               <w:ind w:hanging="0" w:left="0"/>
               <w:rPr>
+                <w:b w:val="false"/>
+                <w:bCs w:val="false"/>
                 <w:lang w:val="en-US"/>
               </w:rPr>
             </w:pPr>
             <w:r>
               <w:rPr>
+                <w:b w:val="false"/>
+                <w:bCs w:val="false"/>
                 <w:lang w:val="en-US"/>
               </w:rPr>
-              <w:t>13.02.2026 12:14</w:t>
+              <w:t>13.02.2026 17:41</w:t>
             </w:r>
           </w:p>
         </w:tc>
         <w:tc>
           <w:tcPr>
-            <w:tcW w:w="1805" w:type="dxa"/>
+            <w:tcW w:w="2621" w:type="dxa"/>
             <w:tcBorders>
               <w:left w:val="single" w:sz="4" w:space="0" w:color="000000"/>
               <w:bottom w:val="single" w:sz="4" w:space="0" w:color="000000"/>
@@ -1846,25 +1896,28 @@
           </w:tcPr>
           <w:p>
             <w:pPr>
-              <w:pStyle w:val="user2"/>
+              <w:pStyle w:val="Style14"/>
               <w:spacing w:lineRule="auto" w:line="240"/>
               <w:ind w:hanging="0" w:left="0"/>
-              <w:jc w:val="right"/>
-              <w:rPr>
+              <w:rPr>
+                <w:b w:val="false"/>
+                <w:bCs w:val="false"/>
                 <w:lang w:val="en-US"/>
               </w:rPr>
             </w:pPr>
             <w:r>
               <w:rPr>
+                <w:b w:val="false"/>
+                <w:bCs w:val="false"/>
                 <w:lang w:val="en-US"/>
               </w:rPr>
-              <w:t>4</w:t>
+              <w:t>3</w:t>
             </w:r>
           </w:p>
         </w:tc>
         <w:tc>
           <w:tcPr>
-            <w:tcW w:w="1805" w:type="dxa"/>
+            <w:tcW w:w="1041" w:type="dxa"/>
             <w:vMerge w:val="continue"/>
             <w:tcBorders>
               <w:left w:val="single" w:sz="4" w:space="0" w:color="000000"/>
@@ -1874,23 +1927,25 @@
           </w:tcPr>
           <w:p>
             <w:pPr>
-              <w:pStyle w:val="user2"/>
+              <w:pStyle w:val="Style14"/>
               <w:spacing w:lineRule="auto" w:line="240"/>
               <w:ind w:hanging="0" w:left="0"/>
               <w:rPr>
-                <w:lang w:val="en-US"/>
+                <w:b w:val="false"/>
+                <w:bCs w:val="false"/>
               </w:rPr>
             </w:pPr>
             <w:r>
               <w:rPr>
-                <w:lang w:val="en-US"/>
+                <w:b w:val="false"/>
+                <w:bCs w:val="false"/>
               </w:rPr>
             </w:r>
           </w:p>
         </w:tc>
         <w:tc>
           <w:tcPr>
-            <w:tcW w:w="1805" w:type="dxa"/>
+            <w:tcW w:w="1041" w:type="dxa"/>
             <w:tcBorders>
               <w:left w:val="single" w:sz="4" w:space="0" w:color="000000"/>
               <w:bottom w:val="single" w:sz="4" w:space="0" w:color="000000"/>
@@ -1899,24 +1954,26 @@
           </w:tcPr>
           <w:p>
             <w:pPr>
-              <w:pStyle w:val="user2"/>
+              <w:pStyle w:val="Style14"/>
               <w:spacing w:lineRule="auto" w:line="240"/>
               <w:ind w:hanging="0" w:left="0"/>
               <w:rPr>
-                <w:lang w:val="en-US"/>
+                <w:b w:val="false"/>
+                <w:bCs w:val="false"/>
               </w:rPr>
             </w:pPr>
             <w:r>
               <w:rPr>
-                <w:lang w:val="en-US"/>
-              </w:rPr>
-              <w:t>16.573226300009992</w:t>
+                <w:b w:val="false"/>
+                <w:bCs w:val="false"/>
+              </w:rPr>
+              <w:t>8.4814</w:t>
             </w:r>
           </w:p>
         </w:tc>
         <w:tc>
           <w:tcPr>
-            <w:tcW w:w="1601" w:type="dxa"/>
+            <w:tcW w:w="1461" w:type="dxa"/>
             <w:tcBorders>
               <w:left w:val="single" w:sz="4" w:space="0" w:color="000000"/>
               <w:bottom w:val="single" w:sz="4" w:space="0" w:color="000000"/>
@@ -1926,18 +1983,168 @@
           </w:tcPr>
           <w:p>
             <w:pPr>
-              <w:pStyle w:val="user2"/>
+              <w:pStyle w:val="Style14"/>
               <w:spacing w:lineRule="auto" w:line="240"/>
               <w:ind w:hanging="0" w:left="0"/>
               <w:rPr>
-                <w:lang w:val="en-US"/>
+                <w:b w:val="false"/>
+                <w:bCs w:val="false"/>
               </w:rPr>
             </w:pPr>
             <w:r>
               <w:rPr>
+                <w:b w:val="false"/>
+                <w:bCs w:val="false"/>
+              </w:rPr>
+              <w:t>2.90103049</w:t>
+            </w:r>
+          </w:p>
+        </w:tc>
+      </w:tr>
+      <w:tr>
+        <w:trPr/>
+        <w:tc>
+          <w:tcPr>
+            <w:tcW w:w="2098" w:type="dxa"/>
+            <w:tcBorders>
+              <w:left w:val="single" w:sz="4" w:space="0" w:color="000000"/>
+              <w:bottom w:val="single" w:sz="4" w:space="0" w:color="000000"/>
+            </w:tcBorders>
+            <w:vAlign w:val="center"/>
+          </w:tcPr>
+          <w:p>
+            <w:pPr>
+              <w:pStyle w:val="Style14"/>
+              <w:spacing w:lineRule="auto" w:line="240"/>
+              <w:ind w:hanging="0" w:left="0"/>
+              <w:rPr>
+                <w:b w:val="false"/>
+                <w:bCs w:val="false"/>
                 <w:lang w:val="en-US"/>
               </w:rPr>
-              <w:t>0,937599826</w:t>
+            </w:pPr>
+            <w:r>
+              <w:rPr>
+                <w:b w:val="false"/>
+                <w:bCs w:val="false"/>
+                <w:lang w:val="en-US"/>
+              </w:rPr>
+              <w:t>13.02.2026 17:43</w:t>
+            </w:r>
+          </w:p>
+        </w:tc>
+        <w:tc>
+          <w:tcPr>
+            <w:tcW w:w="2621" w:type="dxa"/>
+            <w:tcBorders>
+              <w:left w:val="single" w:sz="4" w:space="0" w:color="000000"/>
+              <w:bottom w:val="single" w:sz="4" w:space="0" w:color="000000"/>
+            </w:tcBorders>
+            <w:vAlign w:val="center"/>
+          </w:tcPr>
+          <w:p>
+            <w:pPr>
+              <w:pStyle w:val="Style14"/>
+              <w:spacing w:lineRule="auto" w:line="240"/>
+              <w:ind w:hanging="0" w:left="0"/>
+              <w:rPr>
+                <w:b w:val="false"/>
+                <w:bCs w:val="false"/>
+                <w:lang w:val="en-US"/>
+              </w:rPr>
+            </w:pPr>
+            <w:r>
+              <w:rPr>
+                <w:b w:val="false"/>
+                <w:bCs w:val="false"/>
+                <w:lang w:val="en-US"/>
+              </w:rPr>
+              <w:t>4</w:t>
+            </w:r>
+          </w:p>
+        </w:tc>
+        <w:tc>
+          <w:tcPr>
+            <w:tcW w:w="1041" w:type="dxa"/>
+            <w:vMerge w:val="continue"/>
+            <w:tcBorders>
+              <w:left w:val="single" w:sz="4" w:space="0" w:color="000000"/>
+              <w:bottom w:val="single" w:sz="4" w:space="0" w:color="000000"/>
+            </w:tcBorders>
+            <w:vAlign w:val="center"/>
+          </w:tcPr>
+          <w:p>
+            <w:pPr>
+              <w:pStyle w:val="Style14"/>
+              <w:spacing w:lineRule="auto" w:line="240"/>
+              <w:ind w:hanging="0" w:left="0"/>
+              <w:rPr>
+                <w:b w:val="false"/>
+                <w:bCs w:val="false"/>
+              </w:rPr>
+            </w:pPr>
+            <w:r>
+              <w:rPr>
+                <w:b w:val="false"/>
+                <w:bCs w:val="false"/>
+              </w:rPr>
+            </w:r>
+          </w:p>
+        </w:tc>
+        <w:tc>
+          <w:tcPr>
+            <w:tcW w:w="1041" w:type="dxa"/>
+            <w:tcBorders>
+              <w:left w:val="single" w:sz="4" w:space="0" w:color="000000"/>
+              <w:bottom w:val="single" w:sz="4" w:space="0" w:color="000000"/>
+            </w:tcBorders>
+            <w:vAlign w:val="center"/>
+          </w:tcPr>
+          <w:p>
+            <w:pPr>
+              <w:pStyle w:val="Style14"/>
+              <w:spacing w:lineRule="auto" w:line="240"/>
+              <w:ind w:hanging="0" w:left="0"/>
+              <w:rPr>
+                <w:b w:val="false"/>
+                <w:bCs w:val="false"/>
+              </w:rPr>
+            </w:pPr>
+            <w:r>
+              <w:rPr>
+                <w:b w:val="false"/>
+                <w:bCs w:val="false"/>
+              </w:rPr>
+              <w:t>6.6128</w:t>
+            </w:r>
+          </w:p>
+        </w:tc>
+        <w:tc>
+          <w:tcPr>
+            <w:tcW w:w="1461" w:type="dxa"/>
+            <w:tcBorders>
+              <w:left w:val="single" w:sz="4" w:space="0" w:color="000000"/>
+              <w:bottom w:val="single" w:sz="4" w:space="0" w:color="000000"/>
+              <w:right w:val="single" w:sz="4" w:space="0" w:color="000000"/>
+            </w:tcBorders>
+            <w:vAlign w:val="center"/>
+          </w:tcPr>
+          <w:p>
+            <w:pPr>
+              <w:pStyle w:val="Style14"/>
+              <w:spacing w:lineRule="auto" w:line="240"/>
+              <w:ind w:hanging="0" w:left="0"/>
+              <w:rPr>
+                <w:b w:val="false"/>
+                <w:bCs w:val="false"/>
+              </w:rPr>
+            </w:pPr>
+            <w:r>
+              <w:rPr>
+                <w:b w:val="false"/>
+                <w:bCs w:val="false"/>
+              </w:rPr>
+              <w:t>3.72078393</w:t>
             </w:r>
           </w:p>
         </w:tc>
@@ -2016,7 +2223,7 @@
           </w:tcPr>
           <w:p>
             <w:pPr>
-              <w:pStyle w:val="user2"/>
+              <w:pStyle w:val="Style14"/>
               <w:spacing w:lineRule="auto" w:line="240"/>
               <w:ind w:hanging="0" w:left="0"/>
               <w:rPr/>
@@ -2038,7 +2245,7 @@
           </w:tcPr>
           <w:p>
             <w:pPr>
-              <w:pStyle w:val="user2"/>
+              <w:pStyle w:val="Style14"/>
               <w:spacing w:lineRule="auto" w:line="240"/>
               <w:ind w:hanging="0" w:left="0"/>
               <w:rPr>
@@ -2064,7 +2271,7 @@
           </w:tcPr>
           <w:p>
             <w:pPr>
-              <w:pStyle w:val="user2"/>
+              <w:pStyle w:val="Style14"/>
               <w:spacing w:lineRule="auto" w:line="240"/>
               <w:ind w:hanging="0" w:left="0"/>
               <w:rPr>
@@ -2097,7 +2304,7 @@
           </w:tcPr>
           <w:p>
             <w:pPr>
-              <w:pStyle w:val="user2"/>
+              <w:pStyle w:val="Style14"/>
               <w:spacing w:lineRule="auto" w:line="240"/>
               <w:ind w:hanging="0" w:left="0"/>
               <w:rPr>
@@ -2131,7 +2338,7 @@
           </w:tcPr>
           <w:p>
             <w:pPr>
-              <w:pStyle w:val="user2"/>
+              <w:pStyle w:val="Style14"/>
               <w:spacing w:lineRule="auto" w:line="240"/>
               <w:ind w:hanging="0" w:left="0"/>
               <w:rPr>
@@ -2207,7 +2414,7 @@
           </w:tcPr>
           <w:p>
             <w:pPr>
-              <w:pStyle w:val="user2"/>
+              <w:pStyle w:val="Style14"/>
               <w:spacing w:lineRule="auto" w:line="240"/>
               <w:ind w:hanging="0" w:left="0"/>
               <w:rPr/>
@@ -2229,7 +2436,7 @@
           </w:tcPr>
           <w:p>
             <w:pPr>
-              <w:pStyle w:val="user2"/>
+              <w:pStyle w:val="Style14"/>
               <w:spacing w:lineRule="auto" w:line="240"/>
               <w:ind w:hanging="0" w:left="0"/>
               <w:rPr/>
@@ -2253,7 +2460,7 @@
           </w:tcPr>
           <w:p>
             <w:pPr>
-              <w:pStyle w:val="user2"/>
+              <w:pStyle w:val="Style14"/>
               <w:spacing w:lineRule="auto" w:line="240"/>
               <w:ind w:hanging="0" w:left="0"/>
               <w:rPr>
@@ -2287,7 +2494,7 @@
           </w:tcPr>
           <w:p>
             <w:pPr>
-              <w:pStyle w:val="user2"/>
+              <w:pStyle w:val="Style14"/>
               <w:spacing w:lineRule="auto" w:line="240"/>
               <w:ind w:hanging="0" w:left="0"/>
               <w:rPr>
@@ -3767,12 +3974,12 @@
       <w:lang w:val="en-US" w:eastAsia="uk-UA"/>
     </w:rPr>
   </w:style>
-  <w:style w:type="character" w:styleId="Style12">
-    <w:name w:val="Символ нумерації"/>
+  <w:style w:type="character" w:styleId="user">
+    <w:name w:val="Символ нумерації (user)"/>
     <w:qFormat/>
     <w:rPr/>
   </w:style>
-  <w:style w:type="paragraph" w:styleId="Style13">
+  <w:style w:type="paragraph" w:styleId="Style12">
     <w:name w:val="Заголовок"/>
     <w:basedOn w:val="Normal"/>
     <w:next w:val="BodyText"/>
@@ -3782,7 +3989,7 @@
       <w:spacing w:before="240" w:after="120"/>
     </w:pPr>
     <w:rPr>
-      <w:rFonts w:ascii="Liberation Sans" w:hAnsi="Liberation Sans" w:eastAsia="Microsoft YaHei" w:cs="Lucida Sans"/>
+      <w:rFonts w:ascii="Liberation Sans" w:hAnsi="Liberation Sans" w:eastAsia="Microsoft YaHei" w:cs="Arial Unicode MS"/>
       <w:sz w:val="28"/>
       <w:szCs w:val="28"/>
     </w:rPr>
@@ -3819,8 +4026,34 @@
       <w:szCs w:val="24"/>
     </w:rPr>
   </w:style>
-  <w:style w:type="paragraph" w:styleId="Style14">
+  <w:style w:type="paragraph" w:styleId="Style13">
     <w:name w:val="Покажчик"/>
+    <w:basedOn w:val="Normal"/>
+    <w:qFormat/>
+    <w:pPr>
+      <w:suppressLineNumbers/>
+    </w:pPr>
+    <w:rPr>
+      <w:rFonts w:cs="Arial Unicode MS"/>
+    </w:rPr>
+  </w:style>
+  <w:style w:type="paragraph" w:styleId="user1">
+    <w:name w:val="Заголовок (user)"/>
+    <w:basedOn w:val="Normal"/>
+    <w:next w:val="BodyText"/>
+    <w:qFormat/>
+    <w:pPr>
+      <w:keepNext w:val="true"/>
+      <w:spacing w:before="240" w:after="120"/>
+    </w:pPr>
+    <w:rPr>
+      <w:rFonts w:ascii="Liberation Sans" w:hAnsi="Liberation Sans" w:eastAsia="Microsoft YaHei" w:cs="Lucida Sans"/>
+      <w:sz w:val="28"/>
+      <w:szCs w:val="28"/>
+    </w:rPr>
+  </w:style>
+  <w:style w:type="paragraph" w:styleId="user2">
+    <w:name w:val="Покажчик (user)"/>
     <w:basedOn w:val="Normal"/>
     <w:qFormat/>
     <w:pPr>
@@ -3830,35 +4063,9 @@
       <w:rFonts w:cs="Lucida Sans"/>
     </w:rPr>
   </w:style>
-  <w:style w:type="paragraph" w:styleId="user">
-    <w:name w:val="Заголовок (user)"/>
-    <w:basedOn w:val="Normal"/>
-    <w:next w:val="BodyText"/>
-    <w:qFormat/>
-    <w:pPr>
-      <w:keepNext w:val="true"/>
-      <w:spacing w:before="240" w:after="120"/>
-    </w:pPr>
-    <w:rPr>
-      <w:rFonts w:ascii="Liberation Sans" w:hAnsi="Liberation Sans" w:eastAsia="Microsoft YaHei" w:cs="Arial Unicode MS"/>
-      <w:sz w:val="28"/>
-      <w:szCs w:val="28"/>
-    </w:rPr>
-  </w:style>
-  <w:style w:type="paragraph" w:styleId="user1">
-    <w:name w:val="Покажчик (user)"/>
-    <w:basedOn w:val="Normal"/>
-    <w:qFormat/>
-    <w:pPr>
-      <w:suppressLineNumbers/>
-    </w:pPr>
-    <w:rPr>
-      <w:rFonts w:cs="Arial Unicode MS"/>
-    </w:rPr>
-  </w:style>
   <w:style w:type="paragraph" w:styleId="IndexHeading">
     <w:name w:val="index heading"/>
-    <w:basedOn w:val="user"/>
+    <w:basedOn w:val="Style12"/>
     <w:pPr/>
     <w:rPr/>
   </w:style>
@@ -4136,8 +4343,8 @@
     </w:pPr>
     <w:rPr/>
   </w:style>
-  <w:style w:type="paragraph" w:styleId="user2">
-    <w:name w:val="Вміст таблиці (user)"/>
+  <w:style w:type="paragraph" w:styleId="Style14">
+    <w:name w:val="Вміст таблиці"/>
     <w:basedOn w:val="Normal"/>
     <w:qFormat/>
     <w:pPr>
@@ -4146,8 +4353,8 @@
     </w:pPr>
     <w:rPr/>
   </w:style>
-  <w:style w:type="paragraph" w:styleId="Style15">
-    <w:name w:val="Вміст таблиці"/>
+  <w:style w:type="paragraph" w:styleId="user3">
+    <w:name w:val="Вміст таблиці (user)"/>
     <w:basedOn w:val="Normal"/>
     <w:qFormat/>
     <w:pPr>
@@ -4156,9 +4363,9 @@
     </w:pPr>
     <w:rPr/>
   </w:style>
-  <w:style w:type="paragraph" w:styleId="user3">
-    <w:name w:val="Заголовок таблиці (user)"/>
-    <w:basedOn w:val="user2"/>
+  <w:style w:type="paragraph" w:styleId="Style15">
+    <w:name w:val="Заголовок таблиці"/>
+    <w:basedOn w:val="Style14"/>
     <w:qFormat/>
     <w:pPr>
       <w:suppressLineNumbers/>
@@ -4169,8 +4376,8 @@
       <w:bCs/>
     </w:rPr>
   </w:style>
-  <w:style w:type="paragraph" w:styleId="user4">
-    <w:name w:val="Верхній і нижній колонтитули (user)"/>
+  <w:style w:type="paragraph" w:styleId="Style16">
+    <w:name w:val="Верхній і нижній колонтитули"/>
     <w:basedOn w:val="Normal"/>
     <w:qFormat/>
     <w:pPr>
@@ -4183,8 +4390,8 @@
     </w:pPr>
     <w:rPr/>
   </w:style>
-  <w:style w:type="paragraph" w:styleId="Style16">
-    <w:name w:val="Верхній і нижній колонтитули"/>
+  <w:style w:type="paragraph" w:styleId="user4">
+    <w:name w:val="Верхній і нижній колонтитули (user)"/>
     <w:basedOn w:val="Normal"/>
     <w:qFormat/>
     <w:pPr/>
@@ -4192,7 +4399,7 @@
   </w:style>
   <w:style w:type="paragraph" w:styleId="Footer">
     <w:name w:val="footer"/>
-    <w:basedOn w:val="user4"/>
+    <w:basedOn w:val="Style16"/>
     <w:pPr>
       <w:suppressLineNumbers/>
     </w:pPr>
@@ -4200,7 +4407,7 @@
   </w:style>
   <w:style w:type="paragraph" w:styleId="Header">
     <w:name w:val="header"/>
-    <w:basedOn w:val="Style16"/>
+    <w:basedOn w:val="user4"/>
     <w:pPr>
       <w:suppressLineNumbers/>
       <w:tabs>
@@ -4211,9 +4418,9 @@
     </w:pPr>
     <w:rPr/>
   </w:style>
-  <w:style w:type="paragraph" w:styleId="Style17">
-    <w:name w:val="Заголовок таблиці"/>
-    <w:basedOn w:val="Style15"/>
+  <w:style w:type="paragraph" w:styleId="user5">
+    <w:name w:val="Заголовок таблиці (user)"/>
+    <w:basedOn w:val="user3"/>
     <w:qFormat/>
     <w:pPr>
       <w:suppressLineNumbers/>
@@ -4224,8 +4431,8 @@
       <w:bCs/>
     </w:rPr>
   </w:style>
-  <w:style w:type="numbering" w:styleId="user5" w:default="1">
-    <w:name w:val="Без маркерів (user)"/>
+  <w:style w:type="numbering" w:styleId="Style17" w:default="1">
+    <w:name w:val="Без маркерів"/>
     <w:uiPriority w:val="99"/>
     <w:semiHidden/>
     <w:unhideWhenUsed/>

</xml_diff>

<commit_message>
feat -- TR4: tasks 4.2.1.1 and 4.2.1.2 done, praise King Jesus
</commit_message>
<xml_diff>
--- a/42TR Tehnologiji Rozpodilenyh System/4/TR_KNT-122_Onyshchenko_19_PR4.docx
+++ b/42TR Tehnologiji Rozpodilenyh System/4/TR_KNT-122_Onyshchenko_19_PR4.docx
@@ -1360,7 +1360,7 @@
     </w:p>
     <w:tbl>
       <w:tblPr>
-        <w:tblW w:w="8262" w:type="dxa"/>
+        <w:tblW w:w="5292" w:type="dxa"/>
         <w:jc w:val="left"/>
         <w:tblInd w:w="55" w:type="dxa"/>
         <w:tblLayout w:type="fixed"/>
@@ -1372,17 +1372,17 @@
         </w:tblCellMar>
       </w:tblPr>
       <w:tblGrid>
-        <w:gridCol w:w="2098"/>
+        <w:gridCol w:w="1580"/>
         <w:gridCol w:w="2621"/>
-        <w:gridCol w:w="1041"/>
-        <w:gridCol w:w="1041"/>
-        <w:gridCol w:w="1461"/>
+        <w:gridCol w:w="398"/>
+        <w:gridCol w:w="407"/>
+        <w:gridCol w:w="286"/>
       </w:tblGrid>
       <w:tr>
         <w:trPr/>
         <w:tc>
           <w:tcPr>
-            <w:tcW w:w="2098" w:type="dxa"/>
+            <w:tcW w:w="1580" w:type="dxa"/>
             <w:tcBorders>
               <w:top w:val="single" w:sz="4" w:space="0" w:color="000000"/>
               <w:left w:val="single" w:sz="4" w:space="0" w:color="000000"/>
@@ -1396,14 +1396,14 @@
               <w:spacing w:lineRule="auto" w:line="240"/>
               <w:ind w:hanging="0" w:left="0"/>
               <w:rPr>
-                <w:b/>
-                <w:bCs/>
+                <w:b w:val="false"/>
+                <w:bCs w:val="false"/>
               </w:rPr>
             </w:pPr>
             <w:r>
               <w:rPr>
-                <w:b/>
-                <w:bCs/>
+                <w:b w:val="false"/>
+                <w:bCs w:val="false"/>
               </w:rPr>
               <w:t>Дата та час</w:t>
             </w:r>
@@ -1425,21 +1425,21 @@
               <w:spacing w:lineRule="auto" w:line="240"/>
               <w:ind w:hanging="0" w:left="0"/>
               <w:rPr>
-                <w:b/>
-                <w:bCs/>
+                <w:b w:val="false"/>
+                <w:bCs w:val="false"/>
               </w:rPr>
             </w:pPr>
             <w:r>
               <w:rPr>
-                <w:b/>
-                <w:bCs/>
+                <w:b w:val="false"/>
+                <w:bCs w:val="false"/>
               </w:rPr>
               <w:t xml:space="preserve">Число процесорів </w:t>
             </w:r>
             <w:r>
               <w:rPr>
-                <w:b/>
-                <w:bCs/>
+                <w:b w:val="false"/>
+                <w:bCs w:val="false"/>
                 <w:lang w:val="en-US"/>
               </w:rPr>
               <w:t>P</w:t>
@@ -1448,7 +1448,7 @@
         </w:tc>
         <w:tc>
           <w:tcPr>
-            <w:tcW w:w="1041" w:type="dxa"/>
+            <w:tcW w:w="398" w:type="dxa"/>
             <w:tcBorders>
               <w:top w:val="single" w:sz="4" w:space="0" w:color="000000"/>
               <w:left w:val="single" w:sz="4" w:space="0" w:color="000000"/>
@@ -1462,22 +1462,22 @@
               <w:spacing w:lineRule="auto" w:line="240"/>
               <w:ind w:hanging="0" w:left="0"/>
               <w:rPr>
-                <w:b/>
-                <w:bCs/>
+                <w:b w:val="false"/>
+                <w:bCs w:val="false"/>
               </w:rPr>
             </w:pPr>
             <w:r>
               <w:rPr>
-                <w:b/>
-                <w:bCs/>
+                <w:b w:val="false"/>
+                <w:bCs w:val="false"/>
                 <w:lang w:val="en-US"/>
               </w:rPr>
               <w:t>T</w:t>
             </w:r>
             <w:r>
               <w:rPr>
-                <w:b/>
-                <w:bCs/>
+                <w:b w:val="false"/>
+                <w:bCs w:val="false"/>
                 <w:vertAlign w:val="subscript"/>
                 <w:lang w:val="en-US"/>
               </w:rPr>
@@ -1487,7 +1487,7 @@
         </w:tc>
         <w:tc>
           <w:tcPr>
-            <w:tcW w:w="1041" w:type="dxa"/>
+            <w:tcW w:w="407" w:type="dxa"/>
             <w:tcBorders>
               <w:top w:val="single" w:sz="4" w:space="0" w:color="000000"/>
               <w:left w:val="single" w:sz="4" w:space="0" w:color="000000"/>
@@ -1501,22 +1501,22 @@
               <w:spacing w:lineRule="auto" w:line="240"/>
               <w:ind w:hanging="0" w:left="0"/>
               <w:rPr>
-                <w:b/>
-                <w:bCs/>
+                <w:b w:val="false"/>
+                <w:bCs w:val="false"/>
               </w:rPr>
             </w:pPr>
             <w:r>
               <w:rPr>
-                <w:b/>
-                <w:bCs/>
+                <w:b w:val="false"/>
+                <w:bCs w:val="false"/>
                 <w:lang w:val="en-US"/>
               </w:rPr>
               <w:t>T</w:t>
             </w:r>
             <w:r>
               <w:rPr>
-                <w:b/>
-                <w:bCs/>
+                <w:b w:val="false"/>
+                <w:bCs w:val="false"/>
                 <w:vertAlign w:val="subscript"/>
                 <w:lang w:val="en-US"/>
               </w:rPr>
@@ -1526,7 +1526,7 @@
         </w:tc>
         <w:tc>
           <w:tcPr>
-            <w:tcW w:w="1461" w:type="dxa"/>
+            <w:tcW w:w="286" w:type="dxa"/>
             <w:tcBorders>
               <w:top w:val="single" w:sz="4" w:space="0" w:color="000000"/>
               <w:left w:val="single" w:sz="4" w:space="0" w:color="000000"/>
@@ -1541,14 +1541,14 @@
               <w:spacing w:lineRule="auto" w:line="240"/>
               <w:ind w:hanging="0" w:left="0"/>
               <w:rPr>
-                <w:b/>
-                <w:bCs/>
+                <w:b w:val="false"/>
+                <w:bCs w:val="false"/>
               </w:rPr>
             </w:pPr>
             <w:r>
               <w:rPr>
-                <w:b/>
-                <w:bCs/>
+                <w:b w:val="false"/>
+                <w:bCs w:val="false"/>
                 <w:lang w:val="en-US"/>
               </w:rPr>
               <w:t>S</w:t>
@@ -1556,613 +1556,7 @@
           </w:p>
         </w:tc>
       </w:tr>
-      <w:tr>
-        <w:trPr/>
-        <w:tc>
-          <w:tcPr>
-            <w:tcW w:w="2098" w:type="dxa"/>
-            <w:tcBorders>
-              <w:left w:val="single" w:sz="4" w:space="0" w:color="000000"/>
-              <w:bottom w:val="single" w:sz="4" w:space="0" w:color="000000"/>
-            </w:tcBorders>
-            <w:vAlign w:val="center"/>
-          </w:tcPr>
-          <w:p>
-            <w:pPr>
-              <w:pStyle w:val="Style14"/>
-              <w:spacing w:lineRule="auto" w:line="240"/>
-              <w:ind w:hanging="0" w:left="0"/>
-              <w:rPr>
-                <w:b w:val="false"/>
-                <w:bCs w:val="false"/>
-              </w:rPr>
-            </w:pPr>
-            <w:r>
-              <w:rPr>
-                <w:b w:val="false"/>
-                <w:bCs w:val="false"/>
-              </w:rPr>
-              <w:t>13.02.2026 17:38</w:t>
-            </w:r>
-          </w:p>
-        </w:tc>
-        <w:tc>
-          <w:tcPr>
-            <w:tcW w:w="2621" w:type="dxa"/>
-            <w:tcBorders>
-              <w:left w:val="single" w:sz="4" w:space="0" w:color="000000"/>
-              <w:bottom w:val="single" w:sz="4" w:space="0" w:color="000000"/>
-            </w:tcBorders>
-            <w:vAlign w:val="center"/>
-          </w:tcPr>
-          <w:p>
-            <w:pPr>
-              <w:pStyle w:val="Style14"/>
-              <w:spacing w:lineRule="auto" w:line="240"/>
-              <w:ind w:hanging="0" w:left="0"/>
-              <w:rPr>
-                <w:b w:val="false"/>
-                <w:bCs w:val="false"/>
-              </w:rPr>
-            </w:pPr>
-            <w:r>
-              <w:rPr>
-                <w:b w:val="false"/>
-                <w:bCs w:val="false"/>
-              </w:rPr>
-              <w:t>1</w:t>
-            </w:r>
-          </w:p>
-        </w:tc>
-        <w:tc>
-          <w:tcPr>
-            <w:tcW w:w="1041" w:type="dxa"/>
-            <w:vMerge w:val="restart"/>
-            <w:tcBorders>
-              <w:left w:val="single" w:sz="4" w:space="0" w:color="000000"/>
-              <w:bottom w:val="single" w:sz="4" w:space="0" w:color="000000"/>
-            </w:tcBorders>
-            <w:vAlign w:val="center"/>
-          </w:tcPr>
-          <w:p>
-            <w:pPr>
-              <w:pStyle w:val="Style14"/>
-              <w:spacing w:lineRule="auto" w:line="240"/>
-              <w:ind w:hanging="0" w:left="0"/>
-              <w:rPr>
-                <w:b w:val="false"/>
-                <w:bCs w:val="false"/>
-              </w:rPr>
-            </w:pPr>
-            <w:r>
-              <w:rPr>
-                <w:b w:val="false"/>
-                <w:bCs w:val="false"/>
-              </w:rPr>
-              <w:t>24.6048</w:t>
-            </w:r>
-          </w:p>
-        </w:tc>
-        <w:tc>
-          <w:tcPr>
-            <w:tcW w:w="1041" w:type="dxa"/>
-            <w:tcBorders>
-              <w:left w:val="single" w:sz="4" w:space="0" w:color="000000"/>
-              <w:bottom w:val="single" w:sz="4" w:space="0" w:color="000000"/>
-            </w:tcBorders>
-            <w:vAlign w:val="center"/>
-          </w:tcPr>
-          <w:p>
-            <w:pPr>
-              <w:pStyle w:val="Style14"/>
-              <w:spacing w:lineRule="auto" w:line="240"/>
-              <w:ind w:hanging="0" w:left="0"/>
-              <w:rPr>
-                <w:b w:val="false"/>
-                <w:bCs w:val="false"/>
-              </w:rPr>
-            </w:pPr>
-            <w:r>
-              <w:rPr>
-                <w:b w:val="false"/>
-                <w:bCs w:val="false"/>
-              </w:rPr>
-              <w:t>24.6048</w:t>
-            </w:r>
-          </w:p>
-        </w:tc>
-        <w:tc>
-          <w:tcPr>
-            <w:tcW w:w="1461" w:type="dxa"/>
-            <w:tcBorders>
-              <w:left w:val="single" w:sz="4" w:space="0" w:color="000000"/>
-              <w:bottom w:val="single" w:sz="4" w:space="0" w:color="000000"/>
-              <w:right w:val="single" w:sz="4" w:space="0" w:color="000000"/>
-            </w:tcBorders>
-            <w:vAlign w:val="center"/>
-          </w:tcPr>
-          <w:p>
-            <w:pPr>
-              <w:pStyle w:val="Style14"/>
-              <w:spacing w:lineRule="auto" w:line="240"/>
-              <w:ind w:hanging="0" w:left="0"/>
-              <w:rPr>
-                <w:b w:val="false"/>
-                <w:bCs w:val="false"/>
-              </w:rPr>
-            </w:pPr>
-            <w:r>
-              <w:rPr>
-                <w:b w:val="false"/>
-                <w:bCs w:val="false"/>
-              </w:rPr>
-              <w:t>1</w:t>
-            </w:r>
-          </w:p>
-        </w:tc>
-      </w:tr>
-      <w:tr>
-        <w:trPr/>
-        <w:tc>
-          <w:tcPr>
-            <w:tcW w:w="2098" w:type="dxa"/>
-            <w:tcBorders>
-              <w:left w:val="single" w:sz="4" w:space="0" w:color="000000"/>
-              <w:bottom w:val="single" w:sz="4" w:space="0" w:color="000000"/>
-            </w:tcBorders>
-            <w:vAlign w:val="center"/>
-          </w:tcPr>
-          <w:p>
-            <w:pPr>
-              <w:pStyle w:val="Style14"/>
-              <w:spacing w:lineRule="auto" w:line="240"/>
-              <w:ind w:hanging="0" w:left="0"/>
-              <w:rPr>
-                <w:b w:val="false"/>
-                <w:bCs w:val="false"/>
-              </w:rPr>
-            </w:pPr>
-            <w:r>
-              <w:rPr>
-                <w:b w:val="false"/>
-                <w:bCs w:val="false"/>
-              </w:rPr>
-              <w:t>13.02.2026 17:</w:t>
-            </w:r>
-            <w:r>
-              <w:rPr>
-                <w:b w:val="false"/>
-                <w:bCs w:val="false"/>
-                <w:lang w:val="en-US"/>
-              </w:rPr>
-              <w:t>40</w:t>
-            </w:r>
-          </w:p>
-        </w:tc>
-        <w:tc>
-          <w:tcPr>
-            <w:tcW w:w="2621" w:type="dxa"/>
-            <w:tcBorders>
-              <w:left w:val="single" w:sz="4" w:space="0" w:color="000000"/>
-              <w:bottom w:val="single" w:sz="4" w:space="0" w:color="000000"/>
-            </w:tcBorders>
-            <w:vAlign w:val="center"/>
-          </w:tcPr>
-          <w:p>
-            <w:pPr>
-              <w:pStyle w:val="Style14"/>
-              <w:spacing w:lineRule="auto" w:line="240"/>
-              <w:ind w:hanging="0" w:left="0"/>
-              <w:rPr>
-                <w:b w:val="false"/>
-                <w:bCs w:val="false"/>
-              </w:rPr>
-            </w:pPr>
-            <w:r>
-              <w:rPr>
-                <w:b w:val="false"/>
-                <w:bCs w:val="false"/>
-              </w:rPr>
-              <w:t>2</w:t>
-            </w:r>
-          </w:p>
-        </w:tc>
-        <w:tc>
-          <w:tcPr>
-            <w:tcW w:w="1041" w:type="dxa"/>
-            <w:vMerge w:val="continue"/>
-            <w:tcBorders>
-              <w:left w:val="single" w:sz="4" w:space="0" w:color="000000"/>
-              <w:bottom w:val="single" w:sz="4" w:space="0" w:color="000000"/>
-            </w:tcBorders>
-            <w:vAlign w:val="center"/>
-          </w:tcPr>
-          <w:p>
-            <w:pPr>
-              <w:pStyle w:val="Style14"/>
-              <w:spacing w:lineRule="auto" w:line="240"/>
-              <w:ind w:hanging="0" w:left="0"/>
-              <w:rPr>
-                <w:b w:val="false"/>
-                <w:bCs w:val="false"/>
-              </w:rPr>
-            </w:pPr>
-            <w:r>
-              <w:rPr>
-                <w:b w:val="false"/>
-                <w:bCs w:val="false"/>
-              </w:rPr>
-            </w:r>
-          </w:p>
-        </w:tc>
-        <w:tc>
-          <w:tcPr>
-            <w:tcW w:w="1041" w:type="dxa"/>
-            <w:tcBorders>
-              <w:left w:val="single" w:sz="4" w:space="0" w:color="000000"/>
-              <w:bottom w:val="single" w:sz="4" w:space="0" w:color="000000"/>
-            </w:tcBorders>
-            <w:vAlign w:val="center"/>
-          </w:tcPr>
-          <w:p>
-            <w:pPr>
-              <w:pStyle w:val="Style14"/>
-              <w:spacing w:lineRule="auto" w:line="240"/>
-              <w:ind w:hanging="0" w:left="0"/>
-              <w:rPr>
-                <w:b w:val="false"/>
-                <w:bCs w:val="false"/>
-              </w:rPr>
-            </w:pPr>
-            <w:r>
-              <w:rPr>
-                <w:b w:val="false"/>
-                <w:bCs w:val="false"/>
-              </w:rPr>
-              <w:t>12.5789</w:t>
-            </w:r>
-          </w:p>
-        </w:tc>
-        <w:tc>
-          <w:tcPr>
-            <w:tcW w:w="1461" w:type="dxa"/>
-            <w:tcBorders>
-              <w:left w:val="single" w:sz="4" w:space="0" w:color="000000"/>
-              <w:bottom w:val="single" w:sz="4" w:space="0" w:color="000000"/>
-              <w:right w:val="single" w:sz="4" w:space="0" w:color="000000"/>
-            </w:tcBorders>
-            <w:vAlign w:val="center"/>
-          </w:tcPr>
-          <w:p>
-            <w:pPr>
-              <w:pStyle w:val="Style14"/>
-              <w:spacing w:lineRule="auto" w:line="240"/>
-              <w:ind w:hanging="0" w:left="0"/>
-              <w:rPr>
-                <w:b w:val="false"/>
-                <w:bCs w:val="false"/>
-              </w:rPr>
-            </w:pPr>
-            <w:r>
-              <w:rPr>
-                <w:b w:val="false"/>
-                <w:bCs w:val="false"/>
-              </w:rPr>
-              <w:t>1.95603749</w:t>
-            </w:r>
-          </w:p>
-        </w:tc>
-      </w:tr>
-      <w:tr>
-        <w:trPr/>
-        <w:tc>
-          <w:tcPr>
-            <w:tcW w:w="2098" w:type="dxa"/>
-            <w:tcBorders>
-              <w:left w:val="single" w:sz="4" w:space="0" w:color="000000"/>
-              <w:bottom w:val="single" w:sz="4" w:space="0" w:color="000000"/>
-            </w:tcBorders>
-            <w:vAlign w:val="center"/>
-          </w:tcPr>
-          <w:p>
-            <w:pPr>
-              <w:pStyle w:val="Style14"/>
-              <w:spacing w:lineRule="auto" w:line="240"/>
-              <w:ind w:hanging="0" w:left="0"/>
-              <w:rPr>
-                <w:b w:val="false"/>
-                <w:bCs w:val="false"/>
-                <w:lang w:val="en-US"/>
-              </w:rPr>
-            </w:pPr>
-            <w:r>
-              <w:rPr>
-                <w:b w:val="false"/>
-                <w:bCs w:val="false"/>
-                <w:lang w:val="en-US"/>
-              </w:rPr>
-              <w:t>13.02.2026 17:41</w:t>
-            </w:r>
-          </w:p>
-        </w:tc>
-        <w:tc>
-          <w:tcPr>
-            <w:tcW w:w="2621" w:type="dxa"/>
-            <w:tcBorders>
-              <w:left w:val="single" w:sz="4" w:space="0" w:color="000000"/>
-              <w:bottom w:val="single" w:sz="4" w:space="0" w:color="000000"/>
-            </w:tcBorders>
-            <w:vAlign w:val="center"/>
-          </w:tcPr>
-          <w:p>
-            <w:pPr>
-              <w:pStyle w:val="Style14"/>
-              <w:spacing w:lineRule="auto" w:line="240"/>
-              <w:ind w:hanging="0" w:left="0"/>
-              <w:rPr>
-                <w:b w:val="false"/>
-                <w:bCs w:val="false"/>
-                <w:lang w:val="en-US"/>
-              </w:rPr>
-            </w:pPr>
-            <w:r>
-              <w:rPr>
-                <w:b w:val="false"/>
-                <w:bCs w:val="false"/>
-                <w:lang w:val="en-US"/>
-              </w:rPr>
-              <w:t>3</w:t>
-            </w:r>
-          </w:p>
-        </w:tc>
-        <w:tc>
-          <w:tcPr>
-            <w:tcW w:w="1041" w:type="dxa"/>
-            <w:vMerge w:val="continue"/>
-            <w:tcBorders>
-              <w:left w:val="single" w:sz="4" w:space="0" w:color="000000"/>
-              <w:bottom w:val="single" w:sz="4" w:space="0" w:color="000000"/>
-            </w:tcBorders>
-            <w:vAlign w:val="center"/>
-          </w:tcPr>
-          <w:p>
-            <w:pPr>
-              <w:pStyle w:val="Style14"/>
-              <w:spacing w:lineRule="auto" w:line="240"/>
-              <w:ind w:hanging="0" w:left="0"/>
-              <w:rPr>
-                <w:b w:val="false"/>
-                <w:bCs w:val="false"/>
-              </w:rPr>
-            </w:pPr>
-            <w:r>
-              <w:rPr>
-                <w:b w:val="false"/>
-                <w:bCs w:val="false"/>
-              </w:rPr>
-            </w:r>
-          </w:p>
-        </w:tc>
-        <w:tc>
-          <w:tcPr>
-            <w:tcW w:w="1041" w:type="dxa"/>
-            <w:tcBorders>
-              <w:left w:val="single" w:sz="4" w:space="0" w:color="000000"/>
-              <w:bottom w:val="single" w:sz="4" w:space="0" w:color="000000"/>
-            </w:tcBorders>
-            <w:vAlign w:val="center"/>
-          </w:tcPr>
-          <w:p>
-            <w:pPr>
-              <w:pStyle w:val="Style14"/>
-              <w:spacing w:lineRule="auto" w:line="240"/>
-              <w:ind w:hanging="0" w:left="0"/>
-              <w:rPr>
-                <w:b w:val="false"/>
-                <w:bCs w:val="false"/>
-              </w:rPr>
-            </w:pPr>
-            <w:r>
-              <w:rPr>
-                <w:b w:val="false"/>
-                <w:bCs w:val="false"/>
-              </w:rPr>
-              <w:t>8.4814</w:t>
-            </w:r>
-          </w:p>
-        </w:tc>
-        <w:tc>
-          <w:tcPr>
-            <w:tcW w:w="1461" w:type="dxa"/>
-            <w:tcBorders>
-              <w:left w:val="single" w:sz="4" w:space="0" w:color="000000"/>
-              <w:bottom w:val="single" w:sz="4" w:space="0" w:color="000000"/>
-              <w:right w:val="single" w:sz="4" w:space="0" w:color="000000"/>
-            </w:tcBorders>
-            <w:vAlign w:val="center"/>
-          </w:tcPr>
-          <w:p>
-            <w:pPr>
-              <w:pStyle w:val="Style14"/>
-              <w:spacing w:lineRule="auto" w:line="240"/>
-              <w:ind w:hanging="0" w:left="0"/>
-              <w:rPr>
-                <w:b w:val="false"/>
-                <w:bCs w:val="false"/>
-              </w:rPr>
-            </w:pPr>
-            <w:r>
-              <w:rPr>
-                <w:b w:val="false"/>
-                <w:bCs w:val="false"/>
-              </w:rPr>
-              <w:t>2.90103049</w:t>
-            </w:r>
-          </w:p>
-        </w:tc>
-      </w:tr>
-      <w:tr>
-        <w:trPr/>
-        <w:tc>
-          <w:tcPr>
-            <w:tcW w:w="2098" w:type="dxa"/>
-            <w:tcBorders>
-              <w:left w:val="single" w:sz="4" w:space="0" w:color="000000"/>
-              <w:bottom w:val="single" w:sz="4" w:space="0" w:color="000000"/>
-            </w:tcBorders>
-            <w:vAlign w:val="center"/>
-          </w:tcPr>
-          <w:p>
-            <w:pPr>
-              <w:pStyle w:val="Style14"/>
-              <w:spacing w:lineRule="auto" w:line="240"/>
-              <w:ind w:hanging="0" w:left="0"/>
-              <w:rPr>
-                <w:b w:val="false"/>
-                <w:bCs w:val="false"/>
-                <w:lang w:val="en-US"/>
-              </w:rPr>
-            </w:pPr>
-            <w:r>
-              <w:rPr>
-                <w:b w:val="false"/>
-                <w:bCs w:val="false"/>
-                <w:lang w:val="en-US"/>
-              </w:rPr>
-              <w:t>13.02.2026 17:43</w:t>
-            </w:r>
-          </w:p>
-        </w:tc>
-        <w:tc>
-          <w:tcPr>
-            <w:tcW w:w="2621" w:type="dxa"/>
-            <w:tcBorders>
-              <w:left w:val="single" w:sz="4" w:space="0" w:color="000000"/>
-              <w:bottom w:val="single" w:sz="4" w:space="0" w:color="000000"/>
-            </w:tcBorders>
-            <w:vAlign w:val="center"/>
-          </w:tcPr>
-          <w:p>
-            <w:pPr>
-              <w:pStyle w:val="Style14"/>
-              <w:spacing w:lineRule="auto" w:line="240"/>
-              <w:ind w:hanging="0" w:left="0"/>
-              <w:rPr>
-                <w:b w:val="false"/>
-                <w:bCs w:val="false"/>
-                <w:lang w:val="en-US"/>
-              </w:rPr>
-            </w:pPr>
-            <w:r>
-              <w:rPr>
-                <w:b w:val="false"/>
-                <w:bCs w:val="false"/>
-                <w:lang w:val="en-US"/>
-              </w:rPr>
-              <w:t>4</w:t>
-            </w:r>
-          </w:p>
-        </w:tc>
-        <w:tc>
-          <w:tcPr>
-            <w:tcW w:w="1041" w:type="dxa"/>
-            <w:vMerge w:val="continue"/>
-            <w:tcBorders>
-              <w:left w:val="single" w:sz="4" w:space="0" w:color="000000"/>
-              <w:bottom w:val="single" w:sz="4" w:space="0" w:color="000000"/>
-            </w:tcBorders>
-            <w:vAlign w:val="center"/>
-          </w:tcPr>
-          <w:p>
-            <w:pPr>
-              <w:pStyle w:val="Style14"/>
-              <w:spacing w:lineRule="auto" w:line="240"/>
-              <w:ind w:hanging="0" w:left="0"/>
-              <w:rPr>
-                <w:b w:val="false"/>
-                <w:bCs w:val="false"/>
-              </w:rPr>
-            </w:pPr>
-            <w:r>
-              <w:rPr>
-                <w:b w:val="false"/>
-                <w:bCs w:val="false"/>
-              </w:rPr>
-            </w:r>
-          </w:p>
-        </w:tc>
-        <w:tc>
-          <w:tcPr>
-            <w:tcW w:w="1041" w:type="dxa"/>
-            <w:tcBorders>
-              <w:left w:val="single" w:sz="4" w:space="0" w:color="000000"/>
-              <w:bottom w:val="single" w:sz="4" w:space="0" w:color="000000"/>
-            </w:tcBorders>
-            <w:vAlign w:val="center"/>
-          </w:tcPr>
-          <w:p>
-            <w:pPr>
-              <w:pStyle w:val="Style14"/>
-              <w:spacing w:lineRule="auto" w:line="240"/>
-              <w:ind w:hanging="0" w:left="0"/>
-              <w:rPr>
-                <w:b w:val="false"/>
-                <w:bCs w:val="false"/>
-              </w:rPr>
-            </w:pPr>
-            <w:r>
-              <w:rPr>
-                <w:b w:val="false"/>
-                <w:bCs w:val="false"/>
-              </w:rPr>
-              <w:t>6.6128</w:t>
-            </w:r>
-          </w:p>
-        </w:tc>
-        <w:tc>
-          <w:tcPr>
-            <w:tcW w:w="1461" w:type="dxa"/>
-            <w:tcBorders>
-              <w:left w:val="single" w:sz="4" w:space="0" w:color="000000"/>
-              <w:bottom w:val="single" w:sz="4" w:space="0" w:color="000000"/>
-              <w:right w:val="single" w:sz="4" w:space="0" w:color="000000"/>
-            </w:tcBorders>
-            <w:vAlign w:val="center"/>
-          </w:tcPr>
-          <w:p>
-            <w:pPr>
-              <w:pStyle w:val="Style14"/>
-              <w:spacing w:lineRule="auto" w:line="240"/>
-              <w:ind w:hanging="0" w:left="0"/>
-              <w:rPr>
-                <w:b w:val="false"/>
-                <w:bCs w:val="false"/>
-              </w:rPr>
-            </w:pPr>
-            <w:r>
-              <w:rPr>
-                <w:b w:val="false"/>
-                <w:bCs w:val="false"/>
-              </w:rPr>
-              <w:t>3.72078393</w:t>
-            </w:r>
-          </w:p>
-        </w:tc>
-      </w:tr>
     </w:tbl>
-    <w:p>
-      <w:pPr>
-        <w:pStyle w:val="P1"/>
-        <w:rPr>
-          <w:lang w:val="en-US"/>
-        </w:rPr>
-      </w:pPr>
-      <w:r>
-        <w:rPr>
-          <w:lang w:val="en-US"/>
-        </w:rPr>
-      </w:r>
-    </w:p>
     <w:p>
       <w:pPr>
         <w:pStyle w:val="P1"/>
@@ -3078,12 +2472,2453 @@
     </w:p>
     <w:p>
       <w:pPr>
+        <w:pStyle w:val="P1"/>
+        <w:rPr/>
+      </w:pPr>
+      <w:r>
+        <w:rPr/>
+      </w:r>
+    </w:p>
+    <w:p>
+      <w:pPr>
         <w:pStyle w:val="h11"/>
         <w:rPr/>
       </w:pPr>
       <w:r>
         <w:rPr/>
         <w:t>Виконання</w:t>
+      </w:r>
+    </w:p>
+    <w:p>
+      <w:pPr>
+        <w:pStyle w:val="H2"/>
+        <w:rPr/>
+      </w:pPr>
+      <w:r>
+        <w:rPr/>
+        <w:t>4.2.1.1 Програма</w:t>
+      </w:r>
+    </w:p>
+    <w:p>
+      <w:pPr>
+        <w:pStyle w:val="H3"/>
+        <w:rPr/>
+      </w:pPr>
+      <w:r>
+        <w:rPr/>
+        <w:t>Завдання</w:t>
+      </w:r>
+    </w:p>
+    <w:p>
+      <w:pPr>
+        <w:pStyle w:val="P1"/>
+        <w:rPr/>
+      </w:pPr>
+      <w:r>
+        <w:rPr/>
+      </w:r>
+    </w:p>
+    <w:p>
+      <w:pPr>
+        <w:pStyle w:val="Normal"/>
+        <w:rPr/>
+      </w:pPr>
+      <w:r>
+        <w:rPr/>
+        <w:t>Створити програму обчислення суми ряду.</w:t>
+      </w:r>
+    </w:p>
+    <w:p>
+      <w:pPr>
+        <w:pStyle w:val="P1"/>
+        <w:ind w:hanging="0" w:left="0"/>
+        <w:rPr>
+          <w:i w:val="false"/>
+          <w:i w:val="false"/>
+          <w:iCs w:val="false"/>
+          <w:sz w:val="28"/>
+          <w:lang w:val="uk-UA"/>
+        </w:rPr>
+      </w:pPr>
+      <w:r>
+        <w:drawing>
+          <wp:anchor behindDoc="0" distT="0" distB="0" distL="0" distR="0" simplePos="0" locked="0" layoutInCell="0" allowOverlap="1" relativeHeight="13">
+            <wp:simplePos x="0" y="0"/>
+            <wp:positionH relativeFrom="column">
+              <wp:posOffset>-376555</wp:posOffset>
+            </wp:positionH>
+            <wp:positionV relativeFrom="paragraph">
+              <wp:posOffset>-57150</wp:posOffset>
+            </wp:positionV>
+            <wp:extent cx="871220" cy="391160"/>
+            <wp:effectExtent l="0" t="0" r="0" b="0"/>
+            <wp:wrapSquare wrapText="largest"/>
+            <wp:docPr id="11" name="Зображення2 копія 1"/>
+            <wp:cNvGraphicFramePr>
+              <a:graphicFrameLocks xmlns:a="http://schemas.openxmlformats.org/drawingml/2006/main" noChangeAspect="1"/>
+            </wp:cNvGraphicFramePr>
+            <a:graphic xmlns:a="http://schemas.openxmlformats.org/drawingml/2006/main">
+              <a:graphicData uri="http://schemas.openxmlformats.org/drawingml/2006/picture">
+                <pic:pic xmlns:pic="http://schemas.openxmlformats.org/drawingml/2006/picture">
+                  <pic:nvPicPr>
+                    <pic:cNvPr id="11" name="Зображення2 копія 1"/>
+                    <pic:cNvPicPr>
+                      <a:picLocks noChangeAspect="1" noChangeArrowheads="1"/>
+                    </pic:cNvPicPr>
+                  </pic:nvPicPr>
+                  <pic:blipFill>
+                    <a:blip r:embed="rId12"/>
+                    <a:stretch>
+                      <a:fillRect/>
+                    </a:stretch>
+                  </pic:blipFill>
+                  <pic:spPr bwMode="auto">
+                    <a:xfrm>
+                      <a:off x="0" y="0"/>
+                      <a:ext cx="871220" cy="391160"/>
+                    </a:xfrm>
+                    <a:prstGeom prst="rect">
+                      <a:avLst/>
+                    </a:prstGeom>
+                    <a:noFill/>
+                  </pic:spPr>
+                </pic:pic>
+              </a:graphicData>
+            </a:graphic>
+          </wp:anchor>
+        </w:drawing>
+        <w:drawing>
+          <wp:anchor behindDoc="0" distT="0" distB="0" distL="0" distR="0" simplePos="0" locked="0" layoutInCell="0" allowOverlap="1" relativeHeight="14">
+            <wp:simplePos x="0" y="0"/>
+            <wp:positionH relativeFrom="column">
+              <wp:posOffset>2297430</wp:posOffset>
+            </wp:positionH>
+            <wp:positionV relativeFrom="paragraph">
+              <wp:posOffset>514350</wp:posOffset>
+            </wp:positionV>
+            <wp:extent cx="4025265" cy="668020"/>
+            <wp:effectExtent l="0" t="0" r="0" b="0"/>
+            <wp:wrapSquare wrapText="largest"/>
+            <wp:docPr id="12" name="Зображення3 копія 1"/>
+            <wp:cNvGraphicFramePr>
+              <a:graphicFrameLocks xmlns:a="http://schemas.openxmlformats.org/drawingml/2006/main" noChangeAspect="1"/>
+            </wp:cNvGraphicFramePr>
+            <a:graphic xmlns:a="http://schemas.openxmlformats.org/drawingml/2006/main">
+              <a:graphicData uri="http://schemas.openxmlformats.org/drawingml/2006/picture">
+                <pic:pic xmlns:pic="http://schemas.openxmlformats.org/drawingml/2006/picture">
+                  <pic:nvPicPr>
+                    <pic:cNvPr id="12" name="Зображення3 копія 1"/>
+                    <pic:cNvPicPr>
+                      <a:picLocks noChangeAspect="1" noChangeArrowheads="1"/>
+                    </pic:cNvPicPr>
+                  </pic:nvPicPr>
+                  <pic:blipFill>
+                    <a:blip r:embed="rId13"/>
+                    <a:stretch>
+                      <a:fillRect/>
+                    </a:stretch>
+                  </pic:blipFill>
+                  <pic:spPr bwMode="auto">
+                    <a:xfrm>
+                      <a:off x="0" y="0"/>
+                      <a:ext cx="4025265" cy="668020"/>
+                    </a:xfrm>
+                    <a:prstGeom prst="rect">
+                      <a:avLst/>
+                    </a:prstGeom>
+                    <a:noFill/>
+                  </pic:spPr>
+                </pic:pic>
+              </a:graphicData>
+            </a:graphic>
+          </wp:anchor>
+        </w:drawing>
+      </w:r>
+      <w:r>
+        <w:rPr>
+          <w:i w:val="false"/>
+          <w:iCs w:val="false"/>
+          <w:sz w:val="28"/>
+          <w:lang w:val="uk-UA"/>
+        </w:rPr>
+        <w:t xml:space="preserve">, де </w:t>
+      </w:r>
+      <w:r>
+        <w:rPr>
+          <w:i w:val="false"/>
+          <w:iCs w:val="false"/>
+          <w:sz w:val="28"/>
+          <w:lang w:val="en-US"/>
+        </w:rPr>
+        <w:t>i=0,1,…,N; N=240 000, x</w:t>
+      </w:r>
+      <w:r>
+        <w:rPr>
+          <w:i w:val="false"/>
+          <w:iCs w:val="false"/>
+          <w:sz w:val="28"/>
+          <w:vertAlign w:val="subscript"/>
+          <w:lang w:val="en-US"/>
+        </w:rPr>
+        <w:t>i</w:t>
+      </w:r>
+      <w:r>
+        <w:rPr>
+          <w:i w:val="false"/>
+          <w:iCs w:val="false"/>
+          <w:position w:val="0"/>
+          <w:sz w:val="28"/>
+          <w:sz w:val="28"/>
+          <w:vertAlign w:val="baseline"/>
+          <w:lang w:val="en-US"/>
+        </w:rPr>
+        <w:t xml:space="preserve"> = 0.0001 * I, a</w:t>
+      </w:r>
+      <w:r>
+        <w:rPr>
+          <w:i w:val="false"/>
+          <w:iCs w:val="false"/>
+          <w:sz w:val="28"/>
+          <w:vertAlign w:val="subscript"/>
+          <w:lang w:val="en-US"/>
+        </w:rPr>
+        <w:t>i</w:t>
+      </w:r>
+      <w:r>
+        <w:rPr>
+          <w:i w:val="false"/>
+          <w:iCs w:val="false"/>
+          <w:position w:val="0"/>
+          <w:sz w:val="28"/>
+          <w:sz w:val="28"/>
+          <w:vertAlign w:val="baseline"/>
+          <w:lang w:val="en-US"/>
+        </w:rPr>
+        <w:t xml:space="preserve"> – </w:t>
+      </w:r>
+      <w:r>
+        <w:rPr>
+          <w:i w:val="false"/>
+          <w:iCs w:val="false"/>
+          <w:position w:val="0"/>
+          <w:sz w:val="28"/>
+          <w:sz w:val="28"/>
+          <w:vertAlign w:val="baseline"/>
+          <w:lang w:val="uk-UA"/>
+        </w:rPr>
+        <w:t xml:space="preserve">випадкові дійсні числа в діапазоні (-1, 1). Функцію </w:t>
+      </w:r>
+      <w:r>
+        <w:rPr>
+          <w:i w:val="false"/>
+          <w:iCs w:val="false"/>
+          <w:position w:val="0"/>
+          <w:sz w:val="28"/>
+          <w:sz w:val="28"/>
+          <w:vertAlign w:val="baseline"/>
+          <w:lang w:val="en-US"/>
+        </w:rPr>
+        <w:t>sin(x</w:t>
+      </w:r>
+      <w:r>
+        <w:rPr>
+          <w:i w:val="false"/>
+          <w:iCs w:val="false"/>
+          <w:sz w:val="28"/>
+          <w:vertAlign w:val="subscript"/>
+          <w:lang w:val="en-US"/>
+        </w:rPr>
+        <w:t>i</w:t>
+      </w:r>
+      <w:r>
+        <w:rPr>
+          <w:i w:val="false"/>
+          <w:iCs w:val="false"/>
+          <w:position w:val="0"/>
+          <w:sz w:val="28"/>
+          <w:sz w:val="28"/>
+          <w:vertAlign w:val="baseline"/>
+          <w:lang w:val="en-US"/>
+        </w:rPr>
+        <w:t xml:space="preserve">) </w:t>
+      </w:r>
+      <w:r>
+        <w:rPr>
+          <w:i w:val="false"/>
+          <w:iCs w:val="false"/>
+          <w:position w:val="0"/>
+          <w:sz w:val="28"/>
+          <w:sz w:val="28"/>
+          <w:vertAlign w:val="baseline"/>
+          <w:lang w:val="uk-UA"/>
+        </w:rPr>
+        <w:t xml:space="preserve">обчислювати за допомогою розкладання її в ряд Тейлора: </w:t>
+      </w:r>
+    </w:p>
+    <w:p>
+      <w:pPr>
+        <w:pStyle w:val="P1"/>
+        <w:ind w:hanging="0" w:left="0"/>
+        <w:rPr>
+          <w:i w:val="false"/>
+          <w:i w:val="false"/>
+          <w:iCs w:val="false"/>
+          <w:sz w:val="28"/>
+          <w:lang w:val="uk-UA"/>
+        </w:rPr>
+      </w:pPr>
+      <w:r>
+        <w:rPr>
+          <w:i w:val="false"/>
+          <w:iCs w:val="false"/>
+          <w:sz w:val="28"/>
+          <w:lang w:val="uk-UA"/>
+        </w:rPr>
+        <w:t xml:space="preserve">Обчислення кожного значення функції </w:t>
+      </w:r>
+      <w:r>
+        <w:rPr>
+          <w:i w:val="false"/>
+          <w:iCs w:val="false"/>
+          <w:sz w:val="28"/>
+          <w:lang w:val="en-US"/>
+        </w:rPr>
+        <w:t>sin(x</w:t>
+      </w:r>
+      <w:r>
+        <w:rPr>
+          <w:i w:val="false"/>
+          <w:iCs w:val="false"/>
+          <w:sz w:val="28"/>
+          <w:vertAlign w:val="subscript"/>
+          <w:lang w:val="en-US"/>
+        </w:rPr>
+        <w:t>i</w:t>
+      </w:r>
+      <w:r>
+        <w:rPr>
+          <w:i w:val="false"/>
+          <w:iCs w:val="false"/>
+          <w:position w:val="0"/>
+          <w:sz w:val="28"/>
+          <w:sz w:val="28"/>
+          <w:vertAlign w:val="baseline"/>
+          <w:lang w:val="en-US"/>
+        </w:rPr>
+        <w:t xml:space="preserve">) </w:t>
+      </w:r>
+      <w:r>
+        <w:rPr>
+          <w:i w:val="false"/>
+          <w:iCs w:val="false"/>
+          <w:position w:val="0"/>
+          <w:sz w:val="28"/>
+          <w:sz w:val="28"/>
+          <w:vertAlign w:val="baseline"/>
+          <w:lang w:val="uk-UA"/>
+        </w:rPr>
+        <w:t>можна організувати за наступним алгоритмом:</w:t>
+      </w:r>
+    </w:p>
+    <w:p>
+      <w:pPr>
+        <w:pStyle w:val="P1"/>
+        <w:ind w:hanging="0" w:left="0"/>
+        <w:rPr>
+          <w:i w:val="false"/>
+          <w:i w:val="false"/>
+          <w:iCs w:val="false"/>
+          <w:sz w:val="28"/>
+          <w:lang w:val="en-US"/>
+        </w:rPr>
+      </w:pPr>
+      <w:r>
+        <w:rPr>
+          <w:i w:val="false"/>
+          <w:iCs w:val="false"/>
+          <w:sz w:val="28"/>
+          <w:lang w:val="en-US"/>
+        </w:rPr>
+        <w:t>a) y = x; s = y; k = 1;</w:t>
+      </w:r>
+    </w:p>
+    <w:p>
+      <w:pPr>
+        <w:pStyle w:val="P1"/>
+        <w:ind w:hanging="0" w:left="0"/>
+        <w:rPr>
+          <w:i w:val="false"/>
+          <w:i w:val="false"/>
+          <w:iCs w:val="false"/>
+          <w:sz w:val="28"/>
+          <w:lang w:val="uk-UA"/>
+        </w:rPr>
+      </w:pPr>
+      <w:r>
+        <w:rPr>
+          <w:i w:val="false"/>
+          <w:iCs w:val="false"/>
+          <w:sz w:val="28"/>
+          <w:lang w:val="uk-UA"/>
+        </w:rPr>
+        <w:t xml:space="preserve">б) </w:t>
+      </w:r>
+      <w:r>
+        <w:rPr>
+          <w:i w:val="false"/>
+          <w:iCs w:val="false"/>
+          <w:sz w:val="28"/>
+          <w:lang w:val="en-US"/>
+        </w:rPr>
+        <w:t>y = - (x</w:t>
+      </w:r>
+      <w:r>
+        <w:rPr>
+          <w:i w:val="false"/>
+          <w:iCs w:val="false"/>
+          <w:sz w:val="28"/>
+          <w:vertAlign w:val="superscript"/>
+          <w:lang w:val="en-US"/>
+        </w:rPr>
+        <w:t>2</w:t>
+      </w:r>
+      <w:r>
+        <w:rPr>
+          <w:i w:val="false"/>
+          <w:iCs w:val="false"/>
+          <w:position w:val="0"/>
+          <w:sz w:val="28"/>
+          <w:sz w:val="28"/>
+          <w:vertAlign w:val="baseline"/>
+          <w:lang w:val="en-US"/>
+        </w:rPr>
+        <w:t xml:space="preserve"> / (k+1)*(k+2)) * y;</w:t>
+      </w:r>
+    </w:p>
+    <w:p>
+      <w:pPr>
+        <w:pStyle w:val="P1"/>
+        <w:ind w:hanging="0" w:left="0"/>
+        <w:rPr>
+          <w:i w:val="false"/>
+          <w:i w:val="false"/>
+          <w:iCs w:val="false"/>
+          <w:sz w:val="28"/>
+          <w:lang w:val="uk-UA"/>
+        </w:rPr>
+      </w:pPr>
+      <w:r>
+        <w:rPr>
+          <w:i w:val="false"/>
+          <w:iCs w:val="false"/>
+          <w:sz w:val="28"/>
+          <w:lang w:val="uk-UA"/>
+        </w:rPr>
+        <w:t xml:space="preserve">в) </w:t>
+      </w:r>
+      <w:r>
+        <w:rPr>
+          <w:i w:val="false"/>
+          <w:iCs w:val="false"/>
+          <w:sz w:val="28"/>
+          <w:lang w:val="en-US"/>
+        </w:rPr>
+        <w:t>s = s + y; k = k + 2;</w:t>
+      </w:r>
+    </w:p>
+    <w:p>
+      <w:pPr>
+        <w:pStyle w:val="P1"/>
+        <w:ind w:hanging="0" w:left="0"/>
+        <w:rPr>
+          <w:i w:val="false"/>
+          <w:i w:val="false"/>
+          <w:iCs w:val="false"/>
+          <w:sz w:val="28"/>
+          <w:lang w:val="uk-UA"/>
+        </w:rPr>
+      </w:pPr>
+      <w:r>
+        <w:rPr>
+          <w:i w:val="false"/>
+          <w:iCs w:val="false"/>
+          <w:sz w:val="28"/>
+          <w:lang w:val="uk-UA"/>
+        </w:rPr>
+        <w:t xml:space="preserve">г) якщо </w:t>
+      </w:r>
+      <w:r>
+        <w:rPr>
+          <w:i w:val="false"/>
+          <w:iCs w:val="false"/>
+          <w:sz w:val="28"/>
+          <w:lang w:val="en-US"/>
+        </w:rPr>
+        <w:t>k &lt;= K,</w:t>
+      </w:r>
+      <w:r>
+        <w:rPr>
+          <w:i w:val="false"/>
+          <w:iCs w:val="false"/>
+          <w:sz w:val="28"/>
+          <w:lang w:val="uk-UA"/>
+        </w:rPr>
+        <w:t xml:space="preserve"> то перехід на п. б), інакше — кінець.</w:t>
+      </w:r>
+    </w:p>
+    <w:p>
+      <w:pPr>
+        <w:pStyle w:val="P1"/>
+        <w:rPr/>
+      </w:pPr>
+      <w:r>
+        <w:rPr/>
+        <w:t>Для обчислення синуса в програмі створити окрему функцію,</w:t>
+      </w:r>
+      <w:r>
+        <w:rPr>
+          <w:lang w:val="en-US"/>
+        </w:rPr>
+        <w:t xml:space="preserve"> K </w:t>
+      </w:r>
+      <w:r>
+        <w:rPr/>
+        <w:t>нехай дорівнює 500.</w:t>
+      </w:r>
+    </w:p>
+    <w:p>
+      <w:pPr>
+        <w:pStyle w:val="P1"/>
+        <w:rPr/>
+      </w:pPr>
+      <w:r>
+        <w:rPr/>
+      </w:r>
+    </w:p>
+    <w:p>
+      <w:pPr>
+        <w:pStyle w:val="H3"/>
+        <w:rPr/>
+      </w:pPr>
+      <w:r>
+        <w:rPr/>
+        <w:t>Код</w:t>
+      </w:r>
+    </w:p>
+    <w:p>
+      <w:pPr>
+        <w:pStyle w:val="P1"/>
+        <w:rPr/>
+      </w:pPr>
+      <w:r>
+        <w:rPr/>
+      </w:r>
+    </w:p>
+    <w:p>
+      <w:pPr>
+        <w:pStyle w:val="Code"/>
+        <w:rPr/>
+      </w:pPr>
+      <w:r>
+        <w:rPr/>
+        <w:t>from mpi4py import MPI</w:t>
+      </w:r>
+    </w:p>
+    <w:p>
+      <w:pPr>
+        <w:pStyle w:val="Code"/>
+        <w:rPr/>
+      </w:pPr>
+      <w:r>
+        <w:rPr/>
+        <w:t>import random</w:t>
+      </w:r>
+    </w:p>
+    <w:p>
+      <w:pPr>
+        <w:pStyle w:val="Code"/>
+        <w:rPr/>
+      </w:pPr>
+      <w:r>
+        <w:rPr/>
+        <w:t>import numpy as np</w:t>
+      </w:r>
+    </w:p>
+    <w:p>
+      <w:pPr>
+        <w:pStyle w:val="Code"/>
+        <w:rPr/>
+      </w:pPr>
+      <w:r>
+        <w:rPr/>
+      </w:r>
+    </w:p>
+    <w:p>
+      <w:pPr>
+        <w:pStyle w:val="Code"/>
+        <w:rPr/>
+      </w:pPr>
+      <w:r>
+        <w:rPr/>
+        <w:t>comm = MPI.COMM_WORLD</w:t>
+      </w:r>
+    </w:p>
+    <w:p>
+      <w:pPr>
+        <w:pStyle w:val="Code"/>
+        <w:rPr/>
+      </w:pPr>
+      <w:r>
+        <w:rPr/>
+        <w:t>size = comm.Get_size()</w:t>
+      </w:r>
+    </w:p>
+    <w:p>
+      <w:pPr>
+        <w:pStyle w:val="Code"/>
+        <w:rPr/>
+      </w:pPr>
+      <w:r>
+        <w:rPr/>
+        <w:t>rank = comm.Get_rank()</w:t>
+      </w:r>
+    </w:p>
+    <w:p>
+      <w:pPr>
+        <w:pStyle w:val="Code"/>
+        <w:rPr/>
+      </w:pPr>
+      <w:r>
+        <w:rPr/>
+      </w:r>
+    </w:p>
+    <w:p>
+      <w:pPr>
+        <w:pStyle w:val="Code"/>
+        <w:rPr/>
+      </w:pPr>
+      <w:r>
+        <w:rPr/>
+        <w:t>def custom_sin(x, this_K=500):</w:t>
+      </w:r>
+    </w:p>
+    <w:p>
+      <w:pPr>
+        <w:pStyle w:val="Code"/>
+        <w:rPr/>
+      </w:pPr>
+      <w:r>
+        <w:rPr/>
+        <w:t xml:space="preserve">    </w:t>
+      </w:r>
+      <w:r>
+        <w:rPr/>
+        <w:t>y = x</w:t>
+      </w:r>
+    </w:p>
+    <w:p>
+      <w:pPr>
+        <w:pStyle w:val="Code"/>
+        <w:rPr/>
+      </w:pPr>
+      <w:r>
+        <w:rPr/>
+        <w:t xml:space="preserve">    </w:t>
+      </w:r>
+      <w:r>
+        <w:rPr/>
+        <w:t>s = y</w:t>
+      </w:r>
+    </w:p>
+    <w:p>
+      <w:pPr>
+        <w:pStyle w:val="Code"/>
+        <w:rPr/>
+      </w:pPr>
+      <w:r>
+        <w:rPr/>
+        <w:t xml:space="preserve">    </w:t>
+      </w:r>
+      <w:r>
+        <w:rPr/>
+        <w:t>k = 1</w:t>
+      </w:r>
+    </w:p>
+    <w:p>
+      <w:pPr>
+        <w:pStyle w:val="Code"/>
+        <w:rPr/>
+      </w:pPr>
+      <w:r>
+        <w:rPr/>
+        <w:t xml:space="preserve">    </w:t>
+      </w:r>
+      <w:r>
+        <w:rPr/>
+        <w:t>while k &lt;= this_K:</w:t>
+      </w:r>
+    </w:p>
+    <w:p>
+      <w:pPr>
+        <w:pStyle w:val="Code"/>
+        <w:rPr/>
+      </w:pPr>
+      <w:r>
+        <w:rPr/>
+        <w:t xml:space="preserve">        </w:t>
+      </w:r>
+      <w:r>
+        <w:rPr/>
+        <w:t>y = -((x**2) / ((k + 1) * (k + 2))) * y</w:t>
+      </w:r>
+    </w:p>
+    <w:p>
+      <w:pPr>
+        <w:pStyle w:val="Code"/>
+        <w:rPr/>
+      </w:pPr>
+      <w:r>
+        <w:rPr/>
+        <w:t xml:space="preserve">        </w:t>
+      </w:r>
+      <w:r>
+        <w:rPr/>
+        <w:t>s = s + y</w:t>
+      </w:r>
+    </w:p>
+    <w:p>
+      <w:pPr>
+        <w:pStyle w:val="Code"/>
+        <w:rPr/>
+      </w:pPr>
+      <w:r>
+        <w:rPr/>
+        <w:t xml:space="preserve">        </w:t>
+      </w:r>
+      <w:r>
+        <w:rPr/>
+        <w:t>k = k + 2</w:t>
+      </w:r>
+    </w:p>
+    <w:p>
+      <w:pPr>
+        <w:pStyle w:val="Code"/>
+        <w:rPr/>
+      </w:pPr>
+      <w:r>
+        <w:rPr/>
+        <w:t xml:space="preserve">    </w:t>
+      </w:r>
+      <w:r>
+        <w:rPr/>
+        <w:t>return s</w:t>
+      </w:r>
+    </w:p>
+    <w:p>
+      <w:pPr>
+        <w:pStyle w:val="Code"/>
+        <w:rPr/>
+      </w:pPr>
+      <w:r>
+        <w:rPr/>
+      </w:r>
+    </w:p>
+    <w:p>
+      <w:pPr>
+        <w:pStyle w:val="Code"/>
+        <w:rPr/>
+      </w:pPr>
+      <w:r>
+        <w:rPr/>
+        <w:t>N = 240_000</w:t>
+      </w:r>
+    </w:p>
+    <w:p>
+      <w:pPr>
+        <w:pStyle w:val="Code"/>
+        <w:rPr/>
+      </w:pPr>
+      <w:r>
+        <w:rPr/>
+        <w:t>K = 500</w:t>
+      </w:r>
+    </w:p>
+    <w:p>
+      <w:pPr>
+        <w:pStyle w:val="Code"/>
+        <w:rPr/>
+      </w:pPr>
+      <w:r>
+        <w:rPr/>
+        <w:t>chunk_size = N // size</w:t>
+      </w:r>
+    </w:p>
+    <w:p>
+      <w:pPr>
+        <w:pStyle w:val="Code"/>
+        <w:rPr/>
+      </w:pPr>
+      <w:r>
+        <w:rPr/>
+      </w:r>
+    </w:p>
+    <w:p>
+      <w:pPr>
+        <w:pStyle w:val="Code"/>
+        <w:rPr/>
+      </w:pPr>
+      <w:r>
+        <w:rPr/>
+        <w:t>a_full = None</w:t>
+      </w:r>
+    </w:p>
+    <w:p>
+      <w:pPr>
+        <w:pStyle w:val="Code"/>
+        <w:rPr/>
+      </w:pPr>
+      <w:r>
+        <w:rPr/>
+        <w:t>x_full = None</w:t>
+      </w:r>
+    </w:p>
+    <w:p>
+      <w:pPr>
+        <w:pStyle w:val="Code"/>
+        <w:rPr/>
+      </w:pPr>
+      <w:r>
+        <w:rPr/>
+        <w:t>if rank == 0:</w:t>
+      </w:r>
+    </w:p>
+    <w:p>
+      <w:pPr>
+        <w:pStyle w:val="Code"/>
+        <w:rPr/>
+      </w:pPr>
+      <w:r>
+        <w:rPr/>
+        <w:t xml:space="preserve">    </w:t>
+      </w:r>
+      <w:r>
+        <w:rPr/>
+        <w:t>a_full = np.array([random.uniform(-1, 1) for _ in range(N)], dtype="d")</w:t>
+      </w:r>
+    </w:p>
+    <w:p>
+      <w:pPr>
+        <w:pStyle w:val="Code"/>
+        <w:rPr/>
+      </w:pPr>
+      <w:r>
+        <w:rPr/>
+        <w:t xml:space="preserve">    </w:t>
+      </w:r>
+      <w:r>
+        <w:rPr/>
+        <w:t>x_full = np.array([0.0001 * i for i in range(N)], dtype="d")</w:t>
+      </w:r>
+    </w:p>
+    <w:p>
+      <w:pPr>
+        <w:pStyle w:val="Code"/>
+        <w:rPr/>
+      </w:pPr>
+      <w:r>
+        <w:rPr/>
+      </w:r>
+    </w:p>
+    <w:p>
+      <w:pPr>
+        <w:pStyle w:val="Code"/>
+        <w:rPr/>
+      </w:pPr>
+      <w:r>
+        <w:rPr/>
+        <w:t>a_local = np.empty(chunk_size, dtype="d")</w:t>
+      </w:r>
+    </w:p>
+    <w:p>
+      <w:pPr>
+        <w:pStyle w:val="Code"/>
+        <w:rPr/>
+      </w:pPr>
+      <w:r>
+        <w:rPr/>
+        <w:t>x_local = np.empty(chunk_size, dtype="d")</w:t>
+      </w:r>
+    </w:p>
+    <w:p>
+      <w:pPr>
+        <w:pStyle w:val="Code"/>
+        <w:rPr/>
+      </w:pPr>
+      <w:r>
+        <w:rPr/>
+      </w:r>
+    </w:p>
+    <w:p>
+      <w:pPr>
+        <w:pStyle w:val="Code"/>
+        <w:rPr/>
+      </w:pPr>
+      <w:r>
+        <w:rPr/>
+        <w:t>t_scatter_start = MPI.Wtime()</w:t>
+      </w:r>
+    </w:p>
+    <w:p>
+      <w:pPr>
+        <w:pStyle w:val="Code"/>
+        <w:rPr/>
+      </w:pPr>
+      <w:r>
+        <w:rPr/>
+        <w:t>comm.Scatter(a_full, a_local, root=0)</w:t>
+      </w:r>
+    </w:p>
+    <w:p>
+      <w:pPr>
+        <w:pStyle w:val="Code"/>
+        <w:rPr/>
+      </w:pPr>
+      <w:r>
+        <w:rPr/>
+        <w:t>comm.Scatter(x_full, x_local, root=0)</w:t>
+      </w:r>
+    </w:p>
+    <w:p>
+      <w:pPr>
+        <w:pStyle w:val="Code"/>
+        <w:rPr/>
+      </w:pPr>
+      <w:r>
+        <w:rPr/>
+        <w:t>t_scatter_end = MPI.Wtime()</w:t>
+      </w:r>
+    </w:p>
+    <w:p>
+      <w:pPr>
+        <w:pStyle w:val="Code"/>
+        <w:rPr/>
+      </w:pPr>
+      <w:r>
+        <w:rPr/>
+      </w:r>
+    </w:p>
+    <w:p>
+      <w:pPr>
+        <w:pStyle w:val="Code"/>
+        <w:rPr/>
+      </w:pPr>
+      <w:r>
+        <w:rPr/>
+        <w:t>start_time = MPI.Wtime()</w:t>
+      </w:r>
+    </w:p>
+    <w:p>
+      <w:pPr>
+        <w:pStyle w:val="Code"/>
+        <w:rPr/>
+      </w:pPr>
+      <w:r>
+        <w:rPr/>
+      </w:r>
+    </w:p>
+    <w:p>
+      <w:pPr>
+        <w:pStyle w:val="Code"/>
+        <w:rPr/>
+      </w:pPr>
+      <w:r>
+        <w:rPr/>
+        <w:t>local_sum = 0.0</w:t>
+      </w:r>
+    </w:p>
+    <w:p>
+      <w:pPr>
+        <w:pStyle w:val="Code"/>
+        <w:rPr/>
+      </w:pPr>
+      <w:r>
+        <w:rPr/>
+        <w:t>for i in range(chunk_size):</w:t>
+      </w:r>
+    </w:p>
+    <w:p>
+      <w:pPr>
+        <w:pStyle w:val="Code"/>
+        <w:rPr/>
+      </w:pPr>
+      <w:r>
+        <w:rPr/>
+        <w:t xml:space="preserve">    </w:t>
+      </w:r>
+      <w:r>
+        <w:rPr/>
+        <w:t>local_sum += a_local[i] * custom_sin(x_local[i], this_K=K)</w:t>
+      </w:r>
+    </w:p>
+    <w:p>
+      <w:pPr>
+        <w:pStyle w:val="Code"/>
+        <w:rPr/>
+      </w:pPr>
+      <w:r>
+        <w:rPr/>
+      </w:r>
+    </w:p>
+    <w:p>
+      <w:pPr>
+        <w:pStyle w:val="Code"/>
+        <w:rPr/>
+      </w:pPr>
+      <w:r>
+        <w:rPr/>
+        <w:t>total_sum = comm.reduce(local_sum, op=MPI.SUM, root=0)</w:t>
+      </w:r>
+    </w:p>
+    <w:p>
+      <w:pPr>
+        <w:pStyle w:val="Code"/>
+        <w:rPr/>
+      </w:pPr>
+      <w:r>
+        <w:rPr/>
+      </w:r>
+    </w:p>
+    <w:p>
+      <w:pPr>
+        <w:pStyle w:val="Code"/>
+        <w:rPr/>
+      </w:pPr>
+      <w:r>
+        <w:rPr/>
+        <w:t>end_time = MPI.Wtime()</w:t>
+      </w:r>
+    </w:p>
+    <w:p>
+      <w:pPr>
+        <w:pStyle w:val="Code"/>
+        <w:rPr/>
+      </w:pPr>
+      <w:r>
+        <w:rPr/>
+      </w:r>
+    </w:p>
+    <w:p>
+      <w:pPr>
+        <w:pStyle w:val="Code"/>
+        <w:rPr/>
+      </w:pPr>
+      <w:r>
+        <w:rPr/>
+        <w:t>if rank == 0:</w:t>
+      </w:r>
+    </w:p>
+    <w:p>
+      <w:pPr>
+        <w:pStyle w:val="Code"/>
+        <w:rPr/>
+      </w:pPr>
+      <w:r>
+        <w:rPr/>
+        <w:t xml:space="preserve">    </w:t>
+      </w:r>
+      <w:r>
+        <w:rPr/>
+        <w:t>print(f"Proceses amount: {size}")</w:t>
+      </w:r>
+    </w:p>
+    <w:p>
+      <w:pPr>
+        <w:pStyle w:val="Code"/>
+        <w:rPr/>
+      </w:pPr>
+      <w:r>
+        <w:rPr/>
+        <w:t xml:space="preserve">    </w:t>
+      </w:r>
+      <w:r>
+        <w:rPr/>
+        <w:t>print(f"Total sum: {total_sum}")</w:t>
+      </w:r>
+    </w:p>
+    <w:p>
+      <w:pPr>
+        <w:pStyle w:val="Code"/>
+        <w:rPr/>
+      </w:pPr>
+      <w:r>
+        <w:rPr/>
+        <w:t xml:space="preserve">    </w:t>
+      </w:r>
+      <w:r>
+        <w:rPr/>
+        <w:t>print(f"Running time (Tp): {end_time - start_time:.4f} sec")</w:t>
+      </w:r>
+    </w:p>
+    <w:p>
+      <w:pPr>
+        <w:pStyle w:val="Code"/>
+        <w:rPr/>
+      </w:pPr>
+      <w:r>
+        <w:rPr/>
+        <w:t xml:space="preserve">    </w:t>
+      </w:r>
+      <w:r>
+        <w:rPr/>
+        <w:t>print(f"Scatter time: {t_scatter_end - t_scatter_start:.6f} sec")</w:t>
+      </w:r>
+    </w:p>
+    <w:p>
+      <w:pPr>
+        <w:pStyle w:val="P1"/>
+        <w:rPr/>
+      </w:pPr>
+      <w:r>
+        <w:rPr/>
+      </w:r>
+    </w:p>
+    <w:p>
+      <w:pPr>
+        <w:pStyle w:val="H3"/>
+        <w:rPr/>
+      </w:pPr>
+      <w:r>
+        <w:rPr/>
+        <w:t>Результати</w:t>
+      </w:r>
+    </w:p>
+    <w:p>
+      <w:pPr>
+        <w:pStyle w:val="P1"/>
+        <w:rPr/>
+      </w:pPr>
+      <w:r>
+        <w:rPr/>
+      </w:r>
+    </w:p>
+    <w:p>
+      <w:pPr>
+        <w:pStyle w:val="Code"/>
+        <w:rPr/>
+      </w:pPr>
+      <w:r>
+        <w:rPr/>
+        <w:t>Proceses amount: 4</w:t>
+      </w:r>
+    </w:p>
+    <w:p>
+      <w:pPr>
+        <w:pStyle w:val="Code"/>
+        <w:rPr/>
+      </w:pPr>
+      <w:r>
+        <w:rPr/>
+        <w:t>Total sum: -363.7585435844192</w:t>
+      </w:r>
+    </w:p>
+    <w:p>
+      <w:pPr>
+        <w:pStyle w:val="Code"/>
+        <w:rPr/>
+      </w:pPr>
+      <w:r>
+        <w:rPr/>
+        <w:t>Running time (Tp): 6.6128 sec</w:t>
+      </w:r>
+    </w:p>
+    <w:p>
+      <w:pPr>
+        <w:pStyle w:val="Code"/>
+        <w:rPr/>
+      </w:pPr>
+      <w:r>
+        <w:rPr/>
+        <w:t>Scatter time: 0.008873 sec</w:t>
+      </w:r>
+    </w:p>
+    <w:p>
+      <w:pPr>
+        <w:pStyle w:val="p11"/>
+        <w:rPr/>
+      </w:pPr>
+      <w:r>
+        <w:rPr/>
+      </w:r>
+    </w:p>
+    <w:p>
+      <w:pPr>
+        <w:pStyle w:val="H2"/>
+        <w:rPr/>
+      </w:pPr>
+      <w:r>
+        <w:rPr/>
+        <w:t>4.2.1.2 Значення</w:t>
+      </w:r>
+    </w:p>
+    <w:p>
+      <w:pPr>
+        <w:pStyle w:val="H3"/>
+        <w:rPr/>
+      </w:pPr>
+      <w:r>
+        <w:rPr/>
+        <w:t>Завдання</w:t>
+      </w:r>
+    </w:p>
+    <w:p>
+      <w:pPr>
+        <w:pStyle w:val="P1"/>
+        <w:rPr/>
+      </w:pPr>
+      <w:r>
+        <w:rPr/>
+      </w:r>
+    </w:p>
+    <w:p>
+      <w:pPr>
+        <w:pStyle w:val="P1"/>
+        <w:rPr>
+          <w:lang w:val="en-US"/>
+        </w:rPr>
+      </w:pPr>
+      <w:r>
+        <w:rPr>
+          <w:lang w:val="en-US"/>
+        </w:rPr>
+        <w:t>Виміряйте час виконання розробленої програми на одному, двох, трьох та чотирьох процесорах для N=240 000 та визначте прискорення обчислень для цих випадків. Дані занесіть до таблиці 4.1. Намалюйте графік залежності прискорення від кількості процесорів.</w:t>
+      </w:r>
+    </w:p>
+    <w:p>
+      <w:pPr>
+        <w:pStyle w:val="P1"/>
+        <w:rPr>
+          <w:lang w:val="en-US"/>
+        </w:rPr>
+      </w:pPr>
+      <w:r>
+        <w:rPr>
+          <w:lang w:val="en-US"/>
+        </w:rPr>
+      </w:r>
+    </w:p>
+    <w:p>
+      <w:pPr>
+        <w:pStyle w:val="H3"/>
+        <w:rPr/>
+      </w:pPr>
+      <w:r>
+        <w:rPr/>
+        <w:t>Результати</w:t>
+      </w:r>
+    </w:p>
+    <w:p>
+      <w:pPr>
+        <w:pStyle w:val="p11"/>
+        <w:rPr/>
+      </w:pPr>
+      <w:r>
+        <w:rPr/>
+      </w:r>
+    </w:p>
+    <w:p>
+      <w:pPr>
+        <w:pStyle w:val="Code"/>
+        <w:rPr/>
+      </w:pPr>
+      <w:r>
+        <w:rPr/>
+        <w:t>$ mpiexec -n 1 python 1.py</w:t>
+      </w:r>
+    </w:p>
+    <w:p>
+      <w:pPr>
+        <w:pStyle w:val="Code"/>
+        <w:rPr/>
+      </w:pPr>
+      <w:r>
+        <w:rPr/>
+        <w:t>Proceses amount: 1</w:t>
+      </w:r>
+    </w:p>
+    <w:p>
+      <w:pPr>
+        <w:pStyle w:val="Code"/>
+        <w:rPr/>
+      </w:pPr>
+      <w:r>
+        <w:rPr/>
+        <w:t>Total sum: 146.733741072558</w:t>
+      </w:r>
+    </w:p>
+    <w:p>
+      <w:pPr>
+        <w:pStyle w:val="Code"/>
+        <w:rPr/>
+      </w:pPr>
+      <w:r>
+        <w:rPr/>
+        <w:t>Running time (Tp): 24.6048 sec</w:t>
+      </w:r>
+    </w:p>
+    <w:p>
+      <w:pPr>
+        <w:pStyle w:val="Code"/>
+        <w:rPr/>
+      </w:pPr>
+      <w:r>
+        <w:rPr/>
+        <w:t>Scatter time: 0.000619 sec</w:t>
+      </w:r>
+    </w:p>
+    <w:p>
+      <w:pPr>
+        <w:pStyle w:val="Code"/>
+        <w:rPr/>
+      </w:pPr>
+      <w:r>
+        <w:rPr/>
+      </w:r>
+    </w:p>
+    <w:p>
+      <w:pPr>
+        <w:pStyle w:val="Code"/>
+        <w:rPr/>
+      </w:pPr>
+      <w:r>
+        <w:rPr/>
+        <w:t>$ mpiexec -n 2 python 1.py</w:t>
+      </w:r>
+    </w:p>
+    <w:p>
+      <w:pPr>
+        <w:pStyle w:val="Code"/>
+        <w:rPr/>
+      </w:pPr>
+      <w:r>
+        <w:rPr/>
+        <w:t>Proceses amount: 2</w:t>
+      </w:r>
+    </w:p>
+    <w:p>
+      <w:pPr>
+        <w:pStyle w:val="Code"/>
+        <w:rPr/>
+      </w:pPr>
+      <w:r>
+        <w:rPr/>
+        <w:t>Total sum: -151.31365322656524</w:t>
+      </w:r>
+    </w:p>
+    <w:p>
+      <w:pPr>
+        <w:pStyle w:val="Code"/>
+        <w:rPr/>
+      </w:pPr>
+      <w:r>
+        <w:rPr/>
+        <w:t>Running time (Tp): 12.5789 sec</w:t>
+      </w:r>
+    </w:p>
+    <w:p>
+      <w:pPr>
+        <w:pStyle w:val="Code"/>
+        <w:rPr/>
+      </w:pPr>
+      <w:r>
+        <w:rPr/>
+        <w:t>Scatter time: 0.009543 sec</w:t>
+      </w:r>
+    </w:p>
+    <w:p>
+      <w:pPr>
+        <w:pStyle w:val="Code"/>
+        <w:rPr/>
+      </w:pPr>
+      <w:r>
+        <w:rPr/>
+      </w:r>
+    </w:p>
+    <w:p>
+      <w:pPr>
+        <w:pStyle w:val="Code"/>
+        <w:rPr/>
+      </w:pPr>
+      <w:r>
+        <w:rPr/>
+        <w:t>$ mpiexec -n 3 python 1.py</w:t>
+      </w:r>
+    </w:p>
+    <w:p>
+      <w:pPr>
+        <w:pStyle w:val="Code"/>
+        <w:rPr/>
+      </w:pPr>
+      <w:r>
+        <w:rPr/>
+        <w:t>Proceses amount: 3</w:t>
+      </w:r>
+    </w:p>
+    <w:p>
+      <w:pPr>
+        <w:pStyle w:val="Code"/>
+        <w:rPr/>
+      </w:pPr>
+      <w:r>
+        <w:rPr/>
+        <w:t>Total sum: -314.8372543611528</w:t>
+      </w:r>
+    </w:p>
+    <w:p>
+      <w:pPr>
+        <w:pStyle w:val="Code"/>
+        <w:rPr/>
+      </w:pPr>
+      <w:r>
+        <w:rPr/>
+        <w:t>Running time (Tp): 8.4814 sec</w:t>
+      </w:r>
+    </w:p>
+    <w:p>
+      <w:pPr>
+        <w:pStyle w:val="Code"/>
+        <w:rPr/>
+      </w:pPr>
+      <w:r>
+        <w:rPr/>
+        <w:t>Scatter time: 0.001679 sec</w:t>
+      </w:r>
+    </w:p>
+    <w:p>
+      <w:pPr>
+        <w:pStyle w:val="Code"/>
+        <w:rPr/>
+      </w:pPr>
+      <w:r>
+        <w:rPr/>
+      </w:r>
+    </w:p>
+    <w:p>
+      <w:pPr>
+        <w:pStyle w:val="Code"/>
+        <w:rPr/>
+      </w:pPr>
+      <w:r>
+        <w:rPr/>
+        <w:t>$ mpiexec -n 4 python 1.py</w:t>
+      </w:r>
+    </w:p>
+    <w:p>
+      <w:pPr>
+        <w:pStyle w:val="Code"/>
+        <w:rPr/>
+      </w:pPr>
+      <w:r>
+        <w:rPr/>
+        <w:t>Proceses amount: 4</w:t>
+      </w:r>
+    </w:p>
+    <w:p>
+      <w:pPr>
+        <w:pStyle w:val="Code"/>
+        <w:rPr/>
+      </w:pPr>
+      <w:r>
+        <w:rPr/>
+        <w:t>Total sum: -363.7585435844192</w:t>
+      </w:r>
+    </w:p>
+    <w:p>
+      <w:pPr>
+        <w:pStyle w:val="Code"/>
+        <w:rPr/>
+      </w:pPr>
+      <w:r>
+        <w:rPr/>
+        <w:t>Running time (Tp): 6.6128 sec</w:t>
+      </w:r>
+    </w:p>
+    <w:p>
+      <w:pPr>
+        <w:pStyle w:val="Code"/>
+        <w:rPr/>
+      </w:pPr>
+      <w:r>
+        <w:rPr/>
+        <w:t>Scatter time: 0.008873 sec</w:t>
+      </w:r>
+    </w:p>
+    <w:p>
+      <w:pPr>
+        <w:pStyle w:val="p11"/>
+        <w:rPr/>
+      </w:pPr>
+      <w:r>
+        <w:rPr/>
+      </w:r>
+    </w:p>
+    <w:p>
+      <w:pPr>
+        <w:pStyle w:val="H3"/>
+        <w:rPr/>
+      </w:pPr>
+      <w:r>
+        <w:rPr/>
+        <w:t>Таблиця</w:t>
+      </w:r>
+    </w:p>
+    <w:p>
+      <w:pPr>
+        <w:pStyle w:val="p11"/>
+        <w:rPr>
+          <w:lang w:val="uk-UA"/>
+        </w:rPr>
+      </w:pPr>
+      <w:r>
+        <w:rPr>
+          <w:lang w:val="uk-UA"/>
+        </w:rPr>
+      </w:r>
+    </w:p>
+    <w:p>
+      <w:pPr>
+        <w:pStyle w:val="P1"/>
+        <w:rPr>
+          <w:lang w:val="en-US"/>
+        </w:rPr>
+      </w:pPr>
+      <w:r>
+        <w:rPr>
+          <w:lang w:val="en-US"/>
+        </w:rPr>
+        <w:t>Таблиця 4.1 – Залежність прискорення від кількості процесорів</w:t>
+      </w:r>
+    </w:p>
+    <w:tbl>
+      <w:tblPr>
+        <w:tblW w:w="8262" w:type="dxa"/>
+        <w:jc w:val="left"/>
+        <w:tblInd w:w="55" w:type="dxa"/>
+        <w:tblLayout w:type="fixed"/>
+        <w:tblCellMar>
+          <w:top w:w="55" w:type="dxa"/>
+          <w:left w:w="55" w:type="dxa"/>
+          <w:bottom w:w="55" w:type="dxa"/>
+          <w:right w:w="55" w:type="dxa"/>
+        </w:tblCellMar>
+      </w:tblPr>
+      <w:tblGrid>
+        <w:gridCol w:w="2098"/>
+        <w:gridCol w:w="2621"/>
+        <w:gridCol w:w="1041"/>
+        <w:gridCol w:w="1041"/>
+        <w:gridCol w:w="1461"/>
+      </w:tblGrid>
+      <w:tr>
+        <w:trPr/>
+        <w:tc>
+          <w:tcPr>
+            <w:tcW w:w="2098" w:type="dxa"/>
+            <w:tcBorders>
+              <w:top w:val="single" w:sz="4" w:space="0" w:color="000000"/>
+              <w:left w:val="single" w:sz="4" w:space="0" w:color="000000"/>
+              <w:bottom w:val="single" w:sz="4" w:space="0" w:color="000000"/>
+            </w:tcBorders>
+            <w:vAlign w:val="center"/>
+          </w:tcPr>
+          <w:p>
+            <w:pPr>
+              <w:pStyle w:val="Style14"/>
+              <w:spacing w:lineRule="auto" w:line="240"/>
+              <w:ind w:hanging="0" w:left="0"/>
+              <w:rPr>
+                <w:b/>
+                <w:bCs/>
+              </w:rPr>
+            </w:pPr>
+            <w:r>
+              <w:rPr>
+                <w:b/>
+                <w:bCs/>
+              </w:rPr>
+              <w:t>Дата та час</w:t>
+            </w:r>
+          </w:p>
+        </w:tc>
+        <w:tc>
+          <w:tcPr>
+            <w:tcW w:w="2621" w:type="dxa"/>
+            <w:tcBorders>
+              <w:top w:val="single" w:sz="4" w:space="0" w:color="000000"/>
+              <w:left w:val="single" w:sz="4" w:space="0" w:color="000000"/>
+              <w:bottom w:val="single" w:sz="4" w:space="0" w:color="000000"/>
+            </w:tcBorders>
+            <w:vAlign w:val="center"/>
+          </w:tcPr>
+          <w:p>
+            <w:pPr>
+              <w:pStyle w:val="Style14"/>
+              <w:spacing w:lineRule="auto" w:line="240"/>
+              <w:ind w:hanging="0" w:left="0"/>
+              <w:rPr>
+                <w:b/>
+                <w:bCs/>
+              </w:rPr>
+            </w:pPr>
+            <w:r>
+              <w:rPr>
+                <w:b/>
+                <w:bCs/>
+              </w:rPr>
+              <w:t xml:space="preserve">Число процесорів </w:t>
+            </w:r>
+            <w:r>
+              <w:rPr>
+                <w:b/>
+                <w:bCs/>
+                <w:lang w:val="en-US"/>
+              </w:rPr>
+              <w:t>P</w:t>
+            </w:r>
+          </w:p>
+        </w:tc>
+        <w:tc>
+          <w:tcPr>
+            <w:tcW w:w="1041" w:type="dxa"/>
+            <w:tcBorders>
+              <w:top w:val="single" w:sz="4" w:space="0" w:color="000000"/>
+              <w:left w:val="single" w:sz="4" w:space="0" w:color="000000"/>
+              <w:bottom w:val="single" w:sz="4" w:space="0" w:color="000000"/>
+            </w:tcBorders>
+            <w:vAlign w:val="center"/>
+          </w:tcPr>
+          <w:p>
+            <w:pPr>
+              <w:pStyle w:val="Style14"/>
+              <w:spacing w:lineRule="auto" w:line="240"/>
+              <w:ind w:hanging="0" w:left="0"/>
+              <w:rPr>
+                <w:b/>
+                <w:bCs/>
+              </w:rPr>
+            </w:pPr>
+            <w:r>
+              <w:rPr>
+                <w:b/>
+                <w:bCs/>
+                <w:lang w:val="en-US"/>
+              </w:rPr>
+              <w:t>T</w:t>
+            </w:r>
+            <w:r>
+              <w:rPr>
+                <w:b/>
+                <w:bCs/>
+                <w:vertAlign w:val="subscript"/>
+                <w:lang w:val="en-US"/>
+              </w:rPr>
+              <w:t>1</w:t>
+            </w:r>
+          </w:p>
+        </w:tc>
+        <w:tc>
+          <w:tcPr>
+            <w:tcW w:w="1041" w:type="dxa"/>
+            <w:tcBorders>
+              <w:top w:val="single" w:sz="4" w:space="0" w:color="000000"/>
+              <w:left w:val="single" w:sz="4" w:space="0" w:color="000000"/>
+              <w:bottom w:val="single" w:sz="4" w:space="0" w:color="000000"/>
+            </w:tcBorders>
+            <w:vAlign w:val="center"/>
+          </w:tcPr>
+          <w:p>
+            <w:pPr>
+              <w:pStyle w:val="Style14"/>
+              <w:spacing w:lineRule="auto" w:line="240"/>
+              <w:ind w:hanging="0" w:left="0"/>
+              <w:rPr>
+                <w:b/>
+                <w:bCs/>
+              </w:rPr>
+            </w:pPr>
+            <w:r>
+              <w:rPr>
+                <w:b/>
+                <w:bCs/>
+                <w:lang w:val="en-US"/>
+              </w:rPr>
+              <w:t>T</w:t>
+            </w:r>
+            <w:r>
+              <w:rPr>
+                <w:b/>
+                <w:bCs/>
+                <w:vertAlign w:val="subscript"/>
+                <w:lang w:val="en-US"/>
+              </w:rPr>
+              <w:t>p</w:t>
+            </w:r>
+          </w:p>
+        </w:tc>
+        <w:tc>
+          <w:tcPr>
+            <w:tcW w:w="1461" w:type="dxa"/>
+            <w:tcBorders>
+              <w:top w:val="single" w:sz="4" w:space="0" w:color="000000"/>
+              <w:left w:val="single" w:sz="4" w:space="0" w:color="000000"/>
+              <w:bottom w:val="single" w:sz="4" w:space="0" w:color="000000"/>
+              <w:right w:val="single" w:sz="4" w:space="0" w:color="000000"/>
+            </w:tcBorders>
+            <w:vAlign w:val="center"/>
+          </w:tcPr>
+          <w:p>
+            <w:pPr>
+              <w:pStyle w:val="Style14"/>
+              <w:spacing w:lineRule="auto" w:line="240"/>
+              <w:ind w:hanging="0" w:left="0"/>
+              <w:rPr>
+                <w:b/>
+                <w:bCs/>
+              </w:rPr>
+            </w:pPr>
+            <w:r>
+              <w:rPr>
+                <w:b/>
+                <w:bCs/>
+                <w:lang w:val="en-US"/>
+              </w:rPr>
+              <w:t>S</w:t>
+            </w:r>
+          </w:p>
+        </w:tc>
+      </w:tr>
+      <w:tr>
+        <w:trPr/>
+        <w:tc>
+          <w:tcPr>
+            <w:tcW w:w="2098" w:type="dxa"/>
+            <w:tcBorders>
+              <w:left w:val="single" w:sz="4" w:space="0" w:color="000000"/>
+              <w:bottom w:val="single" w:sz="4" w:space="0" w:color="000000"/>
+            </w:tcBorders>
+            <w:vAlign w:val="center"/>
+          </w:tcPr>
+          <w:p>
+            <w:pPr>
+              <w:pStyle w:val="Style14"/>
+              <w:spacing w:lineRule="auto" w:line="240"/>
+              <w:ind w:hanging="0" w:left="0"/>
+              <w:rPr>
+                <w:b w:val="false"/>
+                <w:bCs w:val="false"/>
+              </w:rPr>
+            </w:pPr>
+            <w:r>
+              <w:rPr>
+                <w:b w:val="false"/>
+                <w:bCs w:val="false"/>
+              </w:rPr>
+              <w:t>13.02.2026 17:38</w:t>
+            </w:r>
+          </w:p>
+        </w:tc>
+        <w:tc>
+          <w:tcPr>
+            <w:tcW w:w="2621" w:type="dxa"/>
+            <w:tcBorders>
+              <w:left w:val="single" w:sz="4" w:space="0" w:color="000000"/>
+              <w:bottom w:val="single" w:sz="4" w:space="0" w:color="000000"/>
+            </w:tcBorders>
+            <w:vAlign w:val="center"/>
+          </w:tcPr>
+          <w:p>
+            <w:pPr>
+              <w:pStyle w:val="Style14"/>
+              <w:spacing w:lineRule="auto" w:line="240"/>
+              <w:ind w:hanging="0" w:left="0"/>
+              <w:rPr>
+                <w:b w:val="false"/>
+                <w:bCs w:val="false"/>
+              </w:rPr>
+            </w:pPr>
+            <w:r>
+              <w:rPr>
+                <w:b w:val="false"/>
+                <w:bCs w:val="false"/>
+              </w:rPr>
+              <w:t>1</w:t>
+            </w:r>
+          </w:p>
+        </w:tc>
+        <w:tc>
+          <w:tcPr>
+            <w:tcW w:w="1041" w:type="dxa"/>
+            <w:vMerge w:val="restart"/>
+            <w:tcBorders>
+              <w:left w:val="single" w:sz="4" w:space="0" w:color="000000"/>
+              <w:bottom w:val="single" w:sz="4" w:space="0" w:color="000000"/>
+            </w:tcBorders>
+            <w:vAlign w:val="center"/>
+          </w:tcPr>
+          <w:p>
+            <w:pPr>
+              <w:pStyle w:val="Style14"/>
+              <w:spacing w:lineRule="auto" w:line="240"/>
+              <w:ind w:hanging="0" w:left="0"/>
+              <w:rPr>
+                <w:b w:val="false"/>
+                <w:bCs w:val="false"/>
+              </w:rPr>
+            </w:pPr>
+            <w:r>
+              <w:rPr>
+                <w:b w:val="false"/>
+                <w:bCs w:val="false"/>
+              </w:rPr>
+              <w:t>24.6048</w:t>
+            </w:r>
+          </w:p>
+        </w:tc>
+        <w:tc>
+          <w:tcPr>
+            <w:tcW w:w="1041" w:type="dxa"/>
+            <w:tcBorders>
+              <w:left w:val="single" w:sz="4" w:space="0" w:color="000000"/>
+              <w:bottom w:val="single" w:sz="4" w:space="0" w:color="000000"/>
+            </w:tcBorders>
+            <w:vAlign w:val="center"/>
+          </w:tcPr>
+          <w:p>
+            <w:pPr>
+              <w:pStyle w:val="Style14"/>
+              <w:spacing w:lineRule="auto" w:line="240"/>
+              <w:ind w:hanging="0" w:left="0"/>
+              <w:rPr>
+                <w:b w:val="false"/>
+                <w:bCs w:val="false"/>
+              </w:rPr>
+            </w:pPr>
+            <w:r>
+              <w:rPr>
+                <w:b w:val="false"/>
+                <w:bCs w:val="false"/>
+              </w:rPr>
+              <w:t>24.6048</w:t>
+            </w:r>
+          </w:p>
+        </w:tc>
+        <w:tc>
+          <w:tcPr>
+            <w:tcW w:w="1461" w:type="dxa"/>
+            <w:tcBorders>
+              <w:left w:val="single" w:sz="4" w:space="0" w:color="000000"/>
+              <w:bottom w:val="single" w:sz="4" w:space="0" w:color="000000"/>
+              <w:right w:val="single" w:sz="4" w:space="0" w:color="000000"/>
+            </w:tcBorders>
+            <w:vAlign w:val="center"/>
+          </w:tcPr>
+          <w:p>
+            <w:pPr>
+              <w:pStyle w:val="Style14"/>
+              <w:spacing w:lineRule="auto" w:line="240"/>
+              <w:ind w:hanging="0" w:left="0"/>
+              <w:rPr>
+                <w:b w:val="false"/>
+                <w:bCs w:val="false"/>
+              </w:rPr>
+            </w:pPr>
+            <w:r>
+              <w:rPr>
+                <w:b w:val="false"/>
+                <w:bCs w:val="false"/>
+              </w:rPr>
+              <w:t>1</w:t>
+            </w:r>
+          </w:p>
+        </w:tc>
+      </w:tr>
+      <w:tr>
+        <w:trPr/>
+        <w:tc>
+          <w:tcPr>
+            <w:tcW w:w="2098" w:type="dxa"/>
+            <w:tcBorders>
+              <w:left w:val="single" w:sz="4" w:space="0" w:color="000000"/>
+              <w:bottom w:val="single" w:sz="4" w:space="0" w:color="000000"/>
+            </w:tcBorders>
+            <w:vAlign w:val="center"/>
+          </w:tcPr>
+          <w:p>
+            <w:pPr>
+              <w:pStyle w:val="Style14"/>
+              <w:spacing w:lineRule="auto" w:line="240"/>
+              <w:ind w:hanging="0" w:left="0"/>
+              <w:rPr>
+                <w:b w:val="false"/>
+                <w:bCs w:val="false"/>
+              </w:rPr>
+            </w:pPr>
+            <w:r>
+              <w:rPr>
+                <w:b w:val="false"/>
+                <w:bCs w:val="false"/>
+              </w:rPr>
+              <w:t>13.02.2026 17:</w:t>
+            </w:r>
+            <w:r>
+              <w:rPr>
+                <w:b w:val="false"/>
+                <w:bCs w:val="false"/>
+                <w:lang w:val="en-US"/>
+              </w:rPr>
+              <w:t>40</w:t>
+            </w:r>
+          </w:p>
+        </w:tc>
+        <w:tc>
+          <w:tcPr>
+            <w:tcW w:w="2621" w:type="dxa"/>
+            <w:tcBorders>
+              <w:left w:val="single" w:sz="4" w:space="0" w:color="000000"/>
+              <w:bottom w:val="single" w:sz="4" w:space="0" w:color="000000"/>
+            </w:tcBorders>
+            <w:vAlign w:val="center"/>
+          </w:tcPr>
+          <w:p>
+            <w:pPr>
+              <w:pStyle w:val="Style14"/>
+              <w:spacing w:lineRule="auto" w:line="240"/>
+              <w:ind w:hanging="0" w:left="0"/>
+              <w:rPr>
+                <w:b w:val="false"/>
+                <w:bCs w:val="false"/>
+              </w:rPr>
+            </w:pPr>
+            <w:r>
+              <w:rPr>
+                <w:b w:val="false"/>
+                <w:bCs w:val="false"/>
+              </w:rPr>
+              <w:t>2</w:t>
+            </w:r>
+          </w:p>
+        </w:tc>
+        <w:tc>
+          <w:tcPr>
+            <w:tcW w:w="1041" w:type="dxa"/>
+            <w:vMerge w:val="continue"/>
+            <w:tcBorders>
+              <w:left w:val="single" w:sz="4" w:space="0" w:color="000000"/>
+              <w:bottom w:val="single" w:sz="4" w:space="0" w:color="000000"/>
+            </w:tcBorders>
+            <w:vAlign w:val="center"/>
+          </w:tcPr>
+          <w:p>
+            <w:pPr>
+              <w:pStyle w:val="Style14"/>
+              <w:spacing w:lineRule="auto" w:line="240"/>
+              <w:ind w:hanging="0" w:left="0"/>
+              <w:rPr>
+                <w:b w:val="false"/>
+                <w:bCs w:val="false"/>
+              </w:rPr>
+            </w:pPr>
+            <w:r>
+              <w:rPr>
+                <w:b w:val="false"/>
+                <w:bCs w:val="false"/>
+              </w:rPr>
+            </w:r>
+          </w:p>
+        </w:tc>
+        <w:tc>
+          <w:tcPr>
+            <w:tcW w:w="1041" w:type="dxa"/>
+            <w:tcBorders>
+              <w:left w:val="single" w:sz="4" w:space="0" w:color="000000"/>
+              <w:bottom w:val="single" w:sz="4" w:space="0" w:color="000000"/>
+            </w:tcBorders>
+            <w:vAlign w:val="center"/>
+          </w:tcPr>
+          <w:p>
+            <w:pPr>
+              <w:pStyle w:val="Style14"/>
+              <w:spacing w:lineRule="auto" w:line="240"/>
+              <w:ind w:hanging="0" w:left="0"/>
+              <w:rPr>
+                <w:b w:val="false"/>
+                <w:bCs w:val="false"/>
+              </w:rPr>
+            </w:pPr>
+            <w:r>
+              <w:rPr>
+                <w:b w:val="false"/>
+                <w:bCs w:val="false"/>
+              </w:rPr>
+              <w:t>12.5789</w:t>
+            </w:r>
+          </w:p>
+        </w:tc>
+        <w:tc>
+          <w:tcPr>
+            <w:tcW w:w="1461" w:type="dxa"/>
+            <w:tcBorders>
+              <w:left w:val="single" w:sz="4" w:space="0" w:color="000000"/>
+              <w:bottom w:val="single" w:sz="4" w:space="0" w:color="000000"/>
+              <w:right w:val="single" w:sz="4" w:space="0" w:color="000000"/>
+            </w:tcBorders>
+            <w:vAlign w:val="center"/>
+          </w:tcPr>
+          <w:p>
+            <w:pPr>
+              <w:pStyle w:val="Style14"/>
+              <w:spacing w:lineRule="auto" w:line="240"/>
+              <w:ind w:hanging="0" w:left="0"/>
+              <w:rPr>
+                <w:b w:val="false"/>
+                <w:bCs w:val="false"/>
+              </w:rPr>
+            </w:pPr>
+            <w:r>
+              <w:rPr>
+                <w:b w:val="false"/>
+                <w:bCs w:val="false"/>
+              </w:rPr>
+              <w:t>1.95603749</w:t>
+            </w:r>
+          </w:p>
+        </w:tc>
+      </w:tr>
+      <w:tr>
+        <w:trPr/>
+        <w:tc>
+          <w:tcPr>
+            <w:tcW w:w="2098" w:type="dxa"/>
+            <w:tcBorders>
+              <w:left w:val="single" w:sz="4" w:space="0" w:color="000000"/>
+              <w:bottom w:val="single" w:sz="4" w:space="0" w:color="000000"/>
+            </w:tcBorders>
+            <w:vAlign w:val="center"/>
+          </w:tcPr>
+          <w:p>
+            <w:pPr>
+              <w:pStyle w:val="Style14"/>
+              <w:spacing w:lineRule="auto" w:line="240"/>
+              <w:ind w:hanging="0" w:left="0"/>
+              <w:rPr>
+                <w:b w:val="false"/>
+                <w:bCs w:val="false"/>
+                <w:lang w:val="en-US"/>
+              </w:rPr>
+            </w:pPr>
+            <w:r>
+              <w:rPr>
+                <w:b w:val="false"/>
+                <w:bCs w:val="false"/>
+                <w:lang w:val="en-US"/>
+              </w:rPr>
+              <w:t>13.02.2026 17:41</w:t>
+            </w:r>
+          </w:p>
+        </w:tc>
+        <w:tc>
+          <w:tcPr>
+            <w:tcW w:w="2621" w:type="dxa"/>
+            <w:tcBorders>
+              <w:left w:val="single" w:sz="4" w:space="0" w:color="000000"/>
+              <w:bottom w:val="single" w:sz="4" w:space="0" w:color="000000"/>
+            </w:tcBorders>
+            <w:vAlign w:val="center"/>
+          </w:tcPr>
+          <w:p>
+            <w:pPr>
+              <w:pStyle w:val="Style14"/>
+              <w:spacing w:lineRule="auto" w:line="240"/>
+              <w:ind w:hanging="0" w:left="0"/>
+              <w:rPr>
+                <w:b w:val="false"/>
+                <w:bCs w:val="false"/>
+                <w:lang w:val="en-US"/>
+              </w:rPr>
+            </w:pPr>
+            <w:r>
+              <w:rPr>
+                <w:b w:val="false"/>
+                <w:bCs w:val="false"/>
+                <w:lang w:val="en-US"/>
+              </w:rPr>
+              <w:t>3</w:t>
+            </w:r>
+          </w:p>
+        </w:tc>
+        <w:tc>
+          <w:tcPr>
+            <w:tcW w:w="1041" w:type="dxa"/>
+            <w:vMerge w:val="continue"/>
+            <w:tcBorders>
+              <w:left w:val="single" w:sz="4" w:space="0" w:color="000000"/>
+              <w:bottom w:val="single" w:sz="4" w:space="0" w:color="000000"/>
+            </w:tcBorders>
+            <w:vAlign w:val="center"/>
+          </w:tcPr>
+          <w:p>
+            <w:pPr>
+              <w:pStyle w:val="Style14"/>
+              <w:spacing w:lineRule="auto" w:line="240"/>
+              <w:ind w:hanging="0" w:left="0"/>
+              <w:rPr>
+                <w:b w:val="false"/>
+                <w:bCs w:val="false"/>
+              </w:rPr>
+            </w:pPr>
+            <w:r>
+              <w:rPr>
+                <w:b w:val="false"/>
+                <w:bCs w:val="false"/>
+              </w:rPr>
+            </w:r>
+          </w:p>
+        </w:tc>
+        <w:tc>
+          <w:tcPr>
+            <w:tcW w:w="1041" w:type="dxa"/>
+            <w:tcBorders>
+              <w:left w:val="single" w:sz="4" w:space="0" w:color="000000"/>
+              <w:bottom w:val="single" w:sz="4" w:space="0" w:color="000000"/>
+            </w:tcBorders>
+            <w:vAlign w:val="center"/>
+          </w:tcPr>
+          <w:p>
+            <w:pPr>
+              <w:pStyle w:val="Style14"/>
+              <w:spacing w:lineRule="auto" w:line="240"/>
+              <w:ind w:hanging="0" w:left="0"/>
+              <w:rPr>
+                <w:b w:val="false"/>
+                <w:bCs w:val="false"/>
+              </w:rPr>
+            </w:pPr>
+            <w:r>
+              <w:rPr>
+                <w:b w:val="false"/>
+                <w:bCs w:val="false"/>
+              </w:rPr>
+              <w:t>8.4814</w:t>
+            </w:r>
+          </w:p>
+        </w:tc>
+        <w:tc>
+          <w:tcPr>
+            <w:tcW w:w="1461" w:type="dxa"/>
+            <w:tcBorders>
+              <w:left w:val="single" w:sz="4" w:space="0" w:color="000000"/>
+              <w:bottom w:val="single" w:sz="4" w:space="0" w:color="000000"/>
+              <w:right w:val="single" w:sz="4" w:space="0" w:color="000000"/>
+            </w:tcBorders>
+            <w:vAlign w:val="center"/>
+          </w:tcPr>
+          <w:p>
+            <w:pPr>
+              <w:pStyle w:val="Style14"/>
+              <w:spacing w:lineRule="auto" w:line="240"/>
+              <w:ind w:hanging="0" w:left="0"/>
+              <w:rPr>
+                <w:b w:val="false"/>
+                <w:bCs w:val="false"/>
+              </w:rPr>
+            </w:pPr>
+            <w:r>
+              <w:rPr>
+                <w:b w:val="false"/>
+                <w:bCs w:val="false"/>
+              </w:rPr>
+              <w:t>2.90103049</w:t>
+            </w:r>
+          </w:p>
+        </w:tc>
+      </w:tr>
+      <w:tr>
+        <w:trPr/>
+        <w:tc>
+          <w:tcPr>
+            <w:tcW w:w="2098" w:type="dxa"/>
+            <w:tcBorders>
+              <w:left w:val="single" w:sz="4" w:space="0" w:color="000000"/>
+              <w:bottom w:val="single" w:sz="4" w:space="0" w:color="000000"/>
+            </w:tcBorders>
+            <w:vAlign w:val="center"/>
+          </w:tcPr>
+          <w:p>
+            <w:pPr>
+              <w:pStyle w:val="Style14"/>
+              <w:spacing w:lineRule="auto" w:line="240"/>
+              <w:ind w:hanging="0" w:left="0"/>
+              <w:rPr>
+                <w:b w:val="false"/>
+                <w:bCs w:val="false"/>
+                <w:lang w:val="en-US"/>
+              </w:rPr>
+            </w:pPr>
+            <w:r>
+              <w:rPr>
+                <w:b w:val="false"/>
+                <w:bCs w:val="false"/>
+                <w:lang w:val="en-US"/>
+              </w:rPr>
+              <w:t>13.02.2026 17:43</w:t>
+            </w:r>
+          </w:p>
+        </w:tc>
+        <w:tc>
+          <w:tcPr>
+            <w:tcW w:w="2621" w:type="dxa"/>
+            <w:tcBorders>
+              <w:left w:val="single" w:sz="4" w:space="0" w:color="000000"/>
+              <w:bottom w:val="single" w:sz="4" w:space="0" w:color="000000"/>
+            </w:tcBorders>
+            <w:vAlign w:val="center"/>
+          </w:tcPr>
+          <w:p>
+            <w:pPr>
+              <w:pStyle w:val="Style14"/>
+              <w:spacing w:lineRule="auto" w:line="240"/>
+              <w:ind w:hanging="0" w:left="0"/>
+              <w:rPr>
+                <w:b w:val="false"/>
+                <w:bCs w:val="false"/>
+                <w:lang w:val="en-US"/>
+              </w:rPr>
+            </w:pPr>
+            <w:r>
+              <w:rPr>
+                <w:b w:val="false"/>
+                <w:bCs w:val="false"/>
+                <w:lang w:val="en-US"/>
+              </w:rPr>
+              <w:t>4</w:t>
+            </w:r>
+          </w:p>
+        </w:tc>
+        <w:tc>
+          <w:tcPr>
+            <w:tcW w:w="1041" w:type="dxa"/>
+            <w:vMerge w:val="continue"/>
+            <w:tcBorders>
+              <w:left w:val="single" w:sz="4" w:space="0" w:color="000000"/>
+              <w:bottom w:val="single" w:sz="4" w:space="0" w:color="000000"/>
+            </w:tcBorders>
+            <w:vAlign w:val="center"/>
+          </w:tcPr>
+          <w:p>
+            <w:pPr>
+              <w:pStyle w:val="Style14"/>
+              <w:spacing w:lineRule="auto" w:line="240"/>
+              <w:ind w:hanging="0" w:left="0"/>
+              <w:rPr>
+                <w:b w:val="false"/>
+                <w:bCs w:val="false"/>
+              </w:rPr>
+            </w:pPr>
+            <w:r>
+              <w:rPr>
+                <w:b w:val="false"/>
+                <w:bCs w:val="false"/>
+              </w:rPr>
+            </w:r>
+          </w:p>
+        </w:tc>
+        <w:tc>
+          <w:tcPr>
+            <w:tcW w:w="1041" w:type="dxa"/>
+            <w:tcBorders>
+              <w:left w:val="single" w:sz="4" w:space="0" w:color="000000"/>
+              <w:bottom w:val="single" w:sz="4" w:space="0" w:color="000000"/>
+            </w:tcBorders>
+            <w:vAlign w:val="center"/>
+          </w:tcPr>
+          <w:p>
+            <w:pPr>
+              <w:pStyle w:val="Style14"/>
+              <w:spacing w:lineRule="auto" w:line="240"/>
+              <w:ind w:hanging="0" w:left="0"/>
+              <w:rPr>
+                <w:b w:val="false"/>
+                <w:bCs w:val="false"/>
+              </w:rPr>
+            </w:pPr>
+            <w:r>
+              <w:rPr>
+                <w:b w:val="false"/>
+                <w:bCs w:val="false"/>
+              </w:rPr>
+              <w:t>6.6128</w:t>
+            </w:r>
+          </w:p>
+        </w:tc>
+        <w:tc>
+          <w:tcPr>
+            <w:tcW w:w="1461" w:type="dxa"/>
+            <w:tcBorders>
+              <w:left w:val="single" w:sz="4" w:space="0" w:color="000000"/>
+              <w:bottom w:val="single" w:sz="4" w:space="0" w:color="000000"/>
+              <w:right w:val="single" w:sz="4" w:space="0" w:color="000000"/>
+            </w:tcBorders>
+            <w:vAlign w:val="center"/>
+          </w:tcPr>
+          <w:p>
+            <w:pPr>
+              <w:pStyle w:val="Style14"/>
+              <w:spacing w:lineRule="auto" w:line="240"/>
+              <w:ind w:hanging="0" w:left="0"/>
+              <w:rPr>
+                <w:b w:val="false"/>
+                <w:bCs w:val="false"/>
+              </w:rPr>
+            </w:pPr>
+            <w:r>
+              <w:rPr>
+                <w:b w:val="false"/>
+                <w:bCs w:val="false"/>
+              </w:rPr>
+              <w:t>3.72078393</w:t>
+            </w:r>
+          </w:p>
+        </w:tc>
+      </w:tr>
+    </w:tbl>
+    <w:p>
+      <w:pPr>
+        <w:pStyle w:val="P1"/>
+        <w:rPr>
+          <w:lang w:val="en-US"/>
+        </w:rPr>
+      </w:pPr>
+      <w:r>
+        <w:rPr>
+          <w:lang w:val="en-US"/>
+        </w:rPr>
+      </w:r>
+    </w:p>
+    <w:p>
+      <w:pPr>
+        <w:pStyle w:val="H3"/>
+        <w:rPr/>
+      </w:pPr>
+      <w:r>
+        <w:rPr/>
+        <w:t>Графік</w:t>
+      </w:r>
+    </w:p>
+    <w:p>
+      <w:pPr>
+        <w:pStyle w:val="p11"/>
+        <w:rPr/>
+      </w:pPr>
+      <w:r>
+        <w:rPr/>
+      </w:r>
+    </w:p>
+    <w:p>
+      <w:pPr>
+        <w:pStyle w:val="p11"/>
+        <w:rPr/>
+      </w:pPr>
+      <w:r>
+        <w:rPr/>
+        <w:t>Графік залежності прискорення від кількості процесорів наведено нижче на рисунку:</w:t>
+      </w:r>
+    </w:p>
+    <w:p>
+      <w:pPr>
+        <w:pStyle w:val="p11"/>
+        <w:rPr/>
+      </w:pPr>
+      <w:r>
+        <w:rPr/>
+      </w:r>
+    </w:p>
+    <w:p>
+      <w:pPr>
+        <w:pStyle w:val="img1"/>
+        <w:rPr/>
+      </w:pPr>
+      <w:r>
+        <w:rPr/>
+        <w:drawing>
+          <wp:inline distT="0" distB="0" distL="0" distR="0">
+            <wp:extent cx="4975860" cy="2985770"/>
+            <wp:effectExtent l="0" t="0" r="0" b="0"/>
+            <wp:docPr id="13" name="Зображення11"/>
+            <wp:cNvGraphicFramePr>
+              <a:graphicFrameLocks xmlns:a="http://schemas.openxmlformats.org/drawingml/2006/main" noChangeAspect="1"/>
+            </wp:cNvGraphicFramePr>
+            <a:graphic xmlns:a="http://schemas.openxmlformats.org/drawingml/2006/main">
+              <a:graphicData uri="http://schemas.openxmlformats.org/drawingml/2006/picture">
+                <pic:pic xmlns:pic="http://schemas.openxmlformats.org/drawingml/2006/picture">
+                  <pic:nvPicPr>
+                    <pic:cNvPr id="13" name="Зображення11"/>
+                    <pic:cNvPicPr>
+                      <a:picLocks noChangeAspect="1" noChangeArrowheads="1"/>
+                    </pic:cNvPicPr>
+                  </pic:nvPicPr>
+                  <pic:blipFill>
+                    <a:blip r:embed="rId14"/>
+                    <a:stretch>
+                      <a:fillRect/>
+                    </a:stretch>
+                  </pic:blipFill>
+                  <pic:spPr bwMode="auto">
+                    <a:xfrm>
+                      <a:off x="0" y="0"/>
+                      <a:ext cx="4975860" cy="2985770"/>
+                    </a:xfrm>
+                    <a:prstGeom prst="rect">
+                      <a:avLst/>
+                    </a:prstGeom>
+                    <a:noFill/>
+                  </pic:spPr>
+                </pic:pic>
+              </a:graphicData>
+            </a:graphic>
+          </wp:inline>
+        </w:drawing>
+      </w:r>
+    </w:p>
+    <w:p>
+      <w:pPr>
+        <w:pStyle w:val="img1"/>
+        <w:rPr/>
+      </w:pPr>
+      <w:r>
+        <w:rPr/>
+        <w:t>Рисунок 1.1 — Графік залежностей</w:t>
+      </w:r>
+    </w:p>
+    <w:p>
+      <w:pPr>
+        <w:pStyle w:val="p11"/>
+        <w:rPr/>
+      </w:pPr>
+      <w:r>
+        <w:rPr/>
+      </w:r>
+    </w:p>
+    <w:p>
+      <w:pPr>
+        <w:pStyle w:val="P1"/>
+        <w:rPr>
+          <w:lang w:val="uk-UA"/>
+        </w:rPr>
+      </w:pPr>
+      <w:r>
+        <w:rPr>
+          <w:lang w:val="uk-UA"/>
+        </w:rPr>
+        <w:t>4.2.1.3 Прискорення</w:t>
       </w:r>
     </w:p>
     <w:p>
@@ -4143,7 +5978,9 @@
     <w:link w:val="H2Char"/>
     <w:qFormat/>
     <w:rsid w:val="00062cf8"/>
-    <w:pPr/>
+    <w:pPr>
+      <w:spacing w:before="0" w:after="0"/>
+    </w:pPr>
     <w:rPr>
       <w:rFonts w:ascii="Times New Roman" w:hAnsi="Times New Roman" w:cs="Times New Roman"/>
       <w:b/>

</xml_diff>

<commit_message>
feat -- TR4: working a little
</commit_message>
<xml_diff>
--- a/42TR Tehnologiji Rozpodilenyh System/4/TR_KNT-122_Onyshchenko_19_PR4.docx
+++ b/42TR Tehnologiji Rozpodilenyh System/4/TR_KNT-122_Onyshchenko_19_PR4.docx
@@ -4909,6 +4909,64 @@
     </w:p>
     <w:p>
       <w:pPr>
+        <w:pStyle w:val="H2"/>
+        <w:rPr/>
+      </w:pPr>
+      <w:r>
+        <w:rPr/>
+        <w:t>4.2.1.3 Прискорення</w:t>
+      </w:r>
+    </w:p>
+    <w:p>
+      <w:pPr>
+        <w:pStyle w:val="H3"/>
+        <w:rPr/>
+      </w:pPr>
+      <w:r>
+        <w:rPr/>
+        <w:t>Завдання</w:t>
+      </w:r>
+    </w:p>
+    <w:p>
+      <w:pPr>
+        <w:pStyle w:val="p11"/>
+        <w:rPr/>
+      </w:pPr>
+      <w:r>
+        <w:rPr/>
+      </w:r>
+    </w:p>
+    <w:p>
+      <w:pPr>
+        <w:pStyle w:val="p11"/>
+        <w:rPr/>
+      </w:pPr>
+      <w:r>
+        <w:rPr/>
+        <w:t>Дослідити та намалювати графіки залежності прискорення від кількості членів ряду при обчисленнях на чотирьох процесорах, змінюючи кількість членів ряду від 20000 до 240000 з дискретністю 20000. Вимірювання виконуйте 3 рази з інтервалом між вимірюваннями 15 хвилин, результати вимірювань занесіть до таблиці 4.2.</w:t>
+      </w:r>
+    </w:p>
+    <w:p>
+      <w:pPr>
+        <w:pStyle w:val="p11"/>
+        <w:rPr/>
+      </w:pPr>
+      <w:r>
+        <w:rPr/>
+      </w:r>
+    </w:p>
+    <w:p>
+      <w:pPr>
+        <w:pStyle w:val="H3"/>
+        <w:rPr/>
+      </w:pPr>
+      <w:r>
+        <w:rPr/>
+        <w:t>Таблиця</w:t>
+      </w:r>
+    </w:p>
+    <w:p>
+      <w:pPr>
         <w:pStyle w:val="P1"/>
         <w:rPr>
           <w:lang w:val="uk-UA"/>
@@ -4918,7 +4976,32 @@
         <w:rPr>
           <w:lang w:val="uk-UA"/>
         </w:rPr>
-        <w:t>4.2.1.3 Прискорення</w:t>
+      </w:r>
+    </w:p>
+    <w:p>
+      <w:pPr>
+        <w:pStyle w:val="P1"/>
+        <w:rPr>
+          <w:lang w:val="uk-UA"/>
+        </w:rPr>
+      </w:pPr>
+      <w:r>
+        <w:rPr>
+          <w:lang w:val="uk-UA"/>
+        </w:rPr>
+      </w:r>
+    </w:p>
+    <w:p>
+      <w:pPr>
+        <w:pStyle w:val="P1"/>
+        <w:rPr>
+          <w:lang w:val="uk-UA"/>
+        </w:rPr>
+      </w:pPr>
+      <w:r>
+        <w:rPr>
+          <w:lang w:val="uk-UA"/>
+        </w:rPr>
       </w:r>
     </w:p>
     <w:p>

</xml_diff>

<commit_message>
feat - TR4: 4.1.2.3 done, praise King Jesus
</commit_message>
<xml_diff>
--- a/42TR Tehnologiji Rozpodilenyh System/4/TR_KNT-122_Onyshchenko_19_PR4.docx
+++ b/42TR Tehnologiji Rozpodilenyh System/4/TR_KNT-122_Onyshchenko_19_PR4.docx
@@ -3608,7 +3608,7 @@
       </w:pPr>
       <w:r>
         <w:rPr/>
-        <w:t>Proceses amount: 4</w:t>
+        <w:t>Proceses amount: 1</w:t>
       </w:r>
     </w:p>
     <w:p>
@@ -3618,7 +3618,7 @@
       </w:pPr>
       <w:r>
         <w:rPr/>
-        <w:t>Total sum: -363.7585435844192</w:t>
+        <w:t>Total sum: -44.749436265304396</w:t>
       </w:r>
     </w:p>
     <w:p>
@@ -3628,7 +3628,7 @@
       </w:pPr>
       <w:r>
         <w:rPr/>
-        <w:t>Running time (Tp): 6.6128 sec</w:t>
+        <w:t>Running time (Tp): 24.8317 sec</w:t>
       </w:r>
     </w:p>
     <w:p>
@@ -3638,7 +3638,7 @@
       </w:pPr>
       <w:r>
         <w:rPr/>
-        <w:t>Scatter time: 0.008873 sec</w:t>
+        <w:t>Scatter time: 0.001168 sec</w:t>
       </w:r>
     </w:p>
     <w:p>
@@ -4968,6 +4968,1877 @@
     <w:p>
       <w:pPr>
         <w:pStyle w:val="P1"/>
+        <w:rPr/>
+      </w:pPr>
+      <w:r>
+        <w:rPr/>
+      </w:r>
+    </w:p>
+    <w:p>
+      <w:pPr>
+        <w:pStyle w:val="P1"/>
+        <w:rPr>
+          <w:lang w:val="en-US"/>
+        </w:rPr>
+      </w:pPr>
+      <w:r>
+        <w:rPr>
+          <w:lang w:val="en-US"/>
+        </w:rPr>
+        <w:t>Таблиця 4.2 – Залежність прискорення від кількості членів при P=4</w:t>
+      </w:r>
+    </w:p>
+    <w:tbl>
+      <w:tblPr>
+        <w:tblW w:w="6402" w:type="dxa"/>
+        <w:jc w:val="left"/>
+        <w:tblInd w:w="55" w:type="dxa"/>
+        <w:tblLayout w:type="fixed"/>
+        <w:tblCellMar>
+          <w:top w:w="55" w:type="dxa"/>
+          <w:left w:w="55" w:type="dxa"/>
+          <w:bottom w:w="55" w:type="dxa"/>
+          <w:right w:w="55" w:type="dxa"/>
+        </w:tblCellMar>
+      </w:tblPr>
+      <w:tblGrid>
+        <w:gridCol w:w="2098"/>
+        <w:gridCol w:w="1041"/>
+        <w:gridCol w:w="1041"/>
+        <w:gridCol w:w="901"/>
+        <w:gridCol w:w="1321"/>
+      </w:tblGrid>
+      <w:tr>
+        <w:trPr/>
+        <w:tc>
+          <w:tcPr>
+            <w:tcW w:w="2098" w:type="dxa"/>
+            <w:tcBorders>
+              <w:top w:val="single" w:sz="4" w:space="0" w:color="000000"/>
+              <w:left w:val="single" w:sz="4" w:space="0" w:color="000000"/>
+              <w:bottom w:val="single" w:sz="4" w:space="0" w:color="000000"/>
+            </w:tcBorders>
+            <w:vAlign w:val="center"/>
+          </w:tcPr>
+          <w:p>
+            <w:pPr>
+              <w:pStyle w:val="Style14"/>
+              <w:spacing w:lineRule="auto" w:line="240"/>
+              <w:ind w:hanging="0" w:left="0"/>
+              <w:rPr>
+                <w:b/>
+                <w:bCs/>
+              </w:rPr>
+            </w:pPr>
+            <w:r>
+              <w:rPr>
+                <w:b/>
+                <w:bCs/>
+              </w:rPr>
+              <w:t>Дата та час</w:t>
+            </w:r>
+          </w:p>
+        </w:tc>
+        <w:tc>
+          <w:tcPr>
+            <w:tcW w:w="1041" w:type="dxa"/>
+            <w:tcBorders>
+              <w:top w:val="single" w:sz="4" w:space="0" w:color="000000"/>
+              <w:left w:val="single" w:sz="4" w:space="0" w:color="000000"/>
+              <w:bottom w:val="single" w:sz="4" w:space="0" w:color="000000"/>
+            </w:tcBorders>
+            <w:vAlign w:val="center"/>
+          </w:tcPr>
+          <w:p>
+            <w:pPr>
+              <w:pStyle w:val="Style14"/>
+              <w:spacing w:lineRule="auto" w:line="240"/>
+              <w:ind w:hanging="0" w:left="0"/>
+              <w:rPr>
+                <w:b/>
+                <w:bCs/>
+              </w:rPr>
+            </w:pPr>
+            <w:r>
+              <w:rPr>
+                <w:b/>
+                <w:bCs/>
+                <w:lang w:val="en-US"/>
+              </w:rPr>
+              <w:t>N</w:t>
+            </w:r>
+          </w:p>
+        </w:tc>
+        <w:tc>
+          <w:tcPr>
+            <w:tcW w:w="1041" w:type="dxa"/>
+            <w:tcBorders>
+              <w:top w:val="single" w:sz="4" w:space="0" w:color="000000"/>
+              <w:left w:val="single" w:sz="4" w:space="0" w:color="000000"/>
+              <w:bottom w:val="single" w:sz="4" w:space="0" w:color="000000"/>
+            </w:tcBorders>
+            <w:vAlign w:val="center"/>
+          </w:tcPr>
+          <w:p>
+            <w:pPr>
+              <w:pStyle w:val="Style14"/>
+              <w:spacing w:lineRule="auto" w:line="240"/>
+              <w:ind w:hanging="0" w:left="0"/>
+              <w:rPr>
+                <w:b/>
+                <w:bCs/>
+              </w:rPr>
+            </w:pPr>
+            <w:r>
+              <w:rPr>
+                <w:b/>
+                <w:bCs/>
+                <w:lang w:val="en-US"/>
+              </w:rPr>
+              <w:t>T</w:t>
+            </w:r>
+            <w:r>
+              <w:rPr>
+                <w:b/>
+                <w:bCs/>
+                <w:vertAlign w:val="subscript"/>
+                <w:lang w:val="en-US"/>
+              </w:rPr>
+              <w:t>1</w:t>
+            </w:r>
+          </w:p>
+        </w:tc>
+        <w:tc>
+          <w:tcPr>
+            <w:tcW w:w="901" w:type="dxa"/>
+            <w:tcBorders>
+              <w:top w:val="single" w:sz="4" w:space="0" w:color="000000"/>
+              <w:left w:val="single" w:sz="4" w:space="0" w:color="000000"/>
+              <w:bottom w:val="single" w:sz="4" w:space="0" w:color="000000"/>
+            </w:tcBorders>
+            <w:vAlign w:val="center"/>
+          </w:tcPr>
+          <w:p>
+            <w:pPr>
+              <w:pStyle w:val="Style14"/>
+              <w:spacing w:lineRule="auto" w:line="240"/>
+              <w:ind w:hanging="0" w:left="0"/>
+              <w:rPr>
+                <w:b/>
+                <w:bCs/>
+              </w:rPr>
+            </w:pPr>
+            <w:r>
+              <w:rPr>
+                <w:b/>
+                <w:bCs/>
+                <w:lang w:val="en-US"/>
+              </w:rPr>
+              <w:t>T</w:t>
+            </w:r>
+            <w:r>
+              <w:rPr>
+                <w:b/>
+                <w:bCs/>
+                <w:vertAlign w:val="subscript"/>
+                <w:lang w:val="en-US"/>
+              </w:rPr>
+              <w:t>4</w:t>
+            </w:r>
+          </w:p>
+        </w:tc>
+        <w:tc>
+          <w:tcPr>
+            <w:tcW w:w="1321" w:type="dxa"/>
+            <w:tcBorders>
+              <w:top w:val="single" w:sz="4" w:space="0" w:color="000000"/>
+              <w:left w:val="single" w:sz="4" w:space="0" w:color="000000"/>
+              <w:bottom w:val="single" w:sz="4" w:space="0" w:color="000000"/>
+              <w:right w:val="single" w:sz="4" w:space="0" w:color="000000"/>
+            </w:tcBorders>
+            <w:vAlign w:val="center"/>
+          </w:tcPr>
+          <w:p>
+            <w:pPr>
+              <w:pStyle w:val="Style14"/>
+              <w:spacing w:lineRule="auto" w:line="240"/>
+              <w:ind w:hanging="0" w:left="0"/>
+              <w:rPr>
+                <w:b/>
+                <w:bCs/>
+              </w:rPr>
+            </w:pPr>
+            <w:r>
+              <w:rPr>
+                <w:b/>
+                <w:bCs/>
+                <w:lang w:val="en-US"/>
+              </w:rPr>
+              <w:t>S</w:t>
+            </w:r>
+          </w:p>
+        </w:tc>
+      </w:tr>
+      <w:tr>
+        <w:trPr/>
+        <w:tc>
+          <w:tcPr>
+            <w:tcW w:w="2098" w:type="dxa"/>
+            <w:tcBorders>
+              <w:left w:val="single" w:sz="4" w:space="0" w:color="000000"/>
+              <w:bottom w:val="single" w:sz="4" w:space="0" w:color="000000"/>
+            </w:tcBorders>
+            <w:vAlign w:val="center"/>
+          </w:tcPr>
+          <w:p>
+            <w:pPr>
+              <w:pStyle w:val="Style14"/>
+              <w:spacing w:lineRule="auto" w:line="240"/>
+              <w:ind w:hanging="0" w:left="0"/>
+              <w:rPr>
+                <w:lang w:val="en-US"/>
+              </w:rPr>
+            </w:pPr>
+            <w:r>
+              <w:rPr>
+                <w:lang w:val="en-US"/>
+              </w:rPr>
+              <w:t>13.02.2026 19:37</w:t>
+            </w:r>
+          </w:p>
+        </w:tc>
+        <w:tc>
+          <w:tcPr>
+            <w:tcW w:w="1041" w:type="dxa"/>
+            <w:tcBorders>
+              <w:left w:val="single" w:sz="4" w:space="0" w:color="000000"/>
+              <w:bottom w:val="single" w:sz="4" w:space="0" w:color="000000"/>
+            </w:tcBorders>
+            <w:vAlign w:val="center"/>
+          </w:tcPr>
+          <w:p>
+            <w:pPr>
+              <w:pStyle w:val="Style14"/>
+              <w:spacing w:lineRule="auto" w:line="240"/>
+              <w:ind w:hanging="0" w:left="0"/>
+              <w:rPr>
+                <w:lang w:val="en-US"/>
+              </w:rPr>
+            </w:pPr>
+            <w:r>
+              <w:rPr>
+                <w:lang w:val="en-US"/>
+              </w:rPr>
+              <w:t>20 000</w:t>
+            </w:r>
+          </w:p>
+        </w:tc>
+        <w:tc>
+          <w:tcPr>
+            <w:tcW w:w="1041" w:type="dxa"/>
+            <w:vMerge w:val="restart"/>
+            <w:tcBorders>
+              <w:left w:val="single" w:sz="4" w:space="0" w:color="000000"/>
+              <w:bottom w:val="single" w:sz="4" w:space="0" w:color="000000"/>
+            </w:tcBorders>
+            <w:vAlign w:val="center"/>
+          </w:tcPr>
+          <w:p>
+            <w:pPr>
+              <w:pStyle w:val="Style14"/>
+              <w:spacing w:lineRule="auto" w:line="240"/>
+              <w:ind w:hanging="0" w:left="0"/>
+              <w:rPr>
+                <w:b w:val="false"/>
+                <w:bCs w:val="false"/>
+              </w:rPr>
+            </w:pPr>
+            <w:r>
+              <w:rPr>
+                <w:b w:val="false"/>
+                <w:bCs w:val="false"/>
+              </w:rPr>
+              <w:t>24.6048</w:t>
+            </w:r>
+          </w:p>
+        </w:tc>
+        <w:tc>
+          <w:tcPr>
+            <w:tcW w:w="901" w:type="dxa"/>
+            <w:tcBorders>
+              <w:left w:val="single" w:sz="4" w:space="0" w:color="000000"/>
+              <w:bottom w:val="single" w:sz="4" w:space="0" w:color="000000"/>
+            </w:tcBorders>
+            <w:vAlign w:val="center"/>
+          </w:tcPr>
+          <w:p>
+            <w:pPr>
+              <w:pStyle w:val="Style14"/>
+              <w:spacing w:lineRule="auto" w:line="240"/>
+              <w:ind w:hanging="0" w:left="0"/>
+              <w:rPr>
+                <w:lang w:val="en-US"/>
+              </w:rPr>
+            </w:pPr>
+            <w:r>
+              <w:rPr>
+                <w:lang w:val="en-US"/>
+              </w:rPr>
+              <w:t>0.3608</w:t>
+            </w:r>
+          </w:p>
+        </w:tc>
+        <w:tc>
+          <w:tcPr>
+            <w:tcW w:w="1321" w:type="dxa"/>
+            <w:tcBorders>
+              <w:left w:val="single" w:sz="4" w:space="0" w:color="000000"/>
+              <w:bottom w:val="single" w:sz="4" w:space="0" w:color="000000"/>
+              <w:right w:val="single" w:sz="4" w:space="0" w:color="000000"/>
+            </w:tcBorders>
+            <w:vAlign w:val="center"/>
+          </w:tcPr>
+          <w:p>
+            <w:pPr>
+              <w:pStyle w:val="Style14"/>
+              <w:spacing w:lineRule="auto" w:line="240"/>
+              <w:ind w:hanging="0" w:left="0"/>
+              <w:rPr>
+                <w:lang w:val="en-US"/>
+              </w:rPr>
+            </w:pPr>
+            <w:r>
+              <w:rPr>
+                <w:lang w:val="en-US"/>
+              </w:rPr>
+              <w:t>68.195122</w:t>
+            </w:r>
+          </w:p>
+        </w:tc>
+      </w:tr>
+      <w:tr>
+        <w:trPr/>
+        <w:tc>
+          <w:tcPr>
+            <w:tcW w:w="2098" w:type="dxa"/>
+            <w:tcBorders>
+              <w:left w:val="single" w:sz="4" w:space="0" w:color="000000"/>
+              <w:bottom w:val="single" w:sz="4" w:space="0" w:color="000000"/>
+            </w:tcBorders>
+            <w:vAlign w:val="center"/>
+          </w:tcPr>
+          <w:p>
+            <w:pPr>
+              <w:pStyle w:val="Style14"/>
+              <w:spacing w:lineRule="auto" w:line="240"/>
+              <w:ind w:hanging="0" w:left="0"/>
+              <w:rPr>
+                <w:lang w:val="en-US"/>
+              </w:rPr>
+            </w:pPr>
+            <w:r>
+              <w:rPr>
+                <w:lang w:val="en-US"/>
+              </w:rPr>
+              <w:t>13.02.2026 19:44</w:t>
+            </w:r>
+          </w:p>
+        </w:tc>
+        <w:tc>
+          <w:tcPr>
+            <w:tcW w:w="1041" w:type="dxa"/>
+            <w:tcBorders>
+              <w:left w:val="single" w:sz="4" w:space="0" w:color="000000"/>
+              <w:bottom w:val="single" w:sz="4" w:space="0" w:color="000000"/>
+            </w:tcBorders>
+            <w:vAlign w:val="center"/>
+          </w:tcPr>
+          <w:p>
+            <w:pPr>
+              <w:pStyle w:val="Style14"/>
+              <w:spacing w:lineRule="auto" w:line="240"/>
+              <w:ind w:hanging="0" w:left="0"/>
+              <w:rPr>
+                <w:lang w:val="en-US"/>
+              </w:rPr>
+            </w:pPr>
+            <w:r>
+              <w:rPr>
+                <w:lang w:val="en-US"/>
+              </w:rPr>
+              <w:t>40 000</w:t>
+            </w:r>
+          </w:p>
+        </w:tc>
+        <w:tc>
+          <w:tcPr>
+            <w:tcW w:w="1041" w:type="dxa"/>
+            <w:vMerge w:val="continue"/>
+            <w:tcBorders>
+              <w:left w:val="single" w:sz="4" w:space="0" w:color="000000"/>
+              <w:bottom w:val="single" w:sz="4" w:space="0" w:color="000000"/>
+            </w:tcBorders>
+            <w:vAlign w:val="center"/>
+          </w:tcPr>
+          <w:p>
+            <w:pPr>
+              <w:pStyle w:val="Style14"/>
+              <w:spacing w:lineRule="auto" w:line="240"/>
+              <w:ind w:hanging="0" w:left="0"/>
+              <w:rPr>
+                <w:b w:val="false"/>
+                <w:bCs w:val="false"/>
+              </w:rPr>
+            </w:pPr>
+            <w:r>
+              <w:rPr>
+                <w:b w:val="false"/>
+                <w:bCs w:val="false"/>
+              </w:rPr>
+            </w:r>
+          </w:p>
+        </w:tc>
+        <w:tc>
+          <w:tcPr>
+            <w:tcW w:w="901" w:type="dxa"/>
+            <w:tcBorders>
+              <w:left w:val="single" w:sz="4" w:space="0" w:color="000000"/>
+              <w:bottom w:val="single" w:sz="4" w:space="0" w:color="000000"/>
+            </w:tcBorders>
+            <w:vAlign w:val="center"/>
+          </w:tcPr>
+          <w:p>
+            <w:pPr>
+              <w:pStyle w:val="Style14"/>
+              <w:spacing w:lineRule="auto" w:line="240"/>
+              <w:ind w:hanging="0" w:left="0"/>
+              <w:rPr>
+                <w:lang w:val="en-US"/>
+              </w:rPr>
+            </w:pPr>
+            <w:r>
+              <w:rPr>
+                <w:lang w:val="en-US"/>
+              </w:rPr>
+              <w:t>0.7315</w:t>
+            </w:r>
+          </w:p>
+        </w:tc>
+        <w:tc>
+          <w:tcPr>
+            <w:tcW w:w="1321" w:type="dxa"/>
+            <w:tcBorders>
+              <w:left w:val="single" w:sz="4" w:space="0" w:color="000000"/>
+              <w:bottom w:val="single" w:sz="4" w:space="0" w:color="000000"/>
+              <w:right w:val="single" w:sz="4" w:space="0" w:color="000000"/>
+            </w:tcBorders>
+            <w:vAlign w:val="center"/>
+          </w:tcPr>
+          <w:p>
+            <w:pPr>
+              <w:pStyle w:val="Style14"/>
+              <w:spacing w:lineRule="auto" w:line="240"/>
+              <w:ind w:hanging="0" w:left="0"/>
+              <w:rPr>
+                <w:lang w:val="en-US"/>
+              </w:rPr>
+            </w:pPr>
+            <w:r>
+              <w:rPr>
+                <w:lang w:val="en-US"/>
+              </w:rPr>
+              <w:t>33.636090</w:t>
+            </w:r>
+          </w:p>
+        </w:tc>
+      </w:tr>
+      <w:tr>
+        <w:trPr/>
+        <w:tc>
+          <w:tcPr>
+            <w:tcW w:w="2098" w:type="dxa"/>
+            <w:tcBorders>
+              <w:left w:val="single" w:sz="4" w:space="0" w:color="000000"/>
+              <w:bottom w:val="single" w:sz="4" w:space="0" w:color="000000"/>
+            </w:tcBorders>
+            <w:vAlign w:val="center"/>
+          </w:tcPr>
+          <w:p>
+            <w:pPr>
+              <w:pStyle w:val="Style14"/>
+              <w:spacing w:lineRule="auto" w:line="240"/>
+              <w:ind w:hanging="0" w:left="0"/>
+              <w:rPr>
+                <w:lang w:val="en-US"/>
+              </w:rPr>
+            </w:pPr>
+            <w:r>
+              <w:rPr>
+                <w:lang w:val="en-US"/>
+              </w:rPr>
+              <w:t>13.02.2026 19:44</w:t>
+            </w:r>
+          </w:p>
+        </w:tc>
+        <w:tc>
+          <w:tcPr>
+            <w:tcW w:w="1041" w:type="dxa"/>
+            <w:tcBorders>
+              <w:left w:val="single" w:sz="4" w:space="0" w:color="000000"/>
+              <w:bottom w:val="single" w:sz="4" w:space="0" w:color="000000"/>
+            </w:tcBorders>
+            <w:vAlign w:val="center"/>
+          </w:tcPr>
+          <w:p>
+            <w:pPr>
+              <w:pStyle w:val="Style14"/>
+              <w:spacing w:lineRule="auto" w:line="240"/>
+              <w:ind w:hanging="0" w:left="0"/>
+              <w:rPr>
+                <w:lang w:val="en-US"/>
+              </w:rPr>
+            </w:pPr>
+            <w:r>
+              <w:rPr>
+                <w:lang w:val="en-US"/>
+              </w:rPr>
+              <w:t>60 000</w:t>
+            </w:r>
+          </w:p>
+        </w:tc>
+        <w:tc>
+          <w:tcPr>
+            <w:tcW w:w="1041" w:type="dxa"/>
+            <w:vMerge w:val="continue"/>
+            <w:tcBorders>
+              <w:left w:val="single" w:sz="4" w:space="0" w:color="000000"/>
+              <w:bottom w:val="single" w:sz="4" w:space="0" w:color="000000"/>
+            </w:tcBorders>
+            <w:vAlign w:val="center"/>
+          </w:tcPr>
+          <w:p>
+            <w:pPr>
+              <w:pStyle w:val="Style14"/>
+              <w:spacing w:lineRule="auto" w:line="240"/>
+              <w:ind w:hanging="0" w:left="0"/>
+              <w:rPr>
+                <w:b w:val="false"/>
+                <w:bCs w:val="false"/>
+              </w:rPr>
+            </w:pPr>
+            <w:r>
+              <w:rPr>
+                <w:b w:val="false"/>
+                <w:bCs w:val="false"/>
+              </w:rPr>
+            </w:r>
+          </w:p>
+        </w:tc>
+        <w:tc>
+          <w:tcPr>
+            <w:tcW w:w="901" w:type="dxa"/>
+            <w:tcBorders>
+              <w:left w:val="single" w:sz="4" w:space="0" w:color="000000"/>
+              <w:bottom w:val="single" w:sz="4" w:space="0" w:color="000000"/>
+            </w:tcBorders>
+            <w:vAlign w:val="center"/>
+          </w:tcPr>
+          <w:p>
+            <w:pPr>
+              <w:pStyle w:val="Style14"/>
+              <w:spacing w:lineRule="auto" w:line="240"/>
+              <w:ind w:hanging="0" w:left="0"/>
+              <w:rPr>
+                <w:lang w:val="en-US"/>
+              </w:rPr>
+            </w:pPr>
+            <w:r>
+              <w:rPr>
+                <w:lang w:val="en-US"/>
+              </w:rPr>
+              <w:t>1.0885</w:t>
+            </w:r>
+          </w:p>
+        </w:tc>
+        <w:tc>
+          <w:tcPr>
+            <w:tcW w:w="1321" w:type="dxa"/>
+            <w:tcBorders>
+              <w:left w:val="single" w:sz="4" w:space="0" w:color="000000"/>
+              <w:bottom w:val="single" w:sz="4" w:space="0" w:color="000000"/>
+              <w:right w:val="single" w:sz="4" w:space="0" w:color="000000"/>
+            </w:tcBorders>
+            <w:vAlign w:val="center"/>
+          </w:tcPr>
+          <w:p>
+            <w:pPr>
+              <w:pStyle w:val="Style14"/>
+              <w:spacing w:lineRule="auto" w:line="240"/>
+              <w:ind w:hanging="0" w:left="0"/>
+              <w:rPr>
+                <w:lang w:val="en-US"/>
+              </w:rPr>
+            </w:pPr>
+            <w:r>
+              <w:rPr>
+                <w:lang w:val="en-US"/>
+              </w:rPr>
+              <w:t>22.604317</w:t>
+            </w:r>
+          </w:p>
+        </w:tc>
+      </w:tr>
+      <w:tr>
+        <w:trPr/>
+        <w:tc>
+          <w:tcPr>
+            <w:tcW w:w="2098" w:type="dxa"/>
+            <w:tcBorders>
+              <w:left w:val="single" w:sz="4" w:space="0" w:color="000000"/>
+              <w:bottom w:val="single" w:sz="4" w:space="0" w:color="000000"/>
+            </w:tcBorders>
+            <w:vAlign w:val="center"/>
+          </w:tcPr>
+          <w:p>
+            <w:pPr>
+              <w:pStyle w:val="Style14"/>
+              <w:spacing w:lineRule="auto" w:line="240"/>
+              <w:ind w:hanging="0" w:left="0"/>
+              <w:rPr>
+                <w:lang w:val="en-US"/>
+              </w:rPr>
+            </w:pPr>
+            <w:r>
+              <w:rPr>
+                <w:lang w:val="en-US"/>
+              </w:rPr>
+              <w:t>13.02.2026 19:45</w:t>
+            </w:r>
+          </w:p>
+        </w:tc>
+        <w:tc>
+          <w:tcPr>
+            <w:tcW w:w="1041" w:type="dxa"/>
+            <w:tcBorders>
+              <w:left w:val="single" w:sz="4" w:space="0" w:color="000000"/>
+              <w:bottom w:val="single" w:sz="4" w:space="0" w:color="000000"/>
+            </w:tcBorders>
+            <w:vAlign w:val="center"/>
+          </w:tcPr>
+          <w:p>
+            <w:pPr>
+              <w:pStyle w:val="Style14"/>
+              <w:spacing w:lineRule="auto" w:line="240"/>
+              <w:ind w:hanging="0" w:left="0"/>
+              <w:rPr>
+                <w:lang w:val="en-US"/>
+              </w:rPr>
+            </w:pPr>
+            <w:r>
+              <w:rPr>
+                <w:lang w:val="en-US"/>
+              </w:rPr>
+              <w:t>80 000</w:t>
+            </w:r>
+          </w:p>
+        </w:tc>
+        <w:tc>
+          <w:tcPr>
+            <w:tcW w:w="1041" w:type="dxa"/>
+            <w:vMerge w:val="continue"/>
+            <w:tcBorders>
+              <w:left w:val="single" w:sz="4" w:space="0" w:color="000000"/>
+              <w:bottom w:val="single" w:sz="4" w:space="0" w:color="000000"/>
+            </w:tcBorders>
+            <w:vAlign w:val="center"/>
+          </w:tcPr>
+          <w:p>
+            <w:pPr>
+              <w:pStyle w:val="Style14"/>
+              <w:spacing w:lineRule="auto" w:line="240"/>
+              <w:ind w:hanging="0" w:left="0"/>
+              <w:rPr>
+                <w:b w:val="false"/>
+                <w:bCs w:val="false"/>
+              </w:rPr>
+            </w:pPr>
+            <w:r>
+              <w:rPr>
+                <w:b w:val="false"/>
+                <w:bCs w:val="false"/>
+              </w:rPr>
+            </w:r>
+          </w:p>
+        </w:tc>
+        <w:tc>
+          <w:tcPr>
+            <w:tcW w:w="901" w:type="dxa"/>
+            <w:tcBorders>
+              <w:left w:val="single" w:sz="4" w:space="0" w:color="000000"/>
+              <w:bottom w:val="single" w:sz="4" w:space="0" w:color="000000"/>
+            </w:tcBorders>
+            <w:vAlign w:val="center"/>
+          </w:tcPr>
+          <w:p>
+            <w:pPr>
+              <w:pStyle w:val="Style14"/>
+              <w:spacing w:lineRule="auto" w:line="240"/>
+              <w:ind w:hanging="0" w:left="0"/>
+              <w:rPr>
+                <w:lang w:val="en-US"/>
+              </w:rPr>
+            </w:pPr>
+            <w:r>
+              <w:rPr>
+                <w:lang w:val="en-US"/>
+              </w:rPr>
+              <w:t>1.4619</w:t>
+            </w:r>
+          </w:p>
+        </w:tc>
+        <w:tc>
+          <w:tcPr>
+            <w:tcW w:w="1321" w:type="dxa"/>
+            <w:tcBorders>
+              <w:left w:val="single" w:sz="4" w:space="0" w:color="000000"/>
+              <w:bottom w:val="single" w:sz="4" w:space="0" w:color="000000"/>
+              <w:right w:val="single" w:sz="4" w:space="0" w:color="000000"/>
+            </w:tcBorders>
+            <w:vAlign w:val="center"/>
+          </w:tcPr>
+          <w:p>
+            <w:pPr>
+              <w:pStyle w:val="Style14"/>
+              <w:spacing w:lineRule="auto" w:line="240"/>
+              <w:ind w:hanging="0" w:left="0"/>
+              <w:rPr>
+                <w:lang w:val="en-US"/>
+              </w:rPr>
+            </w:pPr>
+            <w:r>
+              <w:rPr>
+                <w:lang w:val="en-US"/>
+              </w:rPr>
+              <w:t>16.830699</w:t>
+            </w:r>
+          </w:p>
+        </w:tc>
+      </w:tr>
+      <w:tr>
+        <w:trPr/>
+        <w:tc>
+          <w:tcPr>
+            <w:tcW w:w="2098" w:type="dxa"/>
+            <w:tcBorders>
+              <w:left w:val="single" w:sz="4" w:space="0" w:color="000000"/>
+              <w:bottom w:val="single" w:sz="4" w:space="0" w:color="000000"/>
+            </w:tcBorders>
+            <w:vAlign w:val="center"/>
+          </w:tcPr>
+          <w:p>
+            <w:pPr>
+              <w:pStyle w:val="Style14"/>
+              <w:spacing w:lineRule="auto" w:line="240"/>
+              <w:ind w:hanging="0" w:left="0"/>
+              <w:rPr>
+                <w:lang w:val="en-US"/>
+              </w:rPr>
+            </w:pPr>
+            <w:r>
+              <w:rPr>
+                <w:lang w:val="en-US"/>
+              </w:rPr>
+              <w:t>13.02.2026 19:46</w:t>
+            </w:r>
+          </w:p>
+        </w:tc>
+        <w:tc>
+          <w:tcPr>
+            <w:tcW w:w="1041" w:type="dxa"/>
+            <w:tcBorders>
+              <w:left w:val="single" w:sz="4" w:space="0" w:color="000000"/>
+              <w:bottom w:val="single" w:sz="4" w:space="0" w:color="000000"/>
+            </w:tcBorders>
+            <w:vAlign w:val="center"/>
+          </w:tcPr>
+          <w:p>
+            <w:pPr>
+              <w:pStyle w:val="Style14"/>
+              <w:spacing w:lineRule="auto" w:line="240"/>
+              <w:ind w:hanging="0" w:left="0"/>
+              <w:rPr>
+                <w:lang w:val="en-US"/>
+              </w:rPr>
+            </w:pPr>
+            <w:r>
+              <w:rPr>
+                <w:lang w:val="en-US"/>
+              </w:rPr>
+              <w:t>100 000</w:t>
+            </w:r>
+          </w:p>
+        </w:tc>
+        <w:tc>
+          <w:tcPr>
+            <w:tcW w:w="1041" w:type="dxa"/>
+            <w:vMerge w:val="continue"/>
+            <w:tcBorders>
+              <w:left w:val="single" w:sz="4" w:space="0" w:color="000000"/>
+              <w:bottom w:val="single" w:sz="4" w:space="0" w:color="000000"/>
+            </w:tcBorders>
+            <w:vAlign w:val="center"/>
+          </w:tcPr>
+          <w:p>
+            <w:pPr>
+              <w:pStyle w:val="Style14"/>
+              <w:spacing w:lineRule="auto" w:line="240"/>
+              <w:ind w:hanging="0" w:left="0"/>
+              <w:rPr>
+                <w:b w:val="false"/>
+                <w:bCs w:val="false"/>
+              </w:rPr>
+            </w:pPr>
+            <w:r>
+              <w:rPr>
+                <w:b w:val="false"/>
+                <w:bCs w:val="false"/>
+              </w:rPr>
+            </w:r>
+          </w:p>
+        </w:tc>
+        <w:tc>
+          <w:tcPr>
+            <w:tcW w:w="901" w:type="dxa"/>
+            <w:tcBorders>
+              <w:left w:val="single" w:sz="4" w:space="0" w:color="000000"/>
+              <w:bottom w:val="single" w:sz="4" w:space="0" w:color="000000"/>
+            </w:tcBorders>
+            <w:vAlign w:val="center"/>
+          </w:tcPr>
+          <w:p>
+            <w:pPr>
+              <w:pStyle w:val="Style14"/>
+              <w:spacing w:lineRule="auto" w:line="240"/>
+              <w:ind w:hanging="0" w:left="0"/>
+              <w:rPr>
+                <w:lang w:val="en-US"/>
+              </w:rPr>
+            </w:pPr>
+            <w:r>
+              <w:rPr>
+                <w:lang w:val="en-US"/>
+              </w:rPr>
+              <w:t>1.7941</w:t>
+            </w:r>
+          </w:p>
+        </w:tc>
+        <w:tc>
+          <w:tcPr>
+            <w:tcW w:w="1321" w:type="dxa"/>
+            <w:tcBorders>
+              <w:left w:val="single" w:sz="4" w:space="0" w:color="000000"/>
+              <w:bottom w:val="single" w:sz="4" w:space="0" w:color="000000"/>
+              <w:right w:val="single" w:sz="4" w:space="0" w:color="000000"/>
+            </w:tcBorders>
+            <w:vAlign w:val="center"/>
+          </w:tcPr>
+          <w:p>
+            <w:pPr>
+              <w:pStyle w:val="Style14"/>
+              <w:spacing w:lineRule="auto" w:line="240"/>
+              <w:ind w:hanging="0" w:left="0"/>
+              <w:rPr>
+                <w:lang w:val="en-US"/>
+              </w:rPr>
+            </w:pPr>
+            <w:r>
+              <w:rPr>
+                <w:lang w:val="en-US"/>
+              </w:rPr>
+              <w:t>13.714285</w:t>
+            </w:r>
+          </w:p>
+        </w:tc>
+      </w:tr>
+      <w:tr>
+        <w:trPr/>
+        <w:tc>
+          <w:tcPr>
+            <w:tcW w:w="2098" w:type="dxa"/>
+            <w:tcBorders>
+              <w:left w:val="single" w:sz="4" w:space="0" w:color="000000"/>
+              <w:bottom w:val="single" w:sz="4" w:space="0" w:color="000000"/>
+            </w:tcBorders>
+            <w:vAlign w:val="center"/>
+          </w:tcPr>
+          <w:p>
+            <w:pPr>
+              <w:pStyle w:val="Style14"/>
+              <w:spacing w:lineRule="auto" w:line="240"/>
+              <w:ind w:hanging="0" w:left="0"/>
+              <w:rPr>
+                <w:lang w:val="en-US"/>
+              </w:rPr>
+            </w:pPr>
+            <w:r>
+              <w:rPr>
+                <w:lang w:val="en-US"/>
+              </w:rPr>
+              <w:t>13.02.2026 19:46</w:t>
+            </w:r>
+          </w:p>
+        </w:tc>
+        <w:tc>
+          <w:tcPr>
+            <w:tcW w:w="1041" w:type="dxa"/>
+            <w:tcBorders>
+              <w:left w:val="single" w:sz="4" w:space="0" w:color="000000"/>
+              <w:bottom w:val="single" w:sz="4" w:space="0" w:color="000000"/>
+            </w:tcBorders>
+            <w:vAlign w:val="center"/>
+          </w:tcPr>
+          <w:p>
+            <w:pPr>
+              <w:pStyle w:val="Style14"/>
+              <w:spacing w:lineRule="auto" w:line="240"/>
+              <w:ind w:hanging="0" w:left="0"/>
+              <w:rPr>
+                <w:lang w:val="en-US"/>
+              </w:rPr>
+            </w:pPr>
+            <w:r>
+              <w:rPr>
+                <w:lang w:val="en-US"/>
+              </w:rPr>
+              <w:t>120 000</w:t>
+            </w:r>
+          </w:p>
+        </w:tc>
+        <w:tc>
+          <w:tcPr>
+            <w:tcW w:w="1041" w:type="dxa"/>
+            <w:vMerge w:val="continue"/>
+            <w:tcBorders>
+              <w:left w:val="single" w:sz="4" w:space="0" w:color="000000"/>
+              <w:bottom w:val="single" w:sz="4" w:space="0" w:color="000000"/>
+            </w:tcBorders>
+            <w:vAlign w:val="center"/>
+          </w:tcPr>
+          <w:p>
+            <w:pPr>
+              <w:pStyle w:val="Style14"/>
+              <w:spacing w:lineRule="auto" w:line="240"/>
+              <w:ind w:hanging="0" w:left="0"/>
+              <w:rPr>
+                <w:b w:val="false"/>
+                <w:bCs w:val="false"/>
+              </w:rPr>
+            </w:pPr>
+            <w:r>
+              <w:rPr>
+                <w:b w:val="false"/>
+                <w:bCs w:val="false"/>
+              </w:rPr>
+            </w:r>
+          </w:p>
+        </w:tc>
+        <w:tc>
+          <w:tcPr>
+            <w:tcW w:w="901" w:type="dxa"/>
+            <w:tcBorders>
+              <w:left w:val="single" w:sz="4" w:space="0" w:color="000000"/>
+              <w:bottom w:val="single" w:sz="4" w:space="0" w:color="000000"/>
+            </w:tcBorders>
+            <w:vAlign w:val="center"/>
+          </w:tcPr>
+          <w:p>
+            <w:pPr>
+              <w:pStyle w:val="Style14"/>
+              <w:spacing w:lineRule="auto" w:line="240"/>
+              <w:ind w:hanging="0" w:left="0"/>
+              <w:rPr>
+                <w:lang w:val="en-US"/>
+              </w:rPr>
+            </w:pPr>
+            <w:r>
+              <w:rPr>
+                <w:lang w:val="en-US"/>
+              </w:rPr>
+              <w:t>2.1824</w:t>
+            </w:r>
+          </w:p>
+        </w:tc>
+        <w:tc>
+          <w:tcPr>
+            <w:tcW w:w="1321" w:type="dxa"/>
+            <w:tcBorders>
+              <w:left w:val="single" w:sz="4" w:space="0" w:color="000000"/>
+              <w:bottom w:val="single" w:sz="4" w:space="0" w:color="000000"/>
+              <w:right w:val="single" w:sz="4" w:space="0" w:color="000000"/>
+            </w:tcBorders>
+            <w:vAlign w:val="center"/>
+          </w:tcPr>
+          <w:p>
+            <w:pPr>
+              <w:pStyle w:val="Style14"/>
+              <w:spacing w:lineRule="auto" w:line="240"/>
+              <w:ind w:hanging="0" w:left="0"/>
+              <w:rPr>
+                <w:lang w:val="en-US"/>
+              </w:rPr>
+            </w:pPr>
+            <w:r>
+              <w:rPr>
+                <w:lang w:val="en-US"/>
+              </w:rPr>
+              <w:t>11.274193</w:t>
+            </w:r>
+          </w:p>
+        </w:tc>
+      </w:tr>
+      <w:tr>
+        <w:trPr/>
+        <w:tc>
+          <w:tcPr>
+            <w:tcW w:w="2098" w:type="dxa"/>
+            <w:tcBorders>
+              <w:left w:val="single" w:sz="4" w:space="0" w:color="000000"/>
+              <w:bottom w:val="single" w:sz="4" w:space="0" w:color="000000"/>
+            </w:tcBorders>
+            <w:vAlign w:val="center"/>
+          </w:tcPr>
+          <w:p>
+            <w:pPr>
+              <w:pStyle w:val="Style14"/>
+              <w:spacing w:lineRule="auto" w:line="240"/>
+              <w:ind w:hanging="0" w:left="0"/>
+              <w:rPr>
+                <w:lang w:val="en-US"/>
+              </w:rPr>
+            </w:pPr>
+            <w:r>
+              <w:rPr>
+                <w:lang w:val="en-US"/>
+              </w:rPr>
+              <w:t>13.02.2026 19:46</w:t>
+            </w:r>
+          </w:p>
+        </w:tc>
+        <w:tc>
+          <w:tcPr>
+            <w:tcW w:w="1041" w:type="dxa"/>
+            <w:tcBorders>
+              <w:left w:val="single" w:sz="4" w:space="0" w:color="000000"/>
+              <w:bottom w:val="single" w:sz="4" w:space="0" w:color="000000"/>
+            </w:tcBorders>
+            <w:vAlign w:val="center"/>
+          </w:tcPr>
+          <w:p>
+            <w:pPr>
+              <w:pStyle w:val="Style14"/>
+              <w:spacing w:lineRule="auto" w:line="240"/>
+              <w:ind w:hanging="0" w:left="0"/>
+              <w:rPr>
+                <w:lang w:val="en-US"/>
+              </w:rPr>
+            </w:pPr>
+            <w:r>
+              <w:rPr>
+                <w:lang w:val="en-US"/>
+              </w:rPr>
+              <w:t>140 000</w:t>
+            </w:r>
+          </w:p>
+        </w:tc>
+        <w:tc>
+          <w:tcPr>
+            <w:tcW w:w="1041" w:type="dxa"/>
+            <w:vMerge w:val="continue"/>
+            <w:tcBorders>
+              <w:left w:val="single" w:sz="4" w:space="0" w:color="000000"/>
+              <w:bottom w:val="single" w:sz="4" w:space="0" w:color="000000"/>
+            </w:tcBorders>
+            <w:vAlign w:val="center"/>
+          </w:tcPr>
+          <w:p>
+            <w:pPr>
+              <w:pStyle w:val="Style14"/>
+              <w:spacing w:lineRule="auto" w:line="240"/>
+              <w:ind w:hanging="0" w:left="0"/>
+              <w:rPr>
+                <w:b w:val="false"/>
+                <w:bCs w:val="false"/>
+              </w:rPr>
+            </w:pPr>
+            <w:r>
+              <w:rPr>
+                <w:b w:val="false"/>
+                <w:bCs w:val="false"/>
+              </w:rPr>
+            </w:r>
+          </w:p>
+        </w:tc>
+        <w:tc>
+          <w:tcPr>
+            <w:tcW w:w="901" w:type="dxa"/>
+            <w:tcBorders>
+              <w:left w:val="single" w:sz="4" w:space="0" w:color="000000"/>
+              <w:bottom w:val="single" w:sz="4" w:space="0" w:color="000000"/>
+            </w:tcBorders>
+            <w:vAlign w:val="center"/>
+          </w:tcPr>
+          <w:p>
+            <w:pPr>
+              <w:pStyle w:val="Style14"/>
+              <w:spacing w:lineRule="auto" w:line="240"/>
+              <w:ind w:hanging="0" w:left="0"/>
+              <w:rPr>
+                <w:lang w:val="en-US"/>
+              </w:rPr>
+            </w:pPr>
+            <w:r>
+              <w:rPr>
+                <w:lang w:val="en-US"/>
+              </w:rPr>
+              <w:t>2.5097</w:t>
+            </w:r>
+          </w:p>
+        </w:tc>
+        <w:tc>
+          <w:tcPr>
+            <w:tcW w:w="1321" w:type="dxa"/>
+            <w:tcBorders>
+              <w:left w:val="single" w:sz="4" w:space="0" w:color="000000"/>
+              <w:bottom w:val="single" w:sz="4" w:space="0" w:color="000000"/>
+              <w:right w:val="single" w:sz="4" w:space="0" w:color="000000"/>
+            </w:tcBorders>
+            <w:vAlign w:val="center"/>
+          </w:tcPr>
+          <w:p>
+            <w:pPr>
+              <w:pStyle w:val="Style14"/>
+              <w:spacing w:lineRule="auto" w:line="240"/>
+              <w:ind w:hanging="0" w:left="0"/>
+              <w:rPr>
+                <w:lang w:val="en-US"/>
+              </w:rPr>
+            </w:pPr>
+            <w:r>
+              <w:rPr>
+                <w:lang w:val="en-US"/>
+              </w:rPr>
+              <w:t>9.8038809</w:t>
+            </w:r>
+          </w:p>
+        </w:tc>
+      </w:tr>
+      <w:tr>
+        <w:trPr/>
+        <w:tc>
+          <w:tcPr>
+            <w:tcW w:w="2098" w:type="dxa"/>
+            <w:tcBorders>
+              <w:left w:val="single" w:sz="4" w:space="0" w:color="000000"/>
+              <w:bottom w:val="single" w:sz="4" w:space="0" w:color="000000"/>
+            </w:tcBorders>
+            <w:vAlign w:val="center"/>
+          </w:tcPr>
+          <w:p>
+            <w:pPr>
+              <w:pStyle w:val="Style14"/>
+              <w:spacing w:lineRule="auto" w:line="240"/>
+              <w:ind w:hanging="0" w:left="0"/>
+              <w:rPr>
+                <w:lang w:val="en-US"/>
+              </w:rPr>
+            </w:pPr>
+            <w:r>
+              <w:rPr>
+                <w:lang w:val="en-US"/>
+              </w:rPr>
+              <w:t>13.02.2026 19:47</w:t>
+            </w:r>
+          </w:p>
+        </w:tc>
+        <w:tc>
+          <w:tcPr>
+            <w:tcW w:w="1041" w:type="dxa"/>
+            <w:tcBorders>
+              <w:left w:val="single" w:sz="4" w:space="0" w:color="000000"/>
+              <w:bottom w:val="single" w:sz="4" w:space="0" w:color="000000"/>
+            </w:tcBorders>
+            <w:vAlign w:val="center"/>
+          </w:tcPr>
+          <w:p>
+            <w:pPr>
+              <w:pStyle w:val="Style14"/>
+              <w:spacing w:lineRule="auto" w:line="240"/>
+              <w:ind w:hanging="0" w:left="0"/>
+              <w:rPr>
+                <w:lang w:val="en-US"/>
+              </w:rPr>
+            </w:pPr>
+            <w:r>
+              <w:rPr>
+                <w:lang w:val="en-US"/>
+              </w:rPr>
+              <w:t>160 000</w:t>
+            </w:r>
+          </w:p>
+        </w:tc>
+        <w:tc>
+          <w:tcPr>
+            <w:tcW w:w="1041" w:type="dxa"/>
+            <w:vMerge w:val="continue"/>
+            <w:tcBorders>
+              <w:left w:val="single" w:sz="4" w:space="0" w:color="000000"/>
+              <w:bottom w:val="single" w:sz="4" w:space="0" w:color="000000"/>
+            </w:tcBorders>
+            <w:vAlign w:val="center"/>
+          </w:tcPr>
+          <w:p>
+            <w:pPr>
+              <w:pStyle w:val="Style14"/>
+              <w:spacing w:lineRule="auto" w:line="240"/>
+              <w:ind w:hanging="0" w:left="0"/>
+              <w:rPr>
+                <w:b w:val="false"/>
+                <w:bCs w:val="false"/>
+              </w:rPr>
+            </w:pPr>
+            <w:r>
+              <w:rPr>
+                <w:b w:val="false"/>
+                <w:bCs w:val="false"/>
+              </w:rPr>
+            </w:r>
+          </w:p>
+        </w:tc>
+        <w:tc>
+          <w:tcPr>
+            <w:tcW w:w="901" w:type="dxa"/>
+            <w:tcBorders>
+              <w:left w:val="single" w:sz="4" w:space="0" w:color="000000"/>
+              <w:bottom w:val="single" w:sz="4" w:space="0" w:color="000000"/>
+            </w:tcBorders>
+            <w:vAlign w:val="center"/>
+          </w:tcPr>
+          <w:p>
+            <w:pPr>
+              <w:pStyle w:val="Style14"/>
+              <w:spacing w:lineRule="auto" w:line="240"/>
+              <w:ind w:hanging="0" w:left="0"/>
+              <w:rPr>
+                <w:lang w:val="en-US"/>
+              </w:rPr>
+            </w:pPr>
+            <w:r>
+              <w:rPr>
+                <w:lang w:val="en-US"/>
+              </w:rPr>
+              <w:t>2.9134</w:t>
+            </w:r>
+          </w:p>
+        </w:tc>
+        <w:tc>
+          <w:tcPr>
+            <w:tcW w:w="1321" w:type="dxa"/>
+            <w:tcBorders>
+              <w:left w:val="single" w:sz="4" w:space="0" w:color="000000"/>
+              <w:bottom w:val="single" w:sz="4" w:space="0" w:color="000000"/>
+              <w:right w:val="single" w:sz="4" w:space="0" w:color="000000"/>
+            </w:tcBorders>
+            <w:vAlign w:val="center"/>
+          </w:tcPr>
+          <w:p>
+            <w:pPr>
+              <w:pStyle w:val="Style14"/>
+              <w:spacing w:lineRule="auto" w:line="240"/>
+              <w:ind w:hanging="0" w:left="0"/>
+              <w:rPr>
+                <w:lang w:val="en-US"/>
+              </w:rPr>
+            </w:pPr>
+            <w:r>
+              <w:rPr>
+                <w:lang w:val="en-US"/>
+              </w:rPr>
+              <w:t>8.4453902</w:t>
+            </w:r>
+          </w:p>
+        </w:tc>
+      </w:tr>
+      <w:tr>
+        <w:trPr/>
+        <w:tc>
+          <w:tcPr>
+            <w:tcW w:w="2098" w:type="dxa"/>
+            <w:tcBorders>
+              <w:left w:val="single" w:sz="4" w:space="0" w:color="000000"/>
+              <w:bottom w:val="single" w:sz="4" w:space="0" w:color="000000"/>
+            </w:tcBorders>
+            <w:vAlign w:val="center"/>
+          </w:tcPr>
+          <w:p>
+            <w:pPr>
+              <w:pStyle w:val="Style14"/>
+              <w:spacing w:lineRule="auto" w:line="240"/>
+              <w:ind w:hanging="0" w:left="0"/>
+              <w:rPr>
+                <w:lang w:val="en-US"/>
+              </w:rPr>
+            </w:pPr>
+            <w:r>
+              <w:rPr>
+                <w:lang w:val="en-US"/>
+              </w:rPr>
+              <w:t>13.02.2026 19:47</w:t>
+            </w:r>
+          </w:p>
+        </w:tc>
+        <w:tc>
+          <w:tcPr>
+            <w:tcW w:w="1041" w:type="dxa"/>
+            <w:tcBorders>
+              <w:left w:val="single" w:sz="4" w:space="0" w:color="000000"/>
+              <w:bottom w:val="single" w:sz="4" w:space="0" w:color="000000"/>
+            </w:tcBorders>
+            <w:vAlign w:val="center"/>
+          </w:tcPr>
+          <w:p>
+            <w:pPr>
+              <w:pStyle w:val="Style14"/>
+              <w:spacing w:lineRule="auto" w:line="240"/>
+              <w:ind w:hanging="0" w:left="0"/>
+              <w:rPr>
+                <w:lang w:val="en-US"/>
+              </w:rPr>
+            </w:pPr>
+            <w:r>
+              <w:rPr>
+                <w:lang w:val="en-US"/>
+              </w:rPr>
+              <w:t>180 000</w:t>
+            </w:r>
+          </w:p>
+        </w:tc>
+        <w:tc>
+          <w:tcPr>
+            <w:tcW w:w="1041" w:type="dxa"/>
+            <w:vMerge w:val="continue"/>
+            <w:tcBorders>
+              <w:left w:val="single" w:sz="4" w:space="0" w:color="000000"/>
+              <w:bottom w:val="single" w:sz="4" w:space="0" w:color="000000"/>
+            </w:tcBorders>
+            <w:vAlign w:val="center"/>
+          </w:tcPr>
+          <w:p>
+            <w:pPr>
+              <w:pStyle w:val="Style14"/>
+              <w:spacing w:lineRule="auto" w:line="240"/>
+              <w:ind w:hanging="0" w:left="0"/>
+              <w:rPr>
+                <w:b w:val="false"/>
+                <w:bCs w:val="false"/>
+              </w:rPr>
+            </w:pPr>
+            <w:r>
+              <w:rPr>
+                <w:b w:val="false"/>
+                <w:bCs w:val="false"/>
+              </w:rPr>
+            </w:r>
+          </w:p>
+        </w:tc>
+        <w:tc>
+          <w:tcPr>
+            <w:tcW w:w="901" w:type="dxa"/>
+            <w:tcBorders>
+              <w:left w:val="single" w:sz="4" w:space="0" w:color="000000"/>
+              <w:bottom w:val="single" w:sz="4" w:space="0" w:color="000000"/>
+            </w:tcBorders>
+            <w:vAlign w:val="center"/>
+          </w:tcPr>
+          <w:p>
+            <w:pPr>
+              <w:pStyle w:val="Style14"/>
+              <w:spacing w:lineRule="auto" w:line="240"/>
+              <w:ind w:hanging="0" w:left="0"/>
+              <w:rPr>
+                <w:lang w:val="en-US"/>
+              </w:rPr>
+            </w:pPr>
+            <w:r>
+              <w:rPr>
+                <w:lang w:val="en-US"/>
+              </w:rPr>
+              <w:t>3.3082</w:t>
+            </w:r>
+          </w:p>
+        </w:tc>
+        <w:tc>
+          <w:tcPr>
+            <w:tcW w:w="1321" w:type="dxa"/>
+            <w:tcBorders>
+              <w:left w:val="single" w:sz="4" w:space="0" w:color="000000"/>
+              <w:bottom w:val="single" w:sz="4" w:space="0" w:color="000000"/>
+              <w:right w:val="single" w:sz="4" w:space="0" w:color="000000"/>
+            </w:tcBorders>
+            <w:vAlign w:val="center"/>
+          </w:tcPr>
+          <w:p>
+            <w:pPr>
+              <w:pStyle w:val="Style14"/>
+              <w:spacing w:lineRule="auto" w:line="240"/>
+              <w:ind w:hanging="0" w:left="0"/>
+              <w:rPr>
+                <w:lang w:val="en-US"/>
+              </w:rPr>
+            </w:pPr>
+            <w:r>
+              <w:rPr>
+                <w:lang w:val="en-US"/>
+              </w:rPr>
+              <w:t>7.4375188</w:t>
+            </w:r>
+          </w:p>
+        </w:tc>
+      </w:tr>
+      <w:tr>
+        <w:trPr/>
+        <w:tc>
+          <w:tcPr>
+            <w:tcW w:w="2098" w:type="dxa"/>
+            <w:tcBorders>
+              <w:left w:val="single" w:sz="4" w:space="0" w:color="000000"/>
+              <w:bottom w:val="single" w:sz="4" w:space="0" w:color="000000"/>
+            </w:tcBorders>
+            <w:vAlign w:val="center"/>
+          </w:tcPr>
+          <w:p>
+            <w:pPr>
+              <w:pStyle w:val="Style14"/>
+              <w:spacing w:lineRule="auto" w:line="240"/>
+              <w:ind w:hanging="0" w:left="0"/>
+              <w:rPr>
+                <w:lang w:val="en-US"/>
+              </w:rPr>
+            </w:pPr>
+            <w:r>
+              <w:rPr>
+                <w:lang w:val="en-US"/>
+              </w:rPr>
+              <w:t>13.02.2026 19:48</w:t>
+            </w:r>
+          </w:p>
+        </w:tc>
+        <w:tc>
+          <w:tcPr>
+            <w:tcW w:w="1041" w:type="dxa"/>
+            <w:tcBorders>
+              <w:left w:val="single" w:sz="4" w:space="0" w:color="000000"/>
+              <w:bottom w:val="single" w:sz="4" w:space="0" w:color="000000"/>
+            </w:tcBorders>
+            <w:vAlign w:val="center"/>
+          </w:tcPr>
+          <w:p>
+            <w:pPr>
+              <w:pStyle w:val="Style14"/>
+              <w:spacing w:lineRule="auto" w:line="240"/>
+              <w:ind w:hanging="0" w:left="0"/>
+              <w:rPr>
+                <w:lang w:val="en-US"/>
+              </w:rPr>
+            </w:pPr>
+            <w:r>
+              <w:rPr>
+                <w:lang w:val="en-US"/>
+              </w:rPr>
+              <w:t>200 000</w:t>
+            </w:r>
+          </w:p>
+        </w:tc>
+        <w:tc>
+          <w:tcPr>
+            <w:tcW w:w="1041" w:type="dxa"/>
+            <w:vMerge w:val="continue"/>
+            <w:tcBorders>
+              <w:left w:val="single" w:sz="4" w:space="0" w:color="000000"/>
+              <w:bottom w:val="single" w:sz="4" w:space="0" w:color="000000"/>
+            </w:tcBorders>
+            <w:vAlign w:val="center"/>
+          </w:tcPr>
+          <w:p>
+            <w:pPr>
+              <w:pStyle w:val="Style14"/>
+              <w:spacing w:lineRule="auto" w:line="240"/>
+              <w:ind w:hanging="0" w:left="0"/>
+              <w:rPr>
+                <w:b w:val="false"/>
+                <w:bCs w:val="false"/>
+              </w:rPr>
+            </w:pPr>
+            <w:r>
+              <w:rPr>
+                <w:b w:val="false"/>
+                <w:bCs w:val="false"/>
+              </w:rPr>
+            </w:r>
+          </w:p>
+        </w:tc>
+        <w:tc>
+          <w:tcPr>
+            <w:tcW w:w="901" w:type="dxa"/>
+            <w:tcBorders>
+              <w:left w:val="single" w:sz="4" w:space="0" w:color="000000"/>
+              <w:bottom w:val="single" w:sz="4" w:space="0" w:color="000000"/>
+            </w:tcBorders>
+            <w:vAlign w:val="center"/>
+          </w:tcPr>
+          <w:p>
+            <w:pPr>
+              <w:pStyle w:val="Style14"/>
+              <w:spacing w:lineRule="auto" w:line="240"/>
+              <w:ind w:hanging="0" w:left="0"/>
+              <w:rPr>
+                <w:lang w:val="en-US"/>
+              </w:rPr>
+            </w:pPr>
+            <w:r>
+              <w:rPr>
+                <w:lang w:val="en-US"/>
+              </w:rPr>
+              <w:t>3.6003</w:t>
+            </w:r>
+          </w:p>
+        </w:tc>
+        <w:tc>
+          <w:tcPr>
+            <w:tcW w:w="1321" w:type="dxa"/>
+            <w:tcBorders>
+              <w:left w:val="single" w:sz="4" w:space="0" w:color="000000"/>
+              <w:bottom w:val="single" w:sz="4" w:space="0" w:color="000000"/>
+              <w:right w:val="single" w:sz="4" w:space="0" w:color="000000"/>
+            </w:tcBorders>
+            <w:vAlign w:val="center"/>
+          </w:tcPr>
+          <w:p>
+            <w:pPr>
+              <w:pStyle w:val="Style14"/>
+              <w:spacing w:lineRule="auto" w:line="240"/>
+              <w:ind w:hanging="0" w:left="0"/>
+              <w:rPr>
+                <w:lang w:val="en-US"/>
+              </w:rPr>
+            </w:pPr>
+            <w:r>
+              <w:rPr>
+                <w:lang w:val="en-US"/>
+              </w:rPr>
+              <w:t>6.8340971</w:t>
+            </w:r>
+          </w:p>
+        </w:tc>
+      </w:tr>
+      <w:tr>
+        <w:trPr/>
+        <w:tc>
+          <w:tcPr>
+            <w:tcW w:w="2098" w:type="dxa"/>
+            <w:tcBorders>
+              <w:left w:val="single" w:sz="4" w:space="0" w:color="000000"/>
+              <w:bottom w:val="single" w:sz="4" w:space="0" w:color="000000"/>
+            </w:tcBorders>
+            <w:vAlign w:val="center"/>
+          </w:tcPr>
+          <w:p>
+            <w:pPr>
+              <w:pStyle w:val="Style14"/>
+              <w:spacing w:lineRule="auto" w:line="240"/>
+              <w:ind w:hanging="0" w:left="0"/>
+              <w:rPr>
+                <w:lang w:val="en-US"/>
+              </w:rPr>
+            </w:pPr>
+            <w:r>
+              <w:rPr>
+                <w:lang w:val="en-US"/>
+              </w:rPr>
+              <w:t>13.02.2026 19:48</w:t>
+            </w:r>
+          </w:p>
+        </w:tc>
+        <w:tc>
+          <w:tcPr>
+            <w:tcW w:w="1041" w:type="dxa"/>
+            <w:tcBorders>
+              <w:left w:val="single" w:sz="4" w:space="0" w:color="000000"/>
+              <w:bottom w:val="single" w:sz="4" w:space="0" w:color="000000"/>
+            </w:tcBorders>
+            <w:vAlign w:val="center"/>
+          </w:tcPr>
+          <w:p>
+            <w:pPr>
+              <w:pStyle w:val="Style14"/>
+              <w:spacing w:lineRule="auto" w:line="240"/>
+              <w:ind w:hanging="0" w:left="0"/>
+              <w:rPr>
+                <w:lang w:val="en-US"/>
+              </w:rPr>
+            </w:pPr>
+            <w:r>
+              <w:rPr>
+                <w:lang w:val="en-US"/>
+              </w:rPr>
+              <w:t>220 000</w:t>
+            </w:r>
+          </w:p>
+        </w:tc>
+        <w:tc>
+          <w:tcPr>
+            <w:tcW w:w="1041" w:type="dxa"/>
+            <w:vMerge w:val="continue"/>
+            <w:tcBorders>
+              <w:left w:val="single" w:sz="4" w:space="0" w:color="000000"/>
+              <w:bottom w:val="single" w:sz="4" w:space="0" w:color="000000"/>
+            </w:tcBorders>
+            <w:vAlign w:val="center"/>
+          </w:tcPr>
+          <w:p>
+            <w:pPr>
+              <w:pStyle w:val="Style14"/>
+              <w:spacing w:lineRule="auto" w:line="240"/>
+              <w:ind w:hanging="0" w:left="0"/>
+              <w:rPr>
+                <w:b w:val="false"/>
+                <w:bCs w:val="false"/>
+              </w:rPr>
+            </w:pPr>
+            <w:r>
+              <w:rPr>
+                <w:b w:val="false"/>
+                <w:bCs w:val="false"/>
+              </w:rPr>
+            </w:r>
+          </w:p>
+        </w:tc>
+        <w:tc>
+          <w:tcPr>
+            <w:tcW w:w="901" w:type="dxa"/>
+            <w:tcBorders>
+              <w:left w:val="single" w:sz="4" w:space="0" w:color="000000"/>
+              <w:bottom w:val="single" w:sz="4" w:space="0" w:color="000000"/>
+            </w:tcBorders>
+            <w:vAlign w:val="center"/>
+          </w:tcPr>
+          <w:p>
+            <w:pPr>
+              <w:pStyle w:val="Style14"/>
+              <w:spacing w:lineRule="auto" w:line="240"/>
+              <w:ind w:hanging="0" w:left="0"/>
+              <w:rPr>
+                <w:lang w:val="en-US"/>
+              </w:rPr>
+            </w:pPr>
+            <w:r>
+              <w:rPr>
+                <w:lang w:val="en-US"/>
+              </w:rPr>
+              <w:t>3.9487</w:t>
+            </w:r>
+          </w:p>
+        </w:tc>
+        <w:tc>
+          <w:tcPr>
+            <w:tcW w:w="1321" w:type="dxa"/>
+            <w:tcBorders>
+              <w:left w:val="single" w:sz="4" w:space="0" w:color="000000"/>
+              <w:bottom w:val="single" w:sz="4" w:space="0" w:color="000000"/>
+              <w:right w:val="single" w:sz="4" w:space="0" w:color="000000"/>
+            </w:tcBorders>
+            <w:vAlign w:val="center"/>
+          </w:tcPr>
+          <w:p>
+            <w:pPr>
+              <w:pStyle w:val="Style14"/>
+              <w:spacing w:lineRule="auto" w:line="240"/>
+              <w:ind w:hanging="0" w:left="0"/>
+              <w:rPr>
+                <w:lang w:val="en-US"/>
+              </w:rPr>
+            </w:pPr>
+            <w:r>
+              <w:rPr>
+                <w:lang w:val="en-US"/>
+              </w:rPr>
+              <w:t>6.2311140</w:t>
+            </w:r>
+          </w:p>
+        </w:tc>
+      </w:tr>
+      <w:tr>
+        <w:trPr/>
+        <w:tc>
+          <w:tcPr>
+            <w:tcW w:w="2098" w:type="dxa"/>
+            <w:tcBorders>
+              <w:left w:val="single" w:sz="4" w:space="0" w:color="000000"/>
+              <w:bottom w:val="single" w:sz="4" w:space="0" w:color="000000"/>
+            </w:tcBorders>
+            <w:vAlign w:val="center"/>
+          </w:tcPr>
+          <w:p>
+            <w:pPr>
+              <w:pStyle w:val="Style14"/>
+              <w:spacing w:lineRule="auto" w:line="240"/>
+              <w:ind w:hanging="0" w:left="0"/>
+              <w:rPr>
+                <w:lang w:val="en-US"/>
+              </w:rPr>
+            </w:pPr>
+            <w:r>
+              <w:rPr>
+                <w:lang w:val="en-US"/>
+              </w:rPr>
+              <w:t>13.02.2026 19:49</w:t>
+            </w:r>
+          </w:p>
+        </w:tc>
+        <w:tc>
+          <w:tcPr>
+            <w:tcW w:w="1041" w:type="dxa"/>
+            <w:tcBorders>
+              <w:left w:val="single" w:sz="4" w:space="0" w:color="000000"/>
+              <w:bottom w:val="single" w:sz="4" w:space="0" w:color="000000"/>
+            </w:tcBorders>
+            <w:vAlign w:val="center"/>
+          </w:tcPr>
+          <w:p>
+            <w:pPr>
+              <w:pStyle w:val="Style14"/>
+              <w:spacing w:lineRule="auto" w:line="240"/>
+              <w:ind w:hanging="0" w:left="0"/>
+              <w:rPr>
+                <w:lang w:val="en-US"/>
+              </w:rPr>
+            </w:pPr>
+            <w:r>
+              <w:rPr>
+                <w:lang w:val="en-US"/>
+              </w:rPr>
+              <w:t>240 000</w:t>
+            </w:r>
+          </w:p>
+        </w:tc>
+        <w:tc>
+          <w:tcPr>
+            <w:tcW w:w="1041" w:type="dxa"/>
+            <w:vMerge w:val="continue"/>
+            <w:tcBorders>
+              <w:left w:val="single" w:sz="4" w:space="0" w:color="000000"/>
+              <w:bottom w:val="single" w:sz="4" w:space="0" w:color="000000"/>
+            </w:tcBorders>
+            <w:vAlign w:val="center"/>
+          </w:tcPr>
+          <w:p>
+            <w:pPr>
+              <w:pStyle w:val="Style14"/>
+              <w:spacing w:lineRule="auto" w:line="240"/>
+              <w:ind w:hanging="0" w:left="0"/>
+              <w:rPr>
+                <w:b w:val="false"/>
+                <w:bCs w:val="false"/>
+              </w:rPr>
+            </w:pPr>
+            <w:r>
+              <w:rPr>
+                <w:b w:val="false"/>
+                <w:bCs w:val="false"/>
+              </w:rPr>
+            </w:r>
+          </w:p>
+        </w:tc>
+        <w:tc>
+          <w:tcPr>
+            <w:tcW w:w="901" w:type="dxa"/>
+            <w:tcBorders>
+              <w:left w:val="single" w:sz="4" w:space="0" w:color="000000"/>
+              <w:bottom w:val="single" w:sz="4" w:space="0" w:color="000000"/>
+            </w:tcBorders>
+            <w:vAlign w:val="center"/>
+          </w:tcPr>
+          <w:p>
+            <w:pPr>
+              <w:pStyle w:val="Style14"/>
+              <w:spacing w:lineRule="auto" w:line="240"/>
+              <w:ind w:hanging="0" w:left="0"/>
+              <w:rPr>
+                <w:lang w:val="en-US"/>
+              </w:rPr>
+            </w:pPr>
+            <w:r>
+              <w:rPr>
+                <w:lang w:val="en-US"/>
+              </w:rPr>
+              <w:t>4.4261</w:t>
+            </w:r>
+          </w:p>
+        </w:tc>
+        <w:tc>
+          <w:tcPr>
+            <w:tcW w:w="1321" w:type="dxa"/>
+            <w:tcBorders>
+              <w:left w:val="single" w:sz="4" w:space="0" w:color="000000"/>
+              <w:bottom w:val="single" w:sz="4" w:space="0" w:color="000000"/>
+              <w:right w:val="single" w:sz="4" w:space="0" w:color="000000"/>
+            </w:tcBorders>
+            <w:vAlign w:val="center"/>
+          </w:tcPr>
+          <w:p>
+            <w:pPr>
+              <w:pStyle w:val="Style14"/>
+              <w:spacing w:lineRule="auto" w:line="240"/>
+              <w:ind w:hanging="0" w:left="0"/>
+              <w:rPr>
+                <w:lang w:val="en-US"/>
+              </w:rPr>
+            </w:pPr>
+            <w:r>
+              <w:rPr>
+                <w:lang w:val="en-US"/>
+              </w:rPr>
+              <w:t>5.5590248</w:t>
+            </w:r>
+          </w:p>
+        </w:tc>
+      </w:tr>
+    </w:tbl>
+    <w:p>
+      <w:pPr>
+        <w:pStyle w:val="Normal"/>
+        <w:rPr>
+          <w:lang w:val="en-US"/>
+        </w:rPr>
+      </w:pPr>
+      <w:r>
+        <w:rPr>
+          <w:lang w:val="en-US"/>
+        </w:rPr>
+      </w:r>
+    </w:p>
+    <w:p>
+      <w:pPr>
+        <w:pStyle w:val="H3"/>
+        <w:rPr/>
+      </w:pPr>
+      <w:r>
+        <w:rPr/>
+        <w:t>Графік</w:t>
+      </w:r>
+    </w:p>
+    <w:p>
+      <w:pPr>
+        <w:pStyle w:val="Normal"/>
         <w:rPr>
           <w:lang w:val="uk-UA"/>
         </w:rPr>
@@ -4980,7 +6851,7 @@
     </w:p>
     <w:p>
       <w:pPr>
-        <w:pStyle w:val="P1"/>
+        <w:pStyle w:val="Normal"/>
         <w:rPr>
           <w:lang w:val="uk-UA"/>
         </w:rPr>
@@ -4989,11 +6860,72 @@
         <w:rPr>
           <w:lang w:val="uk-UA"/>
         </w:rPr>
-      </w:r>
-    </w:p>
-    <w:p>
-      <w:pPr>
-        <w:pStyle w:val="P1"/>
+        <w:t>Графік залежності прискорення від розміру задачі наведено нижче на рисунку:</w:t>
+      </w:r>
+    </w:p>
+    <w:p>
+      <w:pPr>
+        <w:pStyle w:val="img1"/>
+        <w:rPr/>
+      </w:pPr>
+      <w:r>
+        <w:rPr/>
+      </w:r>
+    </w:p>
+    <w:p>
+      <w:pPr>
+        <w:pStyle w:val="img1"/>
+        <w:rPr/>
+      </w:pPr>
+      <w:r>
+        <w:rPr/>
+        <w:drawing>
+          <wp:inline distT="0" distB="0" distL="0" distR="0">
+            <wp:extent cx="5731510" cy="2865755"/>
+            <wp:effectExtent l="0" t="0" r="0" b="0"/>
+            <wp:docPr id="14" name="Зображення12"/>
+            <wp:cNvGraphicFramePr>
+              <a:graphicFrameLocks xmlns:a="http://schemas.openxmlformats.org/drawingml/2006/main" noChangeAspect="1"/>
+            </wp:cNvGraphicFramePr>
+            <a:graphic xmlns:a="http://schemas.openxmlformats.org/drawingml/2006/main">
+              <a:graphicData uri="http://schemas.openxmlformats.org/drawingml/2006/picture">
+                <pic:pic xmlns:pic="http://schemas.openxmlformats.org/drawingml/2006/picture">
+                  <pic:nvPicPr>
+                    <pic:cNvPr id="14" name="Зображення12"/>
+                    <pic:cNvPicPr>
+                      <a:picLocks noChangeAspect="1" noChangeArrowheads="1"/>
+                    </pic:cNvPicPr>
+                  </pic:nvPicPr>
+                  <pic:blipFill>
+                    <a:blip r:embed="rId15"/>
+                    <a:stretch>
+                      <a:fillRect/>
+                    </a:stretch>
+                  </pic:blipFill>
+                  <pic:spPr bwMode="auto">
+                    <a:xfrm>
+                      <a:off x="0" y="0"/>
+                      <a:ext cx="5731510" cy="2865755"/>
+                    </a:xfrm>
+                    <a:prstGeom prst="rect">
+                      <a:avLst/>
+                    </a:prstGeom>
+                    <a:noFill/>
+                  </pic:spPr>
+                </pic:pic>
+              </a:graphicData>
+            </a:graphic>
+          </wp:inline>
+        </w:drawing>
+      </w:r>
+      <w:r>
+        <w:rPr/>
+        <w:t>Рисунок 1.2 — Графік залежностей</w:t>
+      </w:r>
+    </w:p>
+    <w:p>
+      <w:pPr>
+        <w:pStyle w:val="Normal"/>
         <w:rPr>
           <w:lang w:val="uk-UA"/>
         </w:rPr>

</xml_diff>

<commit_message>
feat -- TR4: first task done, praise King Jesus
</commit_message>
<xml_diff>
--- a/42TR Tehnologiji Rozpodilenyh System/4/TR_KNT-122_Onyshchenko_19_PR4.docx
+++ b/42TR Tehnologiji Rozpodilenyh System/4/TR_KNT-122_Onyshchenko_19_PR4.docx
@@ -6934,6 +6934,1760 @@
         <w:rPr>
           <w:lang w:val="uk-UA"/>
         </w:rPr>
+      </w:r>
+    </w:p>
+    <w:p>
+      <w:pPr>
+        <w:pStyle w:val="H2"/>
+        <w:rPr/>
+      </w:pPr>
+      <w:r>
+        <w:rPr/>
+        <w:t xml:space="preserve">4.2.1.4 </w:t>
+      </w:r>
+      <w:r>
+        <w:rPr>
+          <w:lang w:val="uk-UA"/>
+        </w:rPr>
+        <w:t xml:space="preserve">Час </w:t>
+      </w:r>
+      <w:r>
+        <w:rPr/>
+        <w:t>Scatter</w:t>
+      </w:r>
+    </w:p>
+    <w:p>
+      <w:pPr>
+        <w:pStyle w:val="H3"/>
+        <w:rPr/>
+      </w:pPr>
+      <w:r>
+        <w:rPr/>
+        <w:t>Завдання</w:t>
+      </w:r>
+    </w:p>
+    <w:p>
+      <w:pPr>
+        <w:pStyle w:val="Normal"/>
+        <w:rPr>
+          <w:lang w:val="uk-UA"/>
+        </w:rPr>
+      </w:pPr>
+      <w:r>
+        <w:rPr>
+          <w:lang w:val="uk-UA"/>
+        </w:rPr>
+      </w:r>
+    </w:p>
+    <w:p>
+      <w:pPr>
+        <w:pStyle w:val="P1"/>
+        <w:rPr>
+          <w:lang w:val="en-US"/>
+        </w:rPr>
+      </w:pPr>
+      <w:r>
+        <w:rPr/>
+        <w:t>Додайте до програми код для вимірювання часу, який витрачається на виконання двох функцій MPI_Scatter(), дослідіть та намалюйте графіки залежності цього часу від довжини масиву, що розсилається при виконанні задачі на чотирьох процесорах. Результати занесіть до таблиці 4.3.</w:t>
+      </w:r>
+    </w:p>
+    <w:p>
+      <w:pPr>
+        <w:pStyle w:val="P1"/>
+        <w:rPr>
+          <w:lang w:val="en-US"/>
+        </w:rPr>
+      </w:pPr>
+      <w:r>
+        <w:rPr/>
+      </w:r>
+    </w:p>
+    <w:p>
+      <w:pPr>
+        <w:pStyle w:val="H3"/>
+        <w:rPr/>
+      </w:pPr>
+      <w:r>
+        <w:rPr/>
+        <w:t>Таблиця</w:t>
+      </w:r>
+    </w:p>
+    <w:p>
+      <w:pPr>
+        <w:pStyle w:val="P1"/>
+        <w:rPr>
+          <w:lang w:val="en-US"/>
+        </w:rPr>
+      </w:pPr>
+      <w:r>
+        <w:rPr/>
+      </w:r>
+    </w:p>
+    <w:p>
+      <w:pPr>
+        <w:pStyle w:val="P1"/>
+        <w:rPr>
+          <w:lang w:val="uk-UA"/>
+        </w:rPr>
+      </w:pPr>
+      <w:r>
+        <w:rPr/>
+        <w:t xml:space="preserve">Для обчислення колонки </w:t>
+      </w:r>
+      <w:r>
+        <w:rPr>
+          <w:lang w:val="en-US"/>
+        </w:rPr>
+        <w:t xml:space="preserve">S </w:t>
+      </w:r>
+      <w:r>
+        <w:rPr>
+          <w:lang w:val="uk-UA"/>
+        </w:rPr>
+        <w:t>було використано таку формулу:</w:t>
+      </w:r>
+    </w:p>
+    <w:p>
+      <w:pPr>
+        <w:pStyle w:val="P1"/>
+        <w:rPr>
+          <w:lang w:val="uk-UA"/>
+        </w:rPr>
+      </w:pPr>
+      <w:r>
+        <w:rPr>
+          <w:lang w:val="uk-UA"/>
+        </w:rPr>
+      </w:r>
+    </w:p>
+    <w:p>
+      <w:pPr>
+        <w:pStyle w:val="img1"/>
+        <w:rPr/>
+      </w:pPr>
+      <w:r>
+        <w:rPr/>
+        <w:drawing>
+          <wp:inline distT="0" distB="0" distL="0" distR="0">
+            <wp:extent cx="1466850" cy="904875"/>
+            <wp:effectExtent l="0" t="0" r="0" b="0"/>
+            <wp:docPr id="15" name="Зображення14"/>
+            <wp:cNvGraphicFramePr>
+              <a:graphicFrameLocks xmlns:a="http://schemas.openxmlformats.org/drawingml/2006/main" noChangeAspect="1"/>
+            </wp:cNvGraphicFramePr>
+            <a:graphic xmlns:a="http://schemas.openxmlformats.org/drawingml/2006/main">
+              <a:graphicData uri="http://schemas.openxmlformats.org/drawingml/2006/picture">
+                <pic:pic xmlns:pic="http://schemas.openxmlformats.org/drawingml/2006/picture">
+                  <pic:nvPicPr>
+                    <pic:cNvPr id="15" name="Зображення14"/>
+                    <pic:cNvPicPr>
+                      <a:picLocks noChangeAspect="1" noChangeArrowheads="1"/>
+                    </pic:cNvPicPr>
+                  </pic:nvPicPr>
+                  <pic:blipFill>
+                    <a:blip r:embed="rId16"/>
+                    <a:stretch>
+                      <a:fillRect/>
+                    </a:stretch>
+                  </pic:blipFill>
+                  <pic:spPr bwMode="auto">
+                    <a:xfrm>
+                      <a:off x="0" y="0"/>
+                      <a:ext cx="1466850" cy="904875"/>
+                    </a:xfrm>
+                    <a:prstGeom prst="rect">
+                      <a:avLst/>
+                    </a:prstGeom>
+                    <a:noFill/>
+                  </pic:spPr>
+                </pic:pic>
+              </a:graphicData>
+            </a:graphic>
+          </wp:inline>
+        </w:drawing>
+      </w:r>
+    </w:p>
+    <w:p>
+      <w:pPr>
+        <w:pStyle w:val="P1"/>
+        <w:rPr>
+          <w:lang w:val="en-US"/>
+        </w:rPr>
+      </w:pPr>
+      <w:r>
+        <w:rPr/>
+      </w:r>
+    </w:p>
+    <w:p>
+      <w:pPr>
+        <w:pStyle w:val="BodyText"/>
+        <w:rPr>
+          <w:lang w:val="en-US"/>
+        </w:rPr>
+      </w:pPr>
+      <w:r>
+        <w:rPr>
+          <w:lang w:val="en-US"/>
+        </w:rPr>
+        <w:t>Таблиця 4.3 – Залежність швидкості розсилання від довжини масиву при P=4</w:t>
+      </w:r>
+    </w:p>
+    <w:tbl>
+      <w:tblPr>
+        <w:tblW w:w="7096" w:type="dxa"/>
+        <w:jc w:val="left"/>
+        <w:tblInd w:w="57" w:type="dxa"/>
+        <w:tblLayout w:type="fixed"/>
+        <w:tblCellMar>
+          <w:top w:w="57" w:type="dxa"/>
+          <w:left w:w="57" w:type="dxa"/>
+          <w:bottom w:w="57" w:type="dxa"/>
+          <w:right w:w="0" w:type="dxa"/>
+        </w:tblCellMar>
+      </w:tblPr>
+      <w:tblGrid>
+        <w:gridCol w:w="2045"/>
+        <w:gridCol w:w="988"/>
+        <w:gridCol w:w="1408"/>
+        <w:gridCol w:w="2655"/>
+      </w:tblGrid>
+      <w:tr>
+        <w:trPr/>
+        <w:tc>
+          <w:tcPr>
+            <w:tcW w:w="2045" w:type="dxa"/>
+            <w:tcBorders>
+              <w:top w:val="single" w:sz="2" w:space="0" w:color="000000"/>
+              <w:left w:val="single" w:sz="2" w:space="0" w:color="000000"/>
+              <w:bottom w:val="single" w:sz="2" w:space="0" w:color="000000"/>
+            </w:tcBorders>
+          </w:tcPr>
+          <w:p>
+            <w:pPr>
+              <w:pStyle w:val="Style14"/>
+              <w:widowControl/>
+              <w:spacing w:lineRule="auto" w:line="240" w:before="0" w:after="0"/>
+              <w:ind w:hanging="0" w:left="0" w:right="0"/>
+              <w:jc w:val="both"/>
+              <w:rPr>
+                <w:b/>
+                <w:bCs/>
+              </w:rPr>
+            </w:pPr>
+            <w:r>
+              <w:rPr>
+                <w:b/>
+                <w:bCs/>
+              </w:rPr>
+              <w:t>Дата та час</w:t>
+            </w:r>
+          </w:p>
+        </w:tc>
+        <w:tc>
+          <w:tcPr>
+            <w:tcW w:w="988" w:type="dxa"/>
+            <w:tcBorders>
+              <w:top w:val="single" w:sz="2" w:space="0" w:color="000000"/>
+              <w:left w:val="single" w:sz="2" w:space="0" w:color="000000"/>
+              <w:bottom w:val="single" w:sz="2" w:space="0" w:color="000000"/>
+            </w:tcBorders>
+          </w:tcPr>
+          <w:p>
+            <w:pPr>
+              <w:pStyle w:val="Style14"/>
+              <w:widowControl/>
+              <w:spacing w:lineRule="auto" w:line="240" w:before="0" w:after="0"/>
+              <w:ind w:hanging="0" w:left="0" w:right="0"/>
+              <w:jc w:val="both"/>
+              <w:rPr>
+                <w:b/>
+                <w:bCs/>
+                <w:lang w:val="en-US"/>
+              </w:rPr>
+            </w:pPr>
+            <w:r>
+              <w:rPr>
+                <w:b/>
+                <w:bCs/>
+                <w:lang w:val="en-US"/>
+              </w:rPr>
+              <w:t>N</w:t>
+            </w:r>
+          </w:p>
+        </w:tc>
+        <w:tc>
+          <w:tcPr>
+            <w:tcW w:w="1408" w:type="dxa"/>
+            <w:tcBorders>
+              <w:top w:val="single" w:sz="2" w:space="0" w:color="000000"/>
+              <w:left w:val="single" w:sz="2" w:space="0" w:color="000000"/>
+              <w:bottom w:val="single" w:sz="2" w:space="0" w:color="000000"/>
+            </w:tcBorders>
+          </w:tcPr>
+          <w:p>
+            <w:pPr>
+              <w:pStyle w:val="Style14"/>
+              <w:widowControl/>
+              <w:spacing w:lineRule="auto" w:line="240" w:before="0" w:after="0"/>
+              <w:ind w:hanging="0" w:left="0" w:right="0"/>
+              <w:jc w:val="both"/>
+              <w:rPr>
+                <w:b/>
+                <w:bCs/>
+              </w:rPr>
+            </w:pPr>
+            <w:r>
+              <w:rPr>
+                <w:b/>
+                <w:bCs/>
+                <w:lang w:val="en-US"/>
+              </w:rPr>
+              <w:t>T</w:t>
+            </w:r>
+            <w:r>
+              <w:rPr>
+                <w:b/>
+                <w:bCs/>
+                <w:position w:val="-2"/>
+                <w:sz w:val="22"/>
+                <w:lang w:val="en-US"/>
+              </w:rPr>
+              <w:t>Scatter</w:t>
+            </w:r>
+          </w:p>
+        </w:tc>
+        <w:tc>
+          <w:tcPr>
+            <w:tcW w:w="2655" w:type="dxa"/>
+            <w:tcBorders>
+              <w:top w:val="single" w:sz="2" w:space="0" w:color="000000"/>
+              <w:left w:val="single" w:sz="2" w:space="0" w:color="000000"/>
+              <w:bottom w:val="single" w:sz="2" w:space="0" w:color="000000"/>
+              <w:right w:val="single" w:sz="2" w:space="0" w:color="000000"/>
+            </w:tcBorders>
+            <w:tcMar>
+              <w:right w:w="57" w:type="dxa"/>
+            </w:tcMar>
+          </w:tcPr>
+          <w:p>
+            <w:pPr>
+              <w:pStyle w:val="Style14"/>
+              <w:widowControl/>
+              <w:spacing w:lineRule="auto" w:line="240" w:before="0" w:after="0"/>
+              <w:ind w:hanging="0" w:left="0" w:right="0"/>
+              <w:jc w:val="both"/>
+              <w:rPr>
+                <w:b/>
+                <w:bCs/>
+              </w:rPr>
+            </w:pPr>
+            <w:r>
+              <w:rPr>
+                <w:b/>
+                <w:bCs/>
+                <w:lang w:val="en-US"/>
+              </w:rPr>
+              <w:t xml:space="preserve">S </w:t>
+            </w:r>
+            <w:r>
+              <w:rPr>
+                <w:b/>
+                <w:bCs/>
+                <w:lang w:val="uk-UA"/>
+              </w:rPr>
+              <w:t>(байт / с)</w:t>
+            </w:r>
+          </w:p>
+        </w:tc>
+      </w:tr>
+      <w:tr>
+        <w:trPr/>
+        <w:tc>
+          <w:tcPr>
+            <w:tcW w:w="2045" w:type="dxa"/>
+            <w:tcBorders>
+              <w:left w:val="single" w:sz="2" w:space="0" w:color="000000"/>
+              <w:bottom w:val="single" w:sz="2" w:space="0" w:color="000000"/>
+            </w:tcBorders>
+          </w:tcPr>
+          <w:p>
+            <w:pPr>
+              <w:pStyle w:val="Style14"/>
+              <w:widowControl/>
+              <w:spacing w:lineRule="auto" w:line="240" w:before="0" w:after="0"/>
+              <w:ind w:hanging="0" w:left="0" w:right="0"/>
+              <w:jc w:val="both"/>
+              <w:rPr>
+                <w:lang w:val="en-US"/>
+              </w:rPr>
+            </w:pPr>
+            <w:r>
+              <w:rPr>
+                <w:lang w:val="en-US"/>
+              </w:rPr>
+              <w:t>14.02.2026 10:37</w:t>
+            </w:r>
+          </w:p>
+        </w:tc>
+        <w:tc>
+          <w:tcPr>
+            <w:tcW w:w="988" w:type="dxa"/>
+            <w:tcBorders>
+              <w:left w:val="single" w:sz="2" w:space="0" w:color="000000"/>
+              <w:bottom w:val="single" w:sz="2" w:space="0" w:color="000000"/>
+            </w:tcBorders>
+          </w:tcPr>
+          <w:p>
+            <w:pPr>
+              <w:pStyle w:val="Style14"/>
+              <w:widowControl/>
+              <w:spacing w:lineRule="auto" w:line="240" w:before="0" w:after="0"/>
+              <w:ind w:hanging="0" w:left="0" w:right="0"/>
+              <w:jc w:val="both"/>
+              <w:rPr>
+                <w:lang w:val="en-US"/>
+              </w:rPr>
+            </w:pPr>
+            <w:r>
+              <w:rPr>
+                <w:lang w:val="en-US"/>
+              </w:rPr>
+              <w:t>20 000</w:t>
+            </w:r>
+          </w:p>
+        </w:tc>
+        <w:tc>
+          <w:tcPr>
+            <w:tcW w:w="1408" w:type="dxa"/>
+            <w:tcBorders>
+              <w:left w:val="single" w:sz="2" w:space="0" w:color="000000"/>
+              <w:bottom w:val="single" w:sz="2" w:space="0" w:color="000000"/>
+            </w:tcBorders>
+          </w:tcPr>
+          <w:p>
+            <w:pPr>
+              <w:pStyle w:val="Style14"/>
+              <w:widowControl/>
+              <w:spacing w:lineRule="auto" w:line="240" w:before="0" w:after="0"/>
+              <w:ind w:hanging="0" w:left="0" w:right="0"/>
+              <w:jc w:val="both"/>
+              <w:rPr/>
+            </w:pPr>
+            <w:r>
+              <w:rPr/>
+              <w:t>0.00018030</w:t>
+            </w:r>
+          </w:p>
+        </w:tc>
+        <w:tc>
+          <w:tcPr>
+            <w:tcW w:w="2655" w:type="dxa"/>
+            <w:tcBorders>
+              <w:left w:val="single" w:sz="2" w:space="0" w:color="000000"/>
+              <w:bottom w:val="single" w:sz="2" w:space="0" w:color="000000"/>
+              <w:right w:val="single" w:sz="2" w:space="0" w:color="000000"/>
+            </w:tcBorders>
+            <w:tcMar>
+              <w:right w:w="57" w:type="dxa"/>
+            </w:tcMar>
+          </w:tcPr>
+          <w:p>
+            <w:pPr>
+              <w:pStyle w:val="Style14"/>
+              <w:widowControl/>
+              <w:spacing w:lineRule="auto" w:line="240" w:before="0" w:after="0"/>
+              <w:ind w:hanging="0" w:left="0" w:right="0"/>
+              <w:jc w:val="both"/>
+              <w:rPr/>
+            </w:pPr>
+            <w:r>
+              <w:rPr/>
+              <w:t>1 774 819 744,86966</w:t>
+            </w:r>
+          </w:p>
+        </w:tc>
+      </w:tr>
+      <w:tr>
+        <w:trPr/>
+        <w:tc>
+          <w:tcPr>
+            <w:tcW w:w="2045" w:type="dxa"/>
+            <w:tcBorders>
+              <w:left w:val="single" w:sz="2" w:space="0" w:color="000000"/>
+              <w:bottom w:val="single" w:sz="2" w:space="0" w:color="000000"/>
+            </w:tcBorders>
+          </w:tcPr>
+          <w:p>
+            <w:pPr>
+              <w:pStyle w:val="Style14"/>
+              <w:widowControl/>
+              <w:spacing w:lineRule="auto" w:line="240" w:before="0" w:after="0"/>
+              <w:ind w:hanging="0" w:left="0" w:right="0"/>
+              <w:jc w:val="both"/>
+              <w:rPr>
+                <w:lang w:val="en-US"/>
+              </w:rPr>
+            </w:pPr>
+            <w:r>
+              <w:rPr>
+                <w:lang w:val="en-US"/>
+              </w:rPr>
+              <w:t>14.02.2026 10:38</w:t>
+            </w:r>
+          </w:p>
+        </w:tc>
+        <w:tc>
+          <w:tcPr>
+            <w:tcW w:w="988" w:type="dxa"/>
+            <w:tcBorders>
+              <w:left w:val="single" w:sz="2" w:space="0" w:color="000000"/>
+              <w:bottom w:val="single" w:sz="2" w:space="0" w:color="000000"/>
+            </w:tcBorders>
+          </w:tcPr>
+          <w:p>
+            <w:pPr>
+              <w:pStyle w:val="Style14"/>
+              <w:widowControl/>
+              <w:spacing w:lineRule="auto" w:line="240" w:before="0" w:after="0"/>
+              <w:ind w:hanging="0" w:left="0" w:right="0"/>
+              <w:jc w:val="both"/>
+              <w:rPr>
+                <w:lang w:val="en-US"/>
+              </w:rPr>
+            </w:pPr>
+            <w:r>
+              <w:rPr>
+                <w:lang w:val="en-US"/>
+              </w:rPr>
+              <w:t>40 000</w:t>
+            </w:r>
+          </w:p>
+        </w:tc>
+        <w:tc>
+          <w:tcPr>
+            <w:tcW w:w="1408" w:type="dxa"/>
+            <w:tcBorders>
+              <w:left w:val="single" w:sz="2" w:space="0" w:color="000000"/>
+              <w:bottom w:val="single" w:sz="2" w:space="0" w:color="000000"/>
+            </w:tcBorders>
+          </w:tcPr>
+          <w:p>
+            <w:pPr>
+              <w:pStyle w:val="Style14"/>
+              <w:widowControl/>
+              <w:spacing w:lineRule="auto" w:line="240" w:before="0" w:after="0"/>
+              <w:ind w:hanging="0" w:left="0" w:right="0"/>
+              <w:jc w:val="both"/>
+              <w:rPr/>
+            </w:pPr>
+            <w:r>
+              <w:rPr/>
+              <w:t>0.00014770</w:t>
+            </w:r>
+          </w:p>
+        </w:tc>
+        <w:tc>
+          <w:tcPr>
+            <w:tcW w:w="2655" w:type="dxa"/>
+            <w:tcBorders>
+              <w:left w:val="single" w:sz="2" w:space="0" w:color="000000"/>
+              <w:bottom w:val="single" w:sz="2" w:space="0" w:color="000000"/>
+              <w:right w:val="single" w:sz="2" w:space="0" w:color="000000"/>
+            </w:tcBorders>
+            <w:tcMar>
+              <w:right w:w="57" w:type="dxa"/>
+            </w:tcMar>
+          </w:tcPr>
+          <w:p>
+            <w:pPr>
+              <w:pStyle w:val="Style14"/>
+              <w:widowControl/>
+              <w:spacing w:lineRule="auto" w:line="240" w:before="0" w:after="0"/>
+              <w:ind w:hanging="0" w:left="0" w:right="0"/>
+              <w:jc w:val="both"/>
+              <w:rPr/>
+            </w:pPr>
+            <w:r>
+              <w:rPr/>
+              <w:t>4 333 107 650,643196</w:t>
+            </w:r>
+          </w:p>
+        </w:tc>
+      </w:tr>
+      <w:tr>
+        <w:trPr/>
+        <w:tc>
+          <w:tcPr>
+            <w:tcW w:w="2045" w:type="dxa"/>
+            <w:tcBorders>
+              <w:left w:val="single" w:sz="2" w:space="0" w:color="000000"/>
+              <w:bottom w:val="single" w:sz="2" w:space="0" w:color="000000"/>
+            </w:tcBorders>
+          </w:tcPr>
+          <w:p>
+            <w:pPr>
+              <w:pStyle w:val="Style14"/>
+              <w:widowControl/>
+              <w:spacing w:lineRule="auto" w:line="240" w:before="0" w:after="0"/>
+              <w:ind w:hanging="0" w:left="0" w:right="0"/>
+              <w:jc w:val="both"/>
+              <w:rPr>
+                <w:lang w:val="en-US"/>
+              </w:rPr>
+            </w:pPr>
+            <w:r>
+              <w:rPr>
+                <w:lang w:val="en-US"/>
+              </w:rPr>
+              <w:t>14.02.2026 10:38</w:t>
+            </w:r>
+          </w:p>
+        </w:tc>
+        <w:tc>
+          <w:tcPr>
+            <w:tcW w:w="988" w:type="dxa"/>
+            <w:tcBorders>
+              <w:left w:val="single" w:sz="2" w:space="0" w:color="000000"/>
+              <w:bottom w:val="single" w:sz="2" w:space="0" w:color="000000"/>
+            </w:tcBorders>
+          </w:tcPr>
+          <w:p>
+            <w:pPr>
+              <w:pStyle w:val="Style14"/>
+              <w:widowControl/>
+              <w:spacing w:lineRule="auto" w:line="240" w:before="0" w:after="0"/>
+              <w:ind w:hanging="0" w:left="0" w:right="0"/>
+              <w:jc w:val="both"/>
+              <w:rPr>
+                <w:lang w:val="en-US"/>
+              </w:rPr>
+            </w:pPr>
+            <w:r>
+              <w:rPr>
+                <w:lang w:val="en-US"/>
+              </w:rPr>
+              <w:t>60 000</w:t>
+            </w:r>
+          </w:p>
+        </w:tc>
+        <w:tc>
+          <w:tcPr>
+            <w:tcW w:w="1408" w:type="dxa"/>
+            <w:tcBorders>
+              <w:left w:val="single" w:sz="2" w:space="0" w:color="000000"/>
+              <w:bottom w:val="single" w:sz="2" w:space="0" w:color="000000"/>
+            </w:tcBorders>
+          </w:tcPr>
+          <w:p>
+            <w:pPr>
+              <w:pStyle w:val="Style14"/>
+              <w:widowControl/>
+              <w:spacing w:lineRule="auto" w:line="240" w:before="0" w:after="0"/>
+              <w:ind w:hanging="0" w:left="0" w:right="0"/>
+              <w:jc w:val="both"/>
+              <w:rPr/>
+            </w:pPr>
+            <w:r>
+              <w:rPr/>
+              <w:t>0.00018110</w:t>
+            </w:r>
+          </w:p>
+        </w:tc>
+        <w:tc>
+          <w:tcPr>
+            <w:tcW w:w="2655" w:type="dxa"/>
+            <w:tcBorders>
+              <w:left w:val="single" w:sz="2" w:space="0" w:color="000000"/>
+              <w:bottom w:val="single" w:sz="2" w:space="0" w:color="000000"/>
+              <w:right w:val="single" w:sz="2" w:space="0" w:color="000000"/>
+            </w:tcBorders>
+            <w:tcMar>
+              <w:right w:w="57" w:type="dxa"/>
+            </w:tcMar>
+          </w:tcPr>
+          <w:p>
+            <w:pPr>
+              <w:pStyle w:val="Style14"/>
+              <w:widowControl/>
+              <w:spacing w:lineRule="auto" w:line="240" w:before="0" w:after="0"/>
+              <w:ind w:hanging="0" w:left="0" w:right="0"/>
+              <w:jc w:val="both"/>
+              <w:rPr/>
+            </w:pPr>
+            <w:r>
+              <w:rPr/>
+              <w:t>5 300 938 708,2275</w:t>
+            </w:r>
+          </w:p>
+        </w:tc>
+      </w:tr>
+      <w:tr>
+        <w:trPr/>
+        <w:tc>
+          <w:tcPr>
+            <w:tcW w:w="2045" w:type="dxa"/>
+            <w:tcBorders>
+              <w:left w:val="single" w:sz="2" w:space="0" w:color="000000"/>
+              <w:bottom w:val="single" w:sz="2" w:space="0" w:color="000000"/>
+            </w:tcBorders>
+          </w:tcPr>
+          <w:p>
+            <w:pPr>
+              <w:pStyle w:val="Style14"/>
+              <w:widowControl/>
+              <w:spacing w:lineRule="auto" w:line="240" w:before="0" w:after="0"/>
+              <w:ind w:hanging="0" w:left="0" w:right="0"/>
+              <w:jc w:val="both"/>
+              <w:rPr>
+                <w:lang w:val="en-US"/>
+              </w:rPr>
+            </w:pPr>
+            <w:r>
+              <w:rPr>
+                <w:lang w:val="en-US"/>
+              </w:rPr>
+              <w:t>14.02.2026 10:38</w:t>
+            </w:r>
+          </w:p>
+        </w:tc>
+        <w:tc>
+          <w:tcPr>
+            <w:tcW w:w="988" w:type="dxa"/>
+            <w:tcBorders>
+              <w:left w:val="single" w:sz="2" w:space="0" w:color="000000"/>
+              <w:bottom w:val="single" w:sz="2" w:space="0" w:color="000000"/>
+            </w:tcBorders>
+          </w:tcPr>
+          <w:p>
+            <w:pPr>
+              <w:pStyle w:val="Style14"/>
+              <w:widowControl/>
+              <w:spacing w:lineRule="auto" w:line="240" w:before="0" w:after="0"/>
+              <w:ind w:hanging="0" w:left="0" w:right="0"/>
+              <w:jc w:val="both"/>
+              <w:rPr>
+                <w:lang w:val="en-US"/>
+              </w:rPr>
+            </w:pPr>
+            <w:r>
+              <w:rPr>
+                <w:lang w:val="en-US"/>
+              </w:rPr>
+              <w:t>80 000</w:t>
+            </w:r>
+          </w:p>
+        </w:tc>
+        <w:tc>
+          <w:tcPr>
+            <w:tcW w:w="1408" w:type="dxa"/>
+            <w:tcBorders>
+              <w:left w:val="single" w:sz="2" w:space="0" w:color="000000"/>
+              <w:bottom w:val="single" w:sz="2" w:space="0" w:color="000000"/>
+            </w:tcBorders>
+          </w:tcPr>
+          <w:p>
+            <w:pPr>
+              <w:pStyle w:val="Style14"/>
+              <w:widowControl/>
+              <w:spacing w:lineRule="auto" w:line="240" w:before="0" w:after="0"/>
+              <w:ind w:hanging="0" w:left="0" w:right="0"/>
+              <w:jc w:val="both"/>
+              <w:rPr/>
+            </w:pPr>
+            <w:r>
+              <w:rPr/>
+              <w:t>0.00032590</w:t>
+            </w:r>
+          </w:p>
+        </w:tc>
+        <w:tc>
+          <w:tcPr>
+            <w:tcW w:w="2655" w:type="dxa"/>
+            <w:tcBorders>
+              <w:left w:val="single" w:sz="2" w:space="0" w:color="000000"/>
+              <w:bottom w:val="single" w:sz="2" w:space="0" w:color="000000"/>
+              <w:right w:val="single" w:sz="2" w:space="0" w:color="000000"/>
+            </w:tcBorders>
+            <w:tcMar>
+              <w:right w:w="57" w:type="dxa"/>
+            </w:tcMar>
+          </w:tcPr>
+          <w:p>
+            <w:pPr>
+              <w:pStyle w:val="Style14"/>
+              <w:widowControl/>
+              <w:spacing w:lineRule="auto" w:line="240" w:before="0" w:after="0"/>
+              <w:ind w:hanging="0" w:left="0" w:right="0"/>
+              <w:jc w:val="both"/>
+              <w:rPr/>
+            </w:pPr>
+            <w:r>
+              <w:rPr/>
+              <w:t>3 926 142 153,84615</w:t>
+            </w:r>
+          </w:p>
+        </w:tc>
+      </w:tr>
+      <w:tr>
+        <w:trPr/>
+        <w:tc>
+          <w:tcPr>
+            <w:tcW w:w="2045" w:type="dxa"/>
+            <w:tcBorders>
+              <w:left w:val="single" w:sz="2" w:space="0" w:color="000000"/>
+              <w:bottom w:val="single" w:sz="2" w:space="0" w:color="000000"/>
+            </w:tcBorders>
+          </w:tcPr>
+          <w:p>
+            <w:pPr>
+              <w:pStyle w:val="Style14"/>
+              <w:widowControl/>
+              <w:spacing w:lineRule="auto" w:line="240" w:before="0" w:after="0"/>
+              <w:ind w:hanging="0" w:left="0" w:right="0"/>
+              <w:jc w:val="both"/>
+              <w:rPr>
+                <w:lang w:val="en-US"/>
+              </w:rPr>
+            </w:pPr>
+            <w:r>
+              <w:rPr>
+                <w:lang w:val="en-US"/>
+              </w:rPr>
+              <w:t>14.02.2026 10:39</w:t>
+            </w:r>
+          </w:p>
+        </w:tc>
+        <w:tc>
+          <w:tcPr>
+            <w:tcW w:w="988" w:type="dxa"/>
+            <w:tcBorders>
+              <w:left w:val="single" w:sz="2" w:space="0" w:color="000000"/>
+              <w:bottom w:val="single" w:sz="2" w:space="0" w:color="000000"/>
+            </w:tcBorders>
+          </w:tcPr>
+          <w:p>
+            <w:pPr>
+              <w:pStyle w:val="Style14"/>
+              <w:widowControl/>
+              <w:spacing w:lineRule="auto" w:line="240" w:before="0" w:after="0"/>
+              <w:ind w:hanging="0" w:left="0" w:right="0"/>
+              <w:jc w:val="both"/>
+              <w:rPr>
+                <w:lang w:val="en-US"/>
+              </w:rPr>
+            </w:pPr>
+            <w:r>
+              <w:rPr>
+                <w:lang w:val="en-US"/>
+              </w:rPr>
+              <w:t>100 000</w:t>
+            </w:r>
+          </w:p>
+        </w:tc>
+        <w:tc>
+          <w:tcPr>
+            <w:tcW w:w="1408" w:type="dxa"/>
+            <w:tcBorders>
+              <w:left w:val="single" w:sz="2" w:space="0" w:color="000000"/>
+              <w:bottom w:val="single" w:sz="2" w:space="0" w:color="000000"/>
+            </w:tcBorders>
+          </w:tcPr>
+          <w:p>
+            <w:pPr>
+              <w:pStyle w:val="Style14"/>
+              <w:widowControl/>
+              <w:spacing w:lineRule="auto" w:line="240" w:before="0" w:after="0"/>
+              <w:ind w:hanging="0" w:left="0" w:right="0"/>
+              <w:jc w:val="both"/>
+              <w:rPr/>
+            </w:pPr>
+            <w:r>
+              <w:rPr/>
+              <w:t>0.00029120</w:t>
+            </w:r>
+          </w:p>
+        </w:tc>
+        <w:tc>
+          <w:tcPr>
+            <w:tcW w:w="2655" w:type="dxa"/>
+            <w:tcBorders>
+              <w:left w:val="single" w:sz="2" w:space="0" w:color="000000"/>
+              <w:bottom w:val="single" w:sz="2" w:space="0" w:color="000000"/>
+              <w:right w:val="single" w:sz="2" w:space="0" w:color="000000"/>
+            </w:tcBorders>
+            <w:tcMar>
+              <w:right w:w="57" w:type="dxa"/>
+            </w:tcMar>
+          </w:tcPr>
+          <w:p>
+            <w:pPr>
+              <w:pStyle w:val="Style14"/>
+              <w:widowControl/>
+              <w:spacing w:lineRule="auto" w:line="240" w:before="0" w:after="0"/>
+              <w:ind w:hanging="0" w:left="0" w:right="0"/>
+              <w:jc w:val="both"/>
+              <w:rPr/>
+            </w:pPr>
+            <w:r>
+              <w:rPr/>
+              <w:t>5 494 505 494,5055</w:t>
+            </w:r>
+          </w:p>
+        </w:tc>
+      </w:tr>
+      <w:tr>
+        <w:trPr/>
+        <w:tc>
+          <w:tcPr>
+            <w:tcW w:w="2045" w:type="dxa"/>
+            <w:tcBorders>
+              <w:left w:val="single" w:sz="2" w:space="0" w:color="000000"/>
+              <w:bottom w:val="single" w:sz="2" w:space="0" w:color="000000"/>
+            </w:tcBorders>
+          </w:tcPr>
+          <w:p>
+            <w:pPr>
+              <w:pStyle w:val="Style14"/>
+              <w:widowControl/>
+              <w:spacing w:lineRule="auto" w:line="240" w:before="0" w:after="0"/>
+              <w:ind w:hanging="0" w:left="0" w:right="0"/>
+              <w:jc w:val="both"/>
+              <w:rPr>
+                <w:lang w:val="en-US"/>
+              </w:rPr>
+            </w:pPr>
+            <w:r>
+              <w:rPr>
+                <w:lang w:val="en-US"/>
+              </w:rPr>
+              <w:t>14.02.2026 10:39</w:t>
+            </w:r>
+          </w:p>
+        </w:tc>
+        <w:tc>
+          <w:tcPr>
+            <w:tcW w:w="988" w:type="dxa"/>
+            <w:tcBorders>
+              <w:left w:val="single" w:sz="2" w:space="0" w:color="000000"/>
+              <w:bottom w:val="single" w:sz="2" w:space="0" w:color="000000"/>
+            </w:tcBorders>
+          </w:tcPr>
+          <w:p>
+            <w:pPr>
+              <w:pStyle w:val="Style14"/>
+              <w:widowControl/>
+              <w:spacing w:lineRule="auto" w:line="240" w:before="0" w:after="0"/>
+              <w:ind w:hanging="0" w:left="0" w:right="0"/>
+              <w:jc w:val="both"/>
+              <w:rPr>
+                <w:lang w:val="en-US"/>
+              </w:rPr>
+            </w:pPr>
+            <w:r>
+              <w:rPr>
+                <w:lang w:val="en-US"/>
+              </w:rPr>
+              <w:t>120 000</w:t>
+            </w:r>
+          </w:p>
+        </w:tc>
+        <w:tc>
+          <w:tcPr>
+            <w:tcW w:w="1408" w:type="dxa"/>
+            <w:tcBorders>
+              <w:left w:val="single" w:sz="2" w:space="0" w:color="000000"/>
+              <w:bottom w:val="single" w:sz="2" w:space="0" w:color="000000"/>
+            </w:tcBorders>
+          </w:tcPr>
+          <w:p>
+            <w:pPr>
+              <w:pStyle w:val="Style14"/>
+              <w:widowControl/>
+              <w:spacing w:lineRule="auto" w:line="240" w:before="0" w:after="0"/>
+              <w:ind w:hanging="0" w:left="0" w:right="0"/>
+              <w:jc w:val="both"/>
+              <w:rPr/>
+            </w:pPr>
+            <w:r>
+              <w:rPr/>
+              <w:t>0.00043010</w:t>
+            </w:r>
+          </w:p>
+        </w:tc>
+        <w:tc>
+          <w:tcPr>
+            <w:tcW w:w="2655" w:type="dxa"/>
+            <w:tcBorders>
+              <w:left w:val="single" w:sz="2" w:space="0" w:color="000000"/>
+              <w:bottom w:val="single" w:sz="2" w:space="0" w:color="000000"/>
+              <w:right w:val="single" w:sz="2" w:space="0" w:color="000000"/>
+            </w:tcBorders>
+            <w:tcMar>
+              <w:right w:w="57" w:type="dxa"/>
+            </w:tcMar>
+          </w:tcPr>
+          <w:p>
+            <w:pPr>
+              <w:pStyle w:val="Style14"/>
+              <w:widowControl/>
+              <w:spacing w:lineRule="auto" w:line="240" w:before="0" w:after="0"/>
+              <w:ind w:hanging="0" w:left="0" w:right="0"/>
+              <w:jc w:val="both"/>
+              <w:rPr/>
+            </w:pPr>
+            <w:r>
+              <w:rPr/>
+              <w:t>4 464 078 121,3671</w:t>
+            </w:r>
+          </w:p>
+        </w:tc>
+      </w:tr>
+      <w:tr>
+        <w:trPr/>
+        <w:tc>
+          <w:tcPr>
+            <w:tcW w:w="2045" w:type="dxa"/>
+            <w:tcBorders>
+              <w:left w:val="single" w:sz="2" w:space="0" w:color="000000"/>
+              <w:bottom w:val="single" w:sz="2" w:space="0" w:color="000000"/>
+            </w:tcBorders>
+          </w:tcPr>
+          <w:p>
+            <w:pPr>
+              <w:pStyle w:val="Style14"/>
+              <w:widowControl/>
+              <w:spacing w:lineRule="auto" w:line="240" w:before="0" w:after="0"/>
+              <w:ind w:hanging="0" w:left="0" w:right="0"/>
+              <w:jc w:val="both"/>
+              <w:rPr>
+                <w:lang w:val="en-US"/>
+              </w:rPr>
+            </w:pPr>
+            <w:r>
+              <w:rPr>
+                <w:lang w:val="en-US"/>
+              </w:rPr>
+              <w:t>14.02.2026 10:39</w:t>
+            </w:r>
+          </w:p>
+        </w:tc>
+        <w:tc>
+          <w:tcPr>
+            <w:tcW w:w="988" w:type="dxa"/>
+            <w:tcBorders>
+              <w:left w:val="single" w:sz="2" w:space="0" w:color="000000"/>
+              <w:bottom w:val="single" w:sz="2" w:space="0" w:color="000000"/>
+            </w:tcBorders>
+          </w:tcPr>
+          <w:p>
+            <w:pPr>
+              <w:pStyle w:val="Style14"/>
+              <w:widowControl/>
+              <w:spacing w:lineRule="auto" w:line="240" w:before="0" w:after="0"/>
+              <w:ind w:hanging="0" w:left="0" w:right="0"/>
+              <w:jc w:val="both"/>
+              <w:rPr>
+                <w:lang w:val="en-US"/>
+              </w:rPr>
+            </w:pPr>
+            <w:r>
+              <w:rPr>
+                <w:lang w:val="en-US"/>
+              </w:rPr>
+              <w:t>140 000</w:t>
+            </w:r>
+          </w:p>
+        </w:tc>
+        <w:tc>
+          <w:tcPr>
+            <w:tcW w:w="1408" w:type="dxa"/>
+            <w:tcBorders>
+              <w:left w:val="single" w:sz="2" w:space="0" w:color="000000"/>
+              <w:bottom w:val="single" w:sz="2" w:space="0" w:color="000000"/>
+            </w:tcBorders>
+          </w:tcPr>
+          <w:p>
+            <w:pPr>
+              <w:pStyle w:val="Style14"/>
+              <w:widowControl/>
+              <w:spacing w:lineRule="auto" w:line="240" w:before="0" w:after="0"/>
+              <w:ind w:hanging="0" w:left="0" w:right="0"/>
+              <w:jc w:val="both"/>
+              <w:rPr/>
+            </w:pPr>
+            <w:r>
+              <w:rPr/>
+              <w:t>0.00044610</w:t>
+            </w:r>
+          </w:p>
+        </w:tc>
+        <w:tc>
+          <w:tcPr>
+            <w:tcW w:w="2655" w:type="dxa"/>
+            <w:tcBorders>
+              <w:left w:val="single" w:sz="2" w:space="0" w:color="000000"/>
+              <w:bottom w:val="single" w:sz="2" w:space="0" w:color="000000"/>
+              <w:right w:val="single" w:sz="2" w:space="0" w:color="000000"/>
+            </w:tcBorders>
+            <w:tcMar>
+              <w:right w:w="57" w:type="dxa"/>
+            </w:tcMar>
+          </w:tcPr>
+          <w:p>
+            <w:pPr>
+              <w:pStyle w:val="Style14"/>
+              <w:widowControl/>
+              <w:spacing w:lineRule="auto" w:line="240" w:before="0" w:after="0"/>
+              <w:ind w:hanging="0" w:left="0" w:right="0"/>
+              <w:jc w:val="both"/>
+              <w:rPr/>
+            </w:pPr>
+            <w:r>
+              <w:rPr/>
+              <w:t>5 021 295 673,6158</w:t>
+            </w:r>
+          </w:p>
+        </w:tc>
+      </w:tr>
+      <w:tr>
+        <w:trPr/>
+        <w:tc>
+          <w:tcPr>
+            <w:tcW w:w="2045" w:type="dxa"/>
+            <w:tcBorders>
+              <w:left w:val="single" w:sz="2" w:space="0" w:color="000000"/>
+              <w:bottom w:val="single" w:sz="2" w:space="0" w:color="000000"/>
+            </w:tcBorders>
+          </w:tcPr>
+          <w:p>
+            <w:pPr>
+              <w:pStyle w:val="Style14"/>
+              <w:widowControl/>
+              <w:spacing w:lineRule="auto" w:line="240" w:before="0" w:after="0"/>
+              <w:ind w:hanging="0" w:left="0" w:right="0"/>
+              <w:jc w:val="both"/>
+              <w:rPr>
+                <w:lang w:val="en-US"/>
+              </w:rPr>
+            </w:pPr>
+            <w:r>
+              <w:rPr>
+                <w:lang w:val="en-US"/>
+              </w:rPr>
+              <w:t>14.02.2026 10:39</w:t>
+            </w:r>
+          </w:p>
+        </w:tc>
+        <w:tc>
+          <w:tcPr>
+            <w:tcW w:w="988" w:type="dxa"/>
+            <w:tcBorders>
+              <w:left w:val="single" w:sz="2" w:space="0" w:color="000000"/>
+              <w:bottom w:val="single" w:sz="2" w:space="0" w:color="000000"/>
+            </w:tcBorders>
+          </w:tcPr>
+          <w:p>
+            <w:pPr>
+              <w:pStyle w:val="Style14"/>
+              <w:widowControl/>
+              <w:spacing w:lineRule="auto" w:line="240" w:before="0" w:after="0"/>
+              <w:ind w:hanging="0" w:left="0" w:right="0"/>
+              <w:jc w:val="both"/>
+              <w:rPr>
+                <w:lang w:val="en-US"/>
+              </w:rPr>
+            </w:pPr>
+            <w:r>
+              <w:rPr>
+                <w:lang w:val="en-US"/>
+              </w:rPr>
+              <w:t>160 000</w:t>
+            </w:r>
+          </w:p>
+        </w:tc>
+        <w:tc>
+          <w:tcPr>
+            <w:tcW w:w="1408" w:type="dxa"/>
+            <w:tcBorders>
+              <w:left w:val="single" w:sz="2" w:space="0" w:color="000000"/>
+              <w:bottom w:val="single" w:sz="2" w:space="0" w:color="000000"/>
+            </w:tcBorders>
+          </w:tcPr>
+          <w:p>
+            <w:pPr>
+              <w:pStyle w:val="Style14"/>
+              <w:widowControl/>
+              <w:spacing w:lineRule="auto" w:line="240" w:before="0" w:after="0"/>
+              <w:ind w:hanging="0" w:left="0" w:right="0"/>
+              <w:jc w:val="both"/>
+              <w:rPr/>
+            </w:pPr>
+            <w:r>
+              <w:rPr/>
+              <w:t>0.00045490</w:t>
+            </w:r>
+          </w:p>
+        </w:tc>
+        <w:tc>
+          <w:tcPr>
+            <w:tcW w:w="2655" w:type="dxa"/>
+            <w:tcBorders>
+              <w:left w:val="single" w:sz="2" w:space="0" w:color="000000"/>
+              <w:bottom w:val="single" w:sz="2" w:space="0" w:color="000000"/>
+              <w:right w:val="single" w:sz="2" w:space="0" w:color="000000"/>
+            </w:tcBorders>
+            <w:tcMar>
+              <w:right w:w="57" w:type="dxa"/>
+            </w:tcMar>
+          </w:tcPr>
+          <w:p>
+            <w:pPr>
+              <w:pStyle w:val="Style14"/>
+              <w:widowControl/>
+              <w:spacing w:lineRule="auto" w:line="240" w:before="0" w:after="0"/>
+              <w:ind w:hanging="0" w:left="0" w:right="0"/>
+              <w:jc w:val="both"/>
+              <w:rPr/>
+            </w:pPr>
+            <w:r>
+              <w:rPr/>
+              <w:t>5 627 610 463,8382</w:t>
+            </w:r>
+          </w:p>
+        </w:tc>
+      </w:tr>
+      <w:tr>
+        <w:trPr/>
+        <w:tc>
+          <w:tcPr>
+            <w:tcW w:w="2045" w:type="dxa"/>
+            <w:tcBorders>
+              <w:left w:val="single" w:sz="2" w:space="0" w:color="000000"/>
+              <w:bottom w:val="single" w:sz="2" w:space="0" w:color="000000"/>
+            </w:tcBorders>
+          </w:tcPr>
+          <w:p>
+            <w:pPr>
+              <w:pStyle w:val="Style14"/>
+              <w:widowControl/>
+              <w:spacing w:lineRule="auto" w:line="240" w:before="0" w:after="0"/>
+              <w:ind w:hanging="0" w:left="0" w:right="0"/>
+              <w:jc w:val="both"/>
+              <w:rPr>
+                <w:lang w:val="en-US"/>
+              </w:rPr>
+            </w:pPr>
+            <w:r>
+              <w:rPr>
+                <w:lang w:val="en-US"/>
+              </w:rPr>
+              <w:t>14.02.2026 10:39</w:t>
+            </w:r>
+          </w:p>
+        </w:tc>
+        <w:tc>
+          <w:tcPr>
+            <w:tcW w:w="988" w:type="dxa"/>
+            <w:tcBorders>
+              <w:left w:val="single" w:sz="2" w:space="0" w:color="000000"/>
+              <w:bottom w:val="single" w:sz="2" w:space="0" w:color="000000"/>
+            </w:tcBorders>
+          </w:tcPr>
+          <w:p>
+            <w:pPr>
+              <w:pStyle w:val="Style14"/>
+              <w:widowControl/>
+              <w:spacing w:lineRule="auto" w:line="240" w:before="0" w:after="0"/>
+              <w:ind w:hanging="0" w:left="0" w:right="0"/>
+              <w:jc w:val="both"/>
+              <w:rPr>
+                <w:lang w:val="en-US"/>
+              </w:rPr>
+            </w:pPr>
+            <w:r>
+              <w:rPr>
+                <w:lang w:val="en-US"/>
+              </w:rPr>
+              <w:t>180 000</w:t>
+            </w:r>
+          </w:p>
+        </w:tc>
+        <w:tc>
+          <w:tcPr>
+            <w:tcW w:w="1408" w:type="dxa"/>
+            <w:tcBorders>
+              <w:left w:val="single" w:sz="2" w:space="0" w:color="000000"/>
+              <w:bottom w:val="single" w:sz="2" w:space="0" w:color="000000"/>
+            </w:tcBorders>
+          </w:tcPr>
+          <w:p>
+            <w:pPr>
+              <w:pStyle w:val="Style14"/>
+              <w:widowControl/>
+              <w:spacing w:lineRule="auto" w:line="240" w:before="0" w:after="0"/>
+              <w:ind w:hanging="0" w:left="0" w:right="0"/>
+              <w:jc w:val="both"/>
+              <w:rPr/>
+            </w:pPr>
+            <w:r>
+              <w:rPr/>
+              <w:t>0.00038570</w:t>
+            </w:r>
+          </w:p>
+        </w:tc>
+        <w:tc>
+          <w:tcPr>
+            <w:tcW w:w="2655" w:type="dxa"/>
+            <w:tcBorders>
+              <w:left w:val="single" w:sz="2" w:space="0" w:color="000000"/>
+              <w:bottom w:val="single" w:sz="2" w:space="0" w:color="000000"/>
+              <w:right w:val="single" w:sz="2" w:space="0" w:color="000000"/>
+            </w:tcBorders>
+            <w:tcMar>
+              <w:right w:w="57" w:type="dxa"/>
+            </w:tcMar>
+          </w:tcPr>
+          <w:p>
+            <w:pPr>
+              <w:pStyle w:val="Style14"/>
+              <w:widowControl/>
+              <w:spacing w:lineRule="auto" w:line="240" w:before="0" w:after="0"/>
+              <w:ind w:hanging="0" w:left="0" w:right="0"/>
+              <w:jc w:val="both"/>
+              <w:rPr/>
+            </w:pPr>
+            <w:r>
+              <w:rPr/>
+              <w:t>7 466 943 220,1193</w:t>
+            </w:r>
+          </w:p>
+        </w:tc>
+      </w:tr>
+      <w:tr>
+        <w:trPr/>
+        <w:tc>
+          <w:tcPr>
+            <w:tcW w:w="2045" w:type="dxa"/>
+            <w:tcBorders>
+              <w:left w:val="single" w:sz="2" w:space="0" w:color="000000"/>
+              <w:bottom w:val="single" w:sz="2" w:space="0" w:color="000000"/>
+            </w:tcBorders>
+          </w:tcPr>
+          <w:p>
+            <w:pPr>
+              <w:pStyle w:val="Style14"/>
+              <w:widowControl/>
+              <w:spacing w:lineRule="auto" w:line="240" w:before="0" w:after="0"/>
+              <w:ind w:hanging="0" w:left="0" w:right="0"/>
+              <w:jc w:val="both"/>
+              <w:rPr>
+                <w:lang w:val="en-US"/>
+              </w:rPr>
+            </w:pPr>
+            <w:r>
+              <w:rPr>
+                <w:lang w:val="en-US"/>
+              </w:rPr>
+              <w:t>14.02.2026 10:40</w:t>
+            </w:r>
+          </w:p>
+        </w:tc>
+        <w:tc>
+          <w:tcPr>
+            <w:tcW w:w="988" w:type="dxa"/>
+            <w:tcBorders>
+              <w:left w:val="single" w:sz="2" w:space="0" w:color="000000"/>
+              <w:bottom w:val="single" w:sz="2" w:space="0" w:color="000000"/>
+            </w:tcBorders>
+          </w:tcPr>
+          <w:p>
+            <w:pPr>
+              <w:pStyle w:val="Style14"/>
+              <w:widowControl/>
+              <w:spacing w:lineRule="auto" w:line="240" w:before="0" w:after="0"/>
+              <w:ind w:hanging="0" w:left="0" w:right="0"/>
+              <w:jc w:val="both"/>
+              <w:rPr>
+                <w:lang w:val="en-US"/>
+              </w:rPr>
+            </w:pPr>
+            <w:r>
+              <w:rPr>
+                <w:lang w:val="en-US"/>
+              </w:rPr>
+              <w:t>200 000</w:t>
+            </w:r>
+          </w:p>
+        </w:tc>
+        <w:tc>
+          <w:tcPr>
+            <w:tcW w:w="1408" w:type="dxa"/>
+            <w:tcBorders>
+              <w:left w:val="single" w:sz="2" w:space="0" w:color="000000"/>
+              <w:bottom w:val="single" w:sz="2" w:space="0" w:color="000000"/>
+            </w:tcBorders>
+          </w:tcPr>
+          <w:p>
+            <w:pPr>
+              <w:pStyle w:val="Style14"/>
+              <w:widowControl/>
+              <w:spacing w:lineRule="auto" w:line="240" w:before="0" w:after="0"/>
+              <w:ind w:hanging="0" w:left="0" w:right="0"/>
+              <w:jc w:val="both"/>
+              <w:rPr/>
+            </w:pPr>
+            <w:r>
+              <w:rPr/>
+              <w:t>0.00052980</w:t>
+            </w:r>
+          </w:p>
+        </w:tc>
+        <w:tc>
+          <w:tcPr>
+            <w:tcW w:w="2655" w:type="dxa"/>
+            <w:tcBorders>
+              <w:left w:val="single" w:sz="2" w:space="0" w:color="000000"/>
+              <w:bottom w:val="single" w:sz="2" w:space="0" w:color="000000"/>
+              <w:right w:val="single" w:sz="2" w:space="0" w:color="000000"/>
+            </w:tcBorders>
+            <w:tcMar>
+              <w:right w:w="57" w:type="dxa"/>
+            </w:tcMar>
+          </w:tcPr>
+          <w:p>
+            <w:pPr>
+              <w:pStyle w:val="Style14"/>
+              <w:widowControl/>
+              <w:spacing w:lineRule="auto" w:line="240" w:before="0" w:after="0"/>
+              <w:ind w:hanging="0" w:left="0" w:right="0"/>
+              <w:jc w:val="both"/>
+              <w:rPr/>
+            </w:pPr>
+            <w:r>
+              <w:rPr/>
+              <w:t>6 040 015 100,0378</w:t>
+            </w:r>
+          </w:p>
+        </w:tc>
+      </w:tr>
+      <w:tr>
+        <w:trPr/>
+        <w:tc>
+          <w:tcPr>
+            <w:tcW w:w="2045" w:type="dxa"/>
+            <w:tcBorders>
+              <w:left w:val="single" w:sz="2" w:space="0" w:color="000000"/>
+              <w:bottom w:val="single" w:sz="2" w:space="0" w:color="000000"/>
+            </w:tcBorders>
+          </w:tcPr>
+          <w:p>
+            <w:pPr>
+              <w:pStyle w:val="Style14"/>
+              <w:widowControl/>
+              <w:spacing w:lineRule="auto" w:line="240" w:before="0" w:after="0"/>
+              <w:ind w:hanging="0" w:left="0" w:right="0"/>
+              <w:jc w:val="both"/>
+              <w:rPr>
+                <w:lang w:val="en-US"/>
+              </w:rPr>
+            </w:pPr>
+            <w:r>
+              <w:rPr>
+                <w:lang w:val="en-US"/>
+              </w:rPr>
+              <w:t>14.02.2026 10:40</w:t>
+            </w:r>
+          </w:p>
+        </w:tc>
+        <w:tc>
+          <w:tcPr>
+            <w:tcW w:w="988" w:type="dxa"/>
+            <w:tcBorders>
+              <w:left w:val="single" w:sz="2" w:space="0" w:color="000000"/>
+              <w:bottom w:val="single" w:sz="2" w:space="0" w:color="000000"/>
+            </w:tcBorders>
+          </w:tcPr>
+          <w:p>
+            <w:pPr>
+              <w:pStyle w:val="Style14"/>
+              <w:widowControl/>
+              <w:spacing w:lineRule="auto" w:line="240" w:before="0" w:after="0"/>
+              <w:ind w:hanging="0" w:left="0" w:right="0"/>
+              <w:jc w:val="both"/>
+              <w:rPr>
+                <w:lang w:val="en-US"/>
+              </w:rPr>
+            </w:pPr>
+            <w:r>
+              <w:rPr>
+                <w:lang w:val="en-US"/>
+              </w:rPr>
+              <w:t>220 000</w:t>
+            </w:r>
+          </w:p>
+        </w:tc>
+        <w:tc>
+          <w:tcPr>
+            <w:tcW w:w="1408" w:type="dxa"/>
+            <w:tcBorders>
+              <w:left w:val="single" w:sz="2" w:space="0" w:color="000000"/>
+              <w:bottom w:val="single" w:sz="2" w:space="0" w:color="000000"/>
+            </w:tcBorders>
+          </w:tcPr>
+          <w:p>
+            <w:pPr>
+              <w:pStyle w:val="Style14"/>
+              <w:widowControl/>
+              <w:spacing w:lineRule="auto" w:line="240" w:before="0" w:after="0"/>
+              <w:ind w:hanging="0" w:left="0" w:right="0"/>
+              <w:jc w:val="both"/>
+              <w:rPr/>
+            </w:pPr>
+            <w:r>
+              <w:rPr/>
+              <w:t>0.00071900</w:t>
+            </w:r>
+          </w:p>
+        </w:tc>
+        <w:tc>
+          <w:tcPr>
+            <w:tcW w:w="2655" w:type="dxa"/>
+            <w:tcBorders>
+              <w:left w:val="single" w:sz="2" w:space="0" w:color="000000"/>
+              <w:bottom w:val="single" w:sz="2" w:space="0" w:color="000000"/>
+              <w:right w:val="single" w:sz="2" w:space="0" w:color="000000"/>
+            </w:tcBorders>
+            <w:tcMar>
+              <w:right w:w="57" w:type="dxa"/>
+            </w:tcMar>
+          </w:tcPr>
+          <w:p>
+            <w:pPr>
+              <w:pStyle w:val="Style14"/>
+              <w:widowControl/>
+              <w:spacing w:lineRule="auto" w:line="240" w:before="0" w:after="0"/>
+              <w:ind w:hanging="0" w:left="0" w:right="0"/>
+              <w:jc w:val="both"/>
+              <w:rPr/>
+            </w:pPr>
+            <w:r>
+              <w:rPr/>
+              <w:t>4 895 688 456,1892</w:t>
+            </w:r>
+          </w:p>
+        </w:tc>
+      </w:tr>
+      <w:tr>
+        <w:trPr/>
+        <w:tc>
+          <w:tcPr>
+            <w:tcW w:w="2045" w:type="dxa"/>
+            <w:tcBorders>
+              <w:left w:val="single" w:sz="2" w:space="0" w:color="000000"/>
+              <w:bottom w:val="single" w:sz="2" w:space="0" w:color="000000"/>
+            </w:tcBorders>
+          </w:tcPr>
+          <w:p>
+            <w:pPr>
+              <w:pStyle w:val="Style14"/>
+              <w:widowControl/>
+              <w:spacing w:lineRule="auto" w:line="240" w:before="0" w:after="0"/>
+              <w:ind w:hanging="0" w:left="0" w:right="0"/>
+              <w:jc w:val="both"/>
+              <w:rPr>
+                <w:lang w:val="en-US"/>
+              </w:rPr>
+            </w:pPr>
+            <w:r>
+              <w:rPr>
+                <w:lang w:val="en-US"/>
+              </w:rPr>
+              <w:t>14.02.2026 10:40</w:t>
+            </w:r>
+          </w:p>
+        </w:tc>
+        <w:tc>
+          <w:tcPr>
+            <w:tcW w:w="988" w:type="dxa"/>
+            <w:tcBorders>
+              <w:left w:val="single" w:sz="2" w:space="0" w:color="000000"/>
+              <w:bottom w:val="single" w:sz="2" w:space="0" w:color="000000"/>
+            </w:tcBorders>
+          </w:tcPr>
+          <w:p>
+            <w:pPr>
+              <w:pStyle w:val="Style14"/>
+              <w:widowControl/>
+              <w:spacing w:lineRule="auto" w:line="240" w:before="0" w:after="0"/>
+              <w:ind w:hanging="0" w:left="0" w:right="0"/>
+              <w:jc w:val="both"/>
+              <w:rPr>
+                <w:lang w:val="en-US"/>
+              </w:rPr>
+            </w:pPr>
+            <w:r>
+              <w:rPr>
+                <w:lang w:val="en-US"/>
+              </w:rPr>
+              <w:t>240 000</w:t>
+            </w:r>
+          </w:p>
+        </w:tc>
+        <w:tc>
+          <w:tcPr>
+            <w:tcW w:w="1408" w:type="dxa"/>
+            <w:tcBorders>
+              <w:left w:val="single" w:sz="2" w:space="0" w:color="000000"/>
+              <w:bottom w:val="single" w:sz="2" w:space="0" w:color="000000"/>
+            </w:tcBorders>
+          </w:tcPr>
+          <w:p>
+            <w:pPr>
+              <w:pStyle w:val="Style14"/>
+              <w:widowControl/>
+              <w:spacing w:lineRule="auto" w:line="240" w:before="0" w:after="0"/>
+              <w:ind w:hanging="0" w:left="0" w:right="0"/>
+              <w:jc w:val="both"/>
+              <w:rPr/>
+            </w:pPr>
+            <w:r>
+              <w:rPr/>
+              <w:t>0.00055660</w:t>
+            </w:r>
+          </w:p>
+        </w:tc>
+        <w:tc>
+          <w:tcPr>
+            <w:tcW w:w="2655" w:type="dxa"/>
+            <w:tcBorders>
+              <w:left w:val="single" w:sz="2" w:space="0" w:color="000000"/>
+              <w:bottom w:val="single" w:sz="2" w:space="0" w:color="000000"/>
+              <w:right w:val="single" w:sz="2" w:space="0" w:color="000000"/>
+            </w:tcBorders>
+            <w:tcMar>
+              <w:right w:w="57" w:type="dxa"/>
+            </w:tcMar>
+          </w:tcPr>
+          <w:p>
+            <w:pPr>
+              <w:pStyle w:val="Style14"/>
+              <w:widowControl/>
+              <w:spacing w:lineRule="auto" w:line="240" w:before="0" w:after="0"/>
+              <w:ind w:hanging="0" w:left="0" w:right="0"/>
+              <w:jc w:val="both"/>
+              <w:rPr/>
+            </w:pPr>
+            <w:r>
+              <w:rPr/>
+              <w:t>6 899 029 823,931</w:t>
+            </w:r>
+          </w:p>
+        </w:tc>
+      </w:tr>
+    </w:tbl>
+    <w:p>
+      <w:pPr>
+        <w:pStyle w:val="BodyText"/>
+        <w:spacing w:lineRule="auto" w:line="360" w:before="0" w:after="0"/>
+        <w:ind w:hanging="0" w:left="0" w:right="0"/>
+        <w:jc w:val="both"/>
+        <w:rPr/>
+      </w:pPr>
+      <w:r>
+        <w:rPr/>
+      </w:r>
+    </w:p>
+    <w:p>
+      <w:pPr>
+        <w:pStyle w:val="H3"/>
+        <w:rPr/>
+      </w:pPr>
+      <w:r>
+        <w:rPr/>
+        <w:t>Графік</w:t>
+      </w:r>
+    </w:p>
+    <w:p>
+      <w:pPr>
+        <w:pStyle w:val="P1"/>
+        <w:rPr>
+          <w:lang w:val="en-US"/>
+        </w:rPr>
+      </w:pPr>
+      <w:r>
+        <w:rPr/>
+      </w:r>
+    </w:p>
+    <w:p>
+      <w:pPr>
+        <w:pStyle w:val="P1"/>
+        <w:rPr>
+          <w:lang w:val="en-US"/>
+        </w:rPr>
+      </w:pPr>
+      <w:r>
+        <w:rPr/>
+        <w:t>Графік залежностей часу комунікацій від довжини масиву наведено нижче:</w:t>
+      </w:r>
+    </w:p>
+    <w:p>
+      <w:pPr>
+        <w:pStyle w:val="img1"/>
+        <w:rPr/>
+      </w:pPr>
+      <w:r>
+        <w:rPr/>
+      </w:r>
+    </w:p>
+    <w:p>
+      <w:pPr>
+        <w:pStyle w:val="img1"/>
+        <w:rPr/>
+      </w:pPr>
+      <w:r>
+        <w:rPr/>
+        <w:drawing>
+          <wp:inline distT="0" distB="0" distL="0" distR="0">
+            <wp:extent cx="5731510" cy="3438525"/>
+            <wp:effectExtent l="0" t="0" r="0" b="0"/>
+            <wp:docPr id="16" name="Зображення13"/>
+            <wp:cNvGraphicFramePr>
+              <a:graphicFrameLocks xmlns:a="http://schemas.openxmlformats.org/drawingml/2006/main" noChangeAspect="1"/>
+            </wp:cNvGraphicFramePr>
+            <a:graphic xmlns:a="http://schemas.openxmlformats.org/drawingml/2006/main">
+              <a:graphicData uri="http://schemas.openxmlformats.org/drawingml/2006/picture">
+                <pic:pic xmlns:pic="http://schemas.openxmlformats.org/drawingml/2006/picture">
+                  <pic:nvPicPr>
+                    <pic:cNvPr id="16" name="Зображення13"/>
+                    <pic:cNvPicPr>
+                      <a:picLocks noChangeAspect="1" noChangeArrowheads="1"/>
+                    </pic:cNvPicPr>
+                  </pic:nvPicPr>
+                  <pic:blipFill>
+                    <a:blip r:embed="rId17"/>
+                    <a:stretch>
+                      <a:fillRect/>
+                    </a:stretch>
+                  </pic:blipFill>
+                  <pic:spPr bwMode="auto">
+                    <a:xfrm>
+                      <a:off x="0" y="0"/>
+                      <a:ext cx="5731510" cy="3438525"/>
+                    </a:xfrm>
+                    <a:prstGeom prst="rect">
+                      <a:avLst/>
+                    </a:prstGeom>
+                    <a:noFill/>
+                  </pic:spPr>
+                </pic:pic>
+              </a:graphicData>
+            </a:graphic>
+          </wp:inline>
+        </w:drawing>
+      </w:r>
+      <w:r>
+        <w:rPr/>
+        <w:t>Рисунок 1.3 — Графік залежностей</w:t>
       </w:r>
     </w:p>
     <w:p>

</xml_diff>

<commit_message>
feat -- TR4: trying to understand whats going on
</commit_message>
<xml_diff>
--- a/42TR Tehnologiji Rozpodilenyh System/4/TR_KNT-122_Onyshchenko_19_PR4.docx
+++ b/42TR Tehnologiji Rozpodilenyh System/4/TR_KNT-122_Onyshchenko_19_PR4.docx
@@ -3713,6 +3713,445 @@
       </w:pPr>
       <w:r>
         <w:rPr/>
+        <w:t>Код</w:t>
+      </w:r>
+    </w:p>
+    <w:p>
+      <w:pPr>
+        <w:pStyle w:val="P1"/>
+        <w:rPr/>
+      </w:pPr>
+      <w:r>
+        <w:rPr/>
+      </w:r>
+    </w:p>
+    <w:p>
+      <w:pPr>
+        <w:pStyle w:val="Code"/>
+        <w:rPr/>
+      </w:pPr>
+      <w:r>
+        <w:rPr/>
+        <w:t>import matplotlib.pyplot as plt</w:t>
+      </w:r>
+    </w:p>
+    <w:p>
+      <w:pPr>
+        <w:pStyle w:val="Code"/>
+        <w:rPr/>
+      </w:pPr>
+      <w:r>
+        <w:rPr/>
+      </w:r>
+    </w:p>
+    <w:p>
+      <w:pPr>
+        <w:pStyle w:val="Code"/>
+        <w:rPr/>
+      </w:pPr>
+      <w:r>
+        <w:rPr/>
+        <w:t>P_values = [1, 2, 3, 4]  # Кількість процесорів</w:t>
+      </w:r>
+    </w:p>
+    <w:p>
+      <w:pPr>
+        <w:pStyle w:val="Code"/>
+        <w:rPr/>
+      </w:pPr>
+      <w:r>
+        <w:rPr/>
+        <w:t>Tp_values = [24.6048, 12.5789, 8.4814, 6.6128]</w:t>
+      </w:r>
+    </w:p>
+    <w:p>
+      <w:pPr>
+        <w:pStyle w:val="Code"/>
+        <w:rPr/>
+      </w:pPr>
+      <w:r>
+        <w:rPr/>
+      </w:r>
+    </w:p>
+    <w:p>
+      <w:pPr>
+        <w:pStyle w:val="Code"/>
+        <w:rPr/>
+      </w:pPr>
+      <w:r>
+        <w:rPr/>
+        <w:t># 1. Розрахунок прискорення S</w:t>
+      </w:r>
+    </w:p>
+    <w:p>
+      <w:pPr>
+        <w:pStyle w:val="Code"/>
+        <w:rPr/>
+      </w:pPr>
+      <w:r>
+        <w:rPr/>
+        <w:t>T1 = Tp_values[0]</w:t>
+      </w:r>
+    </w:p>
+    <w:p>
+      <w:pPr>
+        <w:pStyle w:val="Code"/>
+        <w:rPr/>
+      </w:pPr>
+      <w:r>
+        <w:rPr/>
+        <w:t>S_values = [T1 / Tp for Tp in Tp_values]</w:t>
+      </w:r>
+    </w:p>
+    <w:p>
+      <w:pPr>
+        <w:pStyle w:val="Code"/>
+        <w:rPr/>
+      </w:pPr>
+      <w:r>
+        <w:rPr/>
+      </w:r>
+    </w:p>
+    <w:p>
+      <w:pPr>
+        <w:pStyle w:val="Code"/>
+        <w:rPr/>
+      </w:pPr>
+      <w:r>
+        <w:rPr/>
+        <w:t># 2. Розрахунок ідеального прискорення (для порівняння)</w:t>
+      </w:r>
+    </w:p>
+    <w:p>
+      <w:pPr>
+        <w:pStyle w:val="Code"/>
+        <w:rPr/>
+      </w:pPr>
+      <w:r>
+        <w:rPr/>
+        <w:t>ideal_S = P_values</w:t>
+      </w:r>
+    </w:p>
+    <w:p>
+      <w:pPr>
+        <w:pStyle w:val="Code"/>
+        <w:rPr/>
+      </w:pPr>
+      <w:r>
+        <w:rPr/>
+      </w:r>
+    </w:p>
+    <w:p>
+      <w:pPr>
+        <w:pStyle w:val="Code"/>
+        <w:rPr/>
+      </w:pPr>
+      <w:r>
+        <w:rPr/>
+        <w:t># 3. Налаштування графіка</w:t>
+      </w:r>
+    </w:p>
+    <w:p>
+      <w:pPr>
+        <w:pStyle w:val="Code"/>
+        <w:rPr/>
+      </w:pPr>
+      <w:r>
+        <w:rPr/>
+        <w:t>plt.figure(figsize=(10, 6))</w:t>
+      </w:r>
+    </w:p>
+    <w:p>
+      <w:pPr>
+        <w:pStyle w:val="Code"/>
+        <w:rPr/>
+      </w:pPr>
+      <w:r>
+        <w:rPr/>
+        <w:t>plt.plot(P_values, S_values, "ro-", label="Реальне прискорення (S)", linewidth=2)</w:t>
+      </w:r>
+    </w:p>
+    <w:p>
+      <w:pPr>
+        <w:pStyle w:val="Code"/>
+        <w:rPr/>
+      </w:pPr>
+      <w:r>
+        <w:rPr/>
+        <w:t>plt.plot(P_values, ideal_S, "b--", label="Ідеальне прискорення (S=P)", alpha=0.7)</w:t>
+      </w:r>
+    </w:p>
+    <w:p>
+      <w:pPr>
+        <w:pStyle w:val="Code"/>
+        <w:rPr/>
+      </w:pPr>
+      <w:r>
+        <w:rPr/>
+      </w:r>
+    </w:p>
+    <w:p>
+      <w:pPr>
+        <w:pStyle w:val="Code"/>
+        <w:rPr/>
+      </w:pPr>
+      <w:r>
+        <w:rPr/>
+        <w:t># Додавання підписів значень над точками</w:t>
+      </w:r>
+    </w:p>
+    <w:p>
+      <w:pPr>
+        <w:pStyle w:val="Code"/>
+        <w:rPr/>
+      </w:pPr>
+      <w:r>
+        <w:rPr/>
+        <w:t>for i, txt in enumerate(S_values):</w:t>
+      </w:r>
+    </w:p>
+    <w:p>
+      <w:pPr>
+        <w:pStyle w:val="Code"/>
+        <w:rPr/>
+      </w:pPr>
+      <w:r>
+        <w:rPr/>
+        <w:t xml:space="preserve">    </w:t>
+      </w:r>
+      <w:r>
+        <w:rPr/>
+        <w:t>plt.annotate(</w:t>
+      </w:r>
+    </w:p>
+    <w:p>
+      <w:pPr>
+        <w:pStyle w:val="Code"/>
+        <w:rPr/>
+      </w:pPr>
+      <w:r>
+        <w:rPr/>
+        <w:t xml:space="preserve">        </w:t>
+      </w:r>
+      <w:r>
+        <w:rPr/>
+        <w:t>f"{txt:.2f}",</w:t>
+      </w:r>
+    </w:p>
+    <w:p>
+      <w:pPr>
+        <w:pStyle w:val="Code"/>
+        <w:rPr/>
+      </w:pPr>
+      <w:r>
+        <w:rPr/>
+        <w:t xml:space="preserve">        </w:t>
+      </w:r>
+      <w:r>
+        <w:rPr/>
+        <w:t>(P_values[i], S_values[i]),</w:t>
+      </w:r>
+    </w:p>
+    <w:p>
+      <w:pPr>
+        <w:pStyle w:val="Code"/>
+        <w:rPr/>
+      </w:pPr>
+      <w:r>
+        <w:rPr/>
+        <w:t xml:space="preserve">        </w:t>
+      </w:r>
+      <w:r>
+        <w:rPr/>
+        <w:t>textcoords="offset points",</w:t>
+      </w:r>
+    </w:p>
+    <w:p>
+      <w:pPr>
+        <w:pStyle w:val="Code"/>
+        <w:rPr/>
+      </w:pPr>
+      <w:r>
+        <w:rPr/>
+        <w:t xml:space="preserve">        </w:t>
+      </w:r>
+      <w:r>
+        <w:rPr/>
+        <w:t>xytext=(0, 10),</w:t>
+      </w:r>
+    </w:p>
+    <w:p>
+      <w:pPr>
+        <w:pStyle w:val="Code"/>
+        <w:rPr/>
+      </w:pPr>
+      <w:r>
+        <w:rPr/>
+        <w:t xml:space="preserve">        </w:t>
+      </w:r>
+      <w:r>
+        <w:rPr/>
+        <w:t>ha="center",</w:t>
+      </w:r>
+    </w:p>
+    <w:p>
+      <w:pPr>
+        <w:pStyle w:val="Code"/>
+        <w:rPr/>
+      </w:pPr>
+      <w:r>
+        <w:rPr/>
+        <w:t xml:space="preserve">    </w:t>
+      </w:r>
+      <w:r>
+        <w:rPr/>
+        <w:t>)</w:t>
+      </w:r>
+    </w:p>
+    <w:p>
+      <w:pPr>
+        <w:pStyle w:val="Code"/>
+        <w:rPr/>
+      </w:pPr>
+      <w:r>
+        <w:rPr/>
+      </w:r>
+    </w:p>
+    <w:p>
+      <w:pPr>
+        <w:pStyle w:val="Code"/>
+        <w:rPr/>
+      </w:pPr>
+      <w:r>
+        <w:rPr/>
+        <w:t># Оформлення осей та заголовка</w:t>
+      </w:r>
+    </w:p>
+    <w:p>
+      <w:pPr>
+        <w:pStyle w:val="Code"/>
+        <w:rPr/>
+      </w:pPr>
+      <w:r>
+        <w:rPr/>
+        <w:t>plt.title("Залежність прискорення від кількості процесорів (N=240000)", fontsize=14)</w:t>
+      </w:r>
+    </w:p>
+    <w:p>
+      <w:pPr>
+        <w:pStyle w:val="Code"/>
+        <w:rPr/>
+      </w:pPr>
+      <w:r>
+        <w:rPr/>
+        <w:t>plt.xlabel("Кількість процесорів (P)", fontsize=12)</w:t>
+      </w:r>
+    </w:p>
+    <w:p>
+      <w:pPr>
+        <w:pStyle w:val="Code"/>
+        <w:rPr/>
+      </w:pPr>
+      <w:r>
+        <w:rPr/>
+        <w:t>plt.ylabel("Прискорення (S)", fontsize=12)</w:t>
+      </w:r>
+    </w:p>
+    <w:p>
+      <w:pPr>
+        <w:pStyle w:val="Code"/>
+        <w:rPr/>
+      </w:pPr>
+      <w:r>
+        <w:rPr/>
+        <w:t>plt.xticks(P_values)</w:t>
+      </w:r>
+    </w:p>
+    <w:p>
+      <w:pPr>
+        <w:pStyle w:val="Code"/>
+        <w:rPr/>
+      </w:pPr>
+      <w:r>
+        <w:rPr/>
+        <w:t>plt.grid(True, linestyle="--", alpha=0.6)</w:t>
+      </w:r>
+    </w:p>
+    <w:p>
+      <w:pPr>
+        <w:pStyle w:val="Code"/>
+        <w:rPr/>
+      </w:pPr>
+      <w:r>
+        <w:rPr/>
+        <w:t>plt.legend()</w:t>
+      </w:r>
+    </w:p>
+    <w:p>
+      <w:pPr>
+        <w:pStyle w:val="Code"/>
+        <w:rPr/>
+      </w:pPr>
+      <w:r>
+        <w:rPr/>
+      </w:r>
+    </w:p>
+    <w:p>
+      <w:pPr>
+        <w:pStyle w:val="Code"/>
+        <w:rPr/>
+      </w:pPr>
+      <w:r>
+        <w:rPr/>
+        <w:t># Збереження та показ</w:t>
+      </w:r>
+    </w:p>
+    <w:p>
+      <w:pPr>
+        <w:pStyle w:val="Code"/>
+        <w:rPr/>
+      </w:pPr>
+      <w:r>
+        <w:rPr/>
+        <w:t>plt.savefig("speedup_graph.png")</w:t>
+      </w:r>
+    </w:p>
+    <w:p>
+      <w:pPr>
+        <w:pStyle w:val="Code"/>
+        <w:rPr/>
+      </w:pPr>
+      <w:r>
+        <w:rPr/>
+        <w:t>print("Графік збережено у файл 'speedup_graph.png'")</w:t>
+      </w:r>
+    </w:p>
+    <w:p>
+      <w:pPr>
+        <w:pStyle w:val="Code"/>
+        <w:rPr/>
+      </w:pPr>
+      <w:r>
+        <w:rPr/>
+        <w:t>plt.show()</w:t>
+      </w:r>
+    </w:p>
+    <w:p>
+      <w:pPr>
+        <w:pStyle w:val="P1"/>
+        <w:rPr/>
+      </w:pPr>
+      <w:r>
+        <w:rPr/>
+      </w:r>
+    </w:p>
+    <w:p>
+      <w:pPr>
+        <w:pStyle w:val="H3"/>
+        <w:rPr/>
+      </w:pPr>
+      <w:r>
+        <w:rPr/>
         <w:t>Результати</w:t>
       </w:r>
     </w:p>
@@ -3960,6 +4399,9 @@
       <w:r>
         <w:rPr/>
       </w:r>
+      <w:r>
+        <w:br w:type="page"/>
+      </w:r>
     </w:p>
     <w:p>
       <w:pPr>
@@ -3969,6 +4411,105 @@
       <w:r>
         <w:rPr/>
         <w:t>Таблиця</w:t>
+      </w:r>
+    </w:p>
+    <w:p>
+      <w:pPr>
+        <w:pStyle w:val="p11"/>
+        <w:rPr>
+          <w:lang w:val="uk-UA"/>
+        </w:rPr>
+      </w:pPr>
+      <w:r>
+        <w:rPr>
+          <w:lang w:val="uk-UA"/>
+        </w:rPr>
+      </w:r>
+    </w:p>
+    <w:p>
+      <w:pPr>
+        <w:pStyle w:val="p11"/>
+        <w:rPr>
+          <w:lang w:val="uk-UA"/>
+        </w:rPr>
+      </w:pPr>
+      <w:r>
+        <w:rPr>
+          <w:lang w:val="uk-UA"/>
+        </w:rPr>
+        <w:t xml:space="preserve">Значення </w:t>
+      </w:r>
+      <w:r>
+        <w:rPr>
+          <w:lang w:val="en-US"/>
+        </w:rPr>
+        <w:t xml:space="preserve">S </w:t>
+      </w:r>
+      <w:r>
+        <w:rPr>
+          <w:lang w:val="uk-UA"/>
+        </w:rPr>
+        <w:t>(прискорення) виміряно такою формулою:</w:t>
+      </w:r>
+    </w:p>
+    <w:p>
+      <w:pPr>
+        <w:pStyle w:val="p11"/>
+        <w:rPr>
+          <w:lang w:val="uk-UA"/>
+        </w:rPr>
+      </w:pPr>
+      <w:r>
+        <w:rPr>
+          <w:lang w:val="uk-UA"/>
+        </w:rPr>
+      </w:r>
+    </w:p>
+    <w:p>
+      <w:pPr>
+        <w:pStyle w:val="img1"/>
+        <w:rPr/>
+      </w:pPr>
+      <w:r>
+        <w:rPr/>
+        <w:drawing>
+          <wp:inline distT="0" distB="0" distL="0" distR="0">
+            <wp:extent cx="962025" cy="781050"/>
+            <wp:effectExtent l="0" t="0" r="0" b="0"/>
+            <wp:docPr id="13" name="Зображення15"/>
+            <wp:cNvGraphicFramePr>
+              <a:graphicFrameLocks xmlns:a="http://schemas.openxmlformats.org/drawingml/2006/main" noChangeAspect="1"/>
+            </wp:cNvGraphicFramePr>
+            <a:graphic xmlns:a="http://schemas.openxmlformats.org/drawingml/2006/main">
+              <a:graphicData uri="http://schemas.openxmlformats.org/drawingml/2006/picture">
+                <pic:pic xmlns:pic="http://schemas.openxmlformats.org/drawingml/2006/picture">
+                  <pic:nvPicPr>
+                    <pic:cNvPr id="13" name="Зображення15"/>
+                    <pic:cNvPicPr>
+                      <a:picLocks noChangeAspect="1" noChangeArrowheads="1"/>
+                    </pic:cNvPicPr>
+                  </pic:nvPicPr>
+                  <pic:blipFill>
+                    <a:blip r:embed="rId14"/>
+                    <a:stretch>
+                      <a:fillRect/>
+                    </a:stretch>
+                  </pic:blipFill>
+                  <pic:spPr bwMode="auto">
+                    <a:xfrm>
+                      <a:off x="0" y="0"/>
+                      <a:ext cx="962025" cy="781050"/>
+                    </a:xfrm>
+                    <a:prstGeom prst="rect">
+                      <a:avLst/>
+                    </a:prstGeom>
+                    <a:noFill/>
+                  </pic:spPr>
+                </pic:pic>
+              </a:graphicData>
+            </a:graphic>
+          </wp:inline>
+        </w:drawing>
       </w:r>
     </w:p>
     <w:p>
@@ -4829,7 +5370,7 @@
       </w:pPr>
       <w:r>
         <w:rPr/>
-        <w:t>Графік залежності прискорення від кількості процесорів наведено нижче на рисунку:</w:t>
+        <w:t>Графік залежності наведено нижче на рисунку:</w:t>
       </w:r>
     </w:p>
     <w:p>
@@ -4850,9 +5391,9 @@
         <w:rPr/>
         <w:drawing>
           <wp:inline distT="0" distB="0" distL="0" distR="0">
-            <wp:extent cx="4975860" cy="2985770"/>
+            <wp:extent cx="4599305" cy="2759710"/>
             <wp:effectExtent l="0" t="0" r="0" b="0"/>
-            <wp:docPr id="13" name="Зображення11"/>
+            <wp:docPr id="14" name="Зображення11"/>
             <wp:cNvGraphicFramePr>
               <a:graphicFrameLocks xmlns:a="http://schemas.openxmlformats.org/drawingml/2006/main" noChangeAspect="1"/>
             </wp:cNvGraphicFramePr>
@@ -4860,13 +5401,13 @@
               <a:graphicData uri="http://schemas.openxmlformats.org/drawingml/2006/picture">
                 <pic:pic xmlns:pic="http://schemas.openxmlformats.org/drawingml/2006/picture">
                   <pic:nvPicPr>
-                    <pic:cNvPr id="13" name="Зображення11"/>
+                    <pic:cNvPr id="14" name="Зображення11"/>
                     <pic:cNvPicPr>
                       <a:picLocks noChangeAspect="1" noChangeArrowheads="1"/>
                     </pic:cNvPicPr>
                   </pic:nvPicPr>
                   <pic:blipFill>
-                    <a:blip r:embed="rId14"/>
+                    <a:blip r:embed="rId15"/>
                     <a:stretch>
                       <a:fillRect/>
                     </a:stretch>
@@ -4874,7 +5415,7 @@
                   <pic:spPr bwMode="auto">
                     <a:xfrm>
                       <a:off x="0" y="0"/>
-                      <a:ext cx="4975860" cy="2985770"/>
+                      <a:ext cx="4599305" cy="2759710"/>
                     </a:xfrm>
                     <a:prstGeom prst="rect">
                       <a:avLst/>
@@ -4943,12 +5484,725 @@
       </w:pPr>
       <w:r>
         <w:rPr/>
-        <w:t>Дослідити та намалювати графіки залежності прискорення від кількості членів ряду при обчисленнях на чотирьох процесорах, змінюючи кількість членів ряду від 20000 до 240000 з дискретністю 20000. Вимірювання виконуйте 3 рази з інтервалом між вимірюваннями 15 хвилин, результати вимірювань занесіть до таблиці 4.2.</w:t>
+        <w:t>Дослідити та намалювати графіки залежності прискорення від кількості членів ряду при обчисленнях на чотирьох процесорах, змінюючи кількість членів ряду від 20 000 до 240 000 з дискретністю 20000. Вимірювання виконуйте 3 рази з інтервалом між вимірюваннями 15 хвилин, результати вимірювань занесіть до таблиці 4.2.</w:t>
       </w:r>
     </w:p>
     <w:p>
       <w:pPr>
         <w:pStyle w:val="p11"/>
+        <w:rPr/>
+      </w:pPr>
+      <w:r>
+        <w:rPr/>
+      </w:r>
+    </w:p>
+    <w:p>
+      <w:pPr>
+        <w:pStyle w:val="H3"/>
+        <w:rPr/>
+      </w:pPr>
+      <w:r>
+        <w:rPr/>
+        <w:t>Код обчислень</w:t>
+      </w:r>
+    </w:p>
+    <w:p>
+      <w:pPr>
+        <w:pStyle w:val="P1"/>
+        <w:rPr/>
+      </w:pPr>
+      <w:r>
+        <w:rPr/>
+      </w:r>
+    </w:p>
+    <w:p>
+      <w:pPr>
+        <w:pStyle w:val="Code"/>
+        <w:rPr/>
+      </w:pPr>
+      <w:r>
+        <w:rPr/>
+        <w:t>from mpi4py import MPI</w:t>
+      </w:r>
+    </w:p>
+    <w:p>
+      <w:pPr>
+        <w:pStyle w:val="Code"/>
+        <w:rPr/>
+      </w:pPr>
+      <w:r>
+        <w:rPr/>
+        <w:t>import numpy as np</w:t>
+      </w:r>
+    </w:p>
+    <w:p>
+      <w:pPr>
+        <w:pStyle w:val="Code"/>
+        <w:rPr/>
+      </w:pPr>
+      <w:r>
+        <w:rPr/>
+        <w:t>import random</w:t>
+      </w:r>
+    </w:p>
+    <w:p>
+      <w:pPr>
+        <w:pStyle w:val="Code"/>
+        <w:rPr/>
+      </w:pPr>
+      <w:r>
+        <w:rPr/>
+      </w:r>
+    </w:p>
+    <w:p>
+      <w:pPr>
+        <w:pStyle w:val="Code"/>
+        <w:rPr/>
+      </w:pPr>
+      <w:r>
+        <w:rPr/>
+        <w:t>comm = MPI.COMM_WORLD</w:t>
+      </w:r>
+    </w:p>
+    <w:p>
+      <w:pPr>
+        <w:pStyle w:val="Code"/>
+        <w:rPr/>
+      </w:pPr>
+      <w:r>
+        <w:rPr/>
+        <w:t>size = comm.Get_size()</w:t>
+      </w:r>
+    </w:p>
+    <w:p>
+      <w:pPr>
+        <w:pStyle w:val="Code"/>
+        <w:rPr/>
+      </w:pPr>
+      <w:r>
+        <w:rPr/>
+        <w:t>rank = comm.Get_rank()</w:t>
+      </w:r>
+    </w:p>
+    <w:p>
+      <w:pPr>
+        <w:pStyle w:val="Code"/>
+        <w:rPr/>
+      </w:pPr>
+      <w:r>
+        <w:rPr/>
+      </w:r>
+    </w:p>
+    <w:p>
+      <w:pPr>
+        <w:pStyle w:val="Code"/>
+        <w:rPr/>
+      </w:pPr>
+      <w:r>
+        <w:rPr/>
+      </w:r>
+    </w:p>
+    <w:p>
+      <w:pPr>
+        <w:pStyle w:val="Code"/>
+        <w:rPr/>
+      </w:pPr>
+      <w:r>
+        <w:rPr/>
+        <w:t>def custom_sin(x, K=500):</w:t>
+      </w:r>
+    </w:p>
+    <w:p>
+      <w:pPr>
+        <w:pStyle w:val="Code"/>
+        <w:rPr/>
+      </w:pPr>
+      <w:r>
+        <w:rPr/>
+        <w:t xml:space="preserve">    </w:t>
+      </w:r>
+      <w:r>
+        <w:rPr/>
+        <w:t>y = x</w:t>
+      </w:r>
+    </w:p>
+    <w:p>
+      <w:pPr>
+        <w:pStyle w:val="Code"/>
+        <w:rPr/>
+      </w:pPr>
+      <w:r>
+        <w:rPr/>
+        <w:t xml:space="preserve">    </w:t>
+      </w:r>
+      <w:r>
+        <w:rPr/>
+        <w:t>s = y</w:t>
+      </w:r>
+    </w:p>
+    <w:p>
+      <w:pPr>
+        <w:pStyle w:val="Code"/>
+        <w:rPr/>
+      </w:pPr>
+      <w:r>
+        <w:rPr/>
+        <w:t xml:space="preserve">    </w:t>
+      </w:r>
+      <w:r>
+        <w:rPr/>
+        <w:t>k = 1</w:t>
+      </w:r>
+    </w:p>
+    <w:p>
+      <w:pPr>
+        <w:pStyle w:val="Code"/>
+        <w:rPr/>
+      </w:pPr>
+      <w:r>
+        <w:rPr/>
+        <w:t xml:space="preserve">    </w:t>
+      </w:r>
+      <w:r>
+        <w:rPr/>
+        <w:t>while k &lt;= K:</w:t>
+      </w:r>
+    </w:p>
+    <w:p>
+      <w:pPr>
+        <w:pStyle w:val="Code"/>
+        <w:rPr/>
+      </w:pPr>
+      <w:r>
+        <w:rPr/>
+        <w:t xml:space="preserve">        </w:t>
+      </w:r>
+      <w:r>
+        <w:rPr/>
+        <w:t>y = -((x**2) / ((k + 1) * (k + 2))) * y</w:t>
+      </w:r>
+    </w:p>
+    <w:p>
+      <w:pPr>
+        <w:pStyle w:val="Code"/>
+        <w:rPr/>
+      </w:pPr>
+      <w:r>
+        <w:rPr/>
+        <w:t xml:space="preserve">        </w:t>
+      </w:r>
+      <w:r>
+        <w:rPr/>
+        <w:t>s = s + y</w:t>
+      </w:r>
+    </w:p>
+    <w:p>
+      <w:pPr>
+        <w:pStyle w:val="Code"/>
+        <w:rPr/>
+      </w:pPr>
+      <w:r>
+        <w:rPr/>
+        <w:t xml:space="preserve">        </w:t>
+      </w:r>
+      <w:r>
+        <w:rPr/>
+        <w:t>k = k + 2</w:t>
+      </w:r>
+    </w:p>
+    <w:p>
+      <w:pPr>
+        <w:pStyle w:val="Code"/>
+        <w:rPr/>
+      </w:pPr>
+      <w:r>
+        <w:rPr/>
+        <w:t xml:space="preserve">    </w:t>
+      </w:r>
+      <w:r>
+        <w:rPr/>
+        <w:t>return s</w:t>
+      </w:r>
+    </w:p>
+    <w:p>
+      <w:pPr>
+        <w:pStyle w:val="Code"/>
+        <w:rPr/>
+      </w:pPr>
+      <w:r>
+        <w:rPr/>
+      </w:r>
+    </w:p>
+    <w:p>
+      <w:pPr>
+        <w:pStyle w:val="Code"/>
+        <w:rPr/>
+      </w:pPr>
+      <w:r>
+        <w:rPr/>
+      </w:r>
+    </w:p>
+    <w:p>
+      <w:pPr>
+        <w:pStyle w:val="Code"/>
+        <w:rPr/>
+      </w:pPr>
+      <w:r>
+        <w:rPr/>
+        <w:t># Experiment settings</w:t>
+      </w:r>
+    </w:p>
+    <w:p>
+      <w:pPr>
+        <w:pStyle w:val="Code"/>
+        <w:rPr/>
+      </w:pPr>
+      <w:r>
+        <w:rPr/>
+        <w:t>N_values = list(range(20_000, 240_001, 20_000))</w:t>
+      </w:r>
+    </w:p>
+    <w:p>
+      <w:pPr>
+        <w:pStyle w:val="Code"/>
+        <w:rPr/>
+      </w:pPr>
+      <w:r>
+        <w:rPr/>
+        <w:t>P = size</w:t>
+      </w:r>
+    </w:p>
+    <w:p>
+      <w:pPr>
+        <w:pStyle w:val="Code"/>
+        <w:rPr/>
+      </w:pPr>
+      <w:r>
+        <w:rPr/>
+      </w:r>
+    </w:p>
+    <w:p>
+      <w:pPr>
+        <w:pStyle w:val="Code"/>
+        <w:rPr/>
+      </w:pPr>
+      <w:r>
+        <w:rPr/>
+        <w:t>if rank == 0:</w:t>
+      </w:r>
+    </w:p>
+    <w:p>
+      <w:pPr>
+        <w:pStyle w:val="Code"/>
+        <w:rPr/>
+      </w:pPr>
+      <w:r>
+        <w:rPr/>
+        <w:t xml:space="preserve">    </w:t>
+      </w:r>
+      <w:r>
+        <w:rPr/>
+        <w:t>print(</w:t>
+      </w:r>
+    </w:p>
+    <w:p>
+      <w:pPr>
+        <w:pStyle w:val="Code"/>
+        <w:rPr/>
+      </w:pPr>
+      <w:r>
+        <w:rPr/>
+        <w:t xml:space="preserve">        </w:t>
+      </w:r>
+      <w:r>
+        <w:rPr/>
+        <w:t>f"{'N':&gt;10} | {'Attempt 1':&gt;14} | {'Attempt 2':&gt;14} | {'Attempt 3':&gt;14} | {'Average Tp':&gt;14}"</w:t>
+      </w:r>
+    </w:p>
+    <w:p>
+      <w:pPr>
+        <w:pStyle w:val="Code"/>
+        <w:rPr/>
+      </w:pPr>
+      <w:r>
+        <w:rPr/>
+        <w:t xml:space="preserve">    </w:t>
+      </w:r>
+      <w:r>
+        <w:rPr/>
+        <w:t>)</w:t>
+      </w:r>
+    </w:p>
+    <w:p>
+      <w:pPr>
+        <w:pStyle w:val="Code"/>
+        <w:rPr/>
+      </w:pPr>
+      <w:r>
+        <w:rPr/>
+        <w:t xml:space="preserve">    </w:t>
+      </w:r>
+      <w:r>
+        <w:rPr/>
+        <w:t>print("-" * 80)</w:t>
+      </w:r>
+    </w:p>
+    <w:p>
+      <w:pPr>
+        <w:pStyle w:val="Code"/>
+        <w:rPr/>
+      </w:pPr>
+      <w:r>
+        <w:rPr/>
+      </w:r>
+    </w:p>
+    <w:p>
+      <w:pPr>
+        <w:pStyle w:val="Code"/>
+        <w:rPr/>
+      </w:pPr>
+      <w:r>
+        <w:rPr/>
+        <w:t>for N in N_values:</w:t>
+      </w:r>
+    </w:p>
+    <w:p>
+      <w:pPr>
+        <w:pStyle w:val="Code"/>
+        <w:rPr/>
+      </w:pPr>
+      <w:r>
+        <w:rPr/>
+        <w:t xml:space="preserve">    </w:t>
+      </w:r>
+      <w:r>
+        <w:rPr/>
+        <w:t>attempts = []</w:t>
+      </w:r>
+    </w:p>
+    <w:p>
+      <w:pPr>
+        <w:pStyle w:val="Code"/>
+        <w:rPr/>
+      </w:pPr>
+      <w:r>
+        <w:rPr/>
+      </w:r>
+    </w:p>
+    <w:p>
+      <w:pPr>
+        <w:pStyle w:val="Code"/>
+        <w:rPr/>
+      </w:pPr>
+      <w:r>
+        <w:rPr/>
+        <w:t xml:space="preserve">    </w:t>
+      </w:r>
+      <w:r>
+        <w:rPr/>
+        <w:t># Number of tests</w:t>
+      </w:r>
+    </w:p>
+    <w:p>
+      <w:pPr>
+        <w:pStyle w:val="Code"/>
+        <w:rPr/>
+      </w:pPr>
+      <w:r>
+        <w:rPr/>
+        <w:t xml:space="preserve">    </w:t>
+      </w:r>
+      <w:r>
+        <w:rPr/>
+        <w:t>for _ in range(3):</w:t>
+      </w:r>
+    </w:p>
+    <w:p>
+      <w:pPr>
+        <w:pStyle w:val="Code"/>
+        <w:rPr/>
+      </w:pPr>
+      <w:r>
+        <w:rPr/>
+        <w:t xml:space="preserve">        </w:t>
+      </w:r>
+      <w:r>
+        <w:rPr/>
+        <w:t>comm.Barrier()</w:t>
+      </w:r>
+    </w:p>
+    <w:p>
+      <w:pPr>
+        <w:pStyle w:val="Code"/>
+        <w:rPr/>
+      </w:pPr>
+      <w:r>
+        <w:rPr/>
+        <w:t xml:space="preserve">        </w:t>
+      </w:r>
+      <w:r>
+        <w:rPr/>
+        <w:t>start_time = MPI.Wtime()</w:t>
+      </w:r>
+    </w:p>
+    <w:p>
+      <w:pPr>
+        <w:pStyle w:val="Code"/>
+        <w:rPr/>
+      </w:pPr>
+      <w:r>
+        <w:rPr/>
+      </w:r>
+    </w:p>
+    <w:p>
+      <w:pPr>
+        <w:pStyle w:val="Code"/>
+        <w:rPr/>
+      </w:pPr>
+      <w:r>
+        <w:rPr/>
+        <w:t xml:space="preserve">        </w:t>
+      </w:r>
+      <w:r>
+        <w:rPr/>
+        <w:t># Chunking the work</w:t>
+      </w:r>
+    </w:p>
+    <w:p>
+      <w:pPr>
+        <w:pStyle w:val="Code"/>
+        <w:rPr/>
+      </w:pPr>
+      <w:r>
+        <w:rPr/>
+        <w:t xml:space="preserve">        </w:t>
+      </w:r>
+      <w:r>
+        <w:rPr/>
+        <w:t>chunk_size = N // size</w:t>
+      </w:r>
+    </w:p>
+    <w:p>
+      <w:pPr>
+        <w:pStyle w:val="Code"/>
+        <w:rPr/>
+      </w:pPr>
+      <w:r>
+        <w:rPr/>
+        <w:t xml:space="preserve">        </w:t>
+      </w:r>
+      <w:r>
+        <w:rPr/>
+        <w:t>local_sum: float = 0.0</w:t>
+      </w:r>
+    </w:p>
+    <w:p>
+      <w:pPr>
+        <w:pStyle w:val="Code"/>
+        <w:rPr/>
+      </w:pPr>
+      <w:r>
+        <w:rPr/>
+      </w:r>
+    </w:p>
+    <w:p>
+      <w:pPr>
+        <w:pStyle w:val="Code"/>
+        <w:rPr/>
+      </w:pPr>
+      <w:r>
+        <w:rPr/>
+        <w:t xml:space="preserve">        </w:t>
+      </w:r>
+      <w:r>
+        <w:rPr/>
+        <w:t>for i in range(rank * chunk_size, (rank + 1) * chunk_size):</w:t>
+      </w:r>
+    </w:p>
+    <w:p>
+      <w:pPr>
+        <w:pStyle w:val="Code"/>
+        <w:rPr/>
+      </w:pPr>
+      <w:r>
+        <w:rPr/>
+        <w:t xml:space="preserve">            </w:t>
+      </w:r>
+      <w:r>
+        <w:rPr/>
+        <w:t>a_i = random.uniform(-1, 1)</w:t>
+      </w:r>
+    </w:p>
+    <w:p>
+      <w:pPr>
+        <w:pStyle w:val="Code"/>
+        <w:rPr/>
+      </w:pPr>
+      <w:r>
+        <w:rPr/>
+        <w:t xml:space="preserve">            </w:t>
+      </w:r>
+      <w:r>
+        <w:rPr/>
+        <w:t>x_i = 0.0001 * i</w:t>
+      </w:r>
+    </w:p>
+    <w:p>
+      <w:pPr>
+        <w:pStyle w:val="Code"/>
+        <w:rPr/>
+      </w:pPr>
+      <w:r>
+        <w:rPr/>
+        <w:t xml:space="preserve">            </w:t>
+      </w:r>
+      <w:r>
+        <w:rPr/>
+        <w:t>local_sum += a_i * custom_sin(x_i)</w:t>
+      </w:r>
+    </w:p>
+    <w:p>
+      <w:pPr>
+        <w:pStyle w:val="Code"/>
+        <w:rPr/>
+      </w:pPr>
+      <w:r>
+        <w:rPr/>
+      </w:r>
+    </w:p>
+    <w:p>
+      <w:pPr>
+        <w:pStyle w:val="Code"/>
+        <w:rPr/>
+      </w:pPr>
+      <w:r>
+        <w:rPr/>
+        <w:t xml:space="preserve">        </w:t>
+      </w:r>
+      <w:r>
+        <w:rPr/>
+        <w:t>total_sum = comm.reduce(local_sum, op=MPI.SUM, root=0)</w:t>
+      </w:r>
+    </w:p>
+    <w:p>
+      <w:pPr>
+        <w:pStyle w:val="Code"/>
+        <w:rPr/>
+      </w:pPr>
+      <w:r>
+        <w:rPr/>
+        <w:t xml:space="preserve">        </w:t>
+      </w:r>
+      <w:r>
+        <w:rPr/>
+        <w:t>end_time = MPI.Wtime()</w:t>
+      </w:r>
+    </w:p>
+    <w:p>
+      <w:pPr>
+        <w:pStyle w:val="Code"/>
+        <w:rPr/>
+      </w:pPr>
+      <w:r>
+        <w:rPr/>
+      </w:r>
+    </w:p>
+    <w:p>
+      <w:pPr>
+        <w:pStyle w:val="Code"/>
+        <w:rPr/>
+      </w:pPr>
+      <w:r>
+        <w:rPr/>
+        <w:t xml:space="preserve">        </w:t>
+      </w:r>
+      <w:r>
+        <w:rPr/>
+        <w:t>attempts.append(end_time - start_time)</w:t>
+      </w:r>
+    </w:p>
+    <w:p>
+      <w:pPr>
+        <w:pStyle w:val="Code"/>
+        <w:rPr/>
+      </w:pPr>
+      <w:r>
+        <w:rPr/>
+      </w:r>
+    </w:p>
+    <w:p>
+      <w:pPr>
+        <w:pStyle w:val="Code"/>
+        <w:rPr/>
+      </w:pPr>
+      <w:r>
+        <w:rPr/>
+        <w:t xml:space="preserve">    </w:t>
+      </w:r>
+      <w:r>
+        <w:rPr/>
+        <w:t>if rank == 0:</w:t>
+      </w:r>
+    </w:p>
+    <w:p>
+      <w:pPr>
+        <w:pStyle w:val="Code"/>
+        <w:rPr/>
+      </w:pPr>
+      <w:r>
+        <w:rPr/>
+        <w:t xml:space="preserve">        </w:t>
+      </w:r>
+      <w:r>
+        <w:rPr/>
+        <w:t>average_tp = sum(attempts) / 3</w:t>
+      </w:r>
+    </w:p>
+    <w:p>
+      <w:pPr>
+        <w:pStyle w:val="Code"/>
+        <w:rPr/>
+      </w:pPr>
+      <w:r>
+        <w:rPr/>
+        <w:t xml:space="preserve">        </w:t>
+      </w:r>
+      <w:r>
+        <w:rPr/>
+        <w:t>print(</w:t>
+      </w:r>
+    </w:p>
+    <w:p>
+      <w:pPr>
+        <w:pStyle w:val="Code"/>
+        <w:rPr/>
+      </w:pPr>
+      <w:r>
+        <w:rPr/>
+        <w:t xml:space="preserve">            </w:t>
+      </w:r>
+      <w:r>
+        <w:rPr/>
+        <w:t>f"{N:10d} | {attempts[0]:14.4f} | {attempts[1]:14.4f} | {attempts[2]:14.4f} | {average_tp:13.4f}"</w:t>
+      </w:r>
+    </w:p>
+    <w:p>
+      <w:pPr>
+        <w:pStyle w:val="Code"/>
+        <w:rPr/>
+      </w:pPr>
+      <w:r>
+        <w:rPr/>
+        <w:t xml:space="preserve">        </w:t>
+      </w:r>
+      <w:r>
+        <w:rPr/>
+        <w:t>)</w:t>
+      </w:r>
+    </w:p>
+    <w:p>
+      <w:pPr>
+        <w:pStyle w:val="P1"/>
         <w:rPr/>
       </w:pPr>
       <w:r>
@@ -6883,7 +8137,7 @@
           <wp:inline distT="0" distB="0" distL="0" distR="0">
             <wp:extent cx="5731510" cy="2865755"/>
             <wp:effectExtent l="0" t="0" r="0" b="0"/>
-            <wp:docPr id="14" name="Зображення12"/>
+            <wp:docPr id="15" name="Зображення12"/>
             <wp:cNvGraphicFramePr>
               <a:graphicFrameLocks xmlns:a="http://schemas.openxmlformats.org/drawingml/2006/main" noChangeAspect="1"/>
             </wp:cNvGraphicFramePr>
@@ -6891,13 +8145,13 @@
               <a:graphicData uri="http://schemas.openxmlformats.org/drawingml/2006/picture">
                 <pic:pic xmlns:pic="http://schemas.openxmlformats.org/drawingml/2006/picture">
                   <pic:nvPicPr>
-                    <pic:cNvPr id="14" name="Зображення12"/>
+                    <pic:cNvPr id="15" name="Зображення12"/>
                     <pic:cNvPicPr>
                       <a:picLocks noChangeAspect="1" noChangeArrowheads="1"/>
                     </pic:cNvPicPr>
                   </pic:nvPicPr>
                   <pic:blipFill>
-                    <a:blip r:embed="rId15"/>
+                    <a:blip r:embed="rId16"/>
                     <a:stretch>
                       <a:fillRect/>
                     </a:stretch>
@@ -7071,7 +8325,7 @@
           <wp:inline distT="0" distB="0" distL="0" distR="0">
             <wp:extent cx="1466850" cy="904875"/>
             <wp:effectExtent l="0" t="0" r="0" b="0"/>
-            <wp:docPr id="15" name="Зображення14"/>
+            <wp:docPr id="16" name="Зображення14"/>
             <wp:cNvGraphicFramePr>
               <a:graphicFrameLocks xmlns:a="http://schemas.openxmlformats.org/drawingml/2006/main" noChangeAspect="1"/>
             </wp:cNvGraphicFramePr>
@@ -7079,13 +8333,13 @@
               <a:graphicData uri="http://schemas.openxmlformats.org/drawingml/2006/picture">
                 <pic:pic xmlns:pic="http://schemas.openxmlformats.org/drawingml/2006/picture">
                   <pic:nvPicPr>
-                    <pic:cNvPr id="15" name="Зображення14"/>
+                    <pic:cNvPr id="16" name="Зображення14"/>
                     <pic:cNvPicPr>
                       <a:picLocks noChangeAspect="1" noChangeArrowheads="1"/>
                     </pic:cNvPicPr>
                   </pic:nvPicPr>
                   <pic:blipFill>
-                    <a:blip r:embed="rId16"/>
+                    <a:blip r:embed="rId17"/>
                     <a:stretch>
                       <a:fillRect/>
                     </a:stretch>
@@ -8650,7 +9904,7 @@
           <wp:inline distT="0" distB="0" distL="0" distR="0">
             <wp:extent cx="5731510" cy="3438525"/>
             <wp:effectExtent l="0" t="0" r="0" b="0"/>
-            <wp:docPr id="16" name="Зображення13"/>
+            <wp:docPr id="17" name="Зображення13"/>
             <wp:cNvGraphicFramePr>
               <a:graphicFrameLocks xmlns:a="http://schemas.openxmlformats.org/drawingml/2006/main" noChangeAspect="1"/>
             </wp:cNvGraphicFramePr>
@@ -8658,13 +9912,13 @@
               <a:graphicData uri="http://schemas.openxmlformats.org/drawingml/2006/picture">
                 <pic:pic xmlns:pic="http://schemas.openxmlformats.org/drawingml/2006/picture">
                   <pic:nvPicPr>
-                    <pic:cNvPr id="16" name="Зображення13"/>
+                    <pic:cNvPr id="17" name="Зображення13"/>
                     <pic:cNvPicPr>
                       <a:picLocks noChangeAspect="1" noChangeArrowheads="1"/>
                     </pic:cNvPicPr>
                   </pic:nvPicPr>
                   <pic:blipFill>
-                    <a:blip r:embed="rId17"/>
+                    <a:blip r:embed="rId18"/>
                     <a:stretch>
                       <a:fillRect/>
                     </a:stretch>

</xml_diff>